<commit_message>
Thesis: Chapter 4 complete
</commit_message>
<xml_diff>
--- a/thesis/Дипломски рад.docx
+++ b/thesis/Дипломски рад.docx
@@ -6119,7 +6119,11 @@
               <w:tab w:val="right" w:leader="dot" w:pos="8297"/>
             </w:tabs>
             <w:rPr>
+              <w:rFonts w:asciiTheme="minorHAnsi" w:eastAsiaTheme="minorEastAsia" w:hAnsiTheme="minorHAnsi" w:cstheme="minorBidi"/>
               <w:noProof/>
+              <w:kern w:val="2"/>
+              <w:lang w:val="sr-Latn-RS" w:eastAsia="sr-Latn-RS"/>
+              <w14:ligatures w14:val="standardContextual"/>
             </w:rPr>
           </w:pPr>
           <w:r>
@@ -6146,7 +6150,7 @@
             </w:rPr>
             <w:fldChar w:fldCharType="separate"/>
           </w:r>
-          <w:hyperlink w:anchor="_Toc188802039" w:history="1">
+          <w:hyperlink w:anchor="_Toc209437033" w:history="1">
             <w:r>
               <w:rPr>
                 <w:rStyle w:val="Hyperlink"/>
@@ -6181,7 +6185,7 @@
                 <w:noProof/>
                 <w:webHidden/>
               </w:rPr>
-              <w:instrText xml:space="preserve"> PAGEREF _Toc188802039 \h </w:instrText>
+              <w:instrText xml:space="preserve"> PAGEREF _Toc209437033 \h </w:instrText>
             </w:r>
             <w:r>
               <w:rPr>
@@ -6219,10 +6223,14 @@
               <w:tab w:val="right" w:leader="dot" w:pos="8297"/>
             </w:tabs>
             <w:rPr>
+              <w:rFonts w:asciiTheme="minorHAnsi" w:eastAsiaTheme="minorEastAsia" w:hAnsiTheme="minorHAnsi" w:cstheme="minorBidi"/>
               <w:noProof/>
+              <w:kern w:val="2"/>
+              <w:lang w:val="sr-Latn-RS" w:eastAsia="sr-Latn-RS"/>
+              <w14:ligatures w14:val="standardContextual"/>
             </w:rPr>
           </w:pPr>
-          <w:hyperlink w:anchor="_Toc188802040" w:history="1">
+          <w:hyperlink w:anchor="_Toc209437034" w:history="1">
             <w:r>
               <w:rPr>
                 <w:rStyle w:val="Hyperlink"/>
@@ -6272,7 +6280,7 @@
                 <w:noProof/>
                 <w:webHidden/>
               </w:rPr>
-              <w:instrText xml:space="preserve"> PAGEREF _Toc188802040 \h </w:instrText>
+              <w:instrText xml:space="preserve"> PAGEREF _Toc209437034 \h </w:instrText>
             </w:r>
             <w:r>
               <w:rPr>
@@ -6310,10 +6318,14 @@
               <w:tab w:val="right" w:leader="dot" w:pos="8297"/>
             </w:tabs>
             <w:rPr>
+              <w:rFonts w:asciiTheme="minorHAnsi" w:eastAsiaTheme="minorEastAsia" w:hAnsiTheme="minorHAnsi" w:cstheme="minorBidi"/>
               <w:noProof/>
+              <w:kern w:val="2"/>
+              <w:lang w:val="sr-Latn-RS" w:eastAsia="sr-Latn-RS"/>
+              <w14:ligatures w14:val="standardContextual"/>
             </w:rPr>
           </w:pPr>
-          <w:hyperlink w:anchor="_Toc188802041" w:history="1">
+          <w:hyperlink w:anchor="_Toc209437035" w:history="1">
             <w:r>
               <w:rPr>
                 <w:rStyle w:val="Hyperlink"/>
@@ -6363,7 +6375,7 @@
                 <w:noProof/>
                 <w:webHidden/>
               </w:rPr>
-              <w:instrText xml:space="preserve"> PAGEREF _Toc188802041 \h </w:instrText>
+              <w:instrText xml:space="preserve"> PAGEREF _Toc209437035 \h </w:instrText>
             </w:r>
             <w:r>
               <w:rPr>
@@ -6401,10 +6413,14 @@
               <w:tab w:val="right" w:leader="dot" w:pos="8297"/>
             </w:tabs>
             <w:rPr>
+              <w:rFonts w:asciiTheme="minorHAnsi" w:eastAsiaTheme="minorEastAsia" w:hAnsiTheme="minorHAnsi" w:cstheme="minorBidi"/>
               <w:noProof/>
+              <w:kern w:val="2"/>
+              <w:lang w:val="sr-Latn-RS" w:eastAsia="sr-Latn-RS"/>
+              <w14:ligatures w14:val="standardContextual"/>
             </w:rPr>
           </w:pPr>
-          <w:hyperlink w:anchor="_Toc188802042" w:history="1">
+          <w:hyperlink w:anchor="_Toc209437036" w:history="1">
             <w:r>
               <w:rPr>
                 <w:rStyle w:val="Hyperlink"/>
@@ -6441,7 +6457,7 @@
                 <w:noProof/>
                 <w:lang w:val="sr-Cyrl-RS"/>
               </w:rPr>
-              <w:t>Мане колаборативног филтрирања</w:t>
+              <w:t>Недостаци колаборативног филтрирања</w:t>
             </w:r>
             <w:r>
               <w:rPr>
@@ -6462,7 +6478,7 @@
                 <w:noProof/>
                 <w:webHidden/>
               </w:rPr>
-              <w:instrText xml:space="preserve"> PAGEREF _Toc188802042 \h </w:instrText>
+              <w:instrText xml:space="preserve"> PAGEREF _Toc209437036 \h </w:instrText>
             </w:r>
             <w:r>
               <w:rPr>
@@ -6500,10 +6516,14 @@
               <w:tab w:val="right" w:leader="dot" w:pos="8297"/>
             </w:tabs>
             <w:rPr>
+              <w:rFonts w:asciiTheme="minorHAnsi" w:eastAsiaTheme="minorEastAsia" w:hAnsiTheme="minorHAnsi" w:cstheme="minorBidi"/>
               <w:noProof/>
+              <w:kern w:val="2"/>
+              <w:lang w:val="sr-Latn-RS" w:eastAsia="sr-Latn-RS"/>
+              <w14:ligatures w14:val="standardContextual"/>
             </w:rPr>
           </w:pPr>
-          <w:hyperlink w:anchor="_Toc188802043" w:history="1">
+          <w:hyperlink w:anchor="_Toc209437037" w:history="1">
             <w:r>
               <w:rPr>
                 <w:rStyle w:val="Hyperlink"/>
@@ -6553,7 +6573,7 @@
                 <w:noProof/>
                 <w:webHidden/>
               </w:rPr>
-              <w:instrText xml:space="preserve"> PAGEREF _Toc188802043 \h </w:instrText>
+              <w:instrText xml:space="preserve"> PAGEREF _Toc209437037 \h </w:instrText>
             </w:r>
             <w:r>
               <w:rPr>
@@ -6591,17 +6611,21 @@
               <w:tab w:val="right" w:leader="dot" w:pos="8297"/>
             </w:tabs>
             <w:rPr>
+              <w:rFonts w:asciiTheme="minorHAnsi" w:eastAsiaTheme="minorEastAsia" w:hAnsiTheme="minorHAnsi" w:cstheme="minorBidi"/>
               <w:noProof/>
+              <w:kern w:val="2"/>
+              <w:lang w:val="sr-Latn-RS" w:eastAsia="sr-Latn-RS"/>
+              <w14:ligatures w14:val="standardContextual"/>
             </w:rPr>
           </w:pPr>
-          <w:hyperlink w:anchor="_Toc188802044" w:history="1">
+          <w:hyperlink w:anchor="_Toc209437038" w:history="1">
             <w:r>
               <w:rPr>
                 <w:rStyle w:val="Hyperlink"/>
                 <w:noProof/>
                 <w:lang w:val="sr-Cyrl-RS"/>
               </w:rPr>
-              <w:t>Литература</w:t>
+              <w:t>4. Прототипска имплементација</w:t>
             </w:r>
             <w:r>
               <w:rPr>
@@ -6622,7 +6646,7 @@
                 <w:noProof/>
                 <w:webHidden/>
               </w:rPr>
-              <w:instrText xml:space="preserve"> PAGEREF _Toc188802044 \h </w:instrText>
+              <w:instrText xml:space="preserve"> PAGEREF _Toc209437038 \h </w:instrText>
             </w:r>
             <w:r>
               <w:rPr>
@@ -6642,7 +6666,668 @@
                 <w:noProof/>
                 <w:webHidden/>
               </w:rPr>
+              <w:t>10</w:t>
+            </w:r>
+            <w:r>
+              <w:rPr>
+                <w:noProof/>
+                <w:webHidden/>
+              </w:rPr>
+              <w:fldChar w:fldCharType="end"/>
+            </w:r>
+          </w:hyperlink>
+        </w:p>
+        <w:p>
+          <w:pPr>
+            <w:pStyle w:val="TOC2"/>
+            <w:tabs>
+              <w:tab w:val="right" w:leader="dot" w:pos="8297"/>
+            </w:tabs>
+            <w:rPr>
+              <w:rFonts w:asciiTheme="minorHAnsi" w:eastAsiaTheme="minorEastAsia" w:hAnsiTheme="minorHAnsi" w:cstheme="minorBidi"/>
+              <w:noProof/>
+              <w:kern w:val="2"/>
+              <w:lang w:val="sr-Latn-RS" w:eastAsia="sr-Latn-RS"/>
+              <w14:ligatures w14:val="standardContextual"/>
+            </w:rPr>
+          </w:pPr>
+          <w:hyperlink w:anchor="_Toc209437039" w:history="1">
+            <w:r>
+              <w:rPr>
+                <w:rStyle w:val="Hyperlink"/>
+                <w:noProof/>
+                <w:lang w:val="sr-Cyrl-RS"/>
+              </w:rPr>
+              <w:t>4</w:t>
+            </w:r>
+            <w:r>
+              <w:rPr>
+                <w:rStyle w:val="Hyperlink"/>
+                <w:noProof/>
+              </w:rPr>
+              <w:t xml:space="preserve">.1 </w:t>
+            </w:r>
+            <w:r>
+              <w:rPr>
+                <w:rStyle w:val="Hyperlink"/>
+                <w:noProof/>
+                <w:lang w:val="sr-Cyrl-RS"/>
+              </w:rPr>
+              <w:t>Архитектура система</w:t>
+            </w:r>
+            <w:r>
+              <w:rPr>
+                <w:noProof/>
+                <w:webHidden/>
+              </w:rPr>
+              <w:tab/>
+            </w:r>
+            <w:r>
+              <w:rPr>
+                <w:noProof/>
+                <w:webHidden/>
+              </w:rPr>
+              <w:fldChar w:fldCharType="begin"/>
+            </w:r>
+            <w:r>
+              <w:rPr>
+                <w:noProof/>
+                <w:webHidden/>
+              </w:rPr>
+              <w:instrText xml:space="preserve"> PAGEREF _Toc209437039 \h </w:instrText>
+            </w:r>
+            <w:r>
+              <w:rPr>
+                <w:noProof/>
+                <w:webHidden/>
+              </w:rPr>
+            </w:r>
+            <w:r>
+              <w:rPr>
+                <w:noProof/>
+                <w:webHidden/>
+              </w:rPr>
+              <w:fldChar w:fldCharType="separate"/>
+            </w:r>
+            <w:r>
+              <w:rPr>
+                <w:noProof/>
+                <w:webHidden/>
+              </w:rPr>
+              <w:t>10</w:t>
+            </w:r>
+            <w:r>
+              <w:rPr>
+                <w:noProof/>
+                <w:webHidden/>
+              </w:rPr>
+              <w:fldChar w:fldCharType="end"/>
+            </w:r>
+          </w:hyperlink>
+        </w:p>
+        <w:p>
+          <w:pPr>
+            <w:pStyle w:val="TOC2"/>
+            <w:tabs>
+              <w:tab w:val="right" w:leader="dot" w:pos="8297"/>
+            </w:tabs>
+            <w:rPr>
+              <w:rFonts w:asciiTheme="minorHAnsi" w:eastAsiaTheme="minorEastAsia" w:hAnsiTheme="minorHAnsi" w:cstheme="minorBidi"/>
+              <w:noProof/>
+              <w:kern w:val="2"/>
+              <w:lang w:val="sr-Latn-RS" w:eastAsia="sr-Latn-RS"/>
+              <w14:ligatures w14:val="standardContextual"/>
+            </w:rPr>
+          </w:pPr>
+          <w:hyperlink w:anchor="_Toc209437040" w:history="1">
+            <w:r>
+              <w:rPr>
+                <w:rStyle w:val="Hyperlink"/>
+                <w:noProof/>
+                <w:lang w:val="sr-Cyrl-RS"/>
+              </w:rPr>
+              <w:t>4</w:t>
+            </w:r>
+            <w:r>
+              <w:rPr>
+                <w:rStyle w:val="Hyperlink"/>
+                <w:noProof/>
+              </w:rPr>
+              <w:t>.</w:t>
+            </w:r>
+            <w:r>
+              <w:rPr>
+                <w:rStyle w:val="Hyperlink"/>
+                <w:noProof/>
+                <w:lang w:val="en-US"/>
+              </w:rPr>
+              <w:t>2</w:t>
+            </w:r>
+            <w:r>
+              <w:rPr>
+                <w:rStyle w:val="Hyperlink"/>
+                <w:noProof/>
+              </w:rPr>
+              <w:t xml:space="preserve"> </w:t>
+            </w:r>
+            <w:r>
+              <w:rPr>
+                <w:rStyle w:val="Hyperlink"/>
+                <w:noProof/>
+                <w:lang w:val="sr-Cyrl-RS"/>
+              </w:rPr>
+              <w:t>Подсистем за колаборативно филтрирање</w:t>
+            </w:r>
+            <w:r>
+              <w:rPr>
+                <w:noProof/>
+                <w:webHidden/>
+              </w:rPr>
+              <w:tab/>
+            </w:r>
+            <w:r>
+              <w:rPr>
+                <w:noProof/>
+                <w:webHidden/>
+              </w:rPr>
+              <w:fldChar w:fldCharType="begin"/>
+            </w:r>
+            <w:r>
+              <w:rPr>
+                <w:noProof/>
+                <w:webHidden/>
+              </w:rPr>
+              <w:instrText xml:space="preserve"> PAGEREF _Toc209437040 \h </w:instrText>
+            </w:r>
+            <w:r>
+              <w:rPr>
+                <w:noProof/>
+                <w:webHidden/>
+              </w:rPr>
+            </w:r>
+            <w:r>
+              <w:rPr>
+                <w:noProof/>
+                <w:webHidden/>
+              </w:rPr>
+              <w:fldChar w:fldCharType="separate"/>
+            </w:r>
+            <w:r>
+              <w:rPr>
+                <w:noProof/>
+                <w:webHidden/>
+              </w:rPr>
               <w:t>11</w:t>
+            </w:r>
+            <w:r>
+              <w:rPr>
+                <w:noProof/>
+                <w:webHidden/>
+              </w:rPr>
+              <w:fldChar w:fldCharType="end"/>
+            </w:r>
+          </w:hyperlink>
+        </w:p>
+        <w:p>
+          <w:pPr>
+            <w:pStyle w:val="TOC2"/>
+            <w:tabs>
+              <w:tab w:val="right" w:leader="dot" w:pos="8297"/>
+            </w:tabs>
+            <w:rPr>
+              <w:rFonts w:asciiTheme="minorHAnsi" w:eastAsiaTheme="minorEastAsia" w:hAnsiTheme="minorHAnsi" w:cstheme="minorBidi"/>
+              <w:noProof/>
+              <w:kern w:val="2"/>
+              <w:lang w:val="sr-Latn-RS" w:eastAsia="sr-Latn-RS"/>
+              <w14:ligatures w14:val="standardContextual"/>
+            </w:rPr>
+          </w:pPr>
+          <w:hyperlink w:anchor="_Toc209437041" w:history="1">
+            <w:r>
+              <w:rPr>
+                <w:rStyle w:val="Hyperlink"/>
+                <w:noProof/>
+                <w:lang w:val="sr-Cyrl-RS"/>
+              </w:rPr>
+              <w:t>4</w:t>
+            </w:r>
+            <w:r>
+              <w:rPr>
+                <w:rStyle w:val="Hyperlink"/>
+                <w:noProof/>
+              </w:rPr>
+              <w:t>.</w:t>
+            </w:r>
+            <w:r>
+              <w:rPr>
+                <w:rStyle w:val="Hyperlink"/>
+                <w:noProof/>
+                <w:lang w:val="en-US"/>
+              </w:rPr>
+              <w:t>3</w:t>
+            </w:r>
+            <w:r>
+              <w:rPr>
+                <w:rStyle w:val="Hyperlink"/>
+                <w:noProof/>
+              </w:rPr>
+              <w:t xml:space="preserve"> </w:t>
+            </w:r>
+            <w:r>
+              <w:rPr>
+                <w:rStyle w:val="Hyperlink"/>
+                <w:noProof/>
+                <w:lang w:val="sr-Cyrl-RS"/>
+              </w:rPr>
+              <w:t>Подсистем за филтрирање</w:t>
+            </w:r>
+            <w:r>
+              <w:rPr>
+                <w:rStyle w:val="Hyperlink"/>
+                <w:noProof/>
+                <w:lang w:val="en-US"/>
+              </w:rPr>
+              <w:t xml:space="preserve"> </w:t>
+            </w:r>
+            <w:r>
+              <w:rPr>
+                <w:rStyle w:val="Hyperlink"/>
+                <w:noProof/>
+                <w:lang w:val="sr-Cyrl-RS"/>
+              </w:rPr>
+              <w:t>базираног на садржају</w:t>
+            </w:r>
+            <w:r>
+              <w:rPr>
+                <w:noProof/>
+                <w:webHidden/>
+              </w:rPr>
+              <w:tab/>
+            </w:r>
+            <w:r>
+              <w:rPr>
+                <w:noProof/>
+                <w:webHidden/>
+              </w:rPr>
+              <w:fldChar w:fldCharType="begin"/>
+            </w:r>
+            <w:r>
+              <w:rPr>
+                <w:noProof/>
+                <w:webHidden/>
+              </w:rPr>
+              <w:instrText xml:space="preserve"> PAGEREF _Toc209437041 \h </w:instrText>
+            </w:r>
+            <w:r>
+              <w:rPr>
+                <w:noProof/>
+                <w:webHidden/>
+              </w:rPr>
+            </w:r>
+            <w:r>
+              <w:rPr>
+                <w:noProof/>
+                <w:webHidden/>
+              </w:rPr>
+              <w:fldChar w:fldCharType="separate"/>
+            </w:r>
+            <w:r>
+              <w:rPr>
+                <w:noProof/>
+                <w:webHidden/>
+              </w:rPr>
+              <w:t>14</w:t>
+            </w:r>
+            <w:r>
+              <w:rPr>
+                <w:noProof/>
+                <w:webHidden/>
+              </w:rPr>
+              <w:fldChar w:fldCharType="end"/>
+            </w:r>
+          </w:hyperlink>
+        </w:p>
+        <w:p>
+          <w:pPr>
+            <w:pStyle w:val="TOC1"/>
+            <w:tabs>
+              <w:tab w:val="right" w:leader="dot" w:pos="8297"/>
+            </w:tabs>
+            <w:rPr>
+              <w:rFonts w:asciiTheme="minorHAnsi" w:eastAsiaTheme="minorEastAsia" w:hAnsiTheme="minorHAnsi" w:cstheme="minorBidi"/>
+              <w:noProof/>
+              <w:kern w:val="2"/>
+              <w:lang w:val="sr-Latn-RS" w:eastAsia="sr-Latn-RS"/>
+              <w14:ligatures w14:val="standardContextual"/>
+            </w:rPr>
+          </w:pPr>
+          <w:hyperlink w:anchor="_Toc209437042" w:history="1">
+            <w:r>
+              <w:rPr>
+                <w:rStyle w:val="Hyperlink"/>
+                <w:noProof/>
+              </w:rPr>
+              <w:t>5. Верификација и валидација система</w:t>
+            </w:r>
+            <w:r>
+              <w:rPr>
+                <w:noProof/>
+                <w:webHidden/>
+              </w:rPr>
+              <w:tab/>
+            </w:r>
+            <w:r>
+              <w:rPr>
+                <w:noProof/>
+                <w:webHidden/>
+              </w:rPr>
+              <w:fldChar w:fldCharType="begin"/>
+            </w:r>
+            <w:r>
+              <w:rPr>
+                <w:noProof/>
+                <w:webHidden/>
+              </w:rPr>
+              <w:instrText xml:space="preserve"> PAGEREF _Toc209437042 \h </w:instrText>
+            </w:r>
+            <w:r>
+              <w:rPr>
+                <w:noProof/>
+                <w:webHidden/>
+              </w:rPr>
+            </w:r>
+            <w:r>
+              <w:rPr>
+                <w:noProof/>
+                <w:webHidden/>
+              </w:rPr>
+              <w:fldChar w:fldCharType="separate"/>
+            </w:r>
+            <w:r>
+              <w:rPr>
+                <w:noProof/>
+                <w:webHidden/>
+              </w:rPr>
+              <w:t>16</w:t>
+            </w:r>
+            <w:r>
+              <w:rPr>
+                <w:noProof/>
+                <w:webHidden/>
+              </w:rPr>
+              <w:fldChar w:fldCharType="end"/>
+            </w:r>
+          </w:hyperlink>
+        </w:p>
+        <w:p>
+          <w:pPr>
+            <w:pStyle w:val="TOC2"/>
+            <w:tabs>
+              <w:tab w:val="right" w:leader="dot" w:pos="8297"/>
+            </w:tabs>
+            <w:rPr>
+              <w:rFonts w:asciiTheme="minorHAnsi" w:eastAsiaTheme="minorEastAsia" w:hAnsiTheme="minorHAnsi" w:cstheme="minorBidi"/>
+              <w:noProof/>
+              <w:kern w:val="2"/>
+              <w:lang w:val="sr-Latn-RS" w:eastAsia="sr-Latn-RS"/>
+              <w14:ligatures w14:val="standardContextual"/>
+            </w:rPr>
+          </w:pPr>
+          <w:hyperlink w:anchor="_Toc209437043" w:history="1">
+            <w:r>
+              <w:rPr>
+                <w:rStyle w:val="Hyperlink"/>
+                <w:noProof/>
+                <w:lang w:val="sr-Cyrl-RS"/>
+              </w:rPr>
+              <w:t>5</w:t>
+            </w:r>
+            <w:r>
+              <w:rPr>
+                <w:rStyle w:val="Hyperlink"/>
+                <w:noProof/>
+              </w:rPr>
+              <w:t>.</w:t>
+            </w:r>
+            <w:r>
+              <w:rPr>
+                <w:rStyle w:val="Hyperlink"/>
+                <w:noProof/>
+                <w:lang w:val="sr-Cyrl-RS"/>
+              </w:rPr>
+              <w:t>1</w:t>
+            </w:r>
+            <w:r>
+              <w:rPr>
+                <w:rStyle w:val="Hyperlink"/>
+                <w:noProof/>
+              </w:rPr>
+              <w:t xml:space="preserve"> </w:t>
+            </w:r>
+            <w:r>
+              <w:rPr>
+                <w:rStyle w:val="Hyperlink"/>
+                <w:noProof/>
+                <w:lang w:val="sr-Cyrl-RS"/>
+              </w:rPr>
+              <w:t>Верификација колаборативног филтрирања</w:t>
+            </w:r>
+            <w:r>
+              <w:rPr>
+                <w:noProof/>
+                <w:webHidden/>
+              </w:rPr>
+              <w:tab/>
+            </w:r>
+            <w:r>
+              <w:rPr>
+                <w:noProof/>
+                <w:webHidden/>
+              </w:rPr>
+              <w:fldChar w:fldCharType="begin"/>
+            </w:r>
+            <w:r>
+              <w:rPr>
+                <w:noProof/>
+                <w:webHidden/>
+              </w:rPr>
+              <w:instrText xml:space="preserve"> PAGEREF _Toc209437043 \h </w:instrText>
+            </w:r>
+            <w:r>
+              <w:rPr>
+                <w:noProof/>
+                <w:webHidden/>
+              </w:rPr>
+            </w:r>
+            <w:r>
+              <w:rPr>
+                <w:noProof/>
+                <w:webHidden/>
+              </w:rPr>
+              <w:fldChar w:fldCharType="separate"/>
+            </w:r>
+            <w:r>
+              <w:rPr>
+                <w:noProof/>
+                <w:webHidden/>
+              </w:rPr>
+              <w:t>16</w:t>
+            </w:r>
+            <w:r>
+              <w:rPr>
+                <w:noProof/>
+                <w:webHidden/>
+              </w:rPr>
+              <w:fldChar w:fldCharType="end"/>
+            </w:r>
+          </w:hyperlink>
+        </w:p>
+        <w:p>
+          <w:pPr>
+            <w:pStyle w:val="TOC2"/>
+            <w:tabs>
+              <w:tab w:val="right" w:leader="dot" w:pos="8297"/>
+            </w:tabs>
+            <w:rPr>
+              <w:rFonts w:asciiTheme="minorHAnsi" w:eastAsiaTheme="minorEastAsia" w:hAnsiTheme="minorHAnsi" w:cstheme="minorBidi"/>
+              <w:noProof/>
+              <w:kern w:val="2"/>
+              <w:lang w:val="sr-Latn-RS" w:eastAsia="sr-Latn-RS"/>
+              <w14:ligatures w14:val="standardContextual"/>
+            </w:rPr>
+          </w:pPr>
+          <w:hyperlink w:anchor="_Toc209437044" w:history="1">
+            <w:r>
+              <w:rPr>
+                <w:rStyle w:val="Hyperlink"/>
+                <w:noProof/>
+                <w:lang w:val="sr-Cyrl-RS"/>
+              </w:rPr>
+              <w:t>5</w:t>
+            </w:r>
+            <w:r>
+              <w:rPr>
+                <w:rStyle w:val="Hyperlink"/>
+                <w:noProof/>
+              </w:rPr>
+              <w:t>.</w:t>
+            </w:r>
+            <w:r>
+              <w:rPr>
+                <w:rStyle w:val="Hyperlink"/>
+                <w:noProof/>
+                <w:lang w:val="en-US"/>
+              </w:rPr>
+              <w:t>2</w:t>
+            </w:r>
+            <w:r>
+              <w:rPr>
+                <w:rStyle w:val="Hyperlink"/>
+                <w:noProof/>
+              </w:rPr>
+              <w:t xml:space="preserve"> </w:t>
+            </w:r>
+            <w:r>
+              <w:rPr>
+                <w:rStyle w:val="Hyperlink"/>
+                <w:noProof/>
+                <w:lang w:val="sr-Cyrl-RS"/>
+              </w:rPr>
+              <w:t>Верификација филтрирања базираног на садржају</w:t>
+            </w:r>
+            <w:r>
+              <w:rPr>
+                <w:noProof/>
+                <w:webHidden/>
+              </w:rPr>
+              <w:tab/>
+            </w:r>
+            <w:r>
+              <w:rPr>
+                <w:noProof/>
+                <w:webHidden/>
+              </w:rPr>
+              <w:fldChar w:fldCharType="begin"/>
+            </w:r>
+            <w:r>
+              <w:rPr>
+                <w:noProof/>
+                <w:webHidden/>
+              </w:rPr>
+              <w:instrText xml:space="preserve"> PAGEREF _Toc209437044 \h </w:instrText>
+            </w:r>
+            <w:r>
+              <w:rPr>
+                <w:noProof/>
+                <w:webHidden/>
+              </w:rPr>
+            </w:r>
+            <w:r>
+              <w:rPr>
+                <w:noProof/>
+                <w:webHidden/>
+              </w:rPr>
+              <w:fldChar w:fldCharType="separate"/>
+            </w:r>
+            <w:r>
+              <w:rPr>
+                <w:noProof/>
+                <w:webHidden/>
+              </w:rPr>
+              <w:t>22</w:t>
+            </w:r>
+            <w:r>
+              <w:rPr>
+                <w:noProof/>
+                <w:webHidden/>
+              </w:rPr>
+              <w:fldChar w:fldCharType="end"/>
+            </w:r>
+          </w:hyperlink>
+        </w:p>
+        <w:p>
+          <w:pPr>
+            <w:pStyle w:val="TOC1"/>
+            <w:tabs>
+              <w:tab w:val="right" w:leader="dot" w:pos="8297"/>
+            </w:tabs>
+            <w:rPr>
+              <w:rFonts w:asciiTheme="minorHAnsi" w:eastAsiaTheme="minorEastAsia" w:hAnsiTheme="minorHAnsi" w:cstheme="minorBidi"/>
+              <w:noProof/>
+              <w:kern w:val="2"/>
+              <w:lang w:val="sr-Latn-RS" w:eastAsia="sr-Latn-RS"/>
+              <w14:ligatures w14:val="standardContextual"/>
+            </w:rPr>
+          </w:pPr>
+          <w:hyperlink w:anchor="_Toc209437045" w:history="1">
+            <w:r>
+              <w:rPr>
+                <w:rStyle w:val="Hyperlink"/>
+                <w:noProof/>
+                <w:lang w:val="sr-Cyrl-RS"/>
+              </w:rPr>
+              <w:t>Литература</w:t>
+            </w:r>
+            <w:r>
+              <w:rPr>
+                <w:noProof/>
+                <w:webHidden/>
+              </w:rPr>
+              <w:tab/>
+            </w:r>
+            <w:r>
+              <w:rPr>
+                <w:noProof/>
+                <w:webHidden/>
+              </w:rPr>
+              <w:fldChar w:fldCharType="begin"/>
+            </w:r>
+            <w:r>
+              <w:rPr>
+                <w:noProof/>
+                <w:webHidden/>
+              </w:rPr>
+              <w:instrText xml:space="preserve"> PAGEREF _Toc209437045 \h </w:instrText>
+            </w:r>
+            <w:r>
+              <w:rPr>
+                <w:noProof/>
+                <w:webHidden/>
+              </w:rPr>
+            </w:r>
+            <w:r>
+              <w:rPr>
+                <w:noProof/>
+                <w:webHidden/>
+              </w:rPr>
+              <w:fldChar w:fldCharType="separate"/>
+            </w:r>
+            <w:r>
+              <w:rPr>
+                <w:noProof/>
+                <w:webHidden/>
+              </w:rPr>
+              <w:t>27</w:t>
             </w:r>
             <w:r>
               <w:rPr>
@@ -6673,32 +7358,40 @@
           <w:lang w:val="en-US"/>
         </w:rPr>
       </w:pPr>
-    </w:p>
-    <w:p>
-      <w:pPr>
+      <w:r>
         <w:rPr>
           <w:sz w:val="36"/>
           <w:szCs w:val="36"/>
           <w:lang w:val="en-US"/>
         </w:rPr>
-      </w:pPr>
-      <w:r>
+        <w:t>s</w:t>
+      </w:r>
+    </w:p>
+    <w:p>
+      <w:pPr>
         <w:rPr>
           <w:sz w:val="36"/>
           <w:szCs w:val="36"/>
           <w:lang w:val="en-US"/>
         </w:rPr>
-        <w:br w:type="page"/>
-      </w:r>
-    </w:p>
-    <w:p>
-      <w:pPr>
-        <w:rPr>
-          <w:rFonts w:cs="Times New Roman"/>
+      </w:pPr>
+      <w:r>
+        <w:rPr>
           <w:sz w:val="36"/>
           <w:szCs w:val="36"/>
           <w:lang w:val="en-US"/>
         </w:rPr>
+        <w:br w:type="page"/>
+      </w:r>
+    </w:p>
+    <w:p>
+      <w:pPr>
+        <w:rPr>
+          <w:rFonts w:cs="Times New Roman"/>
+          <w:sz w:val="36"/>
+          <w:szCs w:val="36"/>
+          <w:lang w:val="en-US"/>
+        </w:rPr>
       </w:pPr>
     </w:p>
     <w:p>
@@ -6708,7 +7401,7 @@
           <w:lang w:val="en-US"/>
         </w:rPr>
       </w:pPr>
-      <w:bookmarkStart w:id="1" w:name="_Toc188802039"/>
+      <w:bookmarkStart w:id="1" w:name="_Toc209437033"/>
       <w:r>
         <w:t xml:space="preserve">2. </w:t>
       </w:r>
@@ -10189,7 +10882,7 @@
           <w:lang w:val="sr-Cyrl-RS"/>
         </w:rPr>
       </w:pPr>
-      <w:bookmarkStart w:id="2" w:name="_Toc188802040"/>
+      <w:bookmarkStart w:id="2" w:name="_Toc209437034"/>
       <w:r>
         <w:lastRenderedPageBreak/>
         <w:t>2.</w:t>
@@ -11715,7 +12408,7 @@
           <w:lang w:val="sr-Cyrl-RS"/>
         </w:rPr>
       </w:pPr>
-      <w:bookmarkStart w:id="4" w:name="_Toc188802041"/>
+      <w:bookmarkStart w:id="4" w:name="_Toc209437035"/>
       <w:r>
         <w:lastRenderedPageBreak/>
         <w:t>2.</w:t>
@@ -16331,7 +17024,7 @@
           <w:lang w:val="sr-Cyrl-RS"/>
         </w:rPr>
       </w:pPr>
-      <w:bookmarkStart w:id="5" w:name="_Toc188802042"/>
+      <w:bookmarkStart w:id="5" w:name="_Toc209437036"/>
       <w:r>
         <w:t>2.</w:t>
       </w:r>
@@ -16579,7 +17272,7 @@
           <w:lang w:val="sr-Cyrl-RS"/>
         </w:rPr>
       </w:pPr>
-      <w:bookmarkStart w:id="6" w:name="_Toc188802043"/>
+      <w:bookmarkStart w:id="6" w:name="_Toc209437037"/>
       <w:r>
         <w:lastRenderedPageBreak/>
         <w:t>2.</w:t>
@@ -16814,9 +17507,10 @@
       <w:pPr>
         <w:pStyle w:val="Heading1"/>
         <w:rPr>
-          <w:lang w:val="sr-Cyrl-RS"/>
-        </w:rPr>
-      </w:pPr>
+          <w:lang w:val="en-US"/>
+        </w:rPr>
+      </w:pPr>
+      <w:bookmarkStart w:id="7" w:name="_Toc209437038"/>
       <w:r>
         <w:rPr>
           <w:lang w:val="sr-Cyrl-RS"/>
@@ -16830,6 +17524,7 @@
         </w:rPr>
         <w:t xml:space="preserve"> Прототипска имплементација</w:t>
       </w:r>
+      <w:bookmarkEnd w:id="7"/>
     </w:p>
     <w:p>
       <w:pPr>
@@ -16838,6 +17533,7 @@
           <w:lang w:val="sr-Cyrl-RS"/>
         </w:rPr>
       </w:pPr>
+      <w:bookmarkStart w:id="8" w:name="_Toc209437039"/>
       <w:r>
         <w:rPr>
           <w:lang w:val="sr-Cyrl-RS"/>
@@ -16845,13 +17541,7 @@
         <w:t>4</w:t>
       </w:r>
       <w:r>
-        <w:t>.</w:t>
-      </w:r>
-      <w:r>
-        <w:rPr>
-          <w:lang w:val="en-US"/>
-        </w:rPr>
-        <w:t>2</w:t>
+        <w:t>.1</w:t>
       </w:r>
       <w:r>
         <w:t xml:space="preserve"> </w:t>
@@ -16860,15 +17550,9 @@
         <w:rPr>
           <w:lang w:val="sr-Cyrl-RS"/>
         </w:rPr>
-        <w:t>Подсистем за колаборативно филтрирање</w:t>
-      </w:r>
-    </w:p>
-    <w:p>
-      <w:pPr>
-        <w:rPr>
-          <w:lang w:val="sr-Cyrl-RS"/>
-        </w:rPr>
-      </w:pPr>
+        <w:t>Архитектура система</w:t>
+      </w:r>
+      <w:bookmarkEnd w:id="8"/>
     </w:p>
     <w:p>
       <w:pPr>
@@ -16882,6 +17566,269 @@
         <w:rPr>
           <w:lang w:val="sr-Cyrl-RS"/>
         </w:rPr>
+        <w:t>Систем описан у овом раду састоји се из две целине. Први део је подсистем за колаборативно филтрирање. Други део је подсистем за филтрирање базиран на садржају.</w:t>
+      </w:r>
+      <w:r>
+        <w:rPr>
+          <w:lang w:val="sr-Cyrl-RS"/>
+        </w:rPr>
+        <w:t xml:space="preserve"> Оба подсистема писана су у Пајтон програмском језику и изложене су кроз две приступне тачке како би могле да се повежу са другим системима.</w:t>
+      </w:r>
+      <w:r>
+        <w:rPr>
+          <w:lang w:val="sr-Cyrl-RS"/>
+        </w:rPr>
+        <w:t xml:space="preserve"> Да би корисник могао да се повеже са системом, </w:t>
+      </w:r>
+      <w:r>
+        <w:rPr>
+          <w:lang w:val="sr-Cyrl-RS"/>
+        </w:rPr>
+        <w:t xml:space="preserve">издвојена је посебна целина као </w:t>
+      </w:r>
+      <w:r>
+        <w:rPr>
+          <w:lang w:val="en-US"/>
+        </w:rPr>
+        <w:t xml:space="preserve">front-end </w:t>
+      </w:r>
+      <w:r>
+        <w:rPr>
+          <w:lang w:val="sr-Cyrl-RS"/>
+        </w:rPr>
+        <w:t xml:space="preserve">апликација писана помоћу </w:t>
+      </w:r>
+      <w:r>
+        <w:rPr>
+          <w:lang w:val="en-US"/>
+        </w:rPr>
+        <w:t xml:space="preserve">Angular </w:t>
+      </w:r>
+      <w:r>
+        <w:rPr>
+          <w:lang w:val="sr-Cyrl-RS"/>
+        </w:rPr>
+        <w:t>радног оквира и служи као кориснички интерфејс.</w:t>
+      </w:r>
+      <w:r>
+        <w:rPr>
+          <w:lang w:val="sr-Cyrl-RS"/>
+        </w:rPr>
+        <w:t xml:space="preserve"> Приказ архитектуре система приказан је на слици испод.</w:t>
+      </w:r>
+    </w:p>
+    <w:p>
+      <w:pPr>
+        <w:jc w:val="both"/>
+        <w:rPr>
+          <w:lang w:val="sr-Cyrl-RS"/>
+        </w:rPr>
+      </w:pPr>
+    </w:p>
+    <w:p>
+      <w:pPr>
+        <w:keepNext/>
+      </w:pPr>
+      <w:r>
+        <w:rPr>
+          <w:noProof/>
+          <w:lang w:val="sr-Latn-RS"/>
+        </w:rPr>
+        <w:drawing>
+          <wp:inline distT="0" distB="0" distL="0" distR="0" wp14:anchorId="3177F540" wp14:editId="242CB4CD">
+            <wp:extent cx="5274945" cy="2950210"/>
+            <wp:effectExtent l="19050" t="19050" r="20955" b="21590"/>
+            <wp:docPr id="20" name="Picture 20"/>
+            <wp:cNvGraphicFramePr>
+              <a:graphicFrameLocks xmlns:a="http://schemas.openxmlformats.org/drawingml/2006/main" noChangeAspect="1"/>
+            </wp:cNvGraphicFramePr>
+            <a:graphic xmlns:a="http://schemas.openxmlformats.org/drawingml/2006/main">
+              <a:graphicData uri="http://schemas.openxmlformats.org/drawingml/2006/picture">
+                <pic:pic xmlns:pic="http://schemas.openxmlformats.org/drawingml/2006/picture">
+                  <pic:nvPicPr>
+                    <pic:cNvPr id="20" name="Picture 20"/>
+                    <pic:cNvPicPr/>
+                  </pic:nvPicPr>
+                  <pic:blipFill>
+                    <a:blip r:embed="rId16" cstate="print">
+                      <a:extLst>
+                        <a:ext uri="{28A0092B-C50C-407E-A947-70E740481C1C}">
+                          <a14:useLocalDpi xmlns:a14="http://schemas.microsoft.com/office/drawing/2010/main" val="0"/>
+                        </a:ext>
+                      </a:extLst>
+                    </a:blip>
+                    <a:stretch>
+                      <a:fillRect/>
+                    </a:stretch>
+                  </pic:blipFill>
+                  <pic:spPr>
+                    <a:xfrm>
+                      <a:off x="0" y="0"/>
+                      <a:ext cx="5274945" cy="2950210"/>
+                    </a:xfrm>
+                    <a:prstGeom prst="rect">
+                      <a:avLst/>
+                    </a:prstGeom>
+                    <a:ln>
+                      <a:solidFill>
+                        <a:schemeClr val="tx1"/>
+                      </a:solidFill>
+                    </a:ln>
+                  </pic:spPr>
+                </pic:pic>
+              </a:graphicData>
+            </a:graphic>
+          </wp:inline>
+        </w:drawing>
+      </w:r>
+    </w:p>
+    <w:p>
+      <w:pPr>
+        <w:pStyle w:val="Caption"/>
+        <w:jc w:val="center"/>
+        <w:rPr>
+          <w:b/>
+          <w:i w:val="0"/>
+          <w:color w:val="000000" w:themeColor="text1"/>
+          <w:sz w:val="24"/>
+          <w:szCs w:val="24"/>
+          <w:lang w:val="sr-Cyrl-RS"/>
+        </w:rPr>
+      </w:pPr>
+      <w:r>
+        <w:rPr>
+          <w:b/>
+          <w:i w:val="0"/>
+          <w:color w:val="000000" w:themeColor="text1"/>
+          <w:sz w:val="24"/>
+          <w:szCs w:val="24"/>
+        </w:rPr>
+        <w:t xml:space="preserve">Слика </w:t>
+      </w:r>
+      <w:r>
+        <w:rPr>
+          <w:b/>
+          <w:i w:val="0"/>
+          <w:color w:val="000000" w:themeColor="text1"/>
+          <w:sz w:val="24"/>
+          <w:szCs w:val="24"/>
+          <w:lang w:val="sr-Cyrl-RS"/>
+        </w:rPr>
+        <w:t>4.</w:t>
+      </w:r>
+      <w:r>
+        <w:rPr>
+          <w:b/>
+          <w:i w:val="0"/>
+          <w:color w:val="000000" w:themeColor="text1"/>
+          <w:sz w:val="24"/>
+          <w:szCs w:val="24"/>
+          <w:lang w:val="sr-Cyrl-RS"/>
+        </w:rPr>
+        <w:t>1</w:t>
+      </w:r>
+      <w:r>
+        <w:rPr>
+          <w:b/>
+          <w:i w:val="0"/>
+          <w:color w:val="000000" w:themeColor="text1"/>
+          <w:sz w:val="24"/>
+          <w:szCs w:val="24"/>
+        </w:rPr>
+        <w:t xml:space="preserve">. </w:t>
+      </w:r>
+      <w:r>
+        <w:rPr>
+          <w:b/>
+          <w:i w:val="0"/>
+          <w:color w:val="000000" w:themeColor="text1"/>
+          <w:sz w:val="24"/>
+          <w:szCs w:val="24"/>
+          <w:lang w:val="sr-Cyrl-RS"/>
+        </w:rPr>
+        <w:t>Архитектура система</w:t>
+      </w:r>
+    </w:p>
+    <w:p>
+      <w:pPr>
+        <w:rPr>
+          <w:lang w:val="sr-Cyrl-RS"/>
+        </w:rPr>
+      </w:pPr>
+    </w:p>
+    <w:p>
+      <w:pPr>
+        <w:rPr>
+          <w:lang w:val="en-US"/>
+        </w:rPr>
+      </w:pPr>
+      <w:r>
+        <w:rPr>
+          <w:lang w:val="en-US"/>
+        </w:rPr>
+        <w:br w:type="page"/>
+      </w:r>
+    </w:p>
+    <w:p>
+      <w:pPr>
+        <w:rPr>
+          <w:lang w:val="en-US"/>
+        </w:rPr>
+      </w:pPr>
+    </w:p>
+    <w:p>
+      <w:pPr>
+        <w:pStyle w:val="Heading2"/>
+        <w:rPr>
+          <w:lang w:val="sr-Cyrl-RS"/>
+        </w:rPr>
+      </w:pPr>
+      <w:bookmarkStart w:id="9" w:name="_Toc209437040"/>
+      <w:r>
+        <w:rPr>
+          <w:lang w:val="sr-Cyrl-RS"/>
+        </w:rPr>
+        <w:t>4</w:t>
+      </w:r>
+      <w:r>
+        <w:t>.</w:t>
+      </w:r>
+      <w:r>
+        <w:rPr>
+          <w:lang w:val="en-US"/>
+        </w:rPr>
+        <w:t>2</w:t>
+      </w:r>
+      <w:r>
+        <w:t xml:space="preserve"> </w:t>
+      </w:r>
+      <w:r>
+        <w:rPr>
+          <w:lang w:val="sr-Cyrl-RS"/>
+        </w:rPr>
+        <w:t>Подсистем за колаборативно филтрирање</w:t>
+      </w:r>
+      <w:bookmarkEnd w:id="9"/>
+    </w:p>
+    <w:p>
+      <w:pPr>
+        <w:rPr>
+          <w:lang w:val="sr-Cyrl-RS"/>
+        </w:rPr>
+      </w:pPr>
+    </w:p>
+    <w:p>
+      <w:pPr>
+        <w:ind w:firstLine="720"/>
+        <w:jc w:val="both"/>
+        <w:rPr>
+          <w:lang w:val="sr-Cyrl-RS"/>
+        </w:rPr>
+      </w:pPr>
+      <w:r>
+        <w:rPr>
+          <w:lang w:val="sr-Cyrl-RS"/>
+        </w:rPr>
         <w:t>Скуп података који коришћен у овом подсистему је преузет са (</w:t>
       </w:r>
       <w:r>
@@ -16972,7 +17919,19 @@
         <w:rPr>
           <w:lang w:val="sr-Cyrl-RS"/>
         </w:rPr>
-        <w:t xml:space="preserve"> Списак свих фајлова, као и њихови описи, приказан је у табели 4.1.</w:t>
+        <w:t xml:space="preserve"> Списак свих фајлова, као и њихови описи, приказан је у табели 4.</w:t>
+      </w:r>
+      <w:r>
+        <w:rPr>
+          <w:lang w:val="sr-Cyrl-RS"/>
+        </w:rPr>
+        <w:t>2</w:t>
+      </w:r>
+      <w:r>
+        <w:rPr>
+          <w:lang w:val="sr-Cyrl-RS"/>
+        </w:rPr>
+        <w:t>.</w:t>
       </w:r>
     </w:p>
     <w:p>
@@ -17015,7 +17974,18 @@
           <w:szCs w:val="22"/>
           <w:lang w:val="sr-Cyrl-RS"/>
         </w:rPr>
-        <w:t>4.1</w:t>
+        <w:t>4.</w:t>
+      </w:r>
+      <w:r>
+        <w:rPr>
+          <w:b/>
+          <w:i w:val="0"/>
+          <w:color w:val="000000" w:themeColor="text1"/>
+          <w:sz w:val="22"/>
+          <w:szCs w:val="22"/>
+          <w:lang w:val="sr-Cyrl-RS"/>
+        </w:rPr>
+        <w:t>2</w:t>
       </w:r>
       <w:r>
         <w:rPr>
@@ -17133,11 +18103,11 @@
                 <w:lang w:val="sr-Cyrl-RS"/>
               </w:rPr>
             </w:pPr>
-            <w:bookmarkStart w:id="7" w:name="_Hlk207447999"/>
+            <w:bookmarkStart w:id="10" w:name="_Hlk207447999"/>
             <w:r>
               <w:t>movies_metadata.csv</w:t>
             </w:r>
-            <w:bookmarkEnd w:id="7"/>
+            <w:bookmarkEnd w:id="10"/>
           </w:p>
         </w:tc>
         <w:tc>
@@ -17791,7 +18761,18 @@
           <w:szCs w:val="22"/>
           <w:lang w:val="sr-Cyrl-RS"/>
         </w:rPr>
-        <w:t>4.2</w:t>
+        <w:t>4.</w:t>
+      </w:r>
+      <w:r>
+        <w:rPr>
+          <w:b/>
+          <w:i w:val="0"/>
+          <w:color w:val="000000" w:themeColor="text1"/>
+          <w:sz w:val="22"/>
+          <w:szCs w:val="22"/>
+          <w:lang w:val="sr-Cyrl-RS"/>
+        </w:rPr>
+        <w:t>3</w:t>
       </w:r>
       <w:r>
         <w:rPr>
@@ -19101,15 +20082,27 @@
           <w:lang w:val="sr-Cyrl-RS"/>
         </w:rPr>
       </w:pPr>
-      <w:bookmarkStart w:id="8" w:name="_Hlk207449518"/>
-      <w:r>
-        <w:rPr>
-          <w:lang w:val="sr-Cyrl-RS"/>
-        </w:rPr>
-        <w:t>Сам процес препоручивања ставки одвија се у више корака, који су приказани на слици 4.3. Сви ови кораци биће објашњени у наредним пасусима.</w:t>
-      </w:r>
-    </w:p>
-    <w:bookmarkEnd w:id="8"/>
+      <w:bookmarkStart w:id="11" w:name="_Hlk207449518"/>
+      <w:r>
+        <w:rPr>
+          <w:lang w:val="sr-Cyrl-RS"/>
+        </w:rPr>
+        <w:t>Сам процес препоручивања ставки одвија се у више корака, који су приказани на слици 4.</w:t>
+      </w:r>
+      <w:r>
+        <w:rPr>
+          <w:lang w:val="sr-Cyrl-RS"/>
+        </w:rPr>
+        <w:t>4</w:t>
+      </w:r>
+      <w:r>
+        <w:rPr>
+          <w:lang w:val="sr-Cyrl-RS"/>
+        </w:rPr>
+        <w:t>. Сви ови кораци биће објашњени у наредним пасусима.</w:t>
+      </w:r>
+    </w:p>
+    <w:bookmarkEnd w:id="11"/>
     <w:p>
       <w:pPr>
         <w:pStyle w:val="ListParagraph"/>
@@ -19141,16 +20134,9 @@
       </w:pPr>
     </w:p>
     <w:p>
-      <w:pPr>
-        <w:pStyle w:val="Heading1"/>
-      </w:pPr>
-      <w:r>
-        <w:rPr>
-          <w:noProof/>
-          <w:sz w:val="36"/>
-          <w:szCs w:val="36"/>
-          <w:lang w:val="sr-Cyrl-RS"/>
-        </w:rPr>
+      <w:bookmarkStart w:id="12" w:name="_Toc209101505"/>
+      <w:bookmarkStart w:id="13" w:name="_Toc209436773"/>
+      <w:r>
         <w:lastRenderedPageBreak/>
         <w:drawing>
           <wp:inline distT="0" distB="0" distL="0" distR="0" wp14:anchorId="39E742AA" wp14:editId="36DCD708">
@@ -19168,7 +20154,7 @@
                     <pic:cNvPicPr/>
                   </pic:nvPicPr>
                   <pic:blipFill>
-                    <a:blip r:embed="rId16"/>
+                    <a:blip r:embed="rId17"/>
                     <a:stretch>
                       <a:fillRect/>
                     </a:stretch>
@@ -19193,6 +20179,8 @@
           </wp:inline>
         </w:drawing>
       </w:r>
+      <w:bookmarkEnd w:id="12"/>
+      <w:bookmarkEnd w:id="13"/>
     </w:p>
     <w:p>
       <w:pPr>
@@ -19226,7 +20214,7 @@
           <w:szCs w:val="24"/>
           <w:lang w:val="sr-Cyrl-RS"/>
         </w:rPr>
-        <w:t>4.3</w:t>
+        <w:t>4.</w:t>
       </w:r>
       <w:r>
         <w:rPr>
@@ -19235,8 +20223,9 @@
           <w:color w:val="000000" w:themeColor="text1"/>
           <w:sz w:val="24"/>
           <w:szCs w:val="24"/>
-        </w:rPr>
-        <w:t xml:space="preserve">. </w:t>
+          <w:lang w:val="sr-Cyrl-RS"/>
+        </w:rPr>
+        <w:t>4</w:t>
       </w:r>
       <w:r>
         <w:rPr>
@@ -19245,6 +20234,16 @@
           <w:color w:val="000000" w:themeColor="text1"/>
           <w:sz w:val="24"/>
           <w:szCs w:val="24"/>
+        </w:rPr>
+        <w:t xml:space="preserve">. </w:t>
+      </w:r>
+      <w:r>
+        <w:rPr>
+          <w:b/>
+          <w:i w:val="0"/>
+          <w:color w:val="000000" w:themeColor="text1"/>
+          <w:sz w:val="24"/>
+          <w:szCs w:val="24"/>
           <w:lang w:val="sr-Cyrl-RS"/>
         </w:rPr>
         <w:t>Процес препоручивања помоћу колаборативног филтрирања</w:t>
@@ -19774,7 +20773,6 @@
       <w:pPr>
         <w:ind w:firstLine="720"/>
         <w:jc w:val="both"/>
-        <w:cnfStyle w:val="101000000000" w:firstRow="1" w:lastRow="0" w:firstColumn="1" w:lastColumn="0" w:oddVBand="0" w:evenVBand="0" w:oddHBand="0" w:evenHBand="0" w:firstRowFirstColumn="0" w:firstRowLastColumn="0" w:lastRowFirstColumn="0" w:lastRowLastColumn="0"/>
         <w:rPr>
           <w:lang w:val="en-US"/>
         </w:rPr>
@@ -19804,26 +20802,25 @@
         <w:rPr>
           <w:lang w:val="sr-Cyrl-RS"/>
         </w:rPr>
-        <w:t xml:space="preserve"> фајлу. Како би систем радио правилно, потребно </w:t>
+        <w:t xml:space="preserve"> фајлу. Како би систем радио правилно, потребно је уклонити те ИД-еве</w:t>
+      </w:r>
+      <w:r>
+        <w:rPr>
+          <w:lang w:val="sr-Cyrl-RS"/>
+        </w:rPr>
+        <w:t xml:space="preserve">. Најпре се добаве сви ИД-еви ставки које постоје у систему. </w:t>
       </w:r>
       <w:r>
         <w:rPr>
           <w:lang w:val="sr-Cyrl-RS"/>
         </w:rPr>
         <w:lastRenderedPageBreak/>
-        <w:t>је уклонити те ИД-еве</w:t>
-      </w:r>
-      <w:r>
-        <w:rPr>
-          <w:lang w:val="sr-Cyrl-RS"/>
-        </w:rPr>
-        <w:t>. Најпре се добаве сви ИД-еви ставки које постоје у систему. Потом се за сваки од очекиваних оцена проверава да ли ИД-ставке постоји у систему. Уколико не постоје, одбацују се, док остале пролазе даље.</w:t>
+        <w:t>Потом се за сваки од очекиваних оцена проверава да ли ИД-ставке постоји у систему. Уколико не постоје, одбацују се, док остале пролазе даље.</w:t>
       </w:r>
     </w:p>
     <w:p>
       <w:pPr>
         <w:jc w:val="both"/>
-        <w:cnfStyle w:val="101000000000" w:firstRow="1" w:lastRow="0" w:firstColumn="1" w:lastColumn="0" w:oddVBand="0" w:evenVBand="0" w:oddHBand="0" w:evenHBand="0" w:firstRowFirstColumn="0" w:firstRowLastColumn="0" w:lastRowFirstColumn="0" w:lastRowLastColumn="0"/>
         <w:rPr>
           <w:lang w:val="en-US"/>
         </w:rPr>
@@ -19832,7 +20829,6 @@
     <w:p>
       <w:pPr>
         <w:jc w:val="both"/>
-        <w:cnfStyle w:val="101000000000" w:firstRow="1" w:lastRow="0" w:firstColumn="1" w:lastColumn="0" w:oddVBand="0" w:evenVBand="0" w:oddHBand="0" w:evenHBand="0" w:firstRowFirstColumn="0" w:firstRowLastColumn="0" w:lastRowFirstColumn="0" w:lastRowLastColumn="0"/>
         <w:rPr>
           <w:lang w:val="sr-Cyrl-RS"/>
         </w:rPr>
@@ -19847,7 +20843,6 @@
     <w:p>
       <w:pPr>
         <w:jc w:val="both"/>
-        <w:cnfStyle w:val="101000000000" w:firstRow="1" w:lastRow="0" w:firstColumn="1" w:lastColumn="0" w:oddVBand="0" w:evenVBand="0" w:oddHBand="0" w:evenHBand="0" w:firstRowFirstColumn="0" w:firstRowLastColumn="0" w:lastRowFirstColumn="0" w:lastRowLastColumn="0"/>
         <w:rPr>
           <w:lang w:val="sr-Cyrl-RS"/>
         </w:rPr>
@@ -19856,7 +20851,6 @@
     <w:p>
       <w:pPr>
         <w:jc w:val="both"/>
-        <w:cnfStyle w:val="101000000000" w:firstRow="1" w:lastRow="0" w:firstColumn="1" w:lastColumn="0" w:oddVBand="0" w:evenVBand="0" w:oddHBand="0" w:evenHBand="0" w:firstRowFirstColumn="0" w:firstRowLastColumn="0" w:lastRowFirstColumn="0" w:lastRowLastColumn="0"/>
         <w:rPr>
           <w:lang w:val="sr-Cyrl-RS"/>
         </w:rPr>
@@ -19901,33 +20895,429 @@
     <w:p>
       <w:pPr>
         <w:jc w:val="both"/>
-        <w:cnfStyle w:val="101000000000" w:firstRow="1" w:lastRow="0" w:firstColumn="1" w:lastColumn="0" w:oddVBand="0" w:evenVBand="0" w:oddHBand="0" w:evenHBand="0" w:firstRowFirstColumn="0" w:firstRowLastColumn="0" w:lastRowFirstColumn="0" w:lastRowLastColumn="0"/>
-        <w:rPr>
-          <w:lang w:val="sr-Cyrl-RS"/>
-        </w:rPr>
-      </w:pPr>
-    </w:p>
-    <w:p>
-      <w:pPr>
+        <w:rPr>
+          <w:lang w:val="sr-Cyrl-RS"/>
+        </w:rPr>
+      </w:pPr>
+    </w:p>
+    <w:p>
+      <w:pPr>
+        <w:pStyle w:val="Heading2"/>
+        <w:rPr>
+          <w:lang w:val="sr-Cyrl-RS"/>
+        </w:rPr>
+      </w:pPr>
+      <w:bookmarkStart w:id="14" w:name="_Toc209437041"/>
+      <w:r>
+        <w:rPr>
+          <w:lang w:val="sr-Cyrl-RS"/>
+        </w:rPr>
+        <w:t>4</w:t>
+      </w:r>
+      <w:r>
+        <w:t>.</w:t>
+      </w:r>
+      <w:r>
+        <w:rPr>
+          <w:lang w:val="en-US"/>
+        </w:rPr>
+        <w:t>3</w:t>
+      </w:r>
+      <w:r>
+        <w:t xml:space="preserve"> </w:t>
+      </w:r>
+      <w:r>
+        <w:rPr>
+          <w:lang w:val="sr-Cyrl-RS"/>
+        </w:rPr>
+        <w:t>Подсистем за филтрирање</w:t>
+      </w:r>
+      <w:r>
+        <w:rPr>
+          <w:lang w:val="en-US"/>
+        </w:rPr>
+        <w:t xml:space="preserve"> </w:t>
+      </w:r>
+      <w:r>
+        <w:rPr>
+          <w:lang w:val="sr-Cyrl-RS"/>
+        </w:rPr>
+        <w:t>базираног на садржају</w:t>
+      </w:r>
+      <w:bookmarkEnd w:id="14"/>
+    </w:p>
+    <w:p>
+      <w:pPr>
+        <w:rPr>
+          <w:lang w:val="sr-Latn-RS"/>
+        </w:rPr>
+      </w:pPr>
+    </w:p>
+    <w:p>
+      <w:pPr>
+        <w:rPr>
+          <w:lang w:val="sr-Latn-RS"/>
+        </w:rPr>
+      </w:pPr>
+    </w:p>
+    <w:p>
+      <w:pPr>
+        <w:ind w:firstLine="720"/>
         <w:jc w:val="both"/>
-        <w:cnfStyle w:val="101000000000" w:firstRow="1" w:lastRow="0" w:firstColumn="1" w:lastColumn="0" w:oddVBand="0" w:evenVBand="0" w:oddHBand="0" w:evenHBand="0" w:firstRowFirstColumn="0" w:firstRowLastColumn="0" w:lastRowFirstColumn="0" w:lastRowLastColumn="0"/>
-        <w:rPr>
-          <w:lang w:val="sr-Cyrl-RS"/>
-        </w:rPr>
-      </w:pPr>
+        <w:rPr>
+          <w:lang w:val="sr-Cyrl-RS"/>
+        </w:rPr>
+      </w:pPr>
+      <w:r>
+        <w:rPr>
+          <w:lang w:val="sr-Cyrl-RS"/>
+        </w:rPr>
+        <w:t xml:space="preserve">За потребе овог подсистема коришћен је </w:t>
+      </w:r>
+      <w:r>
+        <w:t>movies_metadata</w:t>
+      </w:r>
+      <w:r>
+        <w:rPr>
+          <w:lang w:val="en-US"/>
+        </w:rPr>
+        <w:t>_small</w:t>
+      </w:r>
+      <w:r>
+        <w:t>.csv</w:t>
+      </w:r>
+      <w:r>
+        <w:rPr>
+          <w:lang w:val="sr-Cyrl-RS"/>
+        </w:rPr>
+        <w:t xml:space="preserve"> фајл. </w:t>
+      </w:r>
+      <w:r>
+        <w:rPr>
+          <w:lang w:val="sr-Cyrl-RS"/>
+        </w:rPr>
+        <w:t xml:space="preserve">Сличан је као </w:t>
+      </w:r>
+      <w:r>
+        <w:t>movies_metadata.csv</w:t>
+      </w:r>
+      <w:r>
+        <w:rPr>
+          <w:lang w:val="sr-Cyrl-RS"/>
+        </w:rPr>
+        <w:t xml:space="preserve"> фајл по структури, са тим да се у њему налази 200 филмова који су изабрани насумице из наведеног фајла.</w:t>
+      </w:r>
+      <w:r>
+        <w:rPr>
+          <w:lang w:val="en-US"/>
+        </w:rPr>
+        <w:t xml:space="preserve"> </w:t>
+      </w:r>
+      <w:r>
+        <w:rPr>
+          <w:lang w:val="sr-Cyrl-RS"/>
+        </w:rPr>
+        <w:t>Ово је учињено како не би оптерећивали ресурсе рачунара на коме је развијана ова апликација. Процес препоручивања ставки одвија се у четири корака, што је приказано на слици 4.4, а детаљи сваког од корака биће описан у наредним пасусима.</w:t>
+      </w:r>
     </w:p>
     <w:p>
       <w:pPr>
         <w:jc w:val="both"/>
-        <w:cnfStyle w:val="101000000000" w:firstRow="1" w:lastRow="0" w:firstColumn="1" w:lastColumn="0" w:oddVBand="0" w:evenVBand="0" w:oddHBand="0" w:evenHBand="0" w:firstRowFirstColumn="0" w:firstRowLastColumn="0" w:lastRowFirstColumn="0" w:lastRowLastColumn="0"/>
+        <w:rPr>
+          <w:lang w:val="sr-Latn-RS"/>
+        </w:rPr>
+      </w:pPr>
+    </w:p>
+    <w:p>
+      <w:pPr>
+        <w:keepNext/>
+        <w:jc w:val="both"/>
+      </w:pPr>
+      <w:r>
+        <w:rPr>
+          <w:noProof/>
+          <w:lang w:val="sr-Cyrl-RS"/>
+        </w:rPr>
+        <w:drawing>
+          <wp:inline distT="0" distB="0" distL="0" distR="0" wp14:anchorId="04ECB05E" wp14:editId="3F7F2A0F">
+            <wp:extent cx="5274945" cy="1325880"/>
+            <wp:effectExtent l="19050" t="19050" r="20955" b="26670"/>
+            <wp:docPr id="24" name="Picture 24"/>
+            <wp:cNvGraphicFramePr>
+              <a:graphicFrameLocks xmlns:a="http://schemas.openxmlformats.org/drawingml/2006/main" noChangeAspect="1"/>
+            </wp:cNvGraphicFramePr>
+            <a:graphic xmlns:a="http://schemas.openxmlformats.org/drawingml/2006/main">
+              <a:graphicData uri="http://schemas.openxmlformats.org/drawingml/2006/picture">
+                <pic:pic xmlns:pic="http://schemas.openxmlformats.org/drawingml/2006/picture">
+                  <pic:nvPicPr>
+                    <pic:cNvPr id="1" name=""/>
+                    <pic:cNvPicPr/>
+                  </pic:nvPicPr>
+                  <pic:blipFill>
+                    <a:blip r:embed="rId18"/>
+                    <a:stretch>
+                      <a:fillRect/>
+                    </a:stretch>
+                  </pic:blipFill>
+                  <pic:spPr>
+                    <a:xfrm>
+                      <a:off x="0" y="0"/>
+                      <a:ext cx="5274945" cy="1325880"/>
+                    </a:xfrm>
+                    <a:prstGeom prst="rect">
+                      <a:avLst/>
+                    </a:prstGeom>
+                    <a:ln>
+                      <a:solidFill>
+                        <a:schemeClr val="tx1"/>
+                      </a:solidFill>
+                    </a:ln>
+                  </pic:spPr>
+                </pic:pic>
+              </a:graphicData>
+            </a:graphic>
+          </wp:inline>
+        </w:drawing>
+      </w:r>
+    </w:p>
+    <w:p>
+      <w:pPr>
+        <w:pStyle w:val="Caption"/>
+        <w:jc w:val="center"/>
+        <w:rPr>
+          <w:b/>
+          <w:i w:val="0"/>
+          <w:color w:val="000000" w:themeColor="text1"/>
+          <w:sz w:val="24"/>
+          <w:szCs w:val="24"/>
+          <w:lang w:val="sr-Cyrl-RS"/>
+        </w:rPr>
+      </w:pPr>
+      <w:r>
+        <w:rPr>
+          <w:b/>
+          <w:i w:val="0"/>
+          <w:color w:val="000000" w:themeColor="text1"/>
+          <w:sz w:val="24"/>
+          <w:szCs w:val="24"/>
+        </w:rPr>
+        <w:t xml:space="preserve">Слика </w:t>
+      </w:r>
+      <w:r>
+        <w:rPr>
+          <w:b/>
+          <w:i w:val="0"/>
+          <w:color w:val="000000" w:themeColor="text1"/>
+          <w:sz w:val="24"/>
+          <w:szCs w:val="24"/>
+          <w:lang w:val="sr-Cyrl-RS"/>
+        </w:rPr>
+        <w:t>4.</w:t>
+      </w:r>
+      <w:r>
+        <w:rPr>
+          <w:b/>
+          <w:i w:val="0"/>
+          <w:color w:val="000000" w:themeColor="text1"/>
+          <w:sz w:val="24"/>
+          <w:szCs w:val="24"/>
+          <w:lang w:val="sr-Cyrl-RS"/>
+        </w:rPr>
+        <w:t>5</w:t>
+      </w:r>
+      <w:r>
+        <w:rPr>
+          <w:b/>
+          <w:i w:val="0"/>
+          <w:color w:val="000000" w:themeColor="text1"/>
+          <w:sz w:val="24"/>
+          <w:szCs w:val="24"/>
+        </w:rPr>
+        <w:t xml:space="preserve">. </w:t>
+      </w:r>
+      <w:r>
+        <w:rPr>
+          <w:b/>
+          <w:i w:val="0"/>
+          <w:color w:val="000000" w:themeColor="text1"/>
+          <w:sz w:val="24"/>
+          <w:szCs w:val="24"/>
+          <w:lang w:val="sr-Cyrl-RS"/>
+        </w:rPr>
+        <w:t>Процес препоручивања помоћу филтрирања базираног на садржају</w:t>
+      </w:r>
+    </w:p>
+    <w:p>
+      <w:pPr>
+        <w:rPr>
+          <w:lang w:val="sr-Cyrl-RS"/>
+        </w:rPr>
+      </w:pPr>
+    </w:p>
+    <w:p>
+      <w:pPr>
+        <w:ind w:firstLine="720"/>
+        <w:jc w:val="both"/>
+        <w:rPr>
+          <w:lang w:val="sr-Cyrl-RS"/>
+        </w:rPr>
+      </w:pPr>
+      <w:r>
+        <w:rPr>
+          <w:lang w:val="sr-Cyrl-RS"/>
+        </w:rPr>
+        <w:t xml:space="preserve">У првом кораку, потребно је векторизовати улазно питање које је корисник поставио. За потребе овог корака употребљена је класа </w:t>
+      </w:r>
+      <w:r>
         <w:rPr>
           <w:lang w:val="en-US"/>
         </w:rPr>
-      </w:pPr>
-    </w:p>
-    <w:p>
-      <w:pPr>
+        <w:t xml:space="preserve">OllamaEmbedings </w:t>
+      </w:r>
+      <w:r>
+        <w:rPr>
+          <w:lang w:val="sr-Cyrl-RS"/>
+        </w:rPr>
+        <w:t xml:space="preserve">из библиотеке </w:t>
+      </w:r>
+      <w:r>
+        <w:rPr>
+          <w:lang w:val="sr-Latn-RS"/>
+        </w:rPr>
+        <w:t>langchain_ollama</w:t>
+      </w:r>
+      <w:r>
+        <w:rPr>
+          <w:lang w:val="sr-Cyrl-RS"/>
+        </w:rPr>
+        <w:t xml:space="preserve"> за Пајтон програмски језик. </w:t>
+      </w:r>
+      <w:r>
+        <w:rPr>
+          <w:lang w:val="sr-Cyrl-RS"/>
+        </w:rPr>
+        <w:t xml:space="preserve">Векторизација самог текста се извршава позивом методе </w:t>
+      </w:r>
+      <w:r>
+        <w:rPr>
+          <w:lang w:val="sr-Latn-RS"/>
+        </w:rPr>
+        <w:t>embed_query</w:t>
+      </w:r>
+      <w:r>
+        <w:rPr>
+          <w:lang w:val="sr-Cyrl-RS"/>
+        </w:rPr>
+        <w:t xml:space="preserve"> из </w:t>
+      </w:r>
+      <w:r>
+        <w:rPr>
+          <w:lang w:val="en-US"/>
+        </w:rPr>
+        <w:t>OllamaEmbedings</w:t>
+      </w:r>
+      <w:r>
+        <w:rPr>
+          <w:lang w:val="sr-Cyrl-RS"/>
+        </w:rPr>
+        <w:t xml:space="preserve"> класе.</w:t>
+      </w:r>
+    </w:p>
+    <w:p>
+      <w:pPr>
+        <w:ind w:firstLine="720"/>
         <w:jc w:val="both"/>
+        <w:rPr>
+          <w:lang w:val="sr-Cyrl-RS"/>
+        </w:rPr>
+      </w:pPr>
+    </w:p>
+    <w:p>
+      <w:pPr>
+        <w:ind w:firstLine="720"/>
+        <w:jc w:val="both"/>
+        <w:rPr>
+          <w:lang w:val="sr-Cyrl-RS"/>
+        </w:rPr>
+      </w:pPr>
+    </w:p>
+    <w:p>
+      <w:pPr>
+        <w:jc w:val="both"/>
+        <w:rPr>
+          <w:lang w:val="sr-Cyrl-RS"/>
+        </w:rPr>
+      </w:pPr>
+      <w:r>
+        <w:rPr>
+          <w:lang w:val="sr-Cyrl-RS"/>
+        </w:rPr>
+        <w:lastRenderedPageBreak/>
+        <w:t xml:space="preserve"> </w:t>
+      </w:r>
+      <w:r>
+        <w:rPr>
+          <w:lang w:val="sr-Cyrl-RS"/>
+        </w:rPr>
+        <w:tab/>
+      </w:r>
+      <w:r>
+        <w:rPr>
+          <w:lang w:val="sr-Cyrl-RS"/>
+        </w:rPr>
+        <w:t xml:space="preserve">У другом кораку је потребно наћи најближе суседе на основу добијеног вектора. Ово се ради помоћу </w:t>
+      </w:r>
+      <w:r>
+        <w:rPr>
+          <w:lang w:val="en-US"/>
+        </w:rPr>
+        <w:t xml:space="preserve">KNN </w:t>
+      </w:r>
+      <w:r>
+        <w:rPr>
+          <w:lang w:val="sr-Cyrl-RS"/>
+        </w:rPr>
+        <w:t>алгоритма који је трениран над 200 вектора добијених из векторске базе синопсиса филмова. Као резултат добијају се 20 индекса, односно редних бројева по којима су се филмови нашли у скупу података.</w:t>
+      </w:r>
+    </w:p>
+    <w:p>
+      <w:pPr>
+        <w:jc w:val="both"/>
+        <w:rPr>
+          <w:lang w:val="sr-Cyrl-RS"/>
+        </w:rPr>
+      </w:pPr>
+    </w:p>
+    <w:p>
+      <w:pPr>
+        <w:jc w:val="both"/>
+        <w:rPr>
+          <w:lang w:val="sr-Cyrl-RS"/>
+        </w:rPr>
+      </w:pPr>
+      <w:r>
+        <w:rPr>
+          <w:lang w:val="sr-Cyrl-RS"/>
+        </w:rPr>
+        <w:tab/>
+        <w:t xml:space="preserve">У трећем кораку, потребно је учитати скуп података из којих би се извукле ставке. Као последњи корак, на основу индекса бирају се ставке које ће се приказати  кориснику. Као и у претходном подсистему, бирају се следеће колоне: </w:t>
+      </w:r>
+      <w:r>
+        <w:rPr>
+          <w:lang w:val="sr-Cyrl-RS"/>
+        </w:rPr>
+        <w:t>id, imdb_id, title, genres, original_title, original_language, overview, vote_average, spoken_languages</w:t>
+      </w:r>
+      <w:r>
+        <w:rPr>
+          <w:lang w:val="sr-Cyrl-RS"/>
+        </w:rPr>
+        <w:t>.</w:t>
+      </w:r>
+    </w:p>
+    <w:p>
+      <w:pPr>
+        <w:pStyle w:val="Heading1"/>
         <w:rPr>
           <w:lang w:val="sr-Cyrl-RS"/>
         </w:rPr>
@@ -19940,15 +21330,12 @@
         </w:rPr>
         <w:br w:type="page"/>
       </w:r>
-      <w:r>
-        <w:rPr>
-          <w:sz w:val="40"/>
-          <w:szCs w:val="40"/>
-          <w:lang w:val="sr-Cyrl-RS"/>
-        </w:rPr>
+      <w:bookmarkStart w:id="15" w:name="_Toc209437042"/>
+      <w:r>
         <w:lastRenderedPageBreak/>
         <w:t>5. Верификација и валидација система</w:t>
       </w:r>
+      <w:bookmarkEnd w:id="15"/>
     </w:p>
     <w:p>
       <w:pPr>
@@ -19957,6 +21344,7 @@
           <w:lang w:val="sr-Cyrl-RS"/>
         </w:rPr>
       </w:pPr>
+      <w:bookmarkStart w:id="16" w:name="_Toc209437043"/>
       <w:r>
         <w:rPr>
           <w:lang w:val="sr-Cyrl-RS"/>
@@ -19981,6 +21369,7 @@
         </w:rPr>
         <w:t>Верификација колаборативног филтрирања</w:t>
       </w:r>
+      <w:bookmarkEnd w:id="16"/>
     </w:p>
     <w:p>
       <w:pPr>
@@ -22134,7 +23523,7 @@
         </w:rPr>
         <w:lastRenderedPageBreak/>
         <w:drawing>
-          <wp:inline distT="0" distB="0" distL="0" distR="0" wp14:anchorId="7D5AF9AF" wp14:editId="12961A21">
+          <wp:inline distT="0" distB="0" distL="0" distR="0" wp14:anchorId="7D5AF9AF" wp14:editId="59095CC3">
             <wp:extent cx="5275660" cy="3185160"/>
             <wp:effectExtent l="0" t="0" r="1270" b="0"/>
             <wp:docPr id="7" name="Picture 7"/>
@@ -22149,7 +23538,7 @@
                     <pic:cNvPicPr/>
                   </pic:nvPicPr>
                   <pic:blipFill>
-                    <a:blip r:embed="rId17" cstate="print">
+                    <a:blip r:embed="rId19" cstate="print">
                       <a:extLst>
                         <a:ext uri="{28A0092B-C50C-407E-A947-70E740481C1C}">
                           <a14:useLocalDpi xmlns:a14="http://schemas.microsoft.com/office/drawing/2010/main" val="0"/>
@@ -22399,7 +23788,7 @@
           <w:lang w:val="sr-Cyrl-RS"/>
         </w:rPr>
         <w:drawing>
-          <wp:inline distT="0" distB="0" distL="0" distR="0" wp14:anchorId="75622322" wp14:editId="2F8B6B0A">
+          <wp:inline distT="0" distB="0" distL="0" distR="0" wp14:anchorId="75622322" wp14:editId="68E5F588">
             <wp:extent cx="5287819" cy="2820170"/>
             <wp:effectExtent l="0" t="0" r="8255" b="0"/>
             <wp:docPr id="9" name="Picture 9"/>
@@ -22414,7 +23803,7 @@
                     <pic:cNvPicPr/>
                   </pic:nvPicPr>
                   <pic:blipFill>
-                    <a:blip r:embed="rId18" cstate="print">
+                    <a:blip r:embed="rId20" cstate="print">
                       <a:extLst>
                         <a:ext uri="{28A0092B-C50C-407E-A947-70E740481C1C}">
                           <a14:useLocalDpi xmlns:a14="http://schemas.microsoft.com/office/drawing/2010/main" val="0"/>
@@ -22624,7 +24013,7 @@
           <w:lang w:val="sr-Cyrl-RS"/>
         </w:rPr>
         <w:drawing>
-          <wp:inline distT="0" distB="0" distL="0" distR="0" wp14:anchorId="5685312B" wp14:editId="5ECE687D">
+          <wp:inline distT="0" distB="0" distL="0" distR="0" wp14:anchorId="5685312B" wp14:editId="3D36584A">
             <wp:extent cx="5165092" cy="2754716"/>
             <wp:effectExtent l="0" t="0" r="0" b="7620"/>
             <wp:docPr id="6" name="Picture 6"/>
@@ -22639,7 +24028,7 @@
                     <pic:cNvPicPr/>
                   </pic:nvPicPr>
                   <pic:blipFill>
-                    <a:blip r:embed="rId19" cstate="print">
+                    <a:blip r:embed="rId21" cstate="print">
                       <a:extLst>
                         <a:ext uri="{28A0092B-C50C-407E-A947-70E740481C1C}">
                           <a14:useLocalDpi xmlns:a14="http://schemas.microsoft.com/office/drawing/2010/main" val="0"/>
@@ -22922,7 +24311,7 @@
           <w:lang w:val="sr-Cyrl-RS"/>
         </w:rPr>
         <w:drawing>
-          <wp:inline distT="0" distB="0" distL="0" distR="0" wp14:anchorId="28785063" wp14:editId="61499462">
+          <wp:inline distT="0" distB="0" distL="0" distR="0" wp14:anchorId="28785063" wp14:editId="65D1D070">
             <wp:extent cx="5294493" cy="2823730"/>
             <wp:effectExtent l="0" t="0" r="1905" b="0"/>
             <wp:docPr id="8" name="Picture 8"/>
@@ -22937,7 +24326,7 @@
                     <pic:cNvPicPr/>
                   </pic:nvPicPr>
                   <pic:blipFill>
-                    <a:blip r:embed="rId20" cstate="print">
+                    <a:blip r:embed="rId22" cstate="print">
                       <a:extLst>
                         <a:ext uri="{28A0092B-C50C-407E-A947-70E740481C1C}">
                           <a14:useLocalDpi xmlns:a14="http://schemas.microsoft.com/office/drawing/2010/main" val="0"/>
@@ -23419,7 +24808,7 @@
                     <pic:cNvPicPr/>
                   </pic:nvPicPr>
                   <pic:blipFill>
-                    <a:blip r:embed="rId21"/>
+                    <a:blip r:embed="rId23"/>
                     <a:stretch>
                       <a:fillRect/>
                     </a:stretch>
@@ -23984,7 +25373,7 @@
                 <w:lang w:val="sr-Cyrl-RS"/>
               </w:rPr>
             </w:pPr>
-            <w:bookmarkStart w:id="9" w:name="_Hlk200292756"/>
+            <w:bookmarkStart w:id="17" w:name="_Hlk200292756"/>
             <w:r>
               <w:rPr>
                 <w:rFonts w:cs="Times New Roman"/>
@@ -24017,7 +25406,7 @@
           </w:p>
         </w:tc>
       </w:tr>
-      <w:bookmarkEnd w:id="9"/>
+      <w:bookmarkEnd w:id="17"/>
       <w:tr>
         <w:tc>
           <w:tcPr>
@@ -24261,7 +25650,7 @@
           <w:lang w:val="sr-Cyrl-RS"/>
         </w:rPr>
       </w:pPr>
-      <w:bookmarkStart w:id="10" w:name="_Hlk205806821"/>
+      <w:bookmarkStart w:id="18" w:name="_Hlk205806821"/>
       <w:r>
         <w:rPr>
           <w:rFonts w:cs="Times New Roman"/>
@@ -24382,7 +25771,7 @@
         <w:t xml:space="preserve">износи 76,5%, што и није лош резултат. </w:t>
       </w:r>
     </w:p>
-    <w:bookmarkEnd w:id="10"/>
+    <w:bookmarkEnd w:id="18"/>
     <w:p>
       <w:pPr>
         <w:jc w:val="both"/>
@@ -24419,7 +25808,7 @@
                     <pic:cNvPicPr/>
                   </pic:nvPicPr>
                   <pic:blipFill>
-                    <a:blip r:embed="rId22"/>
+                    <a:blip r:embed="rId24"/>
                     <a:stretch>
                       <a:fillRect/>
                     </a:stretch>
@@ -24535,6 +25924,7 @@
           <w:lang w:val="sr-Cyrl-RS"/>
         </w:rPr>
       </w:pPr>
+      <w:bookmarkStart w:id="19" w:name="_Toc209437044"/>
       <w:r>
         <w:rPr>
           <w:lang w:val="sr-Cyrl-RS"/>
@@ -24559,6 +25949,7 @@
         </w:rPr>
         <w:t>Верификација филтрирања базираног на садржају</w:t>
       </w:r>
+      <w:bookmarkEnd w:id="19"/>
     </w:p>
     <w:p>
       <w:pPr>
@@ -24612,7 +26003,7 @@
                     <pic:cNvPicPr/>
                   </pic:nvPicPr>
                   <pic:blipFill>
-                    <a:blip r:embed="rId23" cstate="print">
+                    <a:blip r:embed="rId25" cstate="print">
                       <a:extLst>
                         <a:ext uri="{28A0092B-C50C-407E-A947-70E740481C1C}">
                           <a14:useLocalDpi xmlns:a14="http://schemas.microsoft.com/office/drawing/2010/main" val="0"/>
@@ -24696,7 +26087,7 @@
         </w:rPr>
         <w:t xml:space="preserve">Резултати тестирања са различитим метрикама за модел </w:t>
       </w:r>
-      <w:bookmarkStart w:id="11" w:name="_Hlk205810646"/>
+      <w:bookmarkStart w:id="20" w:name="_Hlk205810646"/>
       <w:r>
         <w:rPr>
           <w:b/>
@@ -24708,7 +26099,7 @@
         </w:rPr>
         <w:t>granite3.3</w:t>
       </w:r>
-      <w:bookmarkEnd w:id="11"/>
+      <w:bookmarkEnd w:id="20"/>
     </w:p>
     <w:p>
       <w:pPr>
@@ -24834,7 +26225,7 @@
                     <pic:cNvPicPr/>
                   </pic:nvPicPr>
                   <pic:blipFill>
-                    <a:blip r:embed="rId24" cstate="print">
+                    <a:blip r:embed="rId26" cstate="print">
                       <a:extLst>
                         <a:ext uri="{28A0092B-C50C-407E-A947-70E740481C1C}">
                           <a14:useLocalDpi xmlns:a14="http://schemas.microsoft.com/office/drawing/2010/main" val="0"/>
@@ -25029,7 +26420,7 @@
                     <pic:cNvPicPr/>
                   </pic:nvPicPr>
                   <pic:blipFill>
-                    <a:blip r:embed="rId25" cstate="print">
+                    <a:blip r:embed="rId27" cstate="print">
                       <a:extLst>
                         <a:ext uri="{28A0092B-C50C-407E-A947-70E740481C1C}">
                           <a14:useLocalDpi xmlns:a14="http://schemas.microsoft.com/office/drawing/2010/main" val="0"/>
@@ -25152,7 +26543,7 @@
                     <pic:cNvPicPr/>
                   </pic:nvPicPr>
                   <pic:blipFill>
-                    <a:blip r:embed="rId26" cstate="print">
+                    <a:blip r:embed="rId28" cstate="print">
                       <a:extLst>
                         <a:ext uri="{28A0092B-C50C-407E-A947-70E740481C1C}">
                           <a14:useLocalDpi xmlns:a14="http://schemas.microsoft.com/office/drawing/2010/main" val="0"/>
@@ -25350,7 +26741,7 @@
                     <pic:cNvPicPr/>
                   </pic:nvPicPr>
                   <pic:blipFill>
-                    <a:blip r:embed="rId27" cstate="print">
+                    <a:blip r:embed="rId29" cstate="print">
                       <a:extLst>
                         <a:ext uri="{28A0092B-C50C-407E-A947-70E740481C1C}">
                           <a14:useLocalDpi xmlns:a14="http://schemas.microsoft.com/office/drawing/2010/main" val="0"/>
@@ -25532,7 +26923,7 @@
                     <pic:cNvPicPr/>
                   </pic:nvPicPr>
                   <pic:blipFill>
-                    <a:blip r:embed="rId28" cstate="print">
+                    <a:blip r:embed="rId30" cstate="print">
                       <a:extLst>
                         <a:ext uri="{28A0092B-C50C-407E-A947-70E740481C1C}">
                           <a14:useLocalDpi xmlns:a14="http://schemas.microsoft.com/office/drawing/2010/main" val="0"/>
@@ -25709,7 +27100,7 @@
                     <pic:cNvPicPr/>
                   </pic:nvPicPr>
                   <pic:blipFill>
-                    <a:blip r:embed="rId29" cstate="print">
+                    <a:blip r:embed="rId31" cstate="print">
                       <a:extLst>
                         <a:ext uri="{28A0092B-C50C-407E-A947-70E740481C1C}">
                           <a14:useLocalDpi xmlns:a14="http://schemas.microsoft.com/office/drawing/2010/main" val="0"/>
@@ -25855,7 +27246,7 @@
           <w:lang w:val="sr-Cyrl-RS"/>
         </w:rPr>
       </w:pPr>
-      <w:bookmarkStart w:id="12" w:name="_Hlk206429054"/>
+      <w:bookmarkStart w:id="21" w:name="_Hlk206429054"/>
       <w:r>
         <w:rPr>
           <w:lang w:val="sr-Cyrl-RS"/>
@@ -25864,7 +27255,7 @@
         <w:t xml:space="preserve">У поменутом случају, пронађени филмови су у просеку били рангирани на четвртом месту.  </w:t>
       </w:r>
     </w:p>
-    <w:bookmarkEnd w:id="12"/>
+    <w:bookmarkEnd w:id="21"/>
     <w:p>
       <w:pPr>
         <w:keepNext/>
@@ -25891,7 +27282,7 @@
                     <pic:cNvPicPr/>
                   </pic:nvPicPr>
                   <pic:blipFill>
-                    <a:blip r:embed="rId30" cstate="print">
+                    <a:blip r:embed="rId32" cstate="print">
                       <a:extLst>
                         <a:ext uri="{28A0092B-C50C-407E-A947-70E740481C1C}">
                           <a14:useLocalDpi xmlns:a14="http://schemas.microsoft.com/office/drawing/2010/main" val="0"/>
@@ -26493,14 +27884,14 @@
           <w:lang w:val="sr-Cyrl-RS"/>
         </w:rPr>
       </w:pPr>
-      <w:bookmarkStart w:id="13" w:name="_Toc188802044"/>
+      <w:bookmarkStart w:id="22" w:name="_Toc209437045"/>
       <w:r>
         <w:rPr>
           <w:lang w:val="sr-Cyrl-RS"/>
         </w:rPr>
         <w:t>Литература</w:t>
       </w:r>
-      <w:bookmarkEnd w:id="13"/>
+      <w:bookmarkEnd w:id="22"/>
     </w:p>
     <w:p>
       <w:pPr>
@@ -26547,7 +27938,7 @@
         </w:rPr>
         <w:tab/>
       </w:r>
-      <w:hyperlink r:id="rId31" w:history="1">
+      <w:hyperlink r:id="rId33" w:history="1">
         <w:r>
           <w:rPr>
             <w:rStyle w:val="Hyperlink"/>
@@ -26589,7 +27980,7 @@
         </w:rPr>
         <w:t xml:space="preserve"> – Преузето са </w:t>
       </w:r>
-      <w:hyperlink r:id="rId32" w:history="1">
+      <w:hyperlink r:id="rId34" w:history="1">
         <w:r>
           <w:rPr>
             <w:rStyle w:val="Hyperlink"/>
@@ -26637,7 +28028,7 @@
         </w:rPr>
         <w:t xml:space="preserve">2022). </w:t>
       </w:r>
-      <w:hyperlink r:id="rId33" w:history="1">
+      <w:hyperlink r:id="rId35" w:history="1">
         <w:r>
           <w:rPr>
             <w:rStyle w:val="Hyperlink"/>
@@ -26748,7 +28139,7 @@
         </w:rPr>
         <w:t xml:space="preserve">Преузето са </w:t>
       </w:r>
-      <w:hyperlink r:id="rId34" w:history="1">
+      <w:hyperlink r:id="rId36" w:history="1">
         <w:r>
           <w:rPr>
             <w:rStyle w:val="Hyperlink"/>
@@ -26859,7 +28250,7 @@
         </w:rPr>
         <w:t xml:space="preserve"> </w:t>
       </w:r>
-      <w:hyperlink r:id="rId35" w:history="1">
+      <w:hyperlink r:id="rId37" w:history="1">
         <w:r>
           <w:rPr>
             <w:rStyle w:val="Hyperlink"/>
@@ -26959,7 +28350,7 @@
         </w:rPr>
         <w:t xml:space="preserve">, 2024 – Преузето са </w:t>
       </w:r>
-      <w:hyperlink r:id="rId36" w:anchor="f01" w:history="1">
+      <w:hyperlink r:id="rId38" w:anchor="f01" w:history="1">
         <w:r>
           <w:rPr>
             <w:rStyle w:val="Hyperlink"/>
@@ -26994,7 +28385,7 @@
         </w:rPr>
         <w:t xml:space="preserve">, 2025 – преузето са </w:t>
       </w:r>
-      <w:hyperlink r:id="rId37" w:history="1">
+      <w:hyperlink r:id="rId39" w:history="1">
         <w:r>
           <w:rPr>
             <w:rStyle w:val="Hyperlink"/>
@@ -27029,7 +28420,7 @@
         </w:rPr>
         <w:t xml:space="preserve">, 2024 – преузето са </w:t>
       </w:r>
-      <w:hyperlink r:id="rId38" w:history="1">
+      <w:hyperlink r:id="rId40" w:history="1">
         <w:r>
           <w:rPr>
             <w:rStyle w:val="Hyperlink"/>
@@ -27071,7 +28462,7 @@
         </w:rPr>
         <w:t xml:space="preserve">преузето са </w:t>
       </w:r>
-      <w:hyperlink r:id="rId39" w:history="1">
+      <w:hyperlink r:id="rId41" w:history="1">
         <w:r>
           <w:rPr>
             <w:rStyle w:val="Hyperlink"/>
@@ -27107,7 +28498,7 @@
         </w:rPr>
         <w:t xml:space="preserve">, 2021 – преузето са </w:t>
       </w:r>
-      <w:hyperlink r:id="rId40" w:history="1">
+      <w:hyperlink r:id="rId42" w:history="1">
         <w:r>
           <w:rPr>
             <w:rStyle w:val="Hyperlink"/>
@@ -27143,7 +28534,7 @@
         </w:rPr>
         <w:t xml:space="preserve">, - преузето са </w:t>
       </w:r>
-      <w:hyperlink r:id="rId41" w:anchor="fraction-of-concordant-pairs-fcp" w:history="1">
+      <w:hyperlink r:id="rId43" w:anchor="fraction-of-concordant-pairs-fcp" w:history="1">
         <w:r>
           <w:rPr>
             <w:rStyle w:val="Hyperlink"/>
@@ -27199,7 +28590,7 @@
         </w:rPr>
         <w:t xml:space="preserve">, 2017 - </w:t>
       </w:r>
-      <w:hyperlink r:id="rId42" w:history="1">
+      <w:hyperlink r:id="rId44" w:history="1">
         <w:r>
           <w:rPr>
             <w:rStyle w:val="Hyperlink"/>
@@ -27234,7 +28625,7 @@
         </w:rPr>
         <w:t xml:space="preserve">, 2015 - </w:t>
       </w:r>
-      <w:hyperlink r:id="rId43" w:anchor="what-are-raw-and-inner-ids" w:history="1">
+      <w:hyperlink r:id="rId45" w:anchor="what-are-raw-and-inner-ids" w:history="1">
         <w:r>
           <w:rPr>
             <w:rStyle w:val="Hyperlink"/>
@@ -27310,7 +28701,7 @@
       </w:pPr>
     </w:p>
     <w:sectPr>
-      <w:headerReference w:type="first" r:id="rId44"/>
+      <w:headerReference w:type="first" r:id="rId46"/>
       <w:pgSz w:w="11907" w:h="16840" w:code="9"/>
       <w:pgMar w:top="1440" w:right="1800" w:bottom="1440" w:left="1800" w:header="567" w:footer="567" w:gutter="0"/>
       <w:pgNumType w:start="1"/>
@@ -29159,7 +30550,7 @@
   </w:latentStyles>
   <w:style w:type="paragraph" w:default="1" w:styleId="Normal">
     <w:name w:val="Normal"/>
-    <w:rsid w:val="00B1007F"/>
+    <w:rsid w:val="00C666DA"/>
   </w:style>
   <w:style w:type="paragraph" w:styleId="Heading1">
     <w:name w:val="heading 1"/>
@@ -29265,6 +30656,7 @@
   <w:style w:type="character" w:default="1" w:styleId="DefaultParagraphFont">
     <w:name w:val="Default Paragraph Font"/>
     <w:uiPriority w:val="1"/>
+    <w:semiHidden/>
     <w:unhideWhenUsed/>
   </w:style>
   <w:style w:type="table" w:default="1" w:styleId="TableNormal">

</xml_diff>

<commit_message>
Updated chapter 5 with few more paragraphs
</commit_message>
<xml_diff>
--- a/thesis/Дипломски рад.docx
+++ b/thesis/Дипломски рад.docx
@@ -6283,7 +6283,7 @@
             </w:rPr>
             <w:fldChar w:fldCharType="separate"/>
           </w:r>
-          <w:hyperlink w:anchor="_Toc210125422" w:history="1">
+          <w:hyperlink w:anchor="_Toc210313123" w:history="1">
             <w:r>
               <w:rPr>
                 <w:rStyle w:val="Hyperlink"/>
@@ -6318,7 +6318,7 @@
                 <w:noProof/>
                 <w:webHidden/>
               </w:rPr>
-              <w:instrText xml:space="preserve"> PAGEREF _Toc210125422 \h </w:instrText>
+              <w:instrText xml:space="preserve"> PAGEREF _Toc210313123 \h </w:instrText>
             </w:r>
             <w:r>
               <w:rPr>
@@ -6363,7 +6363,7 @@
               <w14:ligatures w14:val="standardContextual"/>
             </w:rPr>
           </w:pPr>
-          <w:hyperlink w:anchor="_Toc210125423" w:history="1">
+          <w:hyperlink w:anchor="_Toc210313124" w:history="1">
             <w:r>
               <w:rPr>
                 <w:rStyle w:val="Hyperlink"/>
@@ -6413,7 +6413,7 @@
                 <w:noProof/>
                 <w:webHidden/>
               </w:rPr>
-              <w:instrText xml:space="preserve"> PAGEREF _Toc210125423 \h </w:instrText>
+              <w:instrText xml:space="preserve"> PAGEREF _Toc210313124 \h </w:instrText>
             </w:r>
             <w:r>
               <w:rPr>
@@ -6458,7 +6458,7 @@
               <w14:ligatures w14:val="standardContextual"/>
             </w:rPr>
           </w:pPr>
-          <w:hyperlink w:anchor="_Toc210125424" w:history="1">
+          <w:hyperlink w:anchor="_Toc210313125" w:history="1">
             <w:r>
               <w:rPr>
                 <w:rStyle w:val="Hyperlink"/>
@@ -6508,7 +6508,7 @@
                 <w:noProof/>
                 <w:webHidden/>
               </w:rPr>
-              <w:instrText xml:space="preserve"> PAGEREF _Toc210125424 \h </w:instrText>
+              <w:instrText xml:space="preserve"> PAGEREF _Toc210313125 \h </w:instrText>
             </w:r>
             <w:r>
               <w:rPr>
@@ -6553,7 +6553,7 @@
               <w14:ligatures w14:val="standardContextual"/>
             </w:rPr>
           </w:pPr>
-          <w:hyperlink w:anchor="_Toc210125425" w:history="1">
+          <w:hyperlink w:anchor="_Toc210313126" w:history="1">
             <w:r>
               <w:rPr>
                 <w:rStyle w:val="Hyperlink"/>
@@ -6611,7 +6611,7 @@
                 <w:noProof/>
                 <w:webHidden/>
               </w:rPr>
-              <w:instrText xml:space="preserve"> PAGEREF _Toc210125425 \h </w:instrText>
+              <w:instrText xml:space="preserve"> PAGEREF _Toc210313126 \h </w:instrText>
             </w:r>
             <w:r>
               <w:rPr>
@@ -6656,7 +6656,7 @@
               <w14:ligatures w14:val="standardContextual"/>
             </w:rPr>
           </w:pPr>
-          <w:hyperlink w:anchor="_Toc210125426" w:history="1">
+          <w:hyperlink w:anchor="_Toc210313127" w:history="1">
             <w:r>
               <w:rPr>
                 <w:rStyle w:val="Hyperlink"/>
@@ -6706,7 +6706,7 @@
                 <w:noProof/>
                 <w:webHidden/>
               </w:rPr>
-              <w:instrText xml:space="preserve"> PAGEREF _Toc210125426 \h </w:instrText>
+              <w:instrText xml:space="preserve"> PAGEREF _Toc210313127 \h </w:instrText>
             </w:r>
             <w:r>
               <w:rPr>
@@ -6751,7 +6751,7 @@
               <w14:ligatures w14:val="standardContextual"/>
             </w:rPr>
           </w:pPr>
-          <w:hyperlink w:anchor="_Toc210125427" w:history="1">
+          <w:hyperlink w:anchor="_Toc210313128" w:history="1">
             <w:r>
               <w:rPr>
                 <w:rStyle w:val="Hyperlink"/>
@@ -6801,7 +6801,7 @@
                 <w:noProof/>
                 <w:webHidden/>
               </w:rPr>
-              <w:instrText xml:space="preserve"> PAGEREF _Toc210125427 \h </w:instrText>
+              <w:instrText xml:space="preserve"> PAGEREF _Toc210313128 \h </w:instrText>
             </w:r>
             <w:r>
               <w:rPr>
@@ -6846,7 +6846,7 @@
               <w14:ligatures w14:val="standardContextual"/>
             </w:rPr>
           </w:pPr>
-          <w:hyperlink w:anchor="_Toc210125428" w:history="1">
+          <w:hyperlink w:anchor="_Toc210313129" w:history="1">
             <w:r>
               <w:rPr>
                 <w:rStyle w:val="Hyperlink"/>
@@ -6904,7 +6904,7 @@
                 <w:noProof/>
                 <w:webHidden/>
               </w:rPr>
-              <w:instrText xml:space="preserve"> PAGEREF _Toc210125428 \h </w:instrText>
+              <w:instrText xml:space="preserve"> PAGEREF _Toc210313129 \h </w:instrText>
             </w:r>
             <w:r>
               <w:rPr>
@@ -6949,7 +6949,7 @@
               <w14:ligatures w14:val="standardContextual"/>
             </w:rPr>
           </w:pPr>
-          <w:hyperlink w:anchor="_Toc210125429" w:history="1">
+          <w:hyperlink w:anchor="_Toc210313130" w:history="1">
             <w:r>
               <w:rPr>
                 <w:rStyle w:val="Hyperlink"/>
@@ -7015,7 +7015,7 @@
                 <w:noProof/>
                 <w:webHidden/>
               </w:rPr>
-              <w:instrText xml:space="preserve"> PAGEREF _Toc210125429 \h </w:instrText>
+              <w:instrText xml:space="preserve"> PAGEREF _Toc210313130 \h </w:instrText>
             </w:r>
             <w:r>
               <w:rPr>
@@ -7060,7 +7060,7 @@
               <w14:ligatures w14:val="standardContextual"/>
             </w:rPr>
           </w:pPr>
-          <w:hyperlink w:anchor="_Toc210125430" w:history="1">
+          <w:hyperlink w:anchor="_Toc210313131" w:history="1">
             <w:r>
               <w:rPr>
                 <w:rStyle w:val="Hyperlink"/>
@@ -7126,7 +7126,7 @@
                 <w:noProof/>
                 <w:webHidden/>
               </w:rPr>
-              <w:instrText xml:space="preserve"> PAGEREF _Toc210125430 \h </w:instrText>
+              <w:instrText xml:space="preserve"> PAGEREF _Toc210313131 \h </w:instrText>
             </w:r>
             <w:r>
               <w:rPr>
@@ -7171,7 +7171,7 @@
               <w14:ligatures w14:val="standardContextual"/>
             </w:rPr>
           </w:pPr>
-          <w:hyperlink w:anchor="_Toc210125431" w:history="1">
+          <w:hyperlink w:anchor="_Toc210313132" w:history="1">
             <w:r>
               <w:rPr>
                 <w:rStyle w:val="Hyperlink"/>
@@ -7199,7 +7199,7 @@
                 <w:noProof/>
                 <w:webHidden/>
               </w:rPr>
-              <w:instrText xml:space="preserve"> PAGEREF _Toc210125431 \h </w:instrText>
+              <w:instrText xml:space="preserve"> PAGEREF _Toc210313132 \h </w:instrText>
             </w:r>
             <w:r>
               <w:rPr>
@@ -7219,7 +7219,7 @@
                 <w:noProof/>
                 <w:webHidden/>
               </w:rPr>
-              <w:t>15</w:t>
+              <w:t>16</w:t>
             </w:r>
             <w:r>
               <w:rPr>
@@ -7244,7 +7244,7 @@
               <w14:ligatures w14:val="standardContextual"/>
             </w:rPr>
           </w:pPr>
-          <w:hyperlink w:anchor="_Toc210125432" w:history="1">
+          <w:hyperlink w:anchor="_Toc210313133" w:history="1">
             <w:r>
               <w:rPr>
                 <w:rStyle w:val="Hyperlink"/>
@@ -7287,7 +7287,7 @@
                 <w:noProof/>
                 <w:webHidden/>
               </w:rPr>
-              <w:instrText xml:space="preserve"> PAGEREF _Toc210125432 \h </w:instrText>
+              <w:instrText xml:space="preserve"> PAGEREF _Toc210313133 \h </w:instrText>
             </w:r>
             <w:r>
               <w:rPr>
@@ -7307,7 +7307,7 @@
                 <w:noProof/>
                 <w:webHidden/>
               </w:rPr>
-              <w:t>15</w:t>
+              <w:t>16</w:t>
             </w:r>
             <w:r>
               <w:rPr>
@@ -7332,7 +7332,7 @@
               <w14:ligatures w14:val="standardContextual"/>
             </w:rPr>
           </w:pPr>
-          <w:hyperlink w:anchor="_Toc210125433" w:history="1">
+          <w:hyperlink w:anchor="_Toc210313134" w:history="1">
             <w:r>
               <w:rPr>
                 <w:rStyle w:val="Hyperlink"/>
@@ -7390,7 +7390,7 @@
                 <w:noProof/>
                 <w:webHidden/>
               </w:rPr>
-              <w:instrText xml:space="preserve"> PAGEREF _Toc210125433 \h </w:instrText>
+              <w:instrText xml:space="preserve"> PAGEREF _Toc210313134 \h </w:instrText>
             </w:r>
             <w:r>
               <w:rPr>
@@ -7410,7 +7410,7 @@
                 <w:noProof/>
                 <w:webHidden/>
               </w:rPr>
-              <w:t>16</w:t>
+              <w:t>17</w:t>
             </w:r>
             <w:r>
               <w:rPr>
@@ -7435,7 +7435,7 @@
               <w14:ligatures w14:val="standardContextual"/>
             </w:rPr>
           </w:pPr>
-          <w:hyperlink w:anchor="_Toc210125434" w:history="1">
+          <w:hyperlink w:anchor="_Toc210313135" w:history="1">
             <w:r>
               <w:rPr>
                 <w:rStyle w:val="Hyperlink"/>
@@ -7509,7 +7509,7 @@
                 <w:noProof/>
                 <w:webHidden/>
               </w:rPr>
-              <w:instrText xml:space="preserve"> PAGEREF _Toc210125434 \h </w:instrText>
+              <w:instrText xml:space="preserve"> PAGEREF _Toc210313135 \h </w:instrText>
             </w:r>
             <w:r>
               <w:rPr>
@@ -7529,7 +7529,7 @@
                 <w:noProof/>
                 <w:webHidden/>
               </w:rPr>
-              <w:t>19</w:t>
+              <w:t>20</w:t>
             </w:r>
             <w:r>
               <w:rPr>
@@ -7554,7 +7554,7 @@
               <w14:ligatures w14:val="standardContextual"/>
             </w:rPr>
           </w:pPr>
-          <w:hyperlink w:anchor="_Toc210125435" w:history="1">
+          <w:hyperlink w:anchor="_Toc210313136" w:history="1">
             <w:r>
               <w:rPr>
                 <w:rStyle w:val="Hyperlink"/>
@@ -7581,7 +7581,7 @@
                 <w:noProof/>
                 <w:webHidden/>
               </w:rPr>
-              <w:instrText xml:space="preserve"> PAGEREF _Toc210125435 \h </w:instrText>
+              <w:instrText xml:space="preserve"> PAGEREF _Toc210313136 \h </w:instrText>
             </w:r>
             <w:r>
               <w:rPr>
@@ -7601,7 +7601,7 @@
                 <w:noProof/>
                 <w:webHidden/>
               </w:rPr>
-              <w:t>21</w:t>
+              <w:t>22</w:t>
             </w:r>
             <w:r>
               <w:rPr>
@@ -7626,7 +7626,7 @@
               <w14:ligatures w14:val="standardContextual"/>
             </w:rPr>
           </w:pPr>
-          <w:hyperlink w:anchor="_Toc210125436" w:history="1">
+          <w:hyperlink w:anchor="_Toc210313137" w:history="1">
             <w:r>
               <w:rPr>
                 <w:rStyle w:val="Hyperlink"/>
@@ -7684,7 +7684,7 @@
                 <w:noProof/>
                 <w:webHidden/>
               </w:rPr>
-              <w:instrText xml:space="preserve"> PAGEREF _Toc210125436 \h </w:instrText>
+              <w:instrText xml:space="preserve"> PAGEREF _Toc210313137 \h </w:instrText>
             </w:r>
             <w:r>
               <w:rPr>
@@ -7704,7 +7704,7 @@
                 <w:noProof/>
                 <w:webHidden/>
               </w:rPr>
-              <w:t>21</w:t>
+              <w:t>22</w:t>
             </w:r>
             <w:r>
               <w:rPr>
@@ -7729,7 +7729,7 @@
               <w14:ligatures w14:val="standardContextual"/>
             </w:rPr>
           </w:pPr>
-          <w:hyperlink w:anchor="_Toc210125437" w:history="1">
+          <w:hyperlink w:anchor="_Toc210313138" w:history="1">
             <w:r>
               <w:rPr>
                 <w:rStyle w:val="Hyperlink"/>
@@ -7787,7 +7787,7 @@
                 <w:noProof/>
                 <w:webHidden/>
               </w:rPr>
-              <w:instrText xml:space="preserve"> PAGEREF _Toc210125437 \h </w:instrText>
+              <w:instrText xml:space="preserve"> PAGEREF _Toc210313138 \h </w:instrText>
             </w:r>
             <w:r>
               <w:rPr>
@@ -7807,7 +7807,7 @@
                 <w:noProof/>
                 <w:webHidden/>
               </w:rPr>
-              <w:t>27</w:t>
+              <w:t>28</w:t>
             </w:r>
             <w:r>
               <w:rPr>
@@ -7832,7 +7832,7 @@
               <w14:ligatures w14:val="standardContextual"/>
             </w:rPr>
           </w:pPr>
-          <w:hyperlink w:anchor="_Toc210125438" w:history="1">
+          <w:hyperlink w:anchor="_Toc210313139" w:history="1">
             <w:r>
               <w:rPr>
                 <w:rStyle w:val="Hyperlink"/>
@@ -7860,7 +7860,7 @@
                 <w:noProof/>
                 <w:webHidden/>
               </w:rPr>
-              <w:instrText xml:space="preserve"> PAGEREF _Toc210125438 \h </w:instrText>
+              <w:instrText xml:space="preserve"> PAGEREF _Toc210313139 \h </w:instrText>
             </w:r>
             <w:r>
               <w:rPr>
@@ -7880,7 +7880,7 @@
                 <w:noProof/>
                 <w:webHidden/>
               </w:rPr>
-              <w:t>32</w:t>
+              <w:t>34</w:t>
             </w:r>
             <w:r>
               <w:rPr>
@@ -7908,7 +7908,7 @@
         <w:rPr>
           <w:sz w:val="36"/>
           <w:szCs w:val="36"/>
-          <w:lang w:val="sr-Latn-RS"/>
+          <w:lang w:val="en-US"/>
         </w:rPr>
       </w:pPr>
     </w:p>
@@ -7946,7 +7946,7 @@
           <w:lang w:val="en-US"/>
         </w:rPr>
       </w:pPr>
-      <w:bookmarkStart w:id="1" w:name="_Toc210125422"/>
+      <w:bookmarkStart w:id="1" w:name="_Toc210313123"/>
       <w:r>
         <w:t xml:space="preserve">2. </w:t>
       </w:r>
@@ -11775,7 +11775,7 @@
           <w:lang w:val="sr-Cyrl-RS"/>
         </w:rPr>
       </w:pPr>
-      <w:bookmarkStart w:id="2" w:name="_Toc210125423"/>
+      <w:bookmarkStart w:id="2" w:name="_Toc210313124"/>
       <w:r>
         <w:lastRenderedPageBreak/>
         <w:t>2.</w:t>
@@ -13943,7 +13943,7 @@
           <w:lang w:val="sr-Cyrl-RS"/>
         </w:rPr>
       </w:pPr>
-      <w:bookmarkStart w:id="4" w:name="_Toc210125424"/>
+      <w:bookmarkStart w:id="4" w:name="_Toc210313125"/>
       <w:r>
         <w:lastRenderedPageBreak/>
         <w:t>2.</w:t>
@@ -19168,7 +19168,7 @@
           <w:lang w:val="sr-Cyrl-RS"/>
         </w:rPr>
       </w:pPr>
-      <w:bookmarkStart w:id="5" w:name="_Toc210125425"/>
+      <w:bookmarkStart w:id="5" w:name="_Toc210313126"/>
       <w:r>
         <w:t>2.</w:t>
       </w:r>
@@ -19757,7 +19757,7 @@
           <w:lang w:val="sr-Cyrl-RS"/>
         </w:rPr>
       </w:pPr>
-      <w:bookmarkStart w:id="6" w:name="_Toc210125426"/>
+      <w:bookmarkStart w:id="6" w:name="_Toc210313127"/>
       <w:r>
         <w:lastRenderedPageBreak/>
         <w:t>2.</w:t>
@@ -20109,7 +20109,7 @@
           <w:lang w:val="sr-Cyrl-RS"/>
         </w:rPr>
       </w:pPr>
-      <w:bookmarkStart w:id="7" w:name="_Toc210125427"/>
+      <w:bookmarkStart w:id="7" w:name="_Toc210313128"/>
       <w:r>
         <w:t>2.</w:t>
       </w:r>
@@ -20442,7 +20442,7 @@
           <w:lang w:val="en-US"/>
         </w:rPr>
       </w:pPr>
-      <w:bookmarkStart w:id="8" w:name="_Toc210125428"/>
+      <w:bookmarkStart w:id="8" w:name="_Toc210313129"/>
       <w:r>
         <w:lastRenderedPageBreak/>
         <w:t>2.</w:t>
@@ -20996,7 +20996,7 @@
           <w:lang w:val="sr-Latn-RS"/>
         </w:rPr>
       </w:pPr>
-      <w:bookmarkStart w:id="9" w:name="_Toc210125429"/>
+      <w:bookmarkStart w:id="9" w:name="_Toc210313130"/>
       <w:r>
         <w:lastRenderedPageBreak/>
         <w:t>2.</w:t>
@@ -22711,7 +22711,7 @@
           <w:lang w:val="sr-Cyrl-RS"/>
         </w:rPr>
       </w:pPr>
-      <w:bookmarkStart w:id="11" w:name="_Toc210125430"/>
+      <w:bookmarkStart w:id="11" w:name="_Toc210313131"/>
       <w:r>
         <w:lastRenderedPageBreak/>
         <w:t>2.</w:t>
@@ -25236,7 +25236,7 @@
           <w:lang w:val="en-US"/>
         </w:rPr>
         <w:drawing>
-          <wp:inline distT="0" distB="0" distL="0" distR="0" wp14:anchorId="5D2B5430" wp14:editId="7E63C9AD">
+          <wp:inline distT="0" distB="0" distL="0" distR="0" wp14:anchorId="5D2B5430" wp14:editId="6C522CCB">
             <wp:extent cx="5274945" cy="3318510"/>
             <wp:effectExtent l="0" t="0" r="1905" b="0"/>
             <wp:docPr id="23" name="Picture 23"/>
@@ -25608,15 +25608,7 @@
           <w:iCs/>
           <w:lang w:val="sr-Cyrl-RS"/>
         </w:rPr>
-        <w:t>, 2024</w:t>
-      </w:r>
-      <w:r>
-        <w:rPr>
-          <w:i/>
-          <w:iCs/>
-          <w:lang w:val="sr-Cyrl-RS"/>
-        </w:rPr>
-        <w:t>)</w:t>
+        <w:t>, 2024)</w:t>
       </w:r>
     </w:p>
     <w:p>
@@ -25792,7 +25784,7 @@
           <w:lang w:val="en-US"/>
         </w:rPr>
       </w:pPr>
-      <w:bookmarkStart w:id="13" w:name="_Toc210125431"/>
+      <w:bookmarkStart w:id="13" w:name="_Toc210313132"/>
       <w:r>
         <w:rPr>
           <w:lang w:val="sr-Cyrl-RS"/>
@@ -25815,7 +25807,7 @@
           <w:lang w:val="sr-Cyrl-RS"/>
         </w:rPr>
       </w:pPr>
-      <w:bookmarkStart w:id="14" w:name="_Toc210125432"/>
+      <w:bookmarkStart w:id="14" w:name="_Toc210313133"/>
       <w:r>
         <w:rPr>
           <w:lang w:val="sr-Cyrl-RS"/>
@@ -26065,7 +26057,7 @@
           <w:lang w:val="sr-Cyrl-RS"/>
         </w:rPr>
       </w:pPr>
-      <w:bookmarkStart w:id="15" w:name="_Toc210125433"/>
+      <w:bookmarkStart w:id="15" w:name="_Toc210313134"/>
       <w:r>
         <w:rPr>
           <w:lang w:val="sr-Cyrl-RS"/>
@@ -29526,7 +29518,7 @@
           <w:lang w:val="sr-Cyrl-RS"/>
         </w:rPr>
       </w:pPr>
-      <w:bookmarkStart w:id="20" w:name="_Toc210125434"/>
+      <w:bookmarkStart w:id="20" w:name="_Toc210313135"/>
       <w:r>
         <w:rPr>
           <w:lang w:val="sr-Cyrl-RS"/>
@@ -30113,7 +30105,7 @@
         </w:rPr>
         <w:br w:type="page"/>
       </w:r>
-      <w:bookmarkStart w:id="21" w:name="_Toc210125435"/>
+      <w:bookmarkStart w:id="21" w:name="_Toc210313136"/>
       <w:r>
         <w:lastRenderedPageBreak/>
         <w:t>5. Верификација и валидација система</w:t>
@@ -30127,7 +30119,7 @@
           <w:lang w:val="sr-Cyrl-RS"/>
         </w:rPr>
       </w:pPr>
-      <w:bookmarkStart w:id="22" w:name="_Toc210125436"/>
+      <w:bookmarkStart w:id="22" w:name="_Toc210313137"/>
       <w:r>
         <w:rPr>
           <w:lang w:val="sr-Cyrl-RS"/>
@@ -30177,15 +30169,89 @@
     </w:p>
     <w:p>
       <w:pPr>
+        <w:ind w:firstLine="720"/>
+        <w:jc w:val="both"/>
+        <w:rPr>
+          <w:lang w:val="sr-Cyrl-RS"/>
+        </w:rPr>
+      </w:pPr>
+      <w:r>
+        <w:rPr>
+          <w:lang w:val="sr-Cyrl-RS"/>
+        </w:rPr>
+        <w:t xml:space="preserve">За потребе евалуације овог подсистема, коришћене су метрике које су доступне у </w:t>
+      </w:r>
+      <w:r>
         <w:rPr>
           <w:lang w:val="en-US"/>
         </w:rPr>
-      </w:pPr>
-      <w:r>
-        <w:rPr>
-          <w:lang w:val="sr-Cyrl-RS"/>
-        </w:rPr>
-        <w:t>##овде иде уводни пасус</w:t>
+        <w:t>Surp</w:t>
+      </w:r>
+      <w:r>
+        <w:rPr>
+          <w:lang w:val="en-US"/>
+        </w:rPr>
+        <w:t>r</w:t>
+      </w:r>
+      <w:r>
+        <w:rPr>
+          <w:lang w:val="en-US"/>
+        </w:rPr>
+        <w:t xml:space="preserve">ise </w:t>
+      </w:r>
+      <w:r>
+        <w:rPr>
+          <w:lang w:val="sr-Cyrl-RS"/>
+        </w:rPr>
+        <w:t xml:space="preserve">библиотеци за колаборативно филтрирање. Те метрике су: </w:t>
+      </w:r>
+      <w:r>
+        <w:rPr>
+          <w:lang w:val="en-US"/>
+        </w:rPr>
+        <w:t xml:space="preserve">RMSE, MAE, MSE  </w:t>
+      </w:r>
+      <w:r>
+        <w:rPr>
+          <w:lang w:val="sr-Cyrl-RS"/>
+        </w:rPr>
+        <w:t>и</w:t>
+      </w:r>
+      <w:r>
+        <w:rPr>
+          <w:lang w:val="en-US"/>
+        </w:rPr>
+        <w:t xml:space="preserve"> FCP.</w:t>
+      </w:r>
+      <w:r>
+        <w:rPr>
+          <w:lang w:val="sr-Cyrl-RS"/>
+        </w:rPr>
+        <w:t xml:space="preserve"> </w:t>
+      </w:r>
+      <w:r>
+        <w:rPr>
+          <w:lang w:val="sr-Cyrl-RS"/>
+        </w:rPr>
+        <w:t>Ради разумевања резултата евалуације, најпре је потребно објаснити</w:t>
+      </w:r>
+      <w:r>
+        <w:rPr>
+          <w:lang w:val="en-US"/>
+        </w:rPr>
+        <w:t xml:space="preserve"> </w:t>
+      </w:r>
+      <w:r>
+        <w:rPr>
+          <w:lang w:val="sr-Cyrl-RS"/>
+        </w:rPr>
+        <w:t>шта представљају ове метрике</w:t>
+      </w:r>
+      <w:r>
+        <w:rPr>
+          <w:lang w:val="sr-Cyrl-RS"/>
+        </w:rPr>
+        <w:t xml:space="preserve"> ове метрике</w:t>
       </w:r>
     </w:p>
     <w:p>
@@ -31527,6 +31593,7 @@
                     <w:szCs w:val="28"/>
                     <w:lang w:val="en-US"/>
                   </w:rPr>
+                  <w:lastRenderedPageBreak/>
                   <m:t>RMSE=</m:t>
                 </m:r>
                 <m:rad>
@@ -31818,6 +31885,42 @@
           </w:p>
         </w:tc>
       </w:tr>
+      <w:tr>
+        <w:trPr>
+          <w:trHeight w:val="1005"/>
+        </w:trPr>
+        <w:tc>
+          <w:tcPr>
+            <w:tcW w:w="7792" w:type="dxa"/>
+            <w:vAlign w:val="center"/>
+          </w:tcPr>
+          <w:p>
+            <w:pPr>
+              <w:jc w:val="center"/>
+              <w:rPr>
+                <w:rFonts w:cs="Times New Roman"/>
+                <w:sz w:val="28"/>
+                <w:szCs w:val="28"/>
+                <w:lang w:val="sr-Cyrl-RS"/>
+              </w:rPr>
+            </w:pPr>
+          </w:p>
+        </w:tc>
+        <w:tc>
+          <w:tcPr>
+            <w:tcW w:w="567" w:type="dxa"/>
+            <w:vAlign w:val="center"/>
+          </w:tcPr>
+          <w:p>
+            <w:pPr>
+              <w:jc w:val="center"/>
+              <w:rPr>
+                <w:lang w:val="sr-Cyrl-RS"/>
+              </w:rPr>
+            </w:pPr>
+          </w:p>
+        </w:tc>
+      </w:tr>
     </w:tbl>
     <w:p>
       <w:pPr>
@@ -31827,30 +31930,6 @@
           <w:lang w:val="sr-Cyrl-RS"/>
         </w:rPr>
       </w:pPr>
-    </w:p>
-    <w:p>
-      <w:pPr>
-        <w:jc w:val="both"/>
-        <w:rPr>
-          <w:rFonts w:cs="Times New Roman"/>
-          <w:lang w:val="sr-Cyrl-RS"/>
-        </w:rPr>
-      </w:pPr>
-      <w:r>
-        <w:rPr>
-          <w:rFonts w:cs="Times New Roman"/>
-          <w:lang w:val="sr-Cyrl-RS"/>
-        </w:rPr>
-        <w:br w:type="page"/>
-      </w:r>
-      <w:r>
-        <w:rPr>
-          <w:rFonts w:cs="Times New Roman"/>
-          <w:lang w:val="en-US"/>
-        </w:rPr>
-        <w:lastRenderedPageBreak/>
-        <w:tab/>
-      </w:r>
       <w:r>
         <w:rPr>
           <w:rFonts w:cs="Times New Roman"/>
@@ -32520,7 +32599,7 @@
         <w:jc w:val="both"/>
         <w:rPr>
           <w:rFonts w:cs="Times New Roman"/>
-          <w:lang w:val="en-US"/>
+          <w:lang w:val="sr-Cyrl-RS"/>
         </w:rPr>
       </w:pPr>
       <w:r>
@@ -33130,6 +33209,13 @@
           <w:lang w:val="sr-Cyrl-RS"/>
         </w:rPr>
       </w:pPr>
+      <w:r>
+        <w:rPr>
+          <w:rFonts w:cs="Times New Roman"/>
+          <w:lang w:val="sr-Cyrl-RS"/>
+        </w:rPr>
+        <w:br w:type="page"/>
+      </w:r>
     </w:p>
     <w:p>
       <w:pPr>
@@ -33142,35 +33228,33 @@
         <w:rPr>
           <w:lang w:val="sr-Cyrl-RS"/>
         </w:rPr>
-        <w:t xml:space="preserve">##овде иде неки пасус </w:t>
+        <w:lastRenderedPageBreak/>
+        <w:t xml:space="preserve">Сада када су објашњен ове метрике, следи преглед резултата </w:t>
+      </w:r>
+      <w:r>
+        <w:rPr>
+          <w:lang w:val="sr-Cyrl-RS"/>
+        </w:rPr>
+        <w:t xml:space="preserve">верификације </w:t>
+      </w:r>
+      <w:r>
+        <w:rPr>
+          <w:lang w:val="sr-Cyrl-RS"/>
+        </w:rPr>
+        <w:t>система.</w:t>
       </w:r>
     </w:p>
     <w:p>
       <w:pPr>
         <w:jc w:val="both"/>
         <w:rPr>
-          <w:lang w:val="en-US"/>
+          <w:rFonts w:cs="Times New Roman"/>
+          <w:lang w:val="sr-Cyrl-RS"/>
         </w:rPr>
       </w:pPr>
     </w:p>
     <w:p>
       <w:pPr>
-        <w:jc w:val="both"/>
-        <w:rPr>
-          <w:lang w:val="en-US"/>
-        </w:rPr>
-      </w:pPr>
-    </w:p>
-    <w:p>
-      <w:pPr>
-        <w:jc w:val="both"/>
-        <w:rPr>
-          <w:lang w:val="en-US"/>
-        </w:rPr>
-      </w:pPr>
-    </w:p>
-    <w:p>
-      <w:pPr>
         <w:keepNext/>
       </w:pPr>
       <w:r>
@@ -33179,9 +33263,8 @@
           <w:noProof/>
           <w:lang w:val="sr-Cyrl-RS"/>
         </w:rPr>
-        <w:lastRenderedPageBreak/>
         <w:drawing>
-          <wp:inline distT="0" distB="0" distL="0" distR="0" wp14:anchorId="7D5AF9AF" wp14:editId="0F670627">
+          <wp:inline distT="0" distB="0" distL="0" distR="0" wp14:anchorId="7D5AF9AF" wp14:editId="43E3DB37">
             <wp:extent cx="5275660" cy="3185160"/>
             <wp:effectExtent l="0" t="0" r="1270" b="0"/>
             <wp:docPr id="7" name="Picture 7"/>
@@ -33210,7 +33293,7 @@
                   <pic:spPr>
                     <a:xfrm>
                       <a:off x="0" y="0"/>
-                      <a:ext cx="5279266" cy="3187337"/>
+                      <a:ext cx="5275660" cy="3185160"/>
                     </a:xfrm>
                     <a:prstGeom prst="rect">
                       <a:avLst/>
@@ -33245,9 +33328,8 @@
           <w:szCs w:val="24"/>
           <w:lang w:val="sr-Cyrl-RS"/>
         </w:rPr>
-        <w:t xml:space="preserve">Слика 3. Резултати тестирања препоручивања по ставкама коришћењем </w:t>
-      </w:r>
-      <w:proofErr w:type="spellStart"/>
+        <w:t xml:space="preserve">Слика </w:t>
+      </w:r>
       <w:r>
         <w:rPr>
           <w:b/>
@@ -33257,9 +33339,8 @@
           <w:szCs w:val="24"/>
           <w:lang w:val="sr-Cyrl-RS"/>
         </w:rPr>
-        <w:t>косинусне</w:t>
-      </w:r>
-      <w:proofErr w:type="spellEnd"/>
+        <w:t>5</w:t>
+      </w:r>
       <w:r>
         <w:rPr>
           <w:b/>
@@ -33269,6 +33350,63 @@
           <w:szCs w:val="24"/>
           <w:lang w:val="sr-Cyrl-RS"/>
         </w:rPr>
+        <w:t>.</w:t>
+      </w:r>
+      <w:r>
+        <w:rPr>
+          <w:b/>
+          <w:i w:val="0"/>
+          <w:color w:val="auto"/>
+          <w:sz w:val="24"/>
+          <w:szCs w:val="24"/>
+          <w:lang w:val="sr-Cyrl-RS"/>
+        </w:rPr>
+        <w:t>1</w:t>
+      </w:r>
+      <w:r>
+        <w:rPr>
+          <w:b/>
+          <w:i w:val="0"/>
+          <w:color w:val="auto"/>
+          <w:sz w:val="24"/>
+          <w:szCs w:val="24"/>
+          <w:lang w:val="sr-Cyrl-RS"/>
+        </w:rPr>
+        <w:t xml:space="preserve"> - </w:t>
+      </w:r>
+      <w:r>
+        <w:rPr>
+          <w:b/>
+          <w:i w:val="0"/>
+          <w:color w:val="auto"/>
+          <w:sz w:val="24"/>
+          <w:szCs w:val="24"/>
+          <w:lang w:val="sr-Cyrl-RS"/>
+        </w:rPr>
+        <w:t xml:space="preserve"> Резултати тестирања препоручивања по ставкама коришћењем </w:t>
+      </w:r>
+      <w:proofErr w:type="spellStart"/>
+      <w:r>
+        <w:rPr>
+          <w:b/>
+          <w:i w:val="0"/>
+          <w:color w:val="auto"/>
+          <w:sz w:val="24"/>
+          <w:szCs w:val="24"/>
+          <w:lang w:val="sr-Cyrl-RS"/>
+        </w:rPr>
+        <w:t>косинусне</w:t>
+      </w:r>
+      <w:proofErr w:type="spellEnd"/>
+      <w:r>
+        <w:rPr>
+          <w:b/>
+          <w:i w:val="0"/>
+          <w:color w:val="auto"/>
+          <w:sz w:val="24"/>
+          <w:szCs w:val="24"/>
+          <w:lang w:val="sr-Cyrl-RS"/>
+        </w:rPr>
         <w:t xml:space="preserve"> сличности</w:t>
       </w:r>
     </w:p>
@@ -33286,14 +33424,14 @@
         <w:jc w:val="both"/>
         <w:rPr>
           <w:rFonts w:cs="Times New Roman"/>
+          <w:lang w:val="sr-Cyrl-RS"/>
+        </w:rPr>
+      </w:pPr>
+      <w:r>
+        <w:rPr>
+          <w:rFonts w:cs="Times New Roman"/>
           <w:lang w:val="en-US"/>
         </w:rPr>
-      </w:pPr>
-      <w:r>
-        <w:rPr>
-          <w:rFonts w:cs="Times New Roman"/>
-          <w:lang w:val="en-US"/>
-        </w:rPr>
         <w:tab/>
       </w:r>
       <w:r>
@@ -33301,7 +33439,21 @@
           <w:rFonts w:cs="Times New Roman"/>
           <w:lang w:val="sr-Cyrl-RS"/>
         </w:rPr>
-        <w:t xml:space="preserve">На слици 3 се види да је у овом случају најлошији резултат имао </w:t>
+        <w:t xml:space="preserve">На слици </w:t>
+      </w:r>
+      <w:r>
+        <w:rPr>
+          <w:rFonts w:cs="Times New Roman"/>
+          <w:lang w:val="sr-Cyrl-RS"/>
+        </w:rPr>
+        <w:t>5.1</w:t>
+      </w:r>
+      <w:r>
+        <w:rPr>
+          <w:rFonts w:cs="Times New Roman"/>
+          <w:lang w:val="sr-Cyrl-RS"/>
+        </w:rPr>
+        <w:t xml:space="preserve"> се види да је у овом случају најлошији резултат имао </w:t>
       </w:r>
       <w:proofErr w:type="spellStart"/>
       <w:r>
@@ -33470,13 +33622,14 @@
         <w:jc w:val="both"/>
         <w:rPr>
           <w:rFonts w:cs="Times New Roman"/>
-          <w:lang w:val="en-US"/>
+          <w:lang w:val="sr-Cyrl-RS"/>
         </w:rPr>
       </w:pPr>
     </w:p>
     <w:p>
       <w:pPr>
         <w:keepNext/>
+        <w:jc w:val="center"/>
       </w:pPr>
       <w:r>
         <w:rPr>
@@ -33485,9 +33638,9 @@
           <w:lang w:val="sr-Cyrl-RS"/>
         </w:rPr>
         <w:drawing>
-          <wp:inline distT="0" distB="0" distL="0" distR="0" wp14:anchorId="75622322" wp14:editId="7BBCA731">
-            <wp:extent cx="5287819" cy="2820170"/>
-            <wp:effectExtent l="0" t="0" r="8255" b="0"/>
+          <wp:inline distT="0" distB="0" distL="0" distR="0" wp14:anchorId="75622322" wp14:editId="34D64825">
+            <wp:extent cx="4831080" cy="2576575"/>
+            <wp:effectExtent l="0" t="0" r="7620" b="0"/>
             <wp:docPr id="9" name="Picture 9"/>
             <wp:cNvGraphicFramePr>
               <a:graphicFrameLocks xmlns:a="http://schemas.openxmlformats.org/drawingml/2006/main" noChangeAspect="1"/>
@@ -33514,7 +33667,7 @@
                   <pic:spPr>
                     <a:xfrm>
                       <a:off x="0" y="0"/>
-                      <a:ext cx="5287819" cy="2820170"/>
+                      <a:ext cx="4855680" cy="2589695"/>
                     </a:xfrm>
                     <a:prstGeom prst="rect">
                       <a:avLst/>
@@ -33558,9 +33711,9 @@
           <w:color w:val="auto"/>
           <w:sz w:val="24"/>
           <w:szCs w:val="24"/>
-          <w:lang w:val="en-US"/>
-        </w:rPr>
-        <w:t>4</w:t>
+          <w:lang w:val="sr-Cyrl-RS"/>
+        </w:rPr>
+        <w:t>5</w:t>
       </w:r>
       <w:r>
         <w:rPr>
@@ -33571,9 +33724,8 @@
           <w:szCs w:val="24"/>
           <w:lang w:val="sr-Cyrl-RS"/>
         </w:rPr>
-        <w:t xml:space="preserve">. Резултати тестирања препоручивања по ставкама коришћењем </w:t>
-      </w:r>
-      <w:proofErr w:type="spellStart"/>
+        <w:t>.</w:t>
+      </w:r>
       <w:r>
         <w:rPr>
           <w:b/>
@@ -33583,7 +33735,7 @@
           <w:szCs w:val="24"/>
           <w:lang w:val="sr-Cyrl-RS"/>
         </w:rPr>
-        <w:t>Пирсонов</w:t>
+        <w:t>2</w:t>
       </w:r>
       <w:r>
         <w:rPr>
@@ -33594,9 +33746,8 @@
           <w:szCs w:val="24"/>
           <w:lang w:val="sr-Cyrl-RS"/>
         </w:rPr>
-        <w:t>ог</w:t>
-      </w:r>
-      <w:proofErr w:type="spellEnd"/>
+        <w:t xml:space="preserve"> -</w:t>
+      </w:r>
       <w:r>
         <w:rPr>
           <w:b/>
@@ -33606,8 +33757,9 @@
           <w:szCs w:val="24"/>
           <w:lang w:val="sr-Cyrl-RS"/>
         </w:rPr>
-        <w:t xml:space="preserve"> коефицијент</w:t>
-      </w:r>
+        <w:t xml:space="preserve"> Резултати тестирања препоручивања по ставкама коришћењем </w:t>
+      </w:r>
+      <w:proofErr w:type="spellStart"/>
       <w:r>
         <w:rPr>
           <w:b/>
@@ -33617,7 +33769,7 @@
           <w:szCs w:val="24"/>
           <w:lang w:val="sr-Cyrl-RS"/>
         </w:rPr>
-        <w:t>а</w:t>
+        <w:t>Пирсонов</w:t>
       </w:r>
       <w:r>
         <w:rPr>
@@ -33628,6 +33780,40 @@
           <w:szCs w:val="24"/>
           <w:lang w:val="sr-Cyrl-RS"/>
         </w:rPr>
+        <w:t>ог</w:t>
+      </w:r>
+      <w:proofErr w:type="spellEnd"/>
+      <w:r>
+        <w:rPr>
+          <w:b/>
+          <w:i w:val="0"/>
+          <w:color w:val="auto"/>
+          <w:sz w:val="24"/>
+          <w:szCs w:val="24"/>
+          <w:lang w:val="sr-Cyrl-RS"/>
+        </w:rPr>
+        <w:t xml:space="preserve"> коефицијент</w:t>
+      </w:r>
+      <w:r>
+        <w:rPr>
+          <w:b/>
+          <w:i w:val="0"/>
+          <w:color w:val="auto"/>
+          <w:sz w:val="24"/>
+          <w:szCs w:val="24"/>
+          <w:lang w:val="sr-Cyrl-RS"/>
+        </w:rPr>
+        <w:t>а</w:t>
+      </w:r>
+      <w:r>
+        <w:rPr>
+          <w:b/>
+          <w:i w:val="0"/>
+          <w:color w:val="auto"/>
+          <w:sz w:val="24"/>
+          <w:szCs w:val="24"/>
+          <w:lang w:val="sr-Cyrl-RS"/>
+        </w:rPr>
         <w:t xml:space="preserve"> корелације</w:t>
       </w:r>
     </w:p>
@@ -33652,7 +33838,21 @@
           <w:rFonts w:cs="Times New Roman"/>
           <w:lang w:val="sr-Cyrl-RS"/>
         </w:rPr>
-        <w:t xml:space="preserve">На слици 4 се примећује да, у односу на претходни случај, </w:t>
+        <w:t xml:space="preserve">На слици </w:t>
+      </w:r>
+      <w:r>
+        <w:rPr>
+          <w:rFonts w:cs="Times New Roman"/>
+          <w:lang w:val="sr-Cyrl-RS"/>
+        </w:rPr>
+        <w:t xml:space="preserve">5.2 </w:t>
+      </w:r>
+      <w:r>
+        <w:rPr>
+          <w:rFonts w:cs="Times New Roman"/>
+          <w:lang w:val="sr-Cyrl-RS"/>
+        </w:rPr>
+        <w:t xml:space="preserve"> се примећује да, у односу на претходни случај, </w:t>
       </w:r>
       <w:proofErr w:type="spellStart"/>
       <w:r>
@@ -33723,7 +33923,7 @@
           <w:lang w:val="sr-Cyrl-RS"/>
         </w:rPr>
         <w:drawing>
-          <wp:inline distT="0" distB="0" distL="0" distR="0" wp14:anchorId="5685312B" wp14:editId="083F340E">
+          <wp:inline distT="0" distB="0" distL="0" distR="0" wp14:anchorId="5685312B" wp14:editId="7AC963FD">
             <wp:extent cx="5165092" cy="2754716"/>
             <wp:effectExtent l="0" t="0" r="0" b="7620"/>
             <wp:docPr id="6" name="Picture 6"/>
@@ -33809,7 +34009,7 @@
           <w:szCs w:val="24"/>
           <w:lang w:val="sr-Cyrl-RS"/>
         </w:rPr>
-        <w:t xml:space="preserve">. Резултати тестирања препоручивања по </w:t>
+        <w:t>.</w:t>
       </w:r>
       <w:r>
         <w:rPr>
@@ -33820,7 +34020,7 @@
           <w:szCs w:val="24"/>
           <w:lang w:val="sr-Cyrl-RS"/>
         </w:rPr>
-        <w:t xml:space="preserve">корисницима </w:t>
+        <w:t>3</w:t>
       </w:r>
       <w:r>
         <w:rPr>
@@ -33831,9 +34031,8 @@
           <w:szCs w:val="24"/>
           <w:lang w:val="sr-Cyrl-RS"/>
         </w:rPr>
-        <w:t xml:space="preserve">коришћењем </w:t>
-      </w:r>
-      <w:proofErr w:type="spellStart"/>
+        <w:t xml:space="preserve"> -</w:t>
+      </w:r>
       <w:r>
         <w:rPr>
           <w:b/>
@@ -33843,9 +34042,8 @@
           <w:szCs w:val="24"/>
           <w:lang w:val="sr-Cyrl-RS"/>
         </w:rPr>
-        <w:t>косинусне</w:t>
-      </w:r>
-      <w:proofErr w:type="spellEnd"/>
+        <w:t xml:space="preserve"> Резултати тестирања препоручивања по </w:t>
+      </w:r>
       <w:r>
         <w:rPr>
           <w:b/>
@@ -33855,6 +34053,41 @@
           <w:szCs w:val="24"/>
           <w:lang w:val="sr-Cyrl-RS"/>
         </w:rPr>
+        <w:t xml:space="preserve">корисницима </w:t>
+      </w:r>
+      <w:r>
+        <w:rPr>
+          <w:b/>
+          <w:i w:val="0"/>
+          <w:color w:val="auto"/>
+          <w:sz w:val="24"/>
+          <w:szCs w:val="24"/>
+          <w:lang w:val="sr-Cyrl-RS"/>
+        </w:rPr>
+        <w:t xml:space="preserve">коришћењем </w:t>
+      </w:r>
+      <w:proofErr w:type="spellStart"/>
+      <w:r>
+        <w:rPr>
+          <w:b/>
+          <w:i w:val="0"/>
+          <w:color w:val="auto"/>
+          <w:sz w:val="24"/>
+          <w:szCs w:val="24"/>
+          <w:lang w:val="sr-Cyrl-RS"/>
+        </w:rPr>
+        <w:t>косинусне</w:t>
+      </w:r>
+      <w:proofErr w:type="spellEnd"/>
+      <w:r>
+        <w:rPr>
+          <w:b/>
+          <w:i w:val="0"/>
+          <w:color w:val="auto"/>
+          <w:sz w:val="24"/>
+          <w:szCs w:val="24"/>
+          <w:lang w:val="sr-Cyrl-RS"/>
+        </w:rPr>
         <w:t xml:space="preserve"> сличности</w:t>
       </w:r>
     </w:p>
@@ -33872,7 +34105,21 @@
           <w:lang w:val="sr-Cyrl-RS"/>
         </w:rPr>
         <w:tab/>
-        <w:t xml:space="preserve">На слици 5 може се уочити да, гледајући </w:t>
+        <w:t>На слици 5</w:t>
+      </w:r>
+      <w:r>
+        <w:rPr>
+          <w:rFonts w:cs="Times New Roman"/>
+          <w:lang w:val="sr-Cyrl-RS"/>
+        </w:rPr>
+        <w:t>.3</w:t>
+      </w:r>
+      <w:r>
+        <w:rPr>
+          <w:rFonts w:cs="Times New Roman"/>
+          <w:lang w:val="sr-Cyrl-RS"/>
+        </w:rPr>
+        <w:t xml:space="preserve"> може се уочити да, гледајући </w:t>
       </w:r>
       <w:r>
         <w:rPr>
@@ -34047,7 +34294,7 @@
           <w:lang w:val="sr-Cyrl-RS"/>
         </w:rPr>
         <w:drawing>
-          <wp:inline distT="0" distB="0" distL="0" distR="0" wp14:anchorId="28785063" wp14:editId="11E7E4BF">
+          <wp:inline distT="0" distB="0" distL="0" distR="0" wp14:anchorId="28785063" wp14:editId="4DEC3C12">
             <wp:extent cx="5294493" cy="2823730"/>
             <wp:effectExtent l="0" t="0" r="1905" b="0"/>
             <wp:docPr id="8" name="Picture 8"/>
@@ -34122,7 +34369,7 @@
           <w:szCs w:val="24"/>
           <w:lang w:val="sr-Cyrl-RS"/>
         </w:rPr>
-        <w:t>6</w:t>
+        <w:t>5.4</w:t>
       </w:r>
       <w:r>
         <w:rPr>
@@ -34133,7 +34380,7 @@
           <w:szCs w:val="24"/>
           <w:lang w:val="sr-Cyrl-RS"/>
         </w:rPr>
-        <w:t xml:space="preserve">. Резултати тестирања препоручивања по </w:t>
+        <w:t xml:space="preserve"> -</w:t>
       </w:r>
       <w:r>
         <w:rPr>
@@ -34144,7 +34391,7 @@
           <w:szCs w:val="24"/>
           <w:lang w:val="sr-Cyrl-RS"/>
         </w:rPr>
-        <w:t xml:space="preserve">корисницима </w:t>
+        <w:t xml:space="preserve"> </w:t>
       </w:r>
       <w:r>
         <w:rPr>
@@ -34155,9 +34402,8 @@
           <w:szCs w:val="24"/>
           <w:lang w:val="sr-Cyrl-RS"/>
         </w:rPr>
-        <w:t xml:space="preserve">коришћењем </w:t>
-      </w:r>
-      <w:proofErr w:type="spellStart"/>
+        <w:t xml:space="preserve">Резултати тестирања препоручивања по </w:t>
+      </w:r>
       <w:r>
         <w:rPr>
           <w:b/>
@@ -34167,9 +34413,8 @@
           <w:szCs w:val="24"/>
           <w:lang w:val="sr-Cyrl-RS"/>
         </w:rPr>
-        <w:t>Пирсоновог</w:t>
-      </w:r>
-      <w:proofErr w:type="spellEnd"/>
+        <w:t xml:space="preserve">корисницима </w:t>
+      </w:r>
       <w:r>
         <w:rPr>
           <w:b/>
@@ -34179,6 +34424,30 @@
           <w:szCs w:val="24"/>
           <w:lang w:val="sr-Cyrl-RS"/>
         </w:rPr>
+        <w:t xml:space="preserve">коришћењем </w:t>
+      </w:r>
+      <w:proofErr w:type="spellStart"/>
+      <w:r>
+        <w:rPr>
+          <w:b/>
+          <w:i w:val="0"/>
+          <w:color w:val="auto"/>
+          <w:sz w:val="24"/>
+          <w:szCs w:val="24"/>
+          <w:lang w:val="sr-Cyrl-RS"/>
+        </w:rPr>
+        <w:t>Пирсоновог</w:t>
+      </w:r>
+      <w:proofErr w:type="spellEnd"/>
+      <w:r>
+        <w:rPr>
+          <w:b/>
+          <w:i w:val="0"/>
+          <w:color w:val="auto"/>
+          <w:sz w:val="24"/>
+          <w:szCs w:val="24"/>
+          <w:lang w:val="sr-Cyrl-RS"/>
+        </w:rPr>
         <w:t xml:space="preserve"> коефицијента корелације</w:t>
       </w:r>
     </w:p>
@@ -34197,7 +34466,21 @@
         </w:rPr>
         <w:lastRenderedPageBreak/>
         <w:tab/>
-        <w:t xml:space="preserve">Посматрајући резултате на слици 6, примећује се да су резултати слични као у претходном случају, али да су се грешке код свих алгоритама повећале, док су </w:t>
+        <w:t xml:space="preserve">Посматрајући резултате на слици </w:t>
+      </w:r>
+      <w:r>
+        <w:rPr>
+          <w:rFonts w:cs="Times New Roman"/>
+          <w:lang w:val="sr-Cyrl-RS"/>
+        </w:rPr>
+        <w:t>5.4</w:t>
+      </w:r>
+      <w:r>
+        <w:rPr>
+          <w:rFonts w:cs="Times New Roman"/>
+          <w:lang w:val="sr-Cyrl-RS"/>
+        </w:rPr>
+        <w:t xml:space="preserve">, примећује се да су резултати слични као у претходном случају, али да су се грешке код свих алгоритама повећале, док су </w:t>
       </w:r>
       <w:r>
         <w:rPr>
@@ -34531,7 +34814,21 @@
           <w:rFonts w:cs="Times New Roman"/>
           <w:lang w:val="sr-Cyrl-RS"/>
         </w:rPr>
-        <w:t xml:space="preserve">Резултати изабраних алгоритама приказани су на слици 7. На тој слици се види да </w:t>
+        <w:t xml:space="preserve">Резултати изабраних алгоритама приказани су на слици </w:t>
+      </w:r>
+      <w:r>
+        <w:rPr>
+          <w:rFonts w:cs="Times New Roman"/>
+          <w:lang w:val="sr-Cyrl-RS"/>
+        </w:rPr>
+        <w:t>5.5</w:t>
+      </w:r>
+      <w:r>
+        <w:rPr>
+          <w:rFonts w:cs="Times New Roman"/>
+          <w:lang w:val="sr-Cyrl-RS"/>
+        </w:rPr>
+        <w:t xml:space="preserve">. На тој слици се види да </w:t>
       </w:r>
       <w:r>
         <w:rPr>
@@ -34697,7 +34994,51 @@
           <w:szCs w:val="24"/>
           <w:lang w:val="sr-Cyrl-RS"/>
         </w:rPr>
-        <w:t>Слика 7. Преглед изабраних алгоритама са њиховим конфигурацијама</w:t>
+        <w:t xml:space="preserve">Слика </w:t>
+      </w:r>
+      <w:r>
+        <w:rPr>
+          <w:b/>
+          <w:i w:val="0"/>
+          <w:color w:val="auto"/>
+          <w:sz w:val="24"/>
+          <w:szCs w:val="24"/>
+          <w:lang w:val="sr-Cyrl-RS"/>
+        </w:rPr>
+        <w:t>5.5</w:t>
+      </w:r>
+      <w:r>
+        <w:rPr>
+          <w:b/>
+          <w:i w:val="0"/>
+          <w:color w:val="auto"/>
+          <w:sz w:val="24"/>
+          <w:szCs w:val="24"/>
+          <w:lang w:val="sr-Cyrl-RS"/>
+        </w:rPr>
+        <w:t xml:space="preserve"> </w:t>
+      </w:r>
+      <w:r>
+        <w:rPr>
+          <w:b/>
+          <w:i w:val="0"/>
+          <w:color w:val="auto"/>
+          <w:sz w:val="24"/>
+          <w:szCs w:val="24"/>
+          <w:lang w:val="sr-Cyrl-RS"/>
+        </w:rPr>
+        <w:t xml:space="preserve">- </w:t>
+      </w:r>
+      <w:r>
+        <w:rPr>
+          <w:b/>
+          <w:i w:val="0"/>
+          <w:color w:val="auto"/>
+          <w:sz w:val="24"/>
+          <w:szCs w:val="24"/>
+          <w:lang w:val="sr-Cyrl-RS"/>
+        </w:rPr>
+        <w:t>Преглед изабраних алгоритама са њиховим конфигурацијама</w:t>
       </w:r>
     </w:p>
     <w:p>
@@ -35056,7 +35397,21 @@
           <w:lang w:val="sr-Cyrl-RS"/>
         </w:rPr>
         <w:tab/>
-        <w:t xml:space="preserve">На слици 8, види се да </w:t>
+        <w:t xml:space="preserve">На слици </w:t>
+      </w:r>
+      <w:r>
+        <w:rPr>
+          <w:rFonts w:cs="Times New Roman"/>
+          <w:lang w:val="sr-Cyrl-RS"/>
+        </w:rPr>
+        <w:t>5.6</w:t>
+      </w:r>
+      <w:r>
+        <w:rPr>
+          <w:rFonts w:cs="Times New Roman"/>
+          <w:lang w:val="sr-Cyrl-RS"/>
+        </w:rPr>
+        <w:t xml:space="preserve">, види се да </w:t>
       </w:r>
       <w:r>
         <w:rPr>
@@ -35170,7 +35525,21 @@
           <w:rFonts w:cs="Times New Roman"/>
           <w:lang w:val="sr-Cyrl-RS"/>
         </w:rPr>
-        <w:t xml:space="preserve"> (приказано у табели 3)</w:t>
+        <w:t xml:space="preserve"> (приказано у табели </w:t>
+      </w:r>
+      <w:r>
+        <w:rPr>
+          <w:rFonts w:cs="Times New Roman"/>
+          <w:lang w:val="sr-Cyrl-RS"/>
+        </w:rPr>
+        <w:t>5.1</w:t>
+      </w:r>
+      <w:r>
+        <w:rPr>
+          <w:rFonts w:cs="Times New Roman"/>
+          <w:lang w:val="sr-Cyrl-RS"/>
+        </w:rPr>
+        <w:t>)</w:t>
       </w:r>
       <w:r>
         <w:rPr>
@@ -35202,6 +35571,7 @@
           <w:lang w:val="sr-Latn-RS"/>
         </w:rPr>
       </w:pPr>
+      <w:bookmarkStart w:id="23" w:name="_Hlk210310486"/>
       <w:r>
         <w:rPr>
           <w:b/>
@@ -35211,7 +35581,29 @@
           <w:szCs w:val="24"/>
           <w:lang w:val="sr-Cyrl-RS"/>
         </w:rPr>
-        <w:t xml:space="preserve">Табела 3 – </w:t>
+        <w:t xml:space="preserve">Табела </w:t>
+      </w:r>
+      <w:r>
+        <w:rPr>
+          <w:b/>
+          <w:i w:val="0"/>
+          <w:color w:val="auto"/>
+          <w:sz w:val="24"/>
+          <w:szCs w:val="24"/>
+          <w:lang w:val="sr-Cyrl-RS"/>
+        </w:rPr>
+        <w:t>5.1</w:t>
+      </w:r>
+      <w:r>
+        <w:rPr>
+          <w:b/>
+          <w:i w:val="0"/>
+          <w:color w:val="auto"/>
+          <w:sz w:val="24"/>
+          <w:szCs w:val="24"/>
+          <w:lang w:val="sr-Cyrl-RS"/>
+        </w:rPr>
+        <w:t xml:space="preserve"> – </w:t>
       </w:r>
       <w:r>
         <w:rPr>
@@ -35249,7 +35641,8 @@
                 <w:lang w:val="sr-Cyrl-RS"/>
               </w:rPr>
             </w:pPr>
-            <w:bookmarkStart w:id="23" w:name="_Hlk200292756"/>
+            <w:bookmarkStart w:id="24" w:name="_Hlk200292756"/>
+            <w:bookmarkEnd w:id="23"/>
             <w:r>
               <w:rPr>
                 <w:rFonts w:cs="Times New Roman"/>
@@ -35282,7 +35675,7 @@
           </w:p>
         </w:tc>
       </w:tr>
-      <w:bookmarkEnd w:id="23"/>
+      <w:bookmarkEnd w:id="24"/>
       <w:tr>
         <w:tc>
           <w:tcPr>
@@ -35526,7 +35919,7 @@
           <w:lang w:val="sr-Cyrl-RS"/>
         </w:rPr>
       </w:pPr>
-      <w:bookmarkStart w:id="24" w:name="_Hlk205806821"/>
+      <w:bookmarkStart w:id="25" w:name="_Hlk205806821"/>
       <w:r>
         <w:rPr>
           <w:rFonts w:cs="Times New Roman"/>
@@ -35660,7 +36053,7 @@
         <w:t xml:space="preserve">износи 76,5%, што и није лош резултат. </w:t>
       </w:r>
     </w:p>
-    <w:bookmarkEnd w:id="24"/>
+    <w:bookmarkEnd w:id="25"/>
     <w:p>
       <w:pPr>
         <w:jc w:val="both"/>
@@ -35751,7 +36144,7 @@
           <w:szCs w:val="24"/>
           <w:lang w:val="sr-Cyrl-RS"/>
         </w:rPr>
-        <w:t>8</w:t>
+        <w:t>5.6</w:t>
       </w:r>
       <w:r>
         <w:rPr>
@@ -35762,7 +36155,7 @@
           <w:szCs w:val="24"/>
           <w:lang w:val="sr-Cyrl-RS"/>
         </w:rPr>
-        <w:t xml:space="preserve">. </w:t>
+        <w:t xml:space="preserve"> - </w:t>
       </w:r>
       <w:r>
         <w:rPr>
@@ -35826,7 +36219,7 @@
           <w:lang w:val="sr-Cyrl-RS"/>
         </w:rPr>
       </w:pPr>
-      <w:bookmarkStart w:id="25" w:name="_Toc210125437"/>
+      <w:bookmarkStart w:id="26" w:name="_Toc210313138"/>
       <w:r>
         <w:rPr>
           <w:lang w:val="sr-Cyrl-RS"/>
@@ -35851,7 +36244,7 @@
         </w:rPr>
         <w:t>Верификација филтрирања базираног на садржају</w:t>
       </w:r>
-      <w:bookmarkEnd w:id="25"/>
+      <w:bookmarkEnd w:id="26"/>
     </w:p>
     <w:p>
       <w:pPr>
@@ -35862,6 +36255,8 @@
     </w:p>
     <w:p>
       <w:pPr>
+        <w:ind w:firstLine="720"/>
+        <w:jc w:val="both"/>
         <w:rPr>
           <w:lang w:val="en-US"/>
         </w:rPr>
@@ -35870,13 +36265,1071 @@
         <w:rPr>
           <w:lang w:val="sr-Cyrl-RS"/>
         </w:rPr>
-        <w:t>##овде иде уводни пасус</w:t>
+        <w:t xml:space="preserve">Верификација овог подсистема није била тривијална, пошто се за препоруку ставки користи синопсис филма. За потребе тестирања, из скупа је насумице одабрано 20 филмова, и за сваки од тих филмова, направљене су по две верзије синопсиса. Потом су за сваку верзију синопсиса проналажено </w:t>
+      </w:r>
+      <w:proofErr w:type="spellStart"/>
+      <w:r>
+        <w:rPr>
+          <w:lang w:val="en-US"/>
+        </w:rPr>
+        <w:t>Top_N</w:t>
+      </w:r>
+      <w:proofErr w:type="spellEnd"/>
+      <w:r>
+        <w:rPr>
+          <w:lang w:val="en-US"/>
+        </w:rPr>
+        <w:t xml:space="preserve"> </w:t>
+      </w:r>
+      <w:r>
+        <w:rPr>
+          <w:lang w:val="sr-Cyrl-RS"/>
+        </w:rPr>
+        <w:t xml:space="preserve">кандидата (где се за </w:t>
+      </w:r>
+      <w:r>
+        <w:rPr>
+          <w:lang w:val="en-US"/>
+        </w:rPr>
+        <w:t xml:space="preserve">N </w:t>
+      </w:r>
+      <w:r>
+        <w:rPr>
+          <w:lang w:val="sr-Cyrl-RS"/>
+        </w:rPr>
+        <w:t xml:space="preserve">коришћене следеће вредности: 10, 15 и 20), и проверавало се да ли се тражени филм налазио у тих </w:t>
+      </w:r>
+      <w:proofErr w:type="spellStart"/>
+      <w:r>
+        <w:rPr>
+          <w:lang w:val="en-US"/>
+        </w:rPr>
+        <w:t>Top_N</w:t>
+      </w:r>
+      <w:proofErr w:type="spellEnd"/>
+      <w:r>
+        <w:rPr>
+          <w:lang w:val="sr-Cyrl-RS"/>
+        </w:rPr>
+        <w:t xml:space="preserve"> кандидата, и ако јесу, колико високо су рангирани. Што се филм налазио ближе првом месту, то је бољи резултат. За сличност су коришћене следеће метрике: </w:t>
+      </w:r>
+      <w:proofErr w:type="spellStart"/>
+      <w:r>
+        <w:rPr>
+          <w:lang w:val="sr-Cyrl-RS"/>
+        </w:rPr>
+        <w:t>косинусна</w:t>
+      </w:r>
+      <w:proofErr w:type="spellEnd"/>
+      <w:r>
+        <w:rPr>
+          <w:lang w:val="sr-Cyrl-RS"/>
+        </w:rPr>
+        <w:t xml:space="preserve"> сличност, </w:t>
+      </w:r>
+      <w:proofErr w:type="spellStart"/>
+      <w:r>
+        <w:rPr>
+          <w:lang w:val="sr-Cyrl-RS"/>
+        </w:rPr>
+        <w:t>еуклидска</w:t>
+      </w:r>
+      <w:proofErr w:type="spellEnd"/>
+      <w:r>
+        <w:rPr>
+          <w:lang w:val="sr-Cyrl-RS"/>
+        </w:rPr>
+        <w:t xml:space="preserve"> дистанца и Менхетн (</w:t>
+      </w:r>
+      <w:proofErr w:type="spellStart"/>
+      <w:r>
+        <w:rPr>
+          <w:lang w:val="en-US"/>
+        </w:rPr>
+        <w:t>cityblock</w:t>
+      </w:r>
+      <w:proofErr w:type="spellEnd"/>
+      <w:r>
+        <w:rPr>
+          <w:lang w:val="sr-Cyrl-RS"/>
+        </w:rPr>
+        <w:t>)</w:t>
+      </w:r>
+      <w:r>
+        <w:rPr>
+          <w:lang w:val="en-US"/>
+        </w:rPr>
+        <w:t xml:space="preserve"> </w:t>
+      </w:r>
+      <w:r>
+        <w:rPr>
+          <w:lang w:val="sr-Cyrl-RS"/>
+        </w:rPr>
+        <w:t xml:space="preserve">дистанца. За </w:t>
+      </w:r>
+      <w:proofErr w:type="spellStart"/>
+      <w:r>
+        <w:rPr>
+          <w:lang w:val="sr-Cyrl-RS"/>
+        </w:rPr>
+        <w:t>векторизацију</w:t>
+      </w:r>
+      <w:proofErr w:type="spellEnd"/>
+      <w:r>
+        <w:rPr>
+          <w:lang w:val="sr-Cyrl-RS"/>
+        </w:rPr>
+        <w:t xml:space="preserve"> текста коришћени су следећи модели: </w:t>
+      </w:r>
+      <w:r>
+        <w:rPr>
+          <w:lang w:val="en-US"/>
+        </w:rPr>
+        <w:t xml:space="preserve">llama3.2, granite3.3, mistral </w:t>
+      </w:r>
+      <w:r>
+        <w:rPr>
+          <w:lang w:val="sr-Cyrl-RS"/>
+        </w:rPr>
+        <w:t xml:space="preserve">и </w:t>
+      </w:r>
+      <w:r>
+        <w:rPr>
+          <w:lang w:val="en-US"/>
+        </w:rPr>
+        <w:t>qwen3:4b.</w:t>
+      </w:r>
+      <w:r>
+        <w:rPr>
+          <w:lang w:val="sr-Cyrl-RS"/>
+        </w:rPr>
+        <w:t xml:space="preserve"> Више информација о овим моделима, дат је у табели испод</w:t>
+      </w:r>
+      <w:r>
+        <w:rPr>
+          <w:lang w:val="en-US"/>
+        </w:rPr>
+        <w:t>.</w:t>
       </w:r>
     </w:p>
     <w:p>
       <w:pPr>
+        <w:ind w:firstLine="720"/>
+        <w:jc w:val="both"/>
         <w:rPr>
           <w:lang w:val="en-US"/>
+        </w:rPr>
+      </w:pPr>
+    </w:p>
+    <w:p>
+      <w:pPr>
+        <w:pStyle w:val="Caption"/>
+        <w:jc w:val="center"/>
+        <w:rPr>
+          <w:b/>
+          <w:i w:val="0"/>
+          <w:color w:val="auto"/>
+          <w:sz w:val="24"/>
+          <w:szCs w:val="24"/>
+          <w:lang w:val="en-US"/>
+        </w:rPr>
+      </w:pPr>
+      <w:r>
+        <w:rPr>
+          <w:b/>
+          <w:i w:val="0"/>
+          <w:color w:val="auto"/>
+          <w:sz w:val="24"/>
+          <w:szCs w:val="24"/>
+          <w:lang w:val="sr-Cyrl-RS"/>
+        </w:rPr>
+        <w:t>Табела</w:t>
+      </w:r>
+      <w:r>
+        <w:rPr>
+          <w:b/>
+          <w:i w:val="0"/>
+          <w:color w:val="auto"/>
+          <w:sz w:val="24"/>
+          <w:szCs w:val="24"/>
+          <w:lang w:val="sr-Cyrl-RS"/>
+        </w:rPr>
+        <w:t xml:space="preserve"> </w:t>
+      </w:r>
+      <w:r>
+        <w:rPr>
+          <w:b/>
+          <w:i w:val="0"/>
+          <w:color w:val="auto"/>
+          <w:sz w:val="24"/>
+          <w:szCs w:val="24"/>
+          <w:lang w:val="sr-Cyrl-RS"/>
+        </w:rPr>
+        <w:t>5.2</w:t>
+      </w:r>
+      <w:r>
+        <w:rPr>
+          <w:b/>
+          <w:i w:val="0"/>
+          <w:color w:val="auto"/>
+          <w:sz w:val="24"/>
+          <w:szCs w:val="24"/>
+          <w:lang w:val="en-US"/>
+        </w:rPr>
+        <w:t xml:space="preserve"> - </w:t>
+      </w:r>
+      <w:r>
+        <w:rPr>
+          <w:b/>
+          <w:i w:val="0"/>
+          <w:color w:val="auto"/>
+          <w:sz w:val="24"/>
+          <w:szCs w:val="24"/>
+          <w:lang w:val="sr-Cyrl-RS"/>
+        </w:rPr>
+        <w:t xml:space="preserve">Информације о </w:t>
+      </w:r>
+      <w:r>
+        <w:rPr>
+          <w:b/>
+          <w:i w:val="0"/>
+          <w:color w:val="auto"/>
+          <w:sz w:val="24"/>
+          <w:szCs w:val="24"/>
+          <w:lang w:val="sr-Cyrl-RS"/>
+        </w:rPr>
+        <w:t>тестираним</w:t>
+      </w:r>
+      <w:r>
+        <w:rPr>
+          <w:b/>
+          <w:i w:val="0"/>
+          <w:color w:val="auto"/>
+          <w:sz w:val="24"/>
+          <w:szCs w:val="24"/>
+          <w:lang w:val="sr-Cyrl-RS"/>
+        </w:rPr>
+        <w:t xml:space="preserve"> моделима</w:t>
+      </w:r>
+    </w:p>
+    <w:tbl>
+      <w:tblPr>
+        <w:tblStyle w:val="GridTable4-Accent5"/>
+        <w:tblW w:w="8358" w:type="dxa"/>
+        <w:tblLook w:val="04A0" w:firstRow="1" w:lastRow="0" w:firstColumn="1" w:lastColumn="0" w:noHBand="0" w:noVBand="1"/>
+      </w:tblPr>
+      <w:tblGrid>
+        <w:gridCol w:w="1818"/>
+        <w:gridCol w:w="2180"/>
+        <w:gridCol w:w="2665"/>
+        <w:gridCol w:w="1695"/>
+      </w:tblGrid>
+      <w:tr>
+        <w:trPr>
+          <w:cnfStyle w:val="100000000000" w:firstRow="1" w:lastRow="0" w:firstColumn="0" w:lastColumn="0" w:oddVBand="0" w:evenVBand="0" w:oddHBand="0" w:evenHBand="0" w:firstRowFirstColumn="0" w:firstRowLastColumn="0" w:lastRowFirstColumn="0" w:lastRowLastColumn="0"/>
+          <w:trHeight w:val="288"/>
+        </w:trPr>
+        <w:tc>
+          <w:tcPr>
+            <w:cnfStyle w:val="001000000000" w:firstRow="0" w:lastRow="0" w:firstColumn="1" w:lastColumn="0" w:oddVBand="0" w:evenVBand="0" w:oddHBand="0" w:evenHBand="0" w:firstRowFirstColumn="0" w:firstRowLastColumn="0" w:lastRowFirstColumn="0" w:lastRowLastColumn="0"/>
+            <w:tcW w:w="1818" w:type="dxa"/>
+            <w:noWrap/>
+            <w:vAlign w:val="center"/>
+            <w:hideMark/>
+          </w:tcPr>
+          <w:p>
+            <w:pPr>
+              <w:jc w:val="center"/>
+              <w:rPr>
+                <w:rFonts w:ascii="Aptos Narrow" w:eastAsia="Times New Roman" w:hAnsi="Aptos Narrow" w:cs="Times New Roman"/>
+                <w:color w:val="FFFFFF"/>
+                <w:sz w:val="20"/>
+                <w:szCs w:val="20"/>
+                <w:lang w:val="sr-Latn-RS" w:eastAsia="sr-Latn-RS"/>
+              </w:rPr>
+            </w:pPr>
+            <w:proofErr w:type="spellStart"/>
+            <w:r>
+              <w:rPr>
+                <w:rFonts w:ascii="Aptos Narrow" w:eastAsia="Times New Roman" w:hAnsi="Aptos Narrow" w:cs="Times New Roman"/>
+                <w:color w:val="FFFFFF"/>
+                <w:sz w:val="20"/>
+                <w:szCs w:val="20"/>
+                <w:lang w:val="sr-Latn-RS" w:eastAsia="sr-Latn-RS"/>
+              </w:rPr>
+              <w:t>Модел</w:t>
+            </w:r>
+            <w:proofErr w:type="spellEnd"/>
+          </w:p>
+        </w:tc>
+        <w:tc>
+          <w:tcPr>
+            <w:tcW w:w="2180" w:type="dxa"/>
+            <w:noWrap/>
+            <w:vAlign w:val="center"/>
+            <w:hideMark/>
+          </w:tcPr>
+          <w:p>
+            <w:pPr>
+              <w:jc w:val="center"/>
+              <w:cnfStyle w:val="100000000000" w:firstRow="1" w:lastRow="0" w:firstColumn="0" w:lastColumn="0" w:oddVBand="0" w:evenVBand="0" w:oddHBand="0" w:evenHBand="0" w:firstRowFirstColumn="0" w:firstRowLastColumn="0" w:lastRowFirstColumn="0" w:lastRowLastColumn="0"/>
+              <w:rPr>
+                <w:rFonts w:ascii="Aptos Narrow" w:eastAsia="Times New Roman" w:hAnsi="Aptos Narrow" w:cs="Times New Roman"/>
+                <w:color w:val="FFFFFF"/>
+                <w:sz w:val="20"/>
+                <w:szCs w:val="20"/>
+                <w:lang w:val="sr-Latn-RS" w:eastAsia="sr-Latn-RS"/>
+              </w:rPr>
+            </w:pPr>
+            <w:proofErr w:type="spellStart"/>
+            <w:r>
+              <w:rPr>
+                <w:rFonts w:ascii="Aptos Narrow" w:eastAsia="Times New Roman" w:hAnsi="Aptos Narrow" w:cs="Times New Roman"/>
+                <w:color w:val="FFFFFF"/>
+                <w:sz w:val="20"/>
+                <w:szCs w:val="20"/>
+                <w:lang w:val="sr-Latn-RS" w:eastAsia="sr-Latn-RS"/>
+              </w:rPr>
+              <w:t>Димензија</w:t>
+            </w:r>
+            <w:proofErr w:type="spellEnd"/>
+            <w:r>
+              <w:rPr>
+                <w:rFonts w:ascii="Aptos Narrow" w:eastAsia="Times New Roman" w:hAnsi="Aptos Narrow" w:cs="Times New Roman"/>
+                <w:color w:val="FFFFFF"/>
+                <w:sz w:val="20"/>
+                <w:szCs w:val="20"/>
+                <w:lang w:val="sr-Latn-RS" w:eastAsia="sr-Latn-RS"/>
+              </w:rPr>
+              <w:t xml:space="preserve"> </w:t>
+            </w:r>
+            <w:proofErr w:type="spellStart"/>
+            <w:r>
+              <w:rPr>
+                <w:rFonts w:ascii="Aptos Narrow" w:eastAsia="Times New Roman" w:hAnsi="Aptos Narrow" w:cs="Times New Roman"/>
+                <w:color w:val="FFFFFF"/>
+                <w:sz w:val="20"/>
+                <w:szCs w:val="20"/>
+                <w:lang w:val="sr-Latn-RS" w:eastAsia="sr-Latn-RS"/>
+              </w:rPr>
+              <w:t>вектора</w:t>
+            </w:r>
+            <w:proofErr w:type="spellEnd"/>
+          </w:p>
+        </w:tc>
+        <w:tc>
+          <w:tcPr>
+            <w:tcW w:w="2665" w:type="dxa"/>
+            <w:vAlign w:val="center"/>
+          </w:tcPr>
+          <w:p>
+            <w:pPr>
+              <w:jc w:val="center"/>
+              <w:cnfStyle w:val="100000000000" w:firstRow="1" w:lastRow="0" w:firstColumn="0" w:lastColumn="0" w:oddVBand="0" w:evenVBand="0" w:oddHBand="0" w:evenHBand="0" w:firstRowFirstColumn="0" w:firstRowLastColumn="0" w:lastRowFirstColumn="0" w:lastRowLastColumn="0"/>
+              <w:rPr>
+                <w:rFonts w:ascii="Aptos Narrow" w:eastAsia="Times New Roman" w:hAnsi="Aptos Narrow" w:cs="Times New Roman"/>
+                <w:color w:val="FFFFFF"/>
+                <w:sz w:val="20"/>
+                <w:szCs w:val="20"/>
+                <w:lang w:val="en-US" w:eastAsia="sr-Latn-RS"/>
+              </w:rPr>
+            </w:pPr>
+            <w:r>
+              <w:rPr>
+                <w:rFonts w:ascii="Aptos Narrow" w:eastAsia="Times New Roman" w:hAnsi="Aptos Narrow" w:cs="Times New Roman"/>
+                <w:b w:val="0"/>
+                <w:bCs w:val="0"/>
+                <w:color w:val="FFFFFF"/>
+                <w:sz w:val="20"/>
+                <w:szCs w:val="20"/>
+                <w:lang w:val="sr-Cyrl-RS" w:eastAsia="sr-Latn-RS"/>
+              </w:rPr>
+              <w:t xml:space="preserve">Број параметара </w:t>
+            </w:r>
+          </w:p>
+          <w:p>
+            <w:pPr>
+              <w:jc w:val="center"/>
+              <w:cnfStyle w:val="100000000000" w:firstRow="1" w:lastRow="0" w:firstColumn="0" w:lastColumn="0" w:oddVBand="0" w:evenVBand="0" w:oddHBand="0" w:evenHBand="0" w:firstRowFirstColumn="0" w:firstRowLastColumn="0" w:lastRowFirstColumn="0" w:lastRowLastColumn="0"/>
+              <w:rPr>
+                <w:rFonts w:ascii="Aptos Narrow" w:eastAsia="Times New Roman" w:hAnsi="Aptos Narrow" w:cs="Times New Roman"/>
+                <w:b w:val="0"/>
+                <w:bCs w:val="0"/>
+                <w:color w:val="FFFFFF"/>
+                <w:sz w:val="20"/>
+                <w:szCs w:val="20"/>
+                <w:lang w:val="sr-Cyrl-RS" w:eastAsia="sr-Latn-RS"/>
+              </w:rPr>
+            </w:pPr>
+            <w:r>
+              <w:rPr>
+                <w:rFonts w:ascii="Aptos Narrow" w:eastAsia="Times New Roman" w:hAnsi="Aptos Narrow" w:cs="Times New Roman"/>
+                <w:b w:val="0"/>
+                <w:bCs w:val="0"/>
+                <w:color w:val="FFFFFF"/>
+                <w:sz w:val="20"/>
+                <w:szCs w:val="20"/>
+                <w:lang w:val="sr-Cyrl-RS" w:eastAsia="sr-Latn-RS"/>
+              </w:rPr>
+              <w:t>(</w:t>
+            </w:r>
+            <w:r>
+              <w:rPr>
+                <w:rFonts w:ascii="Aptos Narrow" w:eastAsia="Times New Roman" w:hAnsi="Aptos Narrow" w:cs="Times New Roman"/>
+                <w:b w:val="0"/>
+                <w:bCs w:val="0"/>
+                <w:color w:val="FFFFFF"/>
+                <w:sz w:val="20"/>
+                <w:szCs w:val="20"/>
+                <w:lang w:val="en-US" w:eastAsia="sr-Latn-RS"/>
+              </w:rPr>
+              <w:t>B= 1</w:t>
+            </w:r>
+            <w:r>
+              <w:rPr>
+                <w:rFonts w:ascii="Aptos Narrow" w:eastAsia="Times New Roman" w:hAnsi="Aptos Narrow" w:cs="Times New Roman"/>
+                <w:b w:val="0"/>
+                <w:bCs w:val="0"/>
+                <w:color w:val="FFFFFF"/>
+                <w:sz w:val="20"/>
+                <w:szCs w:val="20"/>
+                <w:lang w:val="en-US" w:eastAsia="sr-Latn-RS"/>
+              </w:rPr>
+              <w:t xml:space="preserve"> </w:t>
+            </w:r>
+            <w:r>
+              <w:rPr>
+                <w:rFonts w:ascii="Aptos Narrow" w:eastAsia="Times New Roman" w:hAnsi="Aptos Narrow" w:cs="Times New Roman"/>
+                <w:b w:val="0"/>
+                <w:bCs w:val="0"/>
+                <w:color w:val="FFFFFF"/>
+                <w:sz w:val="20"/>
+                <w:szCs w:val="20"/>
+                <w:lang w:val="sr-Cyrl-RS" w:eastAsia="sr-Latn-RS"/>
+              </w:rPr>
+              <w:t>милијарда)</w:t>
+            </w:r>
+          </w:p>
+        </w:tc>
+        <w:tc>
+          <w:tcPr>
+            <w:tcW w:w="1695" w:type="dxa"/>
+          </w:tcPr>
+          <w:p>
+            <w:pPr>
+              <w:cnfStyle w:val="100000000000" w:firstRow="1" w:lastRow="0" w:firstColumn="0" w:lastColumn="0" w:oddVBand="0" w:evenVBand="0" w:oddHBand="0" w:evenHBand="0" w:firstRowFirstColumn="0" w:firstRowLastColumn="0" w:lastRowFirstColumn="0" w:lastRowLastColumn="0"/>
+              <w:rPr>
+                <w:rFonts w:ascii="Aptos Narrow" w:eastAsia="Times New Roman" w:hAnsi="Aptos Narrow" w:cs="Times New Roman"/>
+                <w:b w:val="0"/>
+                <w:bCs w:val="0"/>
+                <w:color w:val="FFFFFF"/>
+                <w:sz w:val="20"/>
+                <w:szCs w:val="20"/>
+                <w:lang w:val="sr-Cyrl-RS" w:eastAsia="sr-Latn-RS"/>
+              </w:rPr>
+            </w:pPr>
+            <w:r>
+              <w:rPr>
+                <w:rFonts w:ascii="Aptos Narrow" w:eastAsia="Times New Roman" w:hAnsi="Aptos Narrow" w:cs="Times New Roman"/>
+                <w:b w:val="0"/>
+                <w:bCs w:val="0"/>
+                <w:color w:val="FFFFFF"/>
+                <w:sz w:val="20"/>
+                <w:szCs w:val="20"/>
+                <w:lang w:val="sr-Cyrl-RS" w:eastAsia="sr-Latn-RS"/>
+              </w:rPr>
+              <w:t>Ко је развио модел</w:t>
+            </w:r>
+          </w:p>
+        </w:tc>
+      </w:tr>
+      <w:tr>
+        <w:trPr>
+          <w:cnfStyle w:val="000000100000" w:firstRow="0" w:lastRow="0" w:firstColumn="0" w:lastColumn="0" w:oddVBand="0" w:evenVBand="0" w:oddHBand="1" w:evenHBand="0" w:firstRowFirstColumn="0" w:firstRowLastColumn="0" w:lastRowFirstColumn="0" w:lastRowLastColumn="0"/>
+          <w:trHeight w:val="288"/>
+        </w:trPr>
+        <w:tc>
+          <w:tcPr>
+            <w:cnfStyle w:val="001000000000" w:firstRow="0" w:lastRow="0" w:firstColumn="1" w:lastColumn="0" w:oddVBand="0" w:evenVBand="0" w:oddHBand="0" w:evenHBand="0" w:firstRowFirstColumn="0" w:firstRowLastColumn="0" w:lastRowFirstColumn="0" w:lastRowLastColumn="0"/>
+            <w:tcW w:w="1818" w:type="dxa"/>
+            <w:noWrap/>
+            <w:vAlign w:val="center"/>
+            <w:hideMark/>
+          </w:tcPr>
+          <w:p>
+            <w:pPr>
+              <w:jc w:val="center"/>
+              <w:rPr>
+                <w:rFonts w:ascii="Aptos Narrow" w:eastAsia="Times New Roman" w:hAnsi="Aptos Narrow" w:cs="Times New Roman"/>
+                <w:color w:val="000000"/>
+                <w:sz w:val="20"/>
+                <w:szCs w:val="20"/>
+                <w:lang w:val="sr-Latn-RS" w:eastAsia="sr-Latn-RS"/>
+              </w:rPr>
+            </w:pPr>
+            <w:r>
+              <w:rPr>
+                <w:rFonts w:ascii="Aptos Narrow" w:eastAsia="Times New Roman" w:hAnsi="Aptos Narrow" w:cs="Times New Roman"/>
+                <w:color w:val="000000"/>
+                <w:sz w:val="20"/>
+                <w:szCs w:val="20"/>
+                <w:lang w:val="sr-Latn-RS" w:eastAsia="sr-Latn-RS"/>
+              </w:rPr>
+              <w:t>llama3.2</w:t>
+            </w:r>
+          </w:p>
+        </w:tc>
+        <w:tc>
+          <w:tcPr>
+            <w:tcW w:w="2180" w:type="dxa"/>
+            <w:noWrap/>
+            <w:vAlign w:val="center"/>
+            <w:hideMark/>
+          </w:tcPr>
+          <w:p>
+            <w:pPr>
+              <w:jc w:val="center"/>
+              <w:cnfStyle w:val="000000100000" w:firstRow="0" w:lastRow="0" w:firstColumn="0" w:lastColumn="0" w:oddVBand="0" w:evenVBand="0" w:oddHBand="1" w:evenHBand="0" w:firstRowFirstColumn="0" w:firstRowLastColumn="0" w:lastRowFirstColumn="0" w:lastRowLastColumn="0"/>
+              <w:rPr>
+                <w:rFonts w:ascii="Aptos Narrow" w:eastAsia="Times New Roman" w:hAnsi="Aptos Narrow" w:cs="Times New Roman"/>
+                <w:color w:val="000000"/>
+                <w:sz w:val="20"/>
+                <w:szCs w:val="20"/>
+                <w:lang w:val="sr-Latn-RS" w:eastAsia="sr-Latn-RS"/>
+              </w:rPr>
+            </w:pPr>
+            <w:r>
+              <w:rPr>
+                <w:rFonts w:ascii="Aptos Narrow" w:eastAsia="Times New Roman" w:hAnsi="Aptos Narrow" w:cs="Times New Roman"/>
+                <w:color w:val="000000"/>
+                <w:sz w:val="20"/>
+                <w:szCs w:val="20"/>
+                <w:lang w:val="sr-Latn-RS" w:eastAsia="sr-Latn-RS"/>
+              </w:rPr>
+              <w:t>3072</w:t>
+            </w:r>
+          </w:p>
+        </w:tc>
+        <w:tc>
+          <w:tcPr>
+            <w:tcW w:w="2665" w:type="dxa"/>
+            <w:vAlign w:val="center"/>
+          </w:tcPr>
+          <w:p>
+            <w:pPr>
+              <w:jc w:val="center"/>
+              <w:cnfStyle w:val="000000100000" w:firstRow="0" w:lastRow="0" w:firstColumn="0" w:lastColumn="0" w:oddVBand="0" w:evenVBand="0" w:oddHBand="1" w:evenHBand="0" w:firstRowFirstColumn="0" w:firstRowLastColumn="0" w:lastRowFirstColumn="0" w:lastRowLastColumn="0"/>
+              <w:rPr>
+                <w:rFonts w:ascii="Aptos Narrow" w:eastAsia="Times New Roman" w:hAnsi="Aptos Narrow" w:cs="Times New Roman"/>
+                <w:color w:val="000000"/>
+                <w:sz w:val="20"/>
+                <w:szCs w:val="20"/>
+                <w:lang w:val="sr-Latn-RS" w:eastAsia="sr-Latn-RS"/>
+              </w:rPr>
+            </w:pPr>
+            <w:r>
+              <w:rPr>
+                <w:rFonts w:ascii="Aptos Narrow" w:eastAsia="Times New Roman" w:hAnsi="Aptos Narrow" w:cs="Times New Roman"/>
+                <w:color w:val="000000"/>
+                <w:sz w:val="20"/>
+                <w:szCs w:val="20"/>
+                <w:lang w:eastAsia="sr-Latn-RS"/>
+              </w:rPr>
+              <w:t>3</w:t>
+            </w:r>
+            <w:r>
+              <w:rPr>
+                <w:rFonts w:ascii="Aptos Narrow" w:eastAsia="Times New Roman" w:hAnsi="Aptos Narrow" w:cs="Times New Roman"/>
+                <w:color w:val="000000"/>
+                <w:sz w:val="20"/>
+                <w:szCs w:val="20"/>
+                <w:lang w:eastAsia="sr-Latn-RS"/>
+              </w:rPr>
+              <w:t xml:space="preserve">.2 </w:t>
+            </w:r>
+            <w:r>
+              <w:rPr>
+                <w:rFonts w:ascii="Aptos Narrow" w:eastAsia="Times New Roman" w:hAnsi="Aptos Narrow" w:cs="Times New Roman"/>
+                <w:color w:val="000000"/>
+                <w:sz w:val="20"/>
+                <w:szCs w:val="20"/>
+                <w:lang w:eastAsia="sr-Latn-RS"/>
+              </w:rPr>
+              <w:t>B</w:t>
+            </w:r>
+          </w:p>
+        </w:tc>
+        <w:tc>
+          <w:tcPr>
+            <w:tcW w:w="1695" w:type="dxa"/>
+          </w:tcPr>
+          <w:p>
+            <w:pPr>
+              <w:cnfStyle w:val="000000100000" w:firstRow="0" w:lastRow="0" w:firstColumn="0" w:lastColumn="0" w:oddVBand="0" w:evenVBand="0" w:oddHBand="1" w:evenHBand="0" w:firstRowFirstColumn="0" w:firstRowLastColumn="0" w:lastRowFirstColumn="0" w:lastRowLastColumn="0"/>
+              <w:rPr>
+                <w:rFonts w:ascii="Aptos Narrow" w:eastAsia="Times New Roman" w:hAnsi="Aptos Narrow" w:cs="Times New Roman"/>
+                <w:color w:val="000000"/>
+                <w:sz w:val="20"/>
+                <w:szCs w:val="20"/>
+                <w:lang w:val="sr-Latn-RS" w:eastAsia="sr-Latn-RS"/>
+              </w:rPr>
+            </w:pPr>
+            <w:r>
+              <w:rPr>
+                <w:rFonts w:ascii="Aptos Narrow" w:eastAsia="Times New Roman" w:hAnsi="Aptos Narrow" w:cs="Times New Roman"/>
+                <w:color w:val="000000"/>
+                <w:sz w:val="20"/>
+                <w:szCs w:val="20"/>
+                <w:lang w:val="sr-Latn-RS" w:eastAsia="sr-Latn-RS"/>
+              </w:rPr>
+              <w:t>Meta</w:t>
+            </w:r>
+          </w:p>
+        </w:tc>
+      </w:tr>
+      <w:tr>
+        <w:trPr>
+          <w:trHeight w:val="288"/>
+        </w:trPr>
+        <w:tc>
+          <w:tcPr>
+            <w:cnfStyle w:val="001000000000" w:firstRow="0" w:lastRow="0" w:firstColumn="1" w:lastColumn="0" w:oddVBand="0" w:evenVBand="0" w:oddHBand="0" w:evenHBand="0" w:firstRowFirstColumn="0" w:firstRowLastColumn="0" w:lastRowFirstColumn="0" w:lastRowLastColumn="0"/>
+            <w:tcW w:w="1818" w:type="dxa"/>
+            <w:noWrap/>
+            <w:vAlign w:val="center"/>
+            <w:hideMark/>
+          </w:tcPr>
+          <w:p>
+            <w:pPr>
+              <w:jc w:val="center"/>
+              <w:rPr>
+                <w:rFonts w:ascii="Aptos Narrow" w:eastAsia="Times New Roman" w:hAnsi="Aptos Narrow" w:cs="Times New Roman"/>
+                <w:color w:val="000000"/>
+                <w:sz w:val="20"/>
+                <w:szCs w:val="20"/>
+                <w:lang w:val="sr-Latn-RS" w:eastAsia="sr-Latn-RS"/>
+              </w:rPr>
+            </w:pPr>
+            <w:proofErr w:type="spellStart"/>
+            <w:r>
+              <w:rPr>
+                <w:rFonts w:ascii="Aptos Narrow" w:eastAsia="Times New Roman" w:hAnsi="Aptos Narrow" w:cs="Times New Roman"/>
+                <w:color w:val="000000"/>
+                <w:sz w:val="20"/>
+                <w:szCs w:val="20"/>
+                <w:lang w:val="sr-Latn-RS" w:eastAsia="sr-Latn-RS"/>
+              </w:rPr>
+              <w:t>mistral</w:t>
+            </w:r>
+            <w:proofErr w:type="spellEnd"/>
+          </w:p>
+        </w:tc>
+        <w:tc>
+          <w:tcPr>
+            <w:tcW w:w="2180" w:type="dxa"/>
+            <w:noWrap/>
+            <w:vAlign w:val="center"/>
+            <w:hideMark/>
+          </w:tcPr>
+          <w:p>
+            <w:pPr>
+              <w:jc w:val="center"/>
+              <w:cnfStyle w:val="000000000000" w:firstRow="0" w:lastRow="0" w:firstColumn="0" w:lastColumn="0" w:oddVBand="0" w:evenVBand="0" w:oddHBand="0" w:evenHBand="0" w:firstRowFirstColumn="0" w:firstRowLastColumn="0" w:lastRowFirstColumn="0" w:lastRowLastColumn="0"/>
+              <w:rPr>
+                <w:rFonts w:ascii="Aptos Narrow" w:eastAsia="Times New Roman" w:hAnsi="Aptos Narrow" w:cs="Times New Roman"/>
+                <w:color w:val="000000"/>
+                <w:sz w:val="20"/>
+                <w:szCs w:val="20"/>
+                <w:lang w:val="sr-Latn-RS" w:eastAsia="sr-Latn-RS"/>
+              </w:rPr>
+            </w:pPr>
+            <w:r>
+              <w:rPr>
+                <w:rFonts w:ascii="Aptos Narrow" w:eastAsia="Times New Roman" w:hAnsi="Aptos Narrow" w:cs="Times New Roman"/>
+                <w:color w:val="000000"/>
+                <w:sz w:val="20"/>
+                <w:szCs w:val="20"/>
+                <w:lang w:val="sr-Latn-RS" w:eastAsia="sr-Latn-RS"/>
+              </w:rPr>
+              <w:t>4096</w:t>
+            </w:r>
+          </w:p>
+        </w:tc>
+        <w:tc>
+          <w:tcPr>
+            <w:tcW w:w="2665" w:type="dxa"/>
+            <w:vAlign w:val="center"/>
+          </w:tcPr>
+          <w:p>
+            <w:pPr>
+              <w:jc w:val="center"/>
+              <w:cnfStyle w:val="000000000000" w:firstRow="0" w:lastRow="0" w:firstColumn="0" w:lastColumn="0" w:oddVBand="0" w:evenVBand="0" w:oddHBand="0" w:evenHBand="0" w:firstRowFirstColumn="0" w:firstRowLastColumn="0" w:lastRowFirstColumn="0" w:lastRowLastColumn="0"/>
+              <w:rPr>
+                <w:rFonts w:ascii="Aptos Narrow" w:eastAsia="Times New Roman" w:hAnsi="Aptos Narrow" w:cs="Times New Roman"/>
+                <w:color w:val="000000"/>
+                <w:sz w:val="20"/>
+                <w:szCs w:val="20"/>
+                <w:lang w:val="sr-Latn-RS" w:eastAsia="sr-Latn-RS"/>
+              </w:rPr>
+            </w:pPr>
+            <w:r>
+              <w:rPr>
+                <w:rFonts w:ascii="Aptos Narrow" w:eastAsia="Times New Roman" w:hAnsi="Aptos Narrow" w:cs="Times New Roman"/>
+                <w:color w:val="000000"/>
+                <w:sz w:val="20"/>
+                <w:szCs w:val="20"/>
+                <w:lang w:eastAsia="sr-Latn-RS"/>
+              </w:rPr>
+              <w:t>7</w:t>
+            </w:r>
+            <w:r>
+              <w:rPr>
+                <w:rFonts w:ascii="Aptos Narrow" w:eastAsia="Times New Roman" w:hAnsi="Aptos Narrow" w:cs="Times New Roman"/>
+                <w:color w:val="000000"/>
+                <w:sz w:val="20"/>
+                <w:szCs w:val="20"/>
+                <w:lang w:eastAsia="sr-Latn-RS"/>
+              </w:rPr>
+              <w:t xml:space="preserve"> </w:t>
+            </w:r>
+            <w:r>
+              <w:rPr>
+                <w:rFonts w:ascii="Aptos Narrow" w:eastAsia="Times New Roman" w:hAnsi="Aptos Narrow" w:cs="Times New Roman"/>
+                <w:color w:val="000000"/>
+                <w:sz w:val="20"/>
+                <w:szCs w:val="20"/>
+                <w:lang w:eastAsia="sr-Latn-RS"/>
+              </w:rPr>
+              <w:t>B</w:t>
+            </w:r>
+          </w:p>
+        </w:tc>
+        <w:tc>
+          <w:tcPr>
+            <w:tcW w:w="1695" w:type="dxa"/>
+          </w:tcPr>
+          <w:p>
+            <w:pPr>
+              <w:cnfStyle w:val="000000000000" w:firstRow="0" w:lastRow="0" w:firstColumn="0" w:lastColumn="0" w:oddVBand="0" w:evenVBand="0" w:oddHBand="0" w:evenHBand="0" w:firstRowFirstColumn="0" w:firstRowLastColumn="0" w:lastRowFirstColumn="0" w:lastRowLastColumn="0"/>
+              <w:rPr>
+                <w:rFonts w:ascii="Aptos Narrow" w:eastAsia="Times New Roman" w:hAnsi="Aptos Narrow" w:cs="Times New Roman"/>
+                <w:color w:val="000000"/>
+                <w:sz w:val="20"/>
+                <w:szCs w:val="20"/>
+                <w:lang w:eastAsia="sr-Latn-RS"/>
+              </w:rPr>
+            </w:pPr>
+            <w:r>
+              <w:rPr>
+                <w:rFonts w:ascii="Aptos Narrow" w:eastAsia="Times New Roman" w:hAnsi="Aptos Narrow" w:cs="Times New Roman"/>
+                <w:color w:val="000000"/>
+                <w:sz w:val="20"/>
+                <w:szCs w:val="20"/>
+                <w:lang w:eastAsia="sr-Latn-RS"/>
+              </w:rPr>
+              <w:t> Arthur Mensch, Guillaume Lample, and Timothée Lacroix</w:t>
+            </w:r>
+          </w:p>
+        </w:tc>
+      </w:tr>
+      <w:tr>
+        <w:trPr>
+          <w:cnfStyle w:val="000000100000" w:firstRow="0" w:lastRow="0" w:firstColumn="0" w:lastColumn="0" w:oddVBand="0" w:evenVBand="0" w:oddHBand="1" w:evenHBand="0" w:firstRowFirstColumn="0" w:firstRowLastColumn="0" w:lastRowFirstColumn="0" w:lastRowLastColumn="0"/>
+          <w:trHeight w:val="288"/>
+        </w:trPr>
+        <w:tc>
+          <w:tcPr>
+            <w:cnfStyle w:val="001000000000" w:firstRow="0" w:lastRow="0" w:firstColumn="1" w:lastColumn="0" w:oddVBand="0" w:evenVBand="0" w:oddHBand="0" w:evenHBand="0" w:firstRowFirstColumn="0" w:firstRowLastColumn="0" w:lastRowFirstColumn="0" w:lastRowLastColumn="0"/>
+            <w:tcW w:w="1818" w:type="dxa"/>
+            <w:noWrap/>
+            <w:vAlign w:val="center"/>
+            <w:hideMark/>
+          </w:tcPr>
+          <w:p>
+            <w:pPr>
+              <w:jc w:val="center"/>
+              <w:rPr>
+                <w:rFonts w:ascii="Aptos Narrow" w:eastAsia="Times New Roman" w:hAnsi="Aptos Narrow" w:cs="Times New Roman"/>
+                <w:color w:val="000000"/>
+                <w:sz w:val="20"/>
+                <w:szCs w:val="20"/>
+                <w:lang w:val="sr-Latn-RS" w:eastAsia="sr-Latn-RS"/>
+              </w:rPr>
+            </w:pPr>
+            <w:r>
+              <w:rPr>
+                <w:rFonts w:ascii="Aptos Narrow" w:eastAsia="Times New Roman" w:hAnsi="Aptos Narrow" w:cs="Times New Roman"/>
+                <w:color w:val="000000"/>
+                <w:sz w:val="20"/>
+                <w:szCs w:val="20"/>
+                <w:lang w:val="sr-Latn-RS" w:eastAsia="sr-Latn-RS"/>
+              </w:rPr>
+              <w:t>granite3.3</w:t>
+            </w:r>
+          </w:p>
+        </w:tc>
+        <w:tc>
+          <w:tcPr>
+            <w:tcW w:w="2180" w:type="dxa"/>
+            <w:noWrap/>
+            <w:vAlign w:val="center"/>
+            <w:hideMark/>
+          </w:tcPr>
+          <w:p>
+            <w:pPr>
+              <w:jc w:val="center"/>
+              <w:cnfStyle w:val="000000100000" w:firstRow="0" w:lastRow="0" w:firstColumn="0" w:lastColumn="0" w:oddVBand="0" w:evenVBand="0" w:oddHBand="1" w:evenHBand="0" w:firstRowFirstColumn="0" w:firstRowLastColumn="0" w:lastRowFirstColumn="0" w:lastRowLastColumn="0"/>
+              <w:rPr>
+                <w:rFonts w:ascii="Aptos Narrow" w:eastAsia="Times New Roman" w:hAnsi="Aptos Narrow" w:cs="Times New Roman"/>
+                <w:color w:val="000000"/>
+                <w:sz w:val="20"/>
+                <w:szCs w:val="20"/>
+                <w:lang w:val="sr-Latn-RS" w:eastAsia="sr-Latn-RS"/>
+              </w:rPr>
+            </w:pPr>
+            <w:r>
+              <w:rPr>
+                <w:rFonts w:ascii="Aptos Narrow" w:eastAsia="Times New Roman" w:hAnsi="Aptos Narrow" w:cs="Times New Roman"/>
+                <w:color w:val="000000"/>
+                <w:sz w:val="20"/>
+                <w:szCs w:val="20"/>
+                <w:lang w:val="sr-Latn-RS" w:eastAsia="sr-Latn-RS"/>
+              </w:rPr>
+              <w:t>4096</w:t>
+            </w:r>
+          </w:p>
+        </w:tc>
+        <w:tc>
+          <w:tcPr>
+            <w:tcW w:w="2665" w:type="dxa"/>
+            <w:vAlign w:val="center"/>
+          </w:tcPr>
+          <w:p>
+            <w:pPr>
+              <w:jc w:val="center"/>
+              <w:cnfStyle w:val="000000100000" w:firstRow="0" w:lastRow="0" w:firstColumn="0" w:lastColumn="0" w:oddVBand="0" w:evenVBand="0" w:oddHBand="1" w:evenHBand="0" w:firstRowFirstColumn="0" w:firstRowLastColumn="0" w:lastRowFirstColumn="0" w:lastRowLastColumn="0"/>
+              <w:rPr>
+                <w:rFonts w:ascii="Aptos Narrow" w:eastAsia="Times New Roman" w:hAnsi="Aptos Narrow" w:cs="Times New Roman"/>
+                <w:color w:val="000000"/>
+                <w:sz w:val="20"/>
+                <w:szCs w:val="20"/>
+                <w:lang w:val="sr-Latn-RS" w:eastAsia="sr-Latn-RS"/>
+              </w:rPr>
+            </w:pPr>
+            <w:r>
+              <w:rPr>
+                <w:rFonts w:ascii="Aptos Narrow" w:eastAsia="Times New Roman" w:hAnsi="Aptos Narrow" w:cs="Times New Roman"/>
+                <w:color w:val="000000"/>
+                <w:sz w:val="20"/>
+                <w:szCs w:val="20"/>
+                <w:lang w:eastAsia="sr-Latn-RS"/>
+              </w:rPr>
+              <w:t>8</w:t>
+            </w:r>
+            <w:r>
+              <w:rPr>
+                <w:rFonts w:ascii="Aptos Narrow" w:eastAsia="Times New Roman" w:hAnsi="Aptos Narrow" w:cs="Times New Roman"/>
+                <w:color w:val="000000"/>
+                <w:sz w:val="20"/>
+                <w:szCs w:val="20"/>
+                <w:lang w:eastAsia="sr-Latn-RS"/>
+              </w:rPr>
+              <w:t xml:space="preserve"> </w:t>
+            </w:r>
+            <w:r>
+              <w:rPr>
+                <w:rFonts w:ascii="Aptos Narrow" w:eastAsia="Times New Roman" w:hAnsi="Aptos Narrow" w:cs="Times New Roman"/>
+                <w:color w:val="000000"/>
+                <w:sz w:val="20"/>
+                <w:szCs w:val="20"/>
+                <w:lang w:eastAsia="sr-Latn-RS"/>
+              </w:rPr>
+              <w:t>B</w:t>
+            </w:r>
+          </w:p>
+        </w:tc>
+        <w:tc>
+          <w:tcPr>
+            <w:tcW w:w="1695" w:type="dxa"/>
+          </w:tcPr>
+          <w:p>
+            <w:pPr>
+              <w:cnfStyle w:val="000000100000" w:firstRow="0" w:lastRow="0" w:firstColumn="0" w:lastColumn="0" w:oddVBand="0" w:evenVBand="0" w:oddHBand="1" w:evenHBand="0" w:firstRowFirstColumn="0" w:firstRowLastColumn="0" w:lastRowFirstColumn="0" w:lastRowLastColumn="0"/>
+              <w:rPr>
+                <w:rFonts w:ascii="Aptos Narrow" w:eastAsia="Times New Roman" w:hAnsi="Aptos Narrow" w:cs="Times New Roman"/>
+                <w:color w:val="000000"/>
+                <w:sz w:val="20"/>
+                <w:szCs w:val="20"/>
+                <w:lang w:eastAsia="sr-Latn-RS"/>
+              </w:rPr>
+            </w:pPr>
+            <w:r>
+              <w:rPr>
+                <w:rFonts w:ascii="Aptos Narrow" w:eastAsia="Times New Roman" w:hAnsi="Aptos Narrow" w:cs="Times New Roman"/>
+                <w:color w:val="000000"/>
+                <w:sz w:val="20"/>
+                <w:szCs w:val="20"/>
+                <w:lang w:eastAsia="sr-Latn-RS"/>
+              </w:rPr>
+              <w:t>IBM</w:t>
+            </w:r>
+          </w:p>
+        </w:tc>
+      </w:tr>
+      <w:tr>
+        <w:trPr>
+          <w:trHeight w:val="288"/>
+        </w:trPr>
+        <w:tc>
+          <w:tcPr>
+            <w:cnfStyle w:val="001000000000" w:firstRow="0" w:lastRow="0" w:firstColumn="1" w:lastColumn="0" w:oddVBand="0" w:evenVBand="0" w:oddHBand="0" w:evenHBand="0" w:firstRowFirstColumn="0" w:firstRowLastColumn="0" w:lastRowFirstColumn="0" w:lastRowLastColumn="0"/>
+            <w:tcW w:w="1818" w:type="dxa"/>
+            <w:noWrap/>
+            <w:vAlign w:val="center"/>
+            <w:hideMark/>
+          </w:tcPr>
+          <w:p>
+            <w:pPr>
+              <w:jc w:val="center"/>
+              <w:rPr>
+                <w:rFonts w:ascii="Aptos Narrow" w:eastAsia="Times New Roman" w:hAnsi="Aptos Narrow" w:cs="Times New Roman"/>
+                <w:color w:val="000000"/>
+                <w:sz w:val="20"/>
+                <w:szCs w:val="20"/>
+                <w:lang w:val="sr-Latn-RS" w:eastAsia="sr-Latn-RS"/>
+              </w:rPr>
+            </w:pPr>
+            <w:r>
+              <w:rPr>
+                <w:rFonts w:ascii="Aptos Narrow" w:eastAsia="Times New Roman" w:hAnsi="Aptos Narrow" w:cs="Times New Roman"/>
+                <w:color w:val="000000"/>
+                <w:sz w:val="20"/>
+                <w:szCs w:val="20"/>
+                <w:lang w:val="sr-Latn-RS" w:eastAsia="sr-Latn-RS"/>
+              </w:rPr>
+              <w:t>qwen3:4b</w:t>
+            </w:r>
+          </w:p>
+        </w:tc>
+        <w:tc>
+          <w:tcPr>
+            <w:tcW w:w="2180" w:type="dxa"/>
+            <w:noWrap/>
+            <w:vAlign w:val="center"/>
+            <w:hideMark/>
+          </w:tcPr>
+          <w:p>
+            <w:pPr>
+              <w:jc w:val="center"/>
+              <w:cnfStyle w:val="000000000000" w:firstRow="0" w:lastRow="0" w:firstColumn="0" w:lastColumn="0" w:oddVBand="0" w:evenVBand="0" w:oddHBand="0" w:evenHBand="0" w:firstRowFirstColumn="0" w:firstRowLastColumn="0" w:lastRowFirstColumn="0" w:lastRowLastColumn="0"/>
+              <w:rPr>
+                <w:rFonts w:ascii="Aptos Narrow" w:eastAsia="Times New Roman" w:hAnsi="Aptos Narrow" w:cs="Times New Roman"/>
+                <w:color w:val="000000"/>
+                <w:sz w:val="20"/>
+                <w:szCs w:val="20"/>
+                <w:lang w:val="sr-Latn-RS" w:eastAsia="sr-Latn-RS"/>
+              </w:rPr>
+            </w:pPr>
+            <w:r>
+              <w:rPr>
+                <w:rFonts w:ascii="Aptos Narrow" w:eastAsia="Times New Roman" w:hAnsi="Aptos Narrow" w:cs="Times New Roman"/>
+                <w:color w:val="000000"/>
+                <w:sz w:val="20"/>
+                <w:szCs w:val="20"/>
+                <w:lang w:val="sr-Latn-RS" w:eastAsia="sr-Latn-RS"/>
+              </w:rPr>
+              <w:t>2560</w:t>
+            </w:r>
+          </w:p>
+        </w:tc>
+        <w:tc>
+          <w:tcPr>
+            <w:tcW w:w="2665" w:type="dxa"/>
+            <w:vAlign w:val="center"/>
+          </w:tcPr>
+          <w:p>
+            <w:pPr>
+              <w:jc w:val="center"/>
+              <w:cnfStyle w:val="000000000000" w:firstRow="0" w:lastRow="0" w:firstColumn="0" w:lastColumn="0" w:oddVBand="0" w:evenVBand="0" w:oddHBand="0" w:evenHBand="0" w:firstRowFirstColumn="0" w:firstRowLastColumn="0" w:lastRowFirstColumn="0" w:lastRowLastColumn="0"/>
+              <w:rPr>
+                <w:rFonts w:ascii="Aptos Narrow" w:eastAsia="Times New Roman" w:hAnsi="Aptos Narrow" w:cs="Times New Roman"/>
+                <w:color w:val="000000"/>
+                <w:sz w:val="20"/>
+                <w:szCs w:val="20"/>
+                <w:lang w:val="sr-Latn-RS" w:eastAsia="sr-Latn-RS"/>
+              </w:rPr>
+            </w:pPr>
+            <w:r>
+              <w:rPr>
+                <w:rFonts w:ascii="Aptos Narrow" w:eastAsia="Times New Roman" w:hAnsi="Aptos Narrow" w:cs="Times New Roman"/>
+                <w:color w:val="000000"/>
+                <w:sz w:val="20"/>
+                <w:szCs w:val="20"/>
+                <w:lang w:val="sr-Latn-RS" w:eastAsia="sr-Latn-RS"/>
+              </w:rPr>
+              <w:t>4 B</w:t>
+            </w:r>
+          </w:p>
+        </w:tc>
+        <w:tc>
+          <w:tcPr>
+            <w:tcW w:w="1695" w:type="dxa"/>
+          </w:tcPr>
+          <w:p>
+            <w:pPr>
+              <w:cnfStyle w:val="000000000000" w:firstRow="0" w:lastRow="0" w:firstColumn="0" w:lastColumn="0" w:oddVBand="0" w:evenVBand="0" w:oddHBand="0" w:evenHBand="0" w:firstRowFirstColumn="0" w:firstRowLastColumn="0" w:lastRowFirstColumn="0" w:lastRowLastColumn="0"/>
+              <w:rPr>
+                <w:rFonts w:ascii="Aptos Narrow" w:eastAsia="Times New Roman" w:hAnsi="Aptos Narrow" w:cs="Times New Roman"/>
+                <w:color w:val="000000"/>
+                <w:sz w:val="20"/>
+                <w:szCs w:val="20"/>
+                <w:lang w:val="sr-Latn-RS" w:eastAsia="sr-Latn-RS"/>
+              </w:rPr>
+            </w:pPr>
+            <w:proofErr w:type="spellStart"/>
+            <w:r>
+              <w:rPr>
+                <w:rFonts w:ascii="Aptos Narrow" w:eastAsia="Times New Roman" w:hAnsi="Aptos Narrow" w:cs="Times New Roman"/>
+                <w:color w:val="000000"/>
+                <w:sz w:val="20"/>
+                <w:szCs w:val="20"/>
+                <w:lang w:val="sr-Latn-RS" w:eastAsia="sr-Latn-RS"/>
+              </w:rPr>
+              <w:t>Alibaba</w:t>
+            </w:r>
+            <w:proofErr w:type="spellEnd"/>
+            <w:r>
+              <w:rPr>
+                <w:rFonts w:ascii="Aptos Narrow" w:eastAsia="Times New Roman" w:hAnsi="Aptos Narrow" w:cs="Times New Roman"/>
+                <w:color w:val="000000"/>
+                <w:sz w:val="20"/>
+                <w:szCs w:val="20"/>
+                <w:lang w:val="sr-Latn-RS" w:eastAsia="sr-Latn-RS"/>
+              </w:rPr>
+              <w:t xml:space="preserve"> </w:t>
+            </w:r>
+            <w:proofErr w:type="spellStart"/>
+            <w:r>
+              <w:rPr>
+                <w:rFonts w:ascii="Aptos Narrow" w:eastAsia="Times New Roman" w:hAnsi="Aptos Narrow" w:cs="Times New Roman"/>
+                <w:color w:val="000000"/>
+                <w:sz w:val="20"/>
+                <w:szCs w:val="20"/>
+                <w:lang w:val="sr-Latn-RS" w:eastAsia="sr-Latn-RS"/>
+              </w:rPr>
+              <w:t>Cloud</w:t>
+            </w:r>
+            <w:proofErr w:type="spellEnd"/>
+          </w:p>
+        </w:tc>
+      </w:tr>
+    </w:tbl>
+    <w:p>
+      <w:pPr>
+        <w:ind w:firstLine="720"/>
+        <w:jc w:val="both"/>
+        <w:rPr>
+          <w:lang w:val="sr-Cyrl-RS"/>
         </w:rPr>
       </w:pPr>
     </w:p>
@@ -35963,9 +37416,9 @@
           <w:color w:val="auto"/>
           <w:sz w:val="24"/>
           <w:szCs w:val="24"/>
-          <w:lang w:val="en-US"/>
-        </w:rPr>
-        <w:t>9</w:t>
+          <w:lang w:val="sr-Cyrl-RS"/>
+        </w:rPr>
+        <w:t>5</w:t>
       </w:r>
       <w:r>
         <w:rPr>
@@ -35976,7 +37429,7 @@
           <w:szCs w:val="24"/>
           <w:lang w:val="sr-Cyrl-RS"/>
         </w:rPr>
-        <w:t xml:space="preserve">. </w:t>
+        <w:t>.</w:t>
       </w:r>
       <w:r>
         <w:rPr>
@@ -35987,9 +37440,42 @@
           <w:szCs w:val="24"/>
           <w:lang w:val="sr-Cyrl-RS"/>
         </w:rPr>
+        <w:t>7</w:t>
+      </w:r>
+      <w:r>
+        <w:rPr>
+          <w:b/>
+          <w:i w:val="0"/>
+          <w:color w:val="auto"/>
+          <w:sz w:val="24"/>
+          <w:szCs w:val="24"/>
+          <w:lang w:val="sr-Cyrl-RS"/>
+        </w:rPr>
+        <w:t xml:space="preserve"> -</w:t>
+      </w:r>
+      <w:r>
+        <w:rPr>
+          <w:b/>
+          <w:i w:val="0"/>
+          <w:color w:val="auto"/>
+          <w:sz w:val="24"/>
+          <w:szCs w:val="24"/>
+          <w:lang w:val="sr-Cyrl-RS"/>
+        </w:rPr>
+        <w:t xml:space="preserve"> </w:t>
+      </w:r>
+      <w:r>
+        <w:rPr>
+          <w:b/>
+          <w:i w:val="0"/>
+          <w:color w:val="auto"/>
+          <w:sz w:val="24"/>
+          <w:szCs w:val="24"/>
+          <w:lang w:val="sr-Cyrl-RS"/>
+        </w:rPr>
         <w:t xml:space="preserve">Резултати тестирања са различитим метрикама за модел </w:t>
       </w:r>
-      <w:bookmarkStart w:id="26" w:name="_Hlk205810646"/>
+      <w:bookmarkStart w:id="27" w:name="_Hlk205810646"/>
       <w:r>
         <w:rPr>
           <w:b/>
@@ -36001,7 +37487,7 @@
         </w:rPr>
         <w:t>granite3.3</w:t>
       </w:r>
-      <w:bookmarkEnd w:id="26"/>
+      <w:bookmarkEnd w:id="27"/>
     </w:p>
     <w:p>
       <w:pPr>
@@ -36016,8 +37502,21 @@
           <w:rFonts w:cs="Times New Roman"/>
           <w:lang w:val="sr-Cyrl-RS"/>
         </w:rPr>
-        <w:lastRenderedPageBreak/>
-        <w:t xml:space="preserve"> На основу слике 9, види се модел</w:t>
+        <w:t xml:space="preserve"> На основу слике </w:t>
+      </w:r>
+      <w:r>
+        <w:rPr>
+          <w:rFonts w:cs="Times New Roman"/>
+          <w:lang w:val="sr-Cyrl-RS"/>
+        </w:rPr>
+        <w:t>5.7</w:t>
+      </w:r>
+      <w:r>
+        <w:rPr>
+          <w:rFonts w:cs="Times New Roman"/>
+          <w:lang w:val="sr-Cyrl-RS"/>
+        </w:rPr>
+        <w:t>, види се модел</w:t>
       </w:r>
       <w:r>
         <w:t xml:space="preserve"> </w:t>
@@ -36092,7 +37591,21 @@
           <w:rFonts w:cs="Times New Roman"/>
           <w:lang w:val="sr-Cyrl-RS"/>
         </w:rPr>
-        <w:t>метрика са 15 и 20 најближих суседа. У тим случајевима, посматрајући слику 10, пронађени филмови су се налазили на петом месту</w:t>
+        <w:t xml:space="preserve">метрика са 15 и 20 најближих суседа. У тим случајевима, посматрајући слику </w:t>
+      </w:r>
+      <w:r>
+        <w:rPr>
+          <w:rFonts w:cs="Times New Roman"/>
+          <w:lang w:val="sr-Cyrl-RS"/>
+        </w:rPr>
+        <w:t>5.8</w:t>
+      </w:r>
+      <w:r>
+        <w:rPr>
+          <w:rFonts w:cs="Times New Roman"/>
+          <w:lang w:val="sr-Cyrl-RS"/>
+        </w:rPr>
+        <w:t>, пронађени филмови су се налазили на петом месту</w:t>
       </w:r>
       <w:r>
         <w:rPr>
@@ -36101,6 +37614,15 @@
         </w:rPr>
         <w:t>.</w:t>
       </w:r>
+    </w:p>
+    <w:p>
+      <w:pPr>
+        <w:jc w:val="both"/>
+        <w:rPr>
+          <w:rFonts w:cs="Times New Roman"/>
+          <w:lang w:val="sr-Cyrl-RS"/>
+        </w:rPr>
+      </w:pPr>
     </w:p>
     <w:p>
       <w:pPr>
@@ -36189,7 +37711,7 @@
           <w:szCs w:val="24"/>
           <w:lang w:val="sr-Cyrl-RS"/>
         </w:rPr>
-        <w:t>10</w:t>
+        <w:t>5.8</w:t>
       </w:r>
       <w:r>
         <w:rPr>
@@ -36200,7 +37722,7 @@
           <w:szCs w:val="24"/>
           <w:lang w:val="sr-Cyrl-RS"/>
         </w:rPr>
-        <w:t xml:space="preserve">. </w:t>
+        <w:t xml:space="preserve"> - </w:t>
       </w:r>
       <w:r>
         <w:rPr>
@@ -36243,6 +37765,7 @@
         <w:rPr>
           <w:lang w:val="sr-Cyrl-RS"/>
         </w:rPr>
+        <w:lastRenderedPageBreak/>
         <w:t xml:space="preserve">Резултати тестирања за модел </w:t>
       </w:r>
       <w:r>
@@ -36255,7 +37778,19 @@
         <w:rPr>
           <w:lang w:val="sr-Cyrl-RS"/>
         </w:rPr>
-        <w:t xml:space="preserve">који су приказани на слици 11, примећује се да се доста боље показао у  односу на претходни модел, тј. да је у већини случајева успео да пронађе одговарајући филм на основу унетог </w:t>
+        <w:t xml:space="preserve">који су приказани на слици </w:t>
+      </w:r>
+      <w:r>
+        <w:rPr>
+          <w:lang w:val="sr-Cyrl-RS"/>
+        </w:rPr>
+        <w:t>5.9</w:t>
+      </w:r>
+      <w:r>
+        <w:rPr>
+          <w:lang w:val="sr-Cyrl-RS"/>
+        </w:rPr>
+        <w:t xml:space="preserve">, примећује се да се доста боље показао у  односу на претходни модел, тј. да је у већини случајева успео да пронађе одговарајући филм на основу унетог </w:t>
       </w:r>
       <w:r>
         <w:rPr>
@@ -36296,6 +37831,14 @@
         </w:rPr>
         <w:t>.</w:t>
       </w:r>
+    </w:p>
+    <w:p>
+      <w:pPr>
+        <w:jc w:val="both"/>
+        <w:rPr>
+          <w:lang w:val="sr-Cyrl-RS"/>
+        </w:rPr>
+      </w:pPr>
     </w:p>
     <w:p>
       <w:pPr>
@@ -36384,7 +37927,7 @@
           <w:szCs w:val="24"/>
           <w:lang w:val="sr-Cyrl-RS"/>
         </w:rPr>
-        <w:t>11</w:t>
+        <w:t>5.9</w:t>
       </w:r>
       <w:r>
         <w:rPr>
@@ -36395,7 +37938,18 @@
           <w:szCs w:val="24"/>
           <w:lang w:val="sr-Cyrl-RS"/>
         </w:rPr>
-        <w:t xml:space="preserve">. </w:t>
+        <w:t xml:space="preserve"> -</w:t>
+      </w:r>
+      <w:r>
+        <w:rPr>
+          <w:b/>
+          <w:i w:val="0"/>
+          <w:color w:val="auto"/>
+          <w:sz w:val="24"/>
+          <w:szCs w:val="24"/>
+          <w:lang w:val="sr-Cyrl-RS"/>
+        </w:rPr>
+        <w:t xml:space="preserve"> </w:t>
       </w:r>
       <w:r>
         <w:rPr>
@@ -36422,6 +37976,13 @@
     </w:p>
     <w:p>
       <w:pPr>
+        <w:rPr>
+          <w:lang w:val="sr-Cyrl-RS"/>
+        </w:rPr>
+      </w:pPr>
+    </w:p>
+    <w:p>
+      <w:pPr>
         <w:keepNext/>
       </w:pPr>
       <w:r>
@@ -36430,7 +37991,6 @@
           <w:noProof/>
           <w:lang w:val="sr-Cyrl-RS"/>
         </w:rPr>
-        <w:lastRenderedPageBreak/>
         <w:drawing>
           <wp:inline distT="0" distB="0" distL="0" distR="0" wp14:anchorId="43E19527" wp14:editId="4023DC00">
             <wp:extent cx="5274945" cy="3115945"/>
@@ -36507,7 +38067,40 @@
           <w:szCs w:val="24"/>
           <w:lang w:val="sr-Cyrl-RS"/>
         </w:rPr>
-        <w:t>1</w:t>
+        <w:t>5.10</w:t>
+      </w:r>
+      <w:r>
+        <w:rPr>
+          <w:b/>
+          <w:i w:val="0"/>
+          <w:color w:val="auto"/>
+          <w:sz w:val="24"/>
+          <w:szCs w:val="24"/>
+          <w:lang w:val="sr-Cyrl-RS"/>
+        </w:rPr>
+        <w:t xml:space="preserve"> -</w:t>
+      </w:r>
+      <w:r>
+        <w:rPr>
+          <w:b/>
+          <w:i w:val="0"/>
+          <w:color w:val="auto"/>
+          <w:sz w:val="24"/>
+          <w:szCs w:val="24"/>
+          <w:lang w:val="sr-Cyrl-RS"/>
+        </w:rPr>
+        <w:t xml:space="preserve"> </w:t>
+      </w:r>
+      <w:r>
+        <w:rPr>
+          <w:b/>
+          <w:i w:val="0"/>
+          <w:color w:val="auto"/>
+          <w:sz w:val="24"/>
+          <w:szCs w:val="24"/>
+          <w:lang w:val="sr-Cyrl-RS"/>
+        </w:rPr>
+        <w:t xml:space="preserve">Просечан ранг пронађених филмова за модел </w:t>
       </w:r>
       <w:r>
         <w:rPr>
@@ -36518,39 +38111,6 @@
           <w:szCs w:val="24"/>
           <w:lang w:val="en-US"/>
         </w:rPr>
-        <w:t>2</w:t>
-      </w:r>
-      <w:r>
-        <w:rPr>
-          <w:b/>
-          <w:i w:val="0"/>
-          <w:color w:val="auto"/>
-          <w:sz w:val="24"/>
-          <w:szCs w:val="24"/>
-          <w:lang w:val="sr-Cyrl-RS"/>
-        </w:rPr>
-        <w:t xml:space="preserve">. </w:t>
-      </w:r>
-      <w:r>
-        <w:rPr>
-          <w:b/>
-          <w:i w:val="0"/>
-          <w:color w:val="auto"/>
-          <w:sz w:val="24"/>
-          <w:szCs w:val="24"/>
-          <w:lang w:val="sr-Cyrl-RS"/>
-        </w:rPr>
-        <w:t xml:space="preserve">Просечан ранг пронађених филмова за модел </w:t>
-      </w:r>
-      <w:r>
-        <w:rPr>
-          <w:b/>
-          <w:i w:val="0"/>
-          <w:color w:val="auto"/>
-          <w:sz w:val="24"/>
-          <w:szCs w:val="24"/>
-          <w:lang w:val="en-US"/>
-        </w:rPr>
         <w:t>llama3.2</w:t>
       </w:r>
     </w:p>
@@ -36572,6 +38132,7 @@
         <w:rPr>
           <w:lang w:val="sr-Cyrl-RS"/>
         </w:rPr>
+        <w:lastRenderedPageBreak/>
         <w:t xml:space="preserve">Значајно лошији резултат од претходног модела има </w:t>
       </w:r>
       <w:r>
@@ -36584,7 +38145,19 @@
         <w:rPr>
           <w:lang w:val="sr-Cyrl-RS"/>
         </w:rPr>
-        <w:t xml:space="preserve">што се може видети на  слици 13. Најбоље резултате је овај модел показао када је користио </w:t>
+        <w:t xml:space="preserve">што се може видети на  слици </w:t>
+      </w:r>
+      <w:r>
+        <w:rPr>
+          <w:lang w:val="sr-Cyrl-RS"/>
+        </w:rPr>
+        <w:t>5.11</w:t>
+      </w:r>
+      <w:r>
+        <w:rPr>
+          <w:lang w:val="sr-Cyrl-RS"/>
+        </w:rPr>
+        <w:t xml:space="preserve">. Најбоље резултате је овај модел показао када је користио </w:t>
       </w:r>
       <w:r>
         <w:rPr>
@@ -36705,7 +38278,29 @@
           <w:szCs w:val="24"/>
           <w:lang w:val="sr-Cyrl-RS"/>
         </w:rPr>
-        <w:t>1</w:t>
+        <w:t>5.11</w:t>
+      </w:r>
+      <w:r>
+        <w:rPr>
+          <w:b/>
+          <w:i w:val="0"/>
+          <w:color w:val="auto"/>
+          <w:sz w:val="24"/>
+          <w:szCs w:val="24"/>
+          <w:lang w:val="sr-Cyrl-RS"/>
+        </w:rPr>
+        <w:t xml:space="preserve"> - </w:t>
+      </w:r>
+      <w:r>
+        <w:rPr>
+          <w:b/>
+          <w:i w:val="0"/>
+          <w:color w:val="auto"/>
+          <w:sz w:val="24"/>
+          <w:szCs w:val="24"/>
+          <w:lang w:val="sr-Cyrl-RS"/>
+        </w:rPr>
+        <w:t xml:space="preserve">Резултати тестирања са различитим метрикама за модел </w:t>
       </w:r>
       <w:r>
         <w:rPr>
@@ -36716,39 +38311,6 @@
           <w:szCs w:val="24"/>
           <w:lang w:val="en-US"/>
         </w:rPr>
-        <w:t>3</w:t>
-      </w:r>
-      <w:r>
-        <w:rPr>
-          <w:b/>
-          <w:i w:val="0"/>
-          <w:color w:val="auto"/>
-          <w:sz w:val="24"/>
-          <w:szCs w:val="24"/>
-          <w:lang w:val="sr-Cyrl-RS"/>
-        </w:rPr>
-        <w:t xml:space="preserve">. </w:t>
-      </w:r>
-      <w:r>
-        <w:rPr>
-          <w:b/>
-          <w:i w:val="0"/>
-          <w:color w:val="auto"/>
-          <w:sz w:val="24"/>
-          <w:szCs w:val="24"/>
-          <w:lang w:val="sr-Cyrl-RS"/>
-        </w:rPr>
-        <w:t xml:space="preserve">Резултати тестирања са различитим метрикама за модел </w:t>
-      </w:r>
-      <w:r>
-        <w:rPr>
-          <w:b/>
-          <w:i w:val="0"/>
-          <w:color w:val="auto"/>
-          <w:sz w:val="24"/>
-          <w:szCs w:val="24"/>
-          <w:lang w:val="en-US"/>
-        </w:rPr>
         <w:t>mistral</w:t>
       </w:r>
     </w:p>
@@ -36765,6 +38327,30 @@
           <w:lang w:val="sr-Cyrl-RS"/>
         </w:rPr>
       </w:pPr>
+      <w:r>
+        <w:rPr>
+          <w:lang w:val="sr-Cyrl-RS"/>
+        </w:rPr>
+        <w:t>У горе наведеним случајевима, пронађени филмови су у просеку заузимали четврто место,  што је илустровано на слици</w:t>
+      </w:r>
+      <w:r>
+        <w:rPr>
+          <w:lang w:val="sr-Cyrl-RS"/>
+        </w:rPr>
+        <w:t xml:space="preserve"> </w:t>
+      </w:r>
+      <w:r>
+        <w:rPr>
+          <w:lang w:val="sr-Cyrl-RS"/>
+        </w:rPr>
+        <w:t>5.12</w:t>
+      </w:r>
+      <w:r>
+        <w:rPr>
+          <w:lang w:val="sr-Cyrl-RS"/>
+        </w:rPr>
+        <w:t>.</w:t>
+      </w:r>
     </w:p>
     <w:p>
       <w:pPr>
@@ -36772,33 +38358,6 @@
           <w:lang w:val="sr-Cyrl-RS"/>
         </w:rPr>
       </w:pPr>
-    </w:p>
-    <w:p>
-      <w:pPr>
-        <w:rPr>
-          <w:lang w:val="sr-Cyrl-RS"/>
-        </w:rPr>
-      </w:pPr>
-    </w:p>
-    <w:p>
-      <w:pPr>
-        <w:rPr>
-          <w:lang w:val="sr-Cyrl-RS"/>
-        </w:rPr>
-      </w:pPr>
-      <w:r>
-        <w:rPr>
-          <w:lang w:val="sr-Cyrl-RS"/>
-        </w:rPr>
-        <w:lastRenderedPageBreak/>
-        <w:t>У горе наведеним случајевима, пронађени филмови су у просеку заузимали четврто место,  што је илустровано на слици</w:t>
-      </w:r>
-      <w:r>
-        <w:rPr>
-          <w:lang w:val="sr-Cyrl-RS"/>
-        </w:rPr>
-        <w:t xml:space="preserve"> 14.</w:t>
-      </w:r>
     </w:p>
     <w:p>
       <w:pPr>
@@ -36887,7 +38446,7 @@
           <w:szCs w:val="24"/>
           <w:lang w:val="sr-Cyrl-RS"/>
         </w:rPr>
-        <w:t>1</w:t>
+        <w:t>5.12</w:t>
       </w:r>
       <w:r>
         <w:rPr>
@@ -36898,7 +38457,7 @@
           <w:szCs w:val="24"/>
           <w:lang w:val="sr-Cyrl-RS"/>
         </w:rPr>
-        <w:t>4</w:t>
+        <w:t xml:space="preserve"> -</w:t>
       </w:r>
       <w:r>
         <w:rPr>
@@ -36909,7 +38468,7 @@
           <w:szCs w:val="24"/>
           <w:lang w:val="sr-Cyrl-RS"/>
         </w:rPr>
-        <w:t xml:space="preserve">. </w:t>
+        <w:t xml:space="preserve"> </w:t>
       </w:r>
       <w:r>
         <w:rPr>
@@ -36938,53 +38497,74 @@
       <w:pPr>
         <w:jc w:val="both"/>
         <w:rPr>
+          <w:lang w:val="sr-Cyrl-RS"/>
+        </w:rPr>
+      </w:pPr>
+      <w:r>
+        <w:rPr>
+          <w:lang w:val="sr-Cyrl-RS"/>
+        </w:rPr>
+        <w:lastRenderedPageBreak/>
+        <w:t xml:space="preserve">На крају, тестиран је и модел </w:t>
+      </w:r>
+      <w:r>
+        <w:rPr>
           <w:lang w:val="en-US"/>
         </w:rPr>
-      </w:pPr>
-      <w:r>
-        <w:rPr>
-          <w:lang w:val="sr-Cyrl-RS"/>
-        </w:rPr>
-        <w:t xml:space="preserve">На крају, тестиран је и модел </w:t>
-      </w:r>
+        <w:t xml:space="preserve">qwen3:4b. </w:t>
+      </w:r>
+      <w:r>
+        <w:rPr>
+          <w:lang w:val="sr-Cyrl-RS"/>
+        </w:rPr>
+        <w:t xml:space="preserve">Ни овај модел се није прославио. </w:t>
+      </w:r>
+      <w:r>
+        <w:rPr>
+          <w:lang w:val="sr-Cyrl-RS"/>
+        </w:rPr>
+        <w:t xml:space="preserve">На слици </w:t>
+      </w:r>
+      <w:r>
+        <w:rPr>
+          <w:lang w:val="sr-Cyrl-RS"/>
+        </w:rPr>
+        <w:t>5.13</w:t>
+      </w:r>
+      <w:r>
+        <w:rPr>
+          <w:lang w:val="sr-Cyrl-RS"/>
+        </w:rPr>
+        <w:t xml:space="preserve">, приметно је да се овај модел најбоље показао када је коришћена </w:t>
+      </w:r>
+      <w:proofErr w:type="spellStart"/>
       <w:r>
         <w:rPr>
           <w:lang w:val="en-US"/>
         </w:rPr>
-        <w:t xml:space="preserve">qwen3:4b. </w:t>
-      </w:r>
-      <w:r>
-        <w:rPr>
-          <w:lang w:val="sr-Cyrl-RS"/>
-        </w:rPr>
-        <w:t xml:space="preserve">Ни овај модел се није прославио. </w:t>
-      </w:r>
-      <w:r>
-        <w:rPr>
-          <w:lang w:val="sr-Cyrl-RS"/>
-        </w:rPr>
-        <w:t xml:space="preserve">На слици 15, приметно је да се овај модел најбоље показао када је коришћена </w:t>
-      </w:r>
-      <w:proofErr w:type="spellStart"/>
+        <w:t>cityblock</w:t>
+      </w:r>
+      <w:proofErr w:type="spellEnd"/>
       <w:r>
         <w:rPr>
           <w:lang w:val="en-US"/>
         </w:rPr>
-        <w:t>cityblock</w:t>
-      </w:r>
-      <w:proofErr w:type="spellEnd"/>
-      <w:r>
+        <w:t xml:space="preserve"> </w:t>
+      </w:r>
+      <w:r>
+        <w:rPr>
+          <w:lang w:val="sr-Cyrl-RS"/>
+        </w:rPr>
+        <w:t xml:space="preserve">метрика која је проналазила 20 најближих суседа. </w:t>
+      </w:r>
+    </w:p>
+    <w:p>
+      <w:pPr>
+        <w:jc w:val="both"/>
         <w:rPr>
           <w:lang w:val="en-US"/>
         </w:rPr>
-        <w:t xml:space="preserve"> </w:t>
-      </w:r>
-      <w:r>
-        <w:rPr>
-          <w:lang w:val="sr-Cyrl-RS"/>
-        </w:rPr>
-        <w:t xml:space="preserve">метрика која је проналазила 20 најближих суседа. </w:t>
-      </w:r>
+      </w:pPr>
     </w:p>
     <w:p>
       <w:pPr>
@@ -37049,7 +38629,7 @@
           <w:color w:val="auto"/>
           <w:sz w:val="24"/>
           <w:szCs w:val="24"/>
-          <w:lang w:val="en-US"/>
+          <w:lang w:val="sr-Cyrl-RS"/>
         </w:rPr>
       </w:pPr>
       <w:r>
@@ -37072,7 +38652,40 @@
           <w:szCs w:val="24"/>
           <w:lang w:val="sr-Cyrl-RS"/>
         </w:rPr>
-        <w:t>1</w:t>
+        <w:t>5.13</w:t>
+      </w:r>
+      <w:r>
+        <w:rPr>
+          <w:b/>
+          <w:i w:val="0"/>
+          <w:color w:val="auto"/>
+          <w:sz w:val="24"/>
+          <w:szCs w:val="24"/>
+          <w:lang w:val="sr-Cyrl-RS"/>
+        </w:rPr>
+        <w:t xml:space="preserve"> -</w:t>
+      </w:r>
+      <w:r>
+        <w:rPr>
+          <w:b/>
+          <w:i w:val="0"/>
+          <w:color w:val="auto"/>
+          <w:sz w:val="24"/>
+          <w:szCs w:val="24"/>
+          <w:lang w:val="sr-Cyrl-RS"/>
+        </w:rPr>
+        <w:t xml:space="preserve"> </w:t>
+      </w:r>
+      <w:r>
+        <w:rPr>
+          <w:b/>
+          <w:i w:val="0"/>
+          <w:color w:val="auto"/>
+          <w:sz w:val="24"/>
+          <w:szCs w:val="24"/>
+          <w:lang w:val="sr-Cyrl-RS"/>
+        </w:rPr>
+        <w:t xml:space="preserve">Резултати тестирања са различитим метрикама за модел </w:t>
       </w:r>
       <w:r>
         <w:rPr>
@@ -37083,39 +38696,6 @@
           <w:szCs w:val="24"/>
           <w:lang w:val="en-US"/>
         </w:rPr>
-        <w:t>5</w:t>
-      </w:r>
-      <w:r>
-        <w:rPr>
-          <w:b/>
-          <w:i w:val="0"/>
-          <w:color w:val="auto"/>
-          <w:sz w:val="24"/>
-          <w:szCs w:val="24"/>
-          <w:lang w:val="sr-Cyrl-RS"/>
-        </w:rPr>
-        <w:t xml:space="preserve">. </w:t>
-      </w:r>
-      <w:r>
-        <w:rPr>
-          <w:b/>
-          <w:i w:val="0"/>
-          <w:color w:val="auto"/>
-          <w:sz w:val="24"/>
-          <w:szCs w:val="24"/>
-          <w:lang w:val="sr-Cyrl-RS"/>
-        </w:rPr>
-        <w:t xml:space="preserve">Резултати тестирања са различитим метрикама за модел </w:t>
-      </w:r>
-      <w:r>
-        <w:rPr>
-          <w:b/>
-          <w:i w:val="0"/>
-          <w:color w:val="auto"/>
-          <w:sz w:val="24"/>
-          <w:szCs w:val="24"/>
-          <w:lang w:val="en-US"/>
-        </w:rPr>
         <w:t>qwen3:4b</w:t>
       </w:r>
     </w:p>
@@ -37131,43 +38711,26 @@
       <w:pPr>
         <w:jc w:val="both"/>
         <w:rPr>
-          <w:lang w:val="en-US"/>
-        </w:rPr>
-      </w:pPr>
+          <w:lang w:val="sr-Cyrl-RS"/>
+        </w:rPr>
+      </w:pPr>
+      <w:bookmarkStart w:id="28" w:name="_Hlk206429054"/>
+      <w:r>
+        <w:rPr>
+          <w:lang w:val="sr-Cyrl-RS"/>
+        </w:rPr>
+        <w:t xml:space="preserve">У поменутом случају, пронађени филмови су у просеку били рангирани на четвртом месту.  </w:t>
+      </w:r>
     </w:p>
     <w:p>
       <w:pPr>
         <w:jc w:val="both"/>
         <w:rPr>
-          <w:lang w:val="en-US"/>
+          <w:lang w:val="sr-Cyrl-RS"/>
         </w:rPr>
       </w:pPr>
     </w:p>
-    <w:p>
-      <w:pPr>
-        <w:jc w:val="both"/>
-        <w:rPr>
-          <w:lang w:val="en-US"/>
-        </w:rPr>
-      </w:pPr>
-    </w:p>
-    <w:p>
-      <w:pPr>
-        <w:jc w:val="both"/>
-        <w:rPr>
-          <w:lang w:val="sr-Cyrl-RS"/>
-        </w:rPr>
-      </w:pPr>
-      <w:bookmarkStart w:id="27" w:name="_Hlk206429054"/>
-      <w:r>
-        <w:rPr>
-          <w:lang w:val="sr-Cyrl-RS"/>
-        </w:rPr>
-        <w:lastRenderedPageBreak/>
-        <w:t xml:space="preserve">У поменутом случају, пронађени филмови су у просеку били рангирани на четвртом месту.  </w:t>
-      </w:r>
-    </w:p>
-    <w:bookmarkEnd w:id="27"/>
+    <w:bookmarkEnd w:id="28"/>
     <w:p>
       <w:pPr>
         <w:keepNext/>
@@ -37231,7 +38794,7 @@
           <w:color w:val="auto"/>
           <w:sz w:val="24"/>
           <w:szCs w:val="24"/>
-          <w:lang w:val="en-US"/>
+          <w:lang w:val="sr-Cyrl-RS"/>
         </w:rPr>
       </w:pPr>
       <w:r>
@@ -37254,7 +38817,51 @@
           <w:szCs w:val="24"/>
           <w:lang w:val="sr-Cyrl-RS"/>
         </w:rPr>
-        <w:t>1</w:t>
+        <w:t>5.14</w:t>
+      </w:r>
+      <w:r>
+        <w:rPr>
+          <w:b/>
+          <w:i w:val="0"/>
+          <w:color w:val="auto"/>
+          <w:sz w:val="24"/>
+          <w:szCs w:val="24"/>
+          <w:lang w:val="sr-Cyrl-RS"/>
+        </w:rPr>
+        <w:t>.</w:t>
+      </w:r>
+      <w:r>
+        <w:rPr>
+          <w:b/>
+          <w:i w:val="0"/>
+          <w:color w:val="auto"/>
+          <w:sz w:val="24"/>
+          <w:szCs w:val="24"/>
+          <w:lang w:val="sr-Cyrl-RS"/>
+        </w:rPr>
+        <w:t xml:space="preserve"> -</w:t>
+      </w:r>
+      <w:r>
+        <w:rPr>
+          <w:b/>
+          <w:i w:val="0"/>
+          <w:color w:val="auto"/>
+          <w:sz w:val="24"/>
+          <w:szCs w:val="24"/>
+          <w:lang w:val="sr-Cyrl-RS"/>
+        </w:rPr>
+        <w:t xml:space="preserve"> </w:t>
+      </w:r>
+      <w:r>
+        <w:rPr>
+          <w:b/>
+          <w:i w:val="0"/>
+          <w:color w:val="auto"/>
+          <w:sz w:val="24"/>
+          <w:szCs w:val="24"/>
+          <w:lang w:val="sr-Cyrl-RS"/>
+        </w:rPr>
+        <w:t xml:space="preserve">Просечан ранг пронађених филмова за модел </w:t>
       </w:r>
       <w:r>
         <w:rPr>
@@ -37265,9 +38872,48 @@
           <w:szCs w:val="24"/>
           <w:lang w:val="en-US"/>
         </w:rPr>
-        <w:t>5</w:t>
-      </w:r>
-      <w:r>
+        <w:t>qwen3:4b</w:t>
+      </w:r>
+    </w:p>
+    <w:p>
+      <w:pPr>
+        <w:jc w:val="both"/>
+        <w:rPr>
+          <w:lang w:val="sr-Cyrl-RS"/>
+        </w:rPr>
+      </w:pPr>
+      <w:r>
+        <w:rPr>
+          <w:lang w:val="sr-Cyrl-RS"/>
+        </w:rPr>
+        <w:lastRenderedPageBreak/>
+        <w:t>На основу резултата свих тестираних модела</w:t>
+      </w:r>
+      <w:r>
+        <w:rPr>
+          <w:lang w:val="sr-Cyrl-RS"/>
+        </w:rPr>
+        <w:t xml:space="preserve">, за филтрирање на основу садржаја се најбоље показао модел </w:t>
+      </w:r>
+      <w:r>
+        <w:rPr>
+          <w:lang w:val="en-US"/>
+        </w:rPr>
+        <w:t xml:space="preserve">llama3.2. </w:t>
+      </w:r>
+    </w:p>
+    <w:p>
+      <w:pPr>
+        <w:jc w:val="both"/>
+        <w:rPr>
+          <w:lang w:val="sr-Cyrl-RS"/>
+        </w:rPr>
+      </w:pPr>
+    </w:p>
+    <w:p>
+      <w:pPr>
+        <w:pStyle w:val="Caption"/>
+        <w:jc w:val="center"/>
         <w:rPr>
           <w:b/>
           <w:i w:val="0"/>
@@ -37276,8 +38922,7 @@
           <w:szCs w:val="24"/>
           <w:lang w:val="sr-Cyrl-RS"/>
         </w:rPr>
-        <w:t xml:space="preserve">. </w:t>
-      </w:r>
+      </w:pPr>
       <w:r>
         <w:rPr>
           <w:b/>
@@ -37287,7 +38932,7 @@
           <w:szCs w:val="24"/>
           <w:lang w:val="sr-Cyrl-RS"/>
         </w:rPr>
-        <w:t xml:space="preserve">Просечан ранг пронађених филмова за модел </w:t>
+        <w:t xml:space="preserve">Табела </w:t>
       </w:r>
       <w:r>
         <w:rPr>
@@ -37296,42 +38941,20 @@
           <w:color w:val="auto"/>
           <w:sz w:val="24"/>
           <w:szCs w:val="24"/>
-          <w:lang w:val="en-US"/>
-        </w:rPr>
-        <w:t>qwen3:4b</w:t>
-      </w:r>
-    </w:p>
-    <w:p>
-      <w:pPr>
-        <w:rPr>
-          <w:lang w:val="en-US"/>
-        </w:rPr>
-      </w:pPr>
-    </w:p>
-    <w:p>
-      <w:pPr>
-        <w:jc w:val="both"/>
-        <w:rPr>
-          <w:lang w:val="sr-Cyrl-RS"/>
-        </w:rPr>
-      </w:pPr>
-      <w:r>
-        <w:rPr>
-          <w:lang w:val="sr-Cyrl-RS"/>
-        </w:rPr>
-        <w:t>На основу резултата свих тестираних модела</w:t>
-      </w:r>
-      <w:r>
-        <w:rPr>
-          <w:lang w:val="sr-Cyrl-RS"/>
-        </w:rPr>
-        <w:t xml:space="preserve">, за филтрирање на основу садржаја се најбоље показао модел </w:t>
-      </w:r>
-      <w:r>
-        <w:rPr>
-          <w:lang w:val="en-US"/>
-        </w:rPr>
-        <w:t xml:space="preserve">llama3.2. </w:t>
+          <w:lang w:val="sr-Cyrl-RS"/>
+        </w:rPr>
+        <w:t xml:space="preserve">5.3 </w:t>
+      </w:r>
+      <w:r>
+        <w:rPr>
+          <w:b/>
+          <w:i w:val="0"/>
+          <w:color w:val="auto"/>
+          <w:sz w:val="24"/>
+          <w:szCs w:val="24"/>
+          <w:lang w:val="sr-Cyrl-RS"/>
+        </w:rPr>
+        <w:t xml:space="preserve"> – Информације о најбоље рангираним конфигурацијама</w:t>
       </w:r>
     </w:p>
     <w:tbl>
@@ -37802,14 +39425,14 @@
           <w:lang w:val="sr-Cyrl-RS"/>
         </w:rPr>
       </w:pPr>
-      <w:bookmarkStart w:id="28" w:name="_Toc210125438"/>
+      <w:bookmarkStart w:id="29" w:name="_Toc210313139"/>
       <w:r>
         <w:rPr>
           <w:lang w:val="sr-Cyrl-RS"/>
         </w:rPr>
         <w:t>Литература</w:t>
       </w:r>
-      <w:bookmarkEnd w:id="28"/>
+      <w:bookmarkEnd w:id="29"/>
     </w:p>
     <w:p>
       <w:pPr>
@@ -45581,6 +47204,370 @@
       <w:szCs w:val="20"/>
     </w:rPr>
   </w:style>
+  <w:style w:type="table" w:styleId="GridTable4-Accent3">
+    <w:name w:val="Grid Table 4 Accent 3"/>
+    <w:basedOn w:val="TableNormal"/>
+    <w:uiPriority w:val="49"/>
+    <w:rsid w:val="00516100"/>
+    <w:pPr>
+      <w:spacing w:line="240" w:lineRule="auto"/>
+    </w:pPr>
+    <w:tblPr>
+      <w:tblStyleRowBandSize w:val="1"/>
+      <w:tblStyleColBandSize w:val="1"/>
+      <w:tblBorders>
+        <w:top w:val="single" w:sz="4" w:space="0" w:color="C2D69B" w:themeColor="accent3" w:themeTint="99"/>
+        <w:left w:val="single" w:sz="4" w:space="0" w:color="C2D69B" w:themeColor="accent3" w:themeTint="99"/>
+        <w:bottom w:val="single" w:sz="4" w:space="0" w:color="C2D69B" w:themeColor="accent3" w:themeTint="99"/>
+        <w:right w:val="single" w:sz="4" w:space="0" w:color="C2D69B" w:themeColor="accent3" w:themeTint="99"/>
+        <w:insideH w:val="single" w:sz="4" w:space="0" w:color="C2D69B" w:themeColor="accent3" w:themeTint="99"/>
+        <w:insideV w:val="single" w:sz="4" w:space="0" w:color="C2D69B" w:themeColor="accent3" w:themeTint="99"/>
+      </w:tblBorders>
+    </w:tblPr>
+    <w:tblStylePr w:type="firstRow">
+      <w:rPr>
+        <w:b/>
+        <w:bCs/>
+        <w:color w:val="FFFFFF" w:themeColor="background1"/>
+      </w:rPr>
+      <w:tblPr/>
+      <w:tcPr>
+        <w:tcBorders>
+          <w:top w:val="single" w:sz="4" w:space="0" w:color="9BBB59" w:themeColor="accent3"/>
+          <w:left w:val="single" w:sz="4" w:space="0" w:color="9BBB59" w:themeColor="accent3"/>
+          <w:bottom w:val="single" w:sz="4" w:space="0" w:color="9BBB59" w:themeColor="accent3"/>
+          <w:right w:val="single" w:sz="4" w:space="0" w:color="9BBB59" w:themeColor="accent3"/>
+          <w:insideH w:val="nil"/>
+          <w:insideV w:val="nil"/>
+        </w:tcBorders>
+        <w:shd w:val="clear" w:color="auto" w:fill="9BBB59" w:themeFill="accent3"/>
+      </w:tcPr>
+    </w:tblStylePr>
+    <w:tblStylePr w:type="lastRow">
+      <w:rPr>
+        <w:b/>
+        <w:bCs/>
+      </w:rPr>
+      <w:tblPr/>
+      <w:tcPr>
+        <w:tcBorders>
+          <w:top w:val="double" w:sz="4" w:space="0" w:color="9BBB59" w:themeColor="accent3"/>
+        </w:tcBorders>
+      </w:tcPr>
+    </w:tblStylePr>
+    <w:tblStylePr w:type="firstCol">
+      <w:rPr>
+        <w:b/>
+        <w:bCs/>
+      </w:rPr>
+    </w:tblStylePr>
+    <w:tblStylePr w:type="lastCol">
+      <w:rPr>
+        <w:b/>
+        <w:bCs/>
+      </w:rPr>
+    </w:tblStylePr>
+    <w:tblStylePr w:type="band1Vert">
+      <w:tblPr/>
+      <w:tcPr>
+        <w:shd w:val="clear" w:color="auto" w:fill="EAF1DD" w:themeFill="accent3" w:themeFillTint="33"/>
+      </w:tcPr>
+    </w:tblStylePr>
+    <w:tblStylePr w:type="band1Horz">
+      <w:tblPr/>
+      <w:tcPr>
+        <w:shd w:val="clear" w:color="auto" w:fill="EAF1DD" w:themeFill="accent3" w:themeFillTint="33"/>
+      </w:tcPr>
+    </w:tblStylePr>
+  </w:style>
+  <w:style w:type="table" w:styleId="GridTable5Dark-Accent2">
+    <w:name w:val="Grid Table 5 Dark Accent 2"/>
+    <w:basedOn w:val="TableNormal"/>
+    <w:uiPriority w:val="50"/>
+    <w:rsid w:val="00516100"/>
+    <w:pPr>
+      <w:spacing w:line="240" w:lineRule="auto"/>
+    </w:pPr>
+    <w:tblPr>
+      <w:tblStyleRowBandSize w:val="1"/>
+      <w:tblStyleColBandSize w:val="1"/>
+      <w:tblBorders>
+        <w:top w:val="single" w:sz="4" w:space="0" w:color="FFFFFF" w:themeColor="background1"/>
+        <w:left w:val="single" w:sz="4" w:space="0" w:color="FFFFFF" w:themeColor="background1"/>
+        <w:bottom w:val="single" w:sz="4" w:space="0" w:color="FFFFFF" w:themeColor="background1"/>
+        <w:right w:val="single" w:sz="4" w:space="0" w:color="FFFFFF" w:themeColor="background1"/>
+        <w:insideH w:val="single" w:sz="4" w:space="0" w:color="FFFFFF" w:themeColor="background1"/>
+        <w:insideV w:val="single" w:sz="4" w:space="0" w:color="FFFFFF" w:themeColor="background1"/>
+      </w:tblBorders>
+    </w:tblPr>
+    <w:tcPr>
+      <w:shd w:val="clear" w:color="auto" w:fill="F2DBDB" w:themeFill="accent2" w:themeFillTint="33"/>
+    </w:tcPr>
+    <w:tblStylePr w:type="firstRow">
+      <w:rPr>
+        <w:b/>
+        <w:bCs/>
+        <w:color w:val="FFFFFF" w:themeColor="background1"/>
+      </w:rPr>
+      <w:tblPr/>
+      <w:tcPr>
+        <w:tcBorders>
+          <w:top w:val="single" w:sz="4" w:space="0" w:color="FFFFFF" w:themeColor="background1"/>
+          <w:left w:val="single" w:sz="4" w:space="0" w:color="FFFFFF" w:themeColor="background1"/>
+          <w:right w:val="single" w:sz="4" w:space="0" w:color="FFFFFF" w:themeColor="background1"/>
+          <w:insideH w:val="nil"/>
+          <w:insideV w:val="nil"/>
+        </w:tcBorders>
+        <w:shd w:val="clear" w:color="auto" w:fill="C0504D" w:themeFill="accent2"/>
+      </w:tcPr>
+    </w:tblStylePr>
+    <w:tblStylePr w:type="lastRow">
+      <w:rPr>
+        <w:b/>
+        <w:bCs/>
+        <w:color w:val="FFFFFF" w:themeColor="background1"/>
+      </w:rPr>
+      <w:tblPr/>
+      <w:tcPr>
+        <w:tcBorders>
+          <w:left w:val="single" w:sz="4" w:space="0" w:color="FFFFFF" w:themeColor="background1"/>
+          <w:bottom w:val="single" w:sz="4" w:space="0" w:color="FFFFFF" w:themeColor="background1"/>
+          <w:right w:val="single" w:sz="4" w:space="0" w:color="FFFFFF" w:themeColor="background1"/>
+          <w:insideH w:val="nil"/>
+          <w:insideV w:val="nil"/>
+        </w:tcBorders>
+        <w:shd w:val="clear" w:color="auto" w:fill="C0504D" w:themeFill="accent2"/>
+      </w:tcPr>
+    </w:tblStylePr>
+    <w:tblStylePr w:type="firstCol">
+      <w:rPr>
+        <w:b/>
+        <w:bCs/>
+        <w:color w:val="FFFFFF" w:themeColor="background1"/>
+      </w:rPr>
+      <w:tblPr/>
+      <w:tcPr>
+        <w:tcBorders>
+          <w:top w:val="single" w:sz="4" w:space="0" w:color="FFFFFF" w:themeColor="background1"/>
+          <w:left w:val="single" w:sz="4" w:space="0" w:color="FFFFFF" w:themeColor="background1"/>
+          <w:bottom w:val="single" w:sz="4" w:space="0" w:color="FFFFFF" w:themeColor="background1"/>
+          <w:insideV w:val="nil"/>
+        </w:tcBorders>
+        <w:shd w:val="clear" w:color="auto" w:fill="C0504D" w:themeFill="accent2"/>
+      </w:tcPr>
+    </w:tblStylePr>
+    <w:tblStylePr w:type="lastCol">
+      <w:rPr>
+        <w:b/>
+        <w:bCs/>
+        <w:color w:val="FFFFFF" w:themeColor="background1"/>
+      </w:rPr>
+      <w:tblPr/>
+      <w:tcPr>
+        <w:tcBorders>
+          <w:top w:val="single" w:sz="4" w:space="0" w:color="FFFFFF" w:themeColor="background1"/>
+          <w:bottom w:val="single" w:sz="4" w:space="0" w:color="FFFFFF" w:themeColor="background1"/>
+          <w:right w:val="single" w:sz="4" w:space="0" w:color="FFFFFF" w:themeColor="background1"/>
+          <w:insideV w:val="nil"/>
+        </w:tcBorders>
+        <w:shd w:val="clear" w:color="auto" w:fill="C0504D" w:themeFill="accent2"/>
+      </w:tcPr>
+    </w:tblStylePr>
+    <w:tblStylePr w:type="band1Vert">
+      <w:tblPr/>
+      <w:tcPr>
+        <w:shd w:val="clear" w:color="auto" w:fill="E5B8B7" w:themeFill="accent2" w:themeFillTint="66"/>
+      </w:tcPr>
+    </w:tblStylePr>
+    <w:tblStylePr w:type="band1Horz">
+      <w:tblPr/>
+      <w:tcPr>
+        <w:shd w:val="clear" w:color="auto" w:fill="E5B8B7" w:themeFill="accent2" w:themeFillTint="66"/>
+      </w:tcPr>
+    </w:tblStylePr>
+  </w:style>
+  <w:style w:type="table" w:styleId="GridTable5Dark-Accent1">
+    <w:name w:val="Grid Table 5 Dark Accent 1"/>
+    <w:basedOn w:val="TableNormal"/>
+    <w:uiPriority w:val="50"/>
+    <w:rsid w:val="00516100"/>
+    <w:pPr>
+      <w:spacing w:line="240" w:lineRule="auto"/>
+    </w:pPr>
+    <w:tblPr>
+      <w:tblStyleRowBandSize w:val="1"/>
+      <w:tblStyleColBandSize w:val="1"/>
+      <w:tblBorders>
+        <w:top w:val="single" w:sz="4" w:space="0" w:color="FFFFFF" w:themeColor="background1"/>
+        <w:left w:val="single" w:sz="4" w:space="0" w:color="FFFFFF" w:themeColor="background1"/>
+        <w:bottom w:val="single" w:sz="4" w:space="0" w:color="FFFFFF" w:themeColor="background1"/>
+        <w:right w:val="single" w:sz="4" w:space="0" w:color="FFFFFF" w:themeColor="background1"/>
+        <w:insideH w:val="single" w:sz="4" w:space="0" w:color="FFFFFF" w:themeColor="background1"/>
+        <w:insideV w:val="single" w:sz="4" w:space="0" w:color="FFFFFF" w:themeColor="background1"/>
+      </w:tblBorders>
+    </w:tblPr>
+    <w:tcPr>
+      <w:shd w:val="clear" w:color="auto" w:fill="DBE5F1" w:themeFill="accent1" w:themeFillTint="33"/>
+    </w:tcPr>
+    <w:tblStylePr w:type="firstRow">
+      <w:rPr>
+        <w:b/>
+        <w:bCs/>
+        <w:color w:val="FFFFFF" w:themeColor="background1"/>
+      </w:rPr>
+      <w:tblPr/>
+      <w:tcPr>
+        <w:tcBorders>
+          <w:top w:val="single" w:sz="4" w:space="0" w:color="FFFFFF" w:themeColor="background1"/>
+          <w:left w:val="single" w:sz="4" w:space="0" w:color="FFFFFF" w:themeColor="background1"/>
+          <w:right w:val="single" w:sz="4" w:space="0" w:color="FFFFFF" w:themeColor="background1"/>
+          <w:insideH w:val="nil"/>
+          <w:insideV w:val="nil"/>
+        </w:tcBorders>
+        <w:shd w:val="clear" w:color="auto" w:fill="4F81BD" w:themeFill="accent1"/>
+      </w:tcPr>
+    </w:tblStylePr>
+    <w:tblStylePr w:type="lastRow">
+      <w:rPr>
+        <w:b/>
+        <w:bCs/>
+        <w:color w:val="FFFFFF" w:themeColor="background1"/>
+      </w:rPr>
+      <w:tblPr/>
+      <w:tcPr>
+        <w:tcBorders>
+          <w:left w:val="single" w:sz="4" w:space="0" w:color="FFFFFF" w:themeColor="background1"/>
+          <w:bottom w:val="single" w:sz="4" w:space="0" w:color="FFFFFF" w:themeColor="background1"/>
+          <w:right w:val="single" w:sz="4" w:space="0" w:color="FFFFFF" w:themeColor="background1"/>
+          <w:insideH w:val="nil"/>
+          <w:insideV w:val="nil"/>
+        </w:tcBorders>
+        <w:shd w:val="clear" w:color="auto" w:fill="4F81BD" w:themeFill="accent1"/>
+      </w:tcPr>
+    </w:tblStylePr>
+    <w:tblStylePr w:type="firstCol">
+      <w:rPr>
+        <w:b/>
+        <w:bCs/>
+        <w:color w:val="FFFFFF" w:themeColor="background1"/>
+      </w:rPr>
+      <w:tblPr/>
+      <w:tcPr>
+        <w:tcBorders>
+          <w:top w:val="single" w:sz="4" w:space="0" w:color="FFFFFF" w:themeColor="background1"/>
+          <w:left w:val="single" w:sz="4" w:space="0" w:color="FFFFFF" w:themeColor="background1"/>
+          <w:bottom w:val="single" w:sz="4" w:space="0" w:color="FFFFFF" w:themeColor="background1"/>
+          <w:insideV w:val="nil"/>
+        </w:tcBorders>
+        <w:shd w:val="clear" w:color="auto" w:fill="4F81BD" w:themeFill="accent1"/>
+      </w:tcPr>
+    </w:tblStylePr>
+    <w:tblStylePr w:type="lastCol">
+      <w:rPr>
+        <w:b/>
+        <w:bCs/>
+        <w:color w:val="FFFFFF" w:themeColor="background1"/>
+      </w:rPr>
+      <w:tblPr/>
+      <w:tcPr>
+        <w:tcBorders>
+          <w:top w:val="single" w:sz="4" w:space="0" w:color="FFFFFF" w:themeColor="background1"/>
+          <w:bottom w:val="single" w:sz="4" w:space="0" w:color="FFFFFF" w:themeColor="background1"/>
+          <w:right w:val="single" w:sz="4" w:space="0" w:color="FFFFFF" w:themeColor="background1"/>
+          <w:insideV w:val="nil"/>
+        </w:tcBorders>
+        <w:shd w:val="clear" w:color="auto" w:fill="4F81BD" w:themeFill="accent1"/>
+      </w:tcPr>
+    </w:tblStylePr>
+    <w:tblStylePr w:type="band1Vert">
+      <w:tblPr/>
+      <w:tcPr>
+        <w:shd w:val="clear" w:color="auto" w:fill="B8CCE4" w:themeFill="accent1" w:themeFillTint="66"/>
+      </w:tcPr>
+    </w:tblStylePr>
+    <w:tblStylePr w:type="band1Horz">
+      <w:tblPr/>
+      <w:tcPr>
+        <w:shd w:val="clear" w:color="auto" w:fill="B8CCE4" w:themeFill="accent1" w:themeFillTint="66"/>
+      </w:tcPr>
+    </w:tblStylePr>
+  </w:style>
+  <w:style w:type="table" w:styleId="GridTable4-Accent5">
+    <w:name w:val="Grid Table 4 Accent 5"/>
+    <w:basedOn w:val="TableNormal"/>
+    <w:uiPriority w:val="49"/>
+    <w:rsid w:val="00516100"/>
+    <w:pPr>
+      <w:spacing w:line="240" w:lineRule="auto"/>
+    </w:pPr>
+    <w:tblPr>
+      <w:tblStyleRowBandSize w:val="1"/>
+      <w:tblStyleColBandSize w:val="1"/>
+      <w:tblBorders>
+        <w:top w:val="single" w:sz="4" w:space="0" w:color="92CDDC" w:themeColor="accent5" w:themeTint="99"/>
+        <w:left w:val="single" w:sz="4" w:space="0" w:color="92CDDC" w:themeColor="accent5" w:themeTint="99"/>
+        <w:bottom w:val="single" w:sz="4" w:space="0" w:color="92CDDC" w:themeColor="accent5" w:themeTint="99"/>
+        <w:right w:val="single" w:sz="4" w:space="0" w:color="92CDDC" w:themeColor="accent5" w:themeTint="99"/>
+        <w:insideH w:val="single" w:sz="4" w:space="0" w:color="92CDDC" w:themeColor="accent5" w:themeTint="99"/>
+        <w:insideV w:val="single" w:sz="4" w:space="0" w:color="92CDDC" w:themeColor="accent5" w:themeTint="99"/>
+      </w:tblBorders>
+    </w:tblPr>
+    <w:tblStylePr w:type="firstRow">
+      <w:rPr>
+        <w:b/>
+        <w:bCs/>
+        <w:color w:val="FFFFFF" w:themeColor="background1"/>
+      </w:rPr>
+      <w:tblPr/>
+      <w:tcPr>
+        <w:tcBorders>
+          <w:top w:val="single" w:sz="4" w:space="0" w:color="4BACC6" w:themeColor="accent5"/>
+          <w:left w:val="single" w:sz="4" w:space="0" w:color="4BACC6" w:themeColor="accent5"/>
+          <w:bottom w:val="single" w:sz="4" w:space="0" w:color="4BACC6" w:themeColor="accent5"/>
+          <w:right w:val="single" w:sz="4" w:space="0" w:color="4BACC6" w:themeColor="accent5"/>
+          <w:insideH w:val="nil"/>
+          <w:insideV w:val="nil"/>
+        </w:tcBorders>
+        <w:shd w:val="clear" w:color="auto" w:fill="4BACC6" w:themeFill="accent5"/>
+      </w:tcPr>
+    </w:tblStylePr>
+    <w:tblStylePr w:type="lastRow">
+      <w:rPr>
+        <w:b/>
+        <w:bCs/>
+      </w:rPr>
+      <w:tblPr/>
+      <w:tcPr>
+        <w:tcBorders>
+          <w:top w:val="double" w:sz="4" w:space="0" w:color="4BACC6" w:themeColor="accent5"/>
+        </w:tcBorders>
+      </w:tcPr>
+    </w:tblStylePr>
+    <w:tblStylePr w:type="firstCol">
+      <w:rPr>
+        <w:b/>
+        <w:bCs/>
+      </w:rPr>
+    </w:tblStylePr>
+    <w:tblStylePr w:type="lastCol">
+      <w:rPr>
+        <w:b/>
+        <w:bCs/>
+      </w:rPr>
+    </w:tblStylePr>
+    <w:tblStylePr w:type="band1Vert">
+      <w:tblPr/>
+      <w:tcPr>
+        <w:shd w:val="clear" w:color="auto" w:fill="DAEEF3" w:themeFill="accent5" w:themeFillTint="33"/>
+      </w:tcPr>
+    </w:tblStylePr>
+    <w:tblStylePr w:type="band1Horz">
+      <w:tblPr/>
+      <w:tcPr>
+        <w:shd w:val="clear" w:color="auto" w:fill="DAEEF3" w:themeFill="accent5" w:themeFillTint="33"/>
+      </w:tcPr>
+    </w:tblStylePr>
+  </w:style>
 </w:styles>
 </file>
 

</xml_diff>

<commit_message>
chore: fix some grammatical errors
</commit_message>
<xml_diff>
--- a/thesis/Дипломски рад.docx
+++ b/thesis/Дипломски рад.docx
@@ -9012,21 +9012,21 @@
           <w:rFonts w:cs="Times New Roman"/>
           <w:lang w:val="sr-Cyrl-RS"/>
         </w:rPr>
-        <w:t>Из горе</w:t>
-      </w:r>
-      <w:r>
-        <w:rPr>
-          <w:rFonts w:cs="Times New Roman"/>
-          <w:lang w:val="sr-Latn-RS"/>
-        </w:rPr>
-        <w:t xml:space="preserve"> </w:t>
-      </w:r>
-      <w:r>
-        <w:rPr>
-          <w:rFonts w:cs="Times New Roman"/>
-          <w:lang w:val="sr-Cyrl-RS"/>
-        </w:rPr>
-        <w:t xml:space="preserve">поменутих табела може се приметити да је матрица </w:t>
+        <w:t xml:space="preserve">Из табела </w:t>
+      </w:r>
+      <w:r>
+        <w:rPr>
+          <w:rFonts w:cs="Times New Roman"/>
+          <w:lang w:val="sr-Cyrl-RS"/>
+        </w:rPr>
+        <w:t xml:space="preserve">2.1 и 2.2 </w:t>
+      </w:r>
+      <w:r>
+        <w:rPr>
+          <w:rFonts w:cs="Times New Roman"/>
+          <w:lang w:val="sr-Cyrl-RS"/>
+        </w:rPr>
+        <w:t xml:space="preserve">може се приметити да је матрица </w:t>
       </w:r>
       <w:r>
         <w:rPr>
@@ -12196,7 +12196,28 @@
           <w:rFonts w:cs="Times New Roman"/>
           <w:lang w:val="sr-Cyrl-RS"/>
         </w:rPr>
-        <w:t>које не могу да обрадим), прикажи ми неколико ставки да одаберем</w:t>
+        <w:t xml:space="preserve">које не могу да обрадим), прикажи ми неколико ставки да </w:t>
+      </w:r>
+      <w:r>
+        <w:rPr>
+          <w:rFonts w:cs="Times New Roman"/>
+          <w:lang w:val="sr-Cyrl-RS"/>
+        </w:rPr>
+        <w:t>„</w:t>
+      </w:r>
+      <w:r>
+        <w:rPr>
+          <w:rFonts w:cs="Times New Roman"/>
+          <w:lang w:val="sr-Cyrl-RS"/>
+        </w:rPr>
+        <w:t>одаберем</w:t>
+      </w:r>
+      <w:r>
+        <w:rPr>
+          <w:rFonts w:cs="Times New Roman"/>
+          <w:lang w:val="sr-Cyrl-RS"/>
+        </w:rPr>
+        <w:t>“</w:t>
       </w:r>
     </w:p>
     <w:p>
@@ -12707,7 +12728,21 @@
           <w:rFonts w:cs="Times New Roman"/>
           <w:lang w:val="sr-Cyrl-RS"/>
         </w:rPr>
-        <w:t>К-најближих суседа. Они користе матрицу корисности како би нашао сличности између корисника или ставки</w:t>
+        <w:t xml:space="preserve">К-најближих суседа. Они користе матрицу корисности како би </w:t>
+      </w:r>
+      <w:r>
+        <w:rPr>
+          <w:rFonts w:cs="Times New Roman"/>
+          <w:lang w:val="sr-Cyrl-RS"/>
+        </w:rPr>
+        <w:t>нашли</w:t>
+      </w:r>
+      <w:r>
+        <w:rPr>
+          <w:rFonts w:cs="Times New Roman"/>
+          <w:lang w:val="sr-Cyrl-RS"/>
+        </w:rPr>
+        <w:t xml:space="preserve"> сличности између корисника или ставки</w:t>
       </w:r>
       <w:r>
         <w:rPr>
@@ -13223,7 +13258,21 @@
           <w:rFonts w:cs="Times New Roman"/>
           <w:lang w:val="sr-Cyrl-RS"/>
         </w:rPr>
-        <w:t xml:space="preserve"> Ставка </w:t>
+        <w:t xml:space="preserve"> Став</w:t>
+      </w:r>
+      <w:r>
+        <w:rPr>
+          <w:rFonts w:cs="Times New Roman"/>
+          <w:lang w:val="sr-Cyrl-RS"/>
+        </w:rPr>
+        <w:t>ке</w:t>
+      </w:r>
+      <w:r>
+        <w:rPr>
+          <w:rFonts w:cs="Times New Roman"/>
+          <w:lang w:val="sr-Cyrl-RS"/>
+        </w:rPr>
+        <w:t xml:space="preserve"> </w:t>
       </w:r>
       <w:r>
         <w:rPr>
@@ -13267,7 +13316,21 @@
           <w:rFonts w:cs="Times New Roman"/>
           <w:lang w:val="sr-Cyrl-RS"/>
         </w:rPr>
-        <w:t xml:space="preserve"> су слична ако су корисници слично оце</w:t>
+        <w:t xml:space="preserve"> су сличн</w:t>
+      </w:r>
+      <w:r>
+        <w:rPr>
+          <w:rFonts w:cs="Times New Roman"/>
+          <w:lang w:val="sr-Cyrl-RS"/>
+        </w:rPr>
+        <w:t>е</w:t>
+      </w:r>
+      <w:r>
+        <w:rPr>
+          <w:rFonts w:cs="Times New Roman"/>
+          <w:lang w:val="sr-Cyrl-RS"/>
+        </w:rPr>
+        <w:t xml:space="preserve"> ако су корисници слично оце</w:t>
       </w:r>
       <w:r>
         <w:rPr>
@@ -13366,7 +13429,19 @@
         <w:rPr>
           <w:lang w:val="sr-Cyrl-RS"/>
         </w:rPr>
-        <w:t xml:space="preserve">Другим речима, Филтрирање базирано на ставкама </w:t>
+        <w:t xml:space="preserve">Другим речима, </w:t>
+      </w:r>
+      <w:r>
+        <w:rPr>
+          <w:lang w:val="sr-Cyrl-RS"/>
+        </w:rPr>
+        <w:t>ф</w:t>
+      </w:r>
+      <w:r>
+        <w:rPr>
+          <w:lang w:val="sr-Cyrl-RS"/>
+        </w:rPr>
+        <w:t xml:space="preserve">илтрирање базирано на ставкама </w:t>
       </w:r>
       <w:r>
         <w:rPr>
@@ -14792,13 +14867,25 @@
         <w:rPr>
           <w:lang w:val="sr-Cyrl-RS"/>
         </w:rPr>
-        <w:t xml:space="preserve">љен као вектор оцена које је дао ставке, односно ставка је вектор оцена који су корисници дали тој ставци. </w:t>
-      </w:r>
-      <w:r>
-        <w:rPr>
-          <w:lang w:val="sr-Cyrl-RS"/>
-        </w:rPr>
-        <w:t>Ова метрика даје вредности између -1 и 1. Када је косинусна сличност 1, то значи да постоји велика јака корелација између два вектора; ако је вредност 0, не постоји корелација између вектора, док -1 говори да постоји негативна корелација између тих вектора</w:t>
+        <w:t>љен као вектор оцена кој</w:t>
+      </w:r>
+      <w:r>
+        <w:rPr>
+          <w:lang w:val="sr-Cyrl-RS"/>
+        </w:rPr>
+        <w:t>и</w:t>
+      </w:r>
+      <w:r>
+        <w:rPr>
+          <w:lang w:val="sr-Cyrl-RS"/>
+        </w:rPr>
+        <w:t xml:space="preserve"> је дао ставке, односно ставка је вектор оцена који су корисници дали тој ставци. </w:t>
+      </w:r>
+      <w:r>
+        <w:rPr>
+          <w:lang w:val="sr-Cyrl-RS"/>
+        </w:rPr>
+        <w:t>Ова метрика даје вредности између -1 и 1. Када је косинусна сличност 1, то значи да постоји велика корелација између два вектора; ако је вредност 0, не постоји корелација између вектора, док -1 говори да постоји негативна корелација између тих вектора</w:t>
       </w:r>
       <w:r>
         <w:rPr>
@@ -15318,7 +15405,19 @@
         <w:rPr>
           <w:lang w:val="sr-Cyrl-RS"/>
         </w:rPr>
-        <w:t>. То значи да неки корисници ставке оцењују скоро увек високим оценам, док неки скоро увек ниским оценама. Да би ово поправили, од сваке оцене које је корисник дао одузме се средња вредност оцена које икада дао</w:t>
+        <w:t>. То значи да неки корисници ставке оцењују скоро увек високим оценам</w:t>
+      </w:r>
+      <w:r>
+        <w:rPr>
+          <w:lang w:val="sr-Cyrl-RS"/>
+        </w:rPr>
+        <w:t>а</w:t>
+      </w:r>
+      <w:r>
+        <w:rPr>
+          <w:lang w:val="sr-Cyrl-RS"/>
+        </w:rPr>
+        <w:t>, док неки скоро увек ниским оценама. Да би ово поправили, од сваке оцене које је корисник дао одузме се средња вредност оцена које икада дао</w:t>
       </w:r>
       <w:r>
         <w:rPr>
@@ -16588,7 +16687,19 @@
         <w:rPr>
           <w:lang w:val="sr-Cyrl-RS"/>
         </w:rPr>
-        <w:t xml:space="preserve">које сада представља суп корисника који се оценили стаке </w:t>
+        <w:t>које сада представља с</w:t>
+      </w:r>
+      <w:r>
+        <w:rPr>
+          <w:lang w:val="sr-Cyrl-RS"/>
+        </w:rPr>
+        <w:t>к</w:t>
+      </w:r>
+      <w:r>
+        <w:rPr>
+          <w:lang w:val="sr-Cyrl-RS"/>
+        </w:rPr>
+        <w:t xml:space="preserve">уп корисника који се оценили стаке </w:t>
       </w:r>
       <w:r>
         <w:rPr>
@@ -18316,12 +18427,6 @@
         <w:rPr>
           <w:lang w:val="sr-Cyrl-RS"/>
         </w:rPr>
-        <w:t xml:space="preserve"> </w:t>
-      </w:r>
-      <w:r>
-        <w:rPr>
-          <w:lang w:val="sr-Cyrl-RS"/>
-        </w:rPr>
         <w:t xml:space="preserve"> дешава се када се група корисника договори да одређеној ставци да веома високе или веома ниске оцене, како би обманули систем да да или не да препоруку за ту ставку.</w:t>
       </w:r>
     </w:p>
@@ -18520,7 +18625,19 @@
         <w:rPr>
           <w:lang w:val="sr-Cyrl-RS"/>
         </w:rPr>
-        <w:t xml:space="preserve"> У примеру система за препоручивање филмова те карактеристике могу бити жанр филма, глумци које глуме у филму, режија, трајање, учешће на фестивалима и сл.</w:t>
+        <w:t xml:space="preserve"> У примеру система за препоручивање филмова те карактеристике могу бити жанр филма, глумци кој</w:t>
+      </w:r>
+      <w:r>
+        <w:rPr>
+          <w:lang w:val="sr-Cyrl-RS"/>
+        </w:rPr>
+        <w:t>и</w:t>
+      </w:r>
+      <w:r>
+        <w:rPr>
+          <w:lang w:val="sr-Cyrl-RS"/>
+        </w:rPr>
+        <w:t xml:space="preserve"> глуме у филму, режија, трајање, учешће на фестивалима и сл.</w:t>
       </w:r>
     </w:p>
     <w:p>
@@ -18663,7 +18780,19 @@
         <w:rPr>
           <w:lang w:val="sr-Cyrl-RS"/>
         </w:rPr>
-        <w:t xml:space="preserve">Једна од главних предности овог приступа је та да омогућава персонализоване  и релевантне препоруке на основу корисничких преференција </w:t>
+        <w:t xml:space="preserve">Једна од главних предности овог приступа је та </w:t>
+      </w:r>
+      <w:r>
+        <w:rPr>
+          <w:lang w:val="sr-Cyrl-RS"/>
+        </w:rPr>
+        <w:t>што</w:t>
+      </w:r>
+      <w:r>
+        <w:rPr>
+          <w:lang w:val="sr-Cyrl-RS"/>
+        </w:rPr>
+        <w:t xml:space="preserve"> омогућава персонализоване  и релевантне препоруке на основу корисничких преференција </w:t>
       </w:r>
       <w:r>
         <w:rPr>
@@ -18745,7 +18874,37 @@
         <w:rPr>
           <w:lang w:val="sr-Cyrl-RS"/>
         </w:rPr>
-        <w:t>о коме је било више речи у претходном поглављу, управо зато што се овај приступ ослања на карактеристикама ставки, уместо ранијих корисничких интеракција.</w:t>
+        <w:t xml:space="preserve">како је наведено </w:t>
+      </w:r>
+      <w:r>
+        <w:rPr>
+          <w:lang w:val="sr-Cyrl-RS"/>
+        </w:rPr>
+        <w:t xml:space="preserve">у претходном поглављу, </w:t>
+      </w:r>
+      <w:r>
+        <w:rPr>
+          <w:lang w:val="sr-Cyrl-RS"/>
+        </w:rPr>
+        <w:t>јер</w:t>
+      </w:r>
+      <w:r>
+        <w:rPr>
+          <w:lang w:val="sr-Cyrl-RS"/>
+        </w:rPr>
+        <w:t xml:space="preserve"> се овај приступ ослања на </w:t>
+      </w:r>
+      <w:r>
+        <w:rPr>
+          <w:lang w:val="sr-Cyrl-RS"/>
+        </w:rPr>
+        <w:t>карактеристике</w:t>
+      </w:r>
+      <w:r>
+        <w:rPr>
+          <w:lang w:val="sr-Cyrl-RS"/>
+        </w:rPr>
+        <w:t xml:space="preserve"> ставки, уместо ранијих корисничких интеракција.</w:t>
       </w:r>
       <w:r>
         <w:rPr>
@@ -18759,7 +18918,7 @@
         <w:ind w:firstLine="720"/>
         <w:jc w:val="both"/>
         <w:rPr>
-          <w:lang w:val="en-US"/>
+          <w:lang w:val="sr-Cyrl-RS"/>
         </w:rPr>
       </w:pPr>
       <w:r>
@@ -18827,6 +18986,15 @@
     </w:p>
     <w:p>
       <w:pPr>
+        <w:ind w:firstLine="720"/>
+        <w:jc w:val="both"/>
+        <w:rPr>
+          <w:lang w:val="en-US"/>
+        </w:rPr>
+      </w:pPr>
+    </w:p>
+    <w:p>
+      <w:pPr>
         <w:pStyle w:val="Heading3"/>
         <w:ind w:left="360"/>
         <w:rPr>
@@ -18873,7 +19041,7 @@
         <w:ind w:firstLine="360"/>
         <w:jc w:val="both"/>
         <w:rPr>
-          <w:lang w:val="en-US"/>
+          <w:lang w:val="sr-Cyrl-RS"/>
         </w:rPr>
       </w:pPr>
       <w:r>
@@ -18989,6 +19157,15 @@
         </w:rPr>
         <w:t xml:space="preserve">. </w:t>
       </w:r>
+    </w:p>
+    <w:p>
+      <w:pPr>
+        <w:ind w:firstLine="360"/>
+        <w:jc w:val="both"/>
+        <w:rPr>
+          <w:lang w:val="en-US"/>
+        </w:rPr>
+      </w:pPr>
     </w:p>
     <w:p>
       <w:pPr>
@@ -19232,15 +19409,6 @@
     </w:p>
     <w:p>
       <w:pPr>
-        <w:ind w:firstLine="360"/>
-        <w:jc w:val="both"/>
-        <w:rPr>
-          <w:lang w:val="en-US"/>
-        </w:rPr>
-      </w:pPr>
-    </w:p>
-    <w:p>
-      <w:pPr>
         <w:pStyle w:val="Heading3"/>
         <w:rPr>
           <w:lang w:val="sr-Latn-RS"/>
@@ -19308,9 +19476,9 @@
       </w:r>
       <w:r>
         <w:rPr>
-          <w:lang w:val="en-US"/>
-        </w:rPr>
-        <w:t>tri</w:t>
+          <w:lang w:val="sr-Cyrl-RS"/>
+        </w:rPr>
+        <w:t>три</w:t>
       </w:r>
       <w:r>
         <w:rPr>
@@ -21019,7 +21187,31 @@
         <w:rPr>
           <w:lang w:val="sr-Cyrl-RS"/>
         </w:rPr>
-        <w:t xml:space="preserve"> мери пропорцију докумената из корпуса које садрже дату реч, односно термин. Речи које су јединствене у малом проценту докумената добијају већи значај него речи које су честе у свим документима</w:t>
+        <w:t xml:space="preserve"> мери пропорцију докумената из корпуса </w:t>
+      </w:r>
+      <w:r>
+        <w:rPr>
+          <w:lang w:val="sr-Cyrl-RS"/>
+        </w:rPr>
+        <w:t>који</w:t>
+      </w:r>
+      <w:r>
+        <w:rPr>
+          <w:lang w:val="sr-Cyrl-RS"/>
+        </w:rPr>
+        <w:t xml:space="preserve"> садрж</w:t>
+      </w:r>
+      <w:r>
+        <w:rPr>
+          <w:lang w:val="sr-Cyrl-RS"/>
+        </w:rPr>
+        <w:t>и</w:t>
+      </w:r>
+      <w:r>
+        <w:rPr>
+          <w:lang w:val="sr-Cyrl-RS"/>
+        </w:rPr>
+        <w:t xml:space="preserve"> дату реч, односно термин. Речи које су јединствене у малом проценту докумената добијају већи значај него речи које су честе у свим документима</w:t>
       </w:r>
       <w:r>
         <w:rPr>
@@ -21735,7 +21927,19 @@
         <w:rPr>
           <w:lang w:val="sr-Cyrl-RS"/>
         </w:rPr>
-        <w:t xml:space="preserve">. Ова методе укључује две ствари: речник свих познатих речи и мера којом се мери присутност познатих речи. Ова метода се зове тако зато што се </w:t>
+        <w:t>. Ова метод</w:t>
+      </w:r>
+      <w:r>
+        <w:rPr>
+          <w:lang w:val="sr-Cyrl-RS"/>
+        </w:rPr>
+        <w:t>а</w:t>
+      </w:r>
+      <w:r>
+        <w:rPr>
+          <w:lang w:val="sr-Cyrl-RS"/>
+        </w:rPr>
+        <w:t xml:space="preserve"> укључује две ствари: речник свих познатих речи и мера којом се мери присутност познатих речи. Ова метода се зове тако зато што се </w:t>
       </w:r>
       <w:r>
         <w:rPr>
@@ -21954,6 +22158,7 @@
     <w:p>
       <w:pPr>
         <w:ind w:firstLine="720"/>
+        <w:jc w:val="both"/>
         <w:rPr>
           <w:lang w:val="sr-Cyrl-RS"/>
         </w:rPr>
@@ -21984,6 +22189,7 @@
           <w:ilvl w:val="0"/>
           <w:numId w:val="10"/>
         </w:numPr>
+        <w:jc w:val="both"/>
         <w:rPr>
           <w:lang w:val="sr-Cyrl-RS"/>
         </w:rPr>
@@ -22002,6 +22208,7 @@
           <w:ilvl w:val="0"/>
           <w:numId w:val="10"/>
         </w:numPr>
+        <w:jc w:val="both"/>
         <w:rPr>
           <w:lang w:val="sr-Cyrl-RS"/>
         </w:rPr>
@@ -22020,6 +22227,7 @@
           <w:ilvl w:val="0"/>
           <w:numId w:val="10"/>
         </w:numPr>
+        <w:jc w:val="both"/>
         <w:rPr>
           <w:lang w:val="sr-Cyrl-RS"/>
         </w:rPr>
@@ -22038,6 +22246,7 @@
           <w:ilvl w:val="0"/>
           <w:numId w:val="10"/>
         </w:numPr>
+        <w:jc w:val="both"/>
         <w:rPr>
           <w:i/>
           <w:iCs/>
@@ -22234,7 +22443,7 @@
           <w:lang w:val="en-US"/>
         </w:rPr>
         <w:drawing>
-          <wp:inline distT="0" distB="0" distL="0" distR="0" wp14:anchorId="5D2B5430" wp14:editId="13257A81">
+          <wp:inline distT="0" distB="0" distL="0" distR="0" wp14:anchorId="5D2B5430" wp14:editId="589C52F7">
             <wp:extent cx="5274945" cy="3318510"/>
             <wp:effectExtent l="0" t="0" r="1905" b="0"/>
             <wp:docPr id="23" name="Picture 23"/>
@@ -22407,24 +22616,6 @@
         </w:rPr>
         <w:t>Текстуални уграђени вектори</w:t>
       </w:r>
-      <w:r>
-        <w:rPr>
-          <w:lang w:val="sr-Cyrl-RS"/>
-        </w:rPr>
-        <w:t xml:space="preserve"> (који су коришћени у овом раду</w:t>
-      </w:r>
-      <w:r>
-        <w:rPr>
-          <w:lang w:val="sr-Cyrl-RS"/>
-        </w:rPr>
-        <w:t>, па ће бити више речи о њима</w:t>
-      </w:r>
-      <w:r>
-        <w:rPr>
-          <w:lang w:val="sr-Cyrl-RS"/>
-        </w:rPr>
-        <w:t>)</w:t>
-      </w:r>
     </w:p>
     <w:p>
       <w:pPr>
@@ -22536,8 +22727,14 @@
         <w:rPr>
           <w:lang w:val="sr-Cyrl-RS"/>
         </w:rPr>
+        <w:t xml:space="preserve">Текстуални уграђени вектори се даље могу поделити на речничке уграђене векторе, које узимају семантичко значење индивидуалних речи, и уграђене </w:t>
+      </w:r>
+      <w:r>
+        <w:rPr>
+          <w:lang w:val="sr-Cyrl-RS"/>
+        </w:rPr>
         <w:lastRenderedPageBreak/>
-        <w:t>Текстуални уграђени вектори се даље могу поделити на речничке уграђене векторе, које узимају семантичко значење индивидуалних речи, и уграђене векторе за документа, које репрезентују читава документа или пасусе као векторе, узимајући семантичко значење редоследа речи.</w:t>
+        <w:t>векторе за документа, које репрезентују читава документа или пасусе као векторе, узимајући семантичко значење редоследа речи.</w:t>
       </w:r>
     </w:p>
     <w:p>
@@ -22596,7 +22793,61 @@
         <w:rPr>
           <w:lang w:val="sr-Cyrl-RS"/>
         </w:rPr>
-        <w:t>Модерни приступ креирања ових вектора користи све популарнијих претходно обучених великих језичких модела</w:t>
+        <w:t>Модерни приступ креирања ових вектора користи све популарниј</w:t>
+      </w:r>
+      <w:r>
+        <w:rPr>
+          <w:lang w:val="sr-Cyrl-RS"/>
+        </w:rPr>
+        <w:t>е</w:t>
+      </w:r>
+      <w:r>
+        <w:rPr>
+          <w:lang w:val="sr-Cyrl-RS"/>
+        </w:rPr>
+        <w:t xml:space="preserve"> претходно обучен</w:t>
+      </w:r>
+      <w:r>
+        <w:rPr>
+          <w:lang w:val="sr-Cyrl-RS"/>
+        </w:rPr>
+        <w:t>е</w:t>
+      </w:r>
+      <w:r>
+        <w:rPr>
+          <w:lang w:val="sr-Cyrl-RS"/>
+        </w:rPr>
+        <w:t xml:space="preserve"> велик</w:t>
+      </w:r>
+      <w:r>
+        <w:rPr>
+          <w:lang w:val="sr-Cyrl-RS"/>
+        </w:rPr>
+        <w:t>е</w:t>
+      </w:r>
+      <w:r>
+        <w:rPr>
+          <w:lang w:val="sr-Cyrl-RS"/>
+        </w:rPr>
+        <w:t xml:space="preserve"> језичк</w:t>
+      </w:r>
+      <w:r>
+        <w:rPr>
+          <w:lang w:val="sr-Cyrl-RS"/>
+        </w:rPr>
+        <w:t>е</w:t>
+      </w:r>
+      <w:r>
+        <w:rPr>
+          <w:lang w:val="sr-Cyrl-RS"/>
+        </w:rPr>
+        <w:t xml:space="preserve"> модел</w:t>
+      </w:r>
+      <w:r>
+        <w:rPr>
+          <w:lang w:val="sr-Cyrl-RS"/>
+        </w:rPr>
+        <w:t>е</w:t>
       </w:r>
       <w:r>
         <w:rPr>
@@ -24080,7 +24331,19 @@
         <w:rPr>
           <w:lang w:val="sr-Cyrl-RS"/>
         </w:rPr>
-        <w:t>Скуп података који коришћен у овом подсистему је преузет са (</w:t>
+        <w:t>Скуп података који</w:t>
+      </w:r>
+      <w:r>
+        <w:rPr>
+          <w:lang w:val="sr-Cyrl-RS"/>
+        </w:rPr>
+        <w:t xml:space="preserve"> је</w:t>
+      </w:r>
+      <w:r>
+        <w:rPr>
+          <w:lang w:val="sr-Cyrl-RS"/>
+        </w:rPr>
+        <w:t xml:space="preserve"> коришћен у овом подсистему је преузет са (</w:t>
       </w:r>
       <w:r>
         <w:rPr>
@@ -24164,7 +24427,7 @@
         <w:rPr>
           <w:lang w:val="sr-Cyrl-RS"/>
         </w:rPr>
-        <w:t xml:space="preserve"> фајловима.</w:t>
+        <w:t xml:space="preserve"> фајлова.</w:t>
       </w:r>
       <w:r>
         <w:rPr>
@@ -24921,7 +25184,19 @@
         <w:rPr>
           <w:lang w:val="sr-Cyrl-RS"/>
         </w:rPr>
-        <w:t>, он има доста више колона, стога су те колоне и опис тих колона представљене у табели</w:t>
+        <w:t xml:space="preserve">, он има </w:t>
+      </w:r>
+      <w:r>
+        <w:rPr>
+          <w:lang w:val="sr-Cyrl-RS"/>
+        </w:rPr>
+        <w:t>много</w:t>
+      </w:r>
+      <w:r>
+        <w:rPr>
+          <w:lang w:val="sr-Cyrl-RS"/>
+        </w:rPr>
+        <w:t xml:space="preserve"> више колона, стога су те колоне и опис тих колона представљене у табели</w:t>
       </w:r>
       <w:r>
         <w:rPr>
@@ -26841,7 +27116,19 @@
         <w:rPr>
           <w:lang w:val="sr-Cyrl-RS"/>
         </w:rPr>
-        <w:t xml:space="preserve">Након овог корака следи давања очекиваних оцена које би корисник дао тим ставкама. Овде алгоритам позива </w:t>
+        <w:t>Након овог корака следи давањ</w:t>
+      </w:r>
+      <w:r>
+        <w:rPr>
+          <w:lang w:val="sr-Cyrl-RS"/>
+        </w:rPr>
+        <w:t>е</w:t>
+      </w:r>
+      <w:r>
+        <w:rPr>
+          <w:lang w:val="sr-Cyrl-RS"/>
+        </w:rPr>
+        <w:t xml:space="preserve"> очекиваних оцена које би корисник дао тим ставкама. Овде алгоритам позива </w:t>
       </w:r>
       <w:r>
         <w:rPr>
@@ -27259,7 +27546,19 @@
         <w:rPr>
           <w:lang w:val="sr-Cyrl-RS"/>
         </w:rPr>
-        <w:t xml:space="preserve"> фајл по структури, са тим да се у њему налази 200 филмова који су изабрани насумице из наведеног фајла.</w:t>
+        <w:t xml:space="preserve"> фајл по структури, са тим да се у њему налази 200 филмова који су изабрани </w:t>
+      </w:r>
+      <w:r>
+        <w:rPr>
+          <w:lang w:val="sr-Cyrl-RS"/>
+        </w:rPr>
+        <w:t>насумично</w:t>
+      </w:r>
+      <w:r>
+        <w:rPr>
+          <w:lang w:val="sr-Cyrl-RS"/>
+        </w:rPr>
+        <w:t xml:space="preserve"> из наведеног фајла.</w:t>
       </w:r>
       <w:r>
         <w:rPr>
@@ -27531,7 +27830,7 @@
         <w:rPr>
           <w:lang w:val="sr-Cyrl-RS"/>
         </w:rPr>
-        <w:t>алгоритма који је трениран над 200 вектора добијених из векторске базе синопсиса филмова. Као резултат добијају се 20 индекса, односно редних бројева по којима су се филмови нашли у скупу података.</w:t>
+        <w:t>алгоритма који је трениран над 200 вектора добијених из векторске базе синопсиса филмова. Као резултат добија се 20 индекса, односно редних бројева по којима су се филмови нашли у скупу података.</w:t>
       </w:r>
     </w:p>
     <w:p>
@@ -29909,7 +30208,7 @@
           <w:lang w:val="sr-Cyrl-RS"/>
         </w:rPr>
         <w:drawing>
-          <wp:inline distT="0" distB="0" distL="0" distR="0" wp14:anchorId="7D5AF9AF" wp14:editId="4DE98879">
+          <wp:inline distT="0" distB="0" distL="0" distR="0" wp14:anchorId="7D5AF9AF" wp14:editId="6C88D690">
             <wp:extent cx="5275660" cy="3185160"/>
             <wp:effectExtent l="0" t="0" r="1270" b="0"/>
             <wp:docPr id="7" name="Picture 7"/>
@@ -30244,7 +30543,7 @@
           <w:lang w:val="sr-Cyrl-RS"/>
         </w:rPr>
         <w:drawing>
-          <wp:inline distT="0" distB="0" distL="0" distR="0" wp14:anchorId="75622322" wp14:editId="49D6BBA5">
+          <wp:inline distT="0" distB="0" distL="0" distR="0" wp14:anchorId="75622322" wp14:editId="3E26AB5D">
             <wp:extent cx="4831080" cy="2576575"/>
             <wp:effectExtent l="0" t="0" r="7620" b="0"/>
             <wp:docPr id="9" name="Picture 9"/>
@@ -30516,7 +30815,7 @@
           <w:lang w:val="sr-Cyrl-RS"/>
         </w:rPr>
         <w:drawing>
-          <wp:inline distT="0" distB="0" distL="0" distR="0" wp14:anchorId="5685312B" wp14:editId="38810CD9">
+          <wp:inline distT="0" distB="0" distL="0" distR="0" wp14:anchorId="5685312B" wp14:editId="58BBF805">
             <wp:extent cx="5165092" cy="2754716"/>
             <wp:effectExtent l="0" t="0" r="0" b="7620"/>
             <wp:docPr id="6" name="Picture 6"/>
@@ -30861,7 +31160,7 @@
           <w:lang w:val="sr-Cyrl-RS"/>
         </w:rPr>
         <w:drawing>
-          <wp:inline distT="0" distB="0" distL="0" distR="0" wp14:anchorId="28785063" wp14:editId="3CFC5CCE">
+          <wp:inline distT="0" distB="0" distL="0" distR="0" wp14:anchorId="28785063" wp14:editId="72022E6D">
             <wp:extent cx="5294493" cy="2823730"/>
             <wp:effectExtent l="0" t="0" r="1905" b="0"/>
             <wp:docPr id="8" name="Picture 8"/>

</xml_diff>

<commit_message>
chore: reference all formulas
</commit_message>
<xml_diff>
--- a/thesis/Дипломски рад.docx
+++ b/thesis/Дипломски рад.docx
@@ -13790,7 +13790,19 @@
         <w:rPr>
           <w:lang w:val="sr-Cyrl-RS"/>
         </w:rPr>
-        <w:t xml:space="preserve">У формули испод се рачунају сличности скупова А и </w:t>
+        <w:t xml:space="preserve">У формули </w:t>
+      </w:r>
+      <w:r>
+        <w:rPr>
+          <w:lang w:val="en-US"/>
+        </w:rPr>
+        <w:t>1</w:t>
+      </w:r>
+      <w:r>
+        <w:rPr>
+          <w:lang w:val="sr-Cyrl-RS"/>
+        </w:rPr>
+        <w:t xml:space="preserve"> се рачунају сличности скупова А и </w:t>
       </w:r>
       <w:r>
         <w:rPr>
@@ -14783,7 +14795,7 @@
       <w:pPr>
         <w:jc w:val="both"/>
         <w:rPr>
-          <w:lang w:val="sr-Cyrl-RS"/>
+          <w:lang w:val="en-US"/>
         </w:rPr>
       </w:pPr>
       <w:r>
@@ -14898,6 +14910,18 @@
           <w:lang w:val="sr-Cyrl-RS"/>
         </w:rPr>
         <w:t>супротни су).</w:t>
+      </w:r>
+      <w:r>
+        <w:rPr>
+          <w:lang w:val="en-US"/>
+        </w:rPr>
+        <w:t xml:space="preserve"> </w:t>
+      </w:r>
+      <w:r>
+        <w:rPr>
+          <w:lang w:val="sr-Cyrl-RS"/>
+        </w:rPr>
+        <w:t>Израчунавање косинусне сличности представљено је формулом 2.</w:t>
       </w:r>
     </w:p>
     <w:tbl>
@@ -15441,9 +15465,15 @@
       </w:r>
       <w:r>
         <w:rPr>
-          <w:lang w:val="sr-Cyrl-RS"/>
-        </w:rPr>
-        <w:tab/>
+          <w:lang w:val="en-US"/>
+        </w:rPr>
+        <w:t xml:space="preserve"> </w:t>
+      </w:r>
+      <w:r>
+        <w:rPr>
+          <w:lang w:val="sr-Cyrl-RS"/>
+        </w:rPr>
+        <w:t>Измењена косинусна сличност предтсављена је формулом 3</w:t>
       </w:r>
     </w:p>
     <w:p>
@@ -16999,6 +17029,12 @@
         </w:rPr>
         <w:t xml:space="preserve"> од -1 до 1.</w:t>
       </w:r>
+      <w:r>
+        <w:rPr>
+          <w:lang w:val="sr-Cyrl-RS"/>
+        </w:rPr>
+        <w:t xml:space="preserve"> Пирсонов коефицијент корелације приказана је формулом 4</w:t>
+      </w:r>
     </w:p>
     <w:p>
       <w:pPr>
@@ -19564,7 +19600,19 @@
           <w:lang w:val="sr-Cyrl-RS"/>
         </w:rPr>
         <w:tab/>
-        <w:t xml:space="preserve">Еуклидска дистанца мери дужину хипотетичке линије која спаја два вектора. Ова мера има </w:t>
+        <w:t>Еуклидска дистанца</w:t>
+      </w:r>
+      <w:r>
+        <w:rPr>
+          <w:lang w:val="sr-Cyrl-RS"/>
+        </w:rPr>
+        <w:t xml:space="preserve"> (формула 5)</w:t>
+      </w:r>
+      <w:r>
+        <w:rPr>
+          <w:lang w:val="sr-Cyrl-RS"/>
+        </w:rPr>
+        <w:t xml:space="preserve"> мери дужину хипотетичке линије која спаја два вектора. Ова мера има </w:t>
       </w:r>
       <w:r>
         <w:rPr>
@@ -19909,9 +19957,9 @@
             </w:r>
             <w:r>
               <w:rPr>
-                <w:lang w:val="en-US"/>
-              </w:rPr>
-              <w:t>4</w:t>
+                <w:lang w:val="sr-Cyrl-RS"/>
+              </w:rPr>
+              <w:t>5</w:t>
             </w:r>
             <w:r>
               <w:rPr>
@@ -19968,7 +20016,7 @@
       <w:pPr>
         <w:jc w:val="both"/>
         <w:rPr>
-          <w:lang w:val="en-US"/>
+          <w:lang w:val="sr-Cyrl-RS"/>
         </w:rPr>
       </w:pPr>
       <w:r>
@@ -20049,6 +20097,18 @@
       <w:r>
         <w:rPr>
           <w:lang w:val="en-US"/>
+        </w:rPr>
+        <w:t>.</w:t>
+      </w:r>
+      <w:r>
+        <w:rPr>
+          <w:lang w:val="sr-Cyrl-RS"/>
+        </w:rPr>
+        <w:t xml:space="preserve"> Ова метрика представљена је формулом 6</w:t>
+      </w:r>
+      <w:r>
+        <w:rPr>
+          <w:lang w:val="sr-Cyrl-RS"/>
         </w:rPr>
         <w:t>.</w:t>
       </w:r>
@@ -20326,7 +20386,7 @@
               <w:rPr>
                 <w:lang w:val="sr-Cyrl-RS"/>
               </w:rPr>
-              <w:t>5</w:t>
+              <w:t>6</w:t>
             </w:r>
             <w:r>
               <w:rPr>
@@ -20397,7 +20457,19 @@
           <w:lang w:val="sr-Cyrl-RS"/>
         </w:rPr>
         <w:tab/>
-        <w:t>Скаларни производ вектора представља производ магнитуда два вектора и косинуса угла коју та два вектора заклапају.</w:t>
+        <w:t>Скаларни производ</w:t>
+      </w:r>
+      <w:r>
+        <w:rPr>
+          <w:lang w:val="sr-Cyrl-RS"/>
+        </w:rPr>
+        <w:t xml:space="preserve"> (формула 7)</w:t>
+      </w:r>
+      <w:r>
+        <w:rPr>
+          <w:lang w:val="sr-Cyrl-RS"/>
+        </w:rPr>
+        <w:t xml:space="preserve"> вектора представља производ магнитуда два вектора и косинуса угла коју та два вектора заклапају.</w:t>
       </w:r>
       <w:r>
         <w:rPr>
@@ -20731,7 +20803,19 @@
               <w:rPr>
                 <w:lang w:val="sr-Cyrl-RS"/>
               </w:rPr>
-              <w:t xml:space="preserve"> (6)</w:t>
+              <w:t xml:space="preserve"> (</w:t>
+            </w:r>
+            <w:r>
+              <w:rPr>
+                <w:lang w:val="sr-Cyrl-RS"/>
+              </w:rPr>
+              <w:t>7</w:t>
+            </w:r>
+            <w:r>
+              <w:rPr>
+                <w:lang w:val="sr-Cyrl-RS"/>
+              </w:rPr>
+              <w:t>)</w:t>
             </w:r>
           </w:p>
         </w:tc>
@@ -20983,7 +21067,19 @@
         <w:rPr>
           <w:lang w:val="sr-Cyrl-RS"/>
         </w:rPr>
-        <w:t>мери колико често се одређена реч појављује у документу. Добија се као однос колико пута се реч појавила у документу са укупним бројем речи у документу.</w:t>
+        <w:t>мери колико често се одређена реч појављује у документу. Добија се као однос колико пута се реч појавила у документу са укупним бројем речи у документу</w:t>
+      </w:r>
+      <w:r>
+        <w:rPr>
+          <w:lang w:val="sr-Cyrl-RS"/>
+        </w:rPr>
+        <w:t xml:space="preserve"> (формула 8)</w:t>
+      </w:r>
+      <w:r>
+        <w:rPr>
+          <w:lang w:val="sr-Cyrl-RS"/>
+        </w:rPr>
+        <w:t>.</w:t>
       </w:r>
     </w:p>
     <w:p>
@@ -21149,7 +21245,7 @@
               <w:rPr>
                 <w:lang w:val="sr-Cyrl-RS"/>
               </w:rPr>
-              <w:t>7</w:t>
+              <w:t>8</w:t>
             </w:r>
             <w:r>
               <w:rPr>
@@ -21182,6 +21278,12 @@
           <w:lang w:val="en-US"/>
         </w:rPr>
         <w:t>IDF</w:t>
+      </w:r>
+      <w:r>
+        <w:rPr>
+          <w:lang w:val="sr-Cyrl-RS"/>
+        </w:rPr>
+        <w:t xml:space="preserve"> (формула 9)</w:t>
       </w:r>
       <w:r>
         <w:rPr>
@@ -21420,9 +21522,9 @@
             </w:r>
             <w:r>
               <w:rPr>
-                <w:lang w:val="en-US"/>
-              </w:rPr>
-              <w:t>8</w:t>
+                <w:lang w:val="sr-Cyrl-RS"/>
+              </w:rPr>
+              <w:t>9</w:t>
             </w:r>
             <w:r>
               <w:rPr>
@@ -21489,7 +21591,19 @@
         <w:rPr>
           <w:lang w:val="sr-Cyrl-RS"/>
         </w:rPr>
-        <w:t xml:space="preserve"> вредности помноже.</w:t>
+        <w:t xml:space="preserve"> вредности помноже</w:t>
+      </w:r>
+      <w:r>
+        <w:rPr>
+          <w:lang w:val="sr-Cyrl-RS"/>
+        </w:rPr>
+        <w:t xml:space="preserve"> (формула 10)</w:t>
+      </w:r>
+      <w:r>
+        <w:rPr>
+          <w:lang w:val="sr-Cyrl-RS"/>
+        </w:rPr>
+        <w:t>.</w:t>
       </w:r>
       <w:r>
         <w:rPr>
@@ -21717,7 +21831,7 @@
               <w:rPr>
                 <w:lang w:val="sr-Cyrl-RS"/>
               </w:rPr>
-              <w:t>9</w:t>
+              <w:t>10</w:t>
             </w:r>
             <w:r>
               <w:rPr>
@@ -22443,7 +22557,7 @@
           <w:lang w:val="en-US"/>
         </w:rPr>
         <w:drawing>
-          <wp:inline distT="0" distB="0" distL="0" distR="0" wp14:anchorId="5D2B5430" wp14:editId="589C52F7">
+          <wp:inline distT="0" distB="0" distL="0" distR="0" wp14:anchorId="5D2B5430" wp14:editId="793630E2">
             <wp:extent cx="5274945" cy="3318510"/>
             <wp:effectExtent l="0" t="0" r="1905" b="0"/>
             <wp:docPr id="23" name="Picture 23"/>
@@ -28114,6 +28228,12 @@
         </w:rPr>
         <w:t>Користи се апсолутна вредност како би се елиминисао негативан знак уколико се деси да је удаљеност има негативну вредност.</w:t>
       </w:r>
+      <w:r>
+        <w:rPr>
+          <w:lang w:val="sr-Cyrl-RS"/>
+        </w:rPr>
+        <w:t xml:space="preserve"> Рачунање ове метрике представљена је формулом 11</w:t>
+      </w:r>
     </w:p>
     <w:p>
       <w:pPr>
@@ -28151,8 +28271,8 @@
         <w:tblLook w:val="04A0" w:firstRow="1" w:lastRow="0" w:firstColumn="1" w:lastColumn="0" w:noHBand="0" w:noVBand="1"/>
       </w:tblPr>
       <w:tblGrid>
-        <w:gridCol w:w="7792"/>
-        <w:gridCol w:w="505"/>
+        <w:gridCol w:w="7691"/>
+        <w:gridCol w:w="616"/>
       </w:tblGrid>
       <w:tr>
         <w:trPr>
@@ -28385,7 +28505,7 @@
               <w:rPr>
                 <w:lang w:val="sr-Cyrl-RS"/>
               </w:rPr>
-              <w:t>5</w:t>
+              <w:t>11</w:t>
             </w:r>
             <w:r>
               <w:rPr>
@@ -28650,6 +28770,13 @@
         </w:rPr>
         <w:t>.</w:t>
       </w:r>
+      <w:r>
+        <w:rPr>
+          <w:rFonts w:cs="Times New Roman"/>
+          <w:lang w:val="sr-Cyrl-RS"/>
+        </w:rPr>
+        <w:t xml:space="preserve"> Средња квадратна грешка се рачуна на начин који је предсгтављен формулом 12.</w:t>
+      </w:r>
     </w:p>
     <w:p>
       <w:pPr>
@@ -28676,8 +28803,8 @@
         <w:tblLook w:val="04A0" w:firstRow="1" w:lastRow="0" w:firstColumn="1" w:lastColumn="0" w:noHBand="0" w:noVBand="1"/>
       </w:tblPr>
       <w:tblGrid>
-        <w:gridCol w:w="7792"/>
-        <w:gridCol w:w="567"/>
+        <w:gridCol w:w="7743"/>
+        <w:gridCol w:w="616"/>
       </w:tblGrid>
       <w:tr>
         <w:trPr>
@@ -28935,9 +29062,9 @@
             </w:r>
             <w:r>
               <w:rPr>
-                <w:lang w:val="en-US"/>
-              </w:rPr>
-              <w:t>6</w:t>
+                <w:lang w:val="sr-Cyrl-RS"/>
+              </w:rPr>
+              <w:t>12</w:t>
             </w:r>
             <w:r>
               <w:rPr>
@@ -29016,7 +29143,21 @@
           <w:rFonts w:cs="Times New Roman"/>
           <w:lang w:val="sr-Cyrl-RS"/>
         </w:rPr>
-        <w:t>како јој име каже, представља корен средње квадратне грешке.</w:t>
+        <w:t>како јој име каже, представља корен средње квадратне грешке</w:t>
+      </w:r>
+      <w:r>
+        <w:rPr>
+          <w:rFonts w:cs="Times New Roman"/>
+          <w:lang w:val="sr-Cyrl-RS"/>
+        </w:rPr>
+        <w:t xml:space="preserve"> (формула 13)</w:t>
+      </w:r>
+      <w:r>
+        <w:rPr>
+          <w:rFonts w:cs="Times New Roman"/>
+          <w:lang w:val="sr-Cyrl-RS"/>
+        </w:rPr>
+        <w:t>.</w:t>
       </w:r>
       <w:r>
         <w:rPr>
@@ -29071,8 +29212,8 @@
         <w:tblLook w:val="04A0" w:firstRow="1" w:lastRow="0" w:firstColumn="1" w:lastColumn="0" w:noHBand="0" w:noVBand="1"/>
       </w:tblPr>
       <w:tblGrid>
-        <w:gridCol w:w="7792"/>
-        <w:gridCol w:w="567"/>
+        <w:gridCol w:w="7743"/>
+        <w:gridCol w:w="616"/>
       </w:tblGrid>
       <w:tr>
         <w:trPr>
@@ -29388,7 +29529,19 @@
               <w:rPr>
                 <w:lang w:val="sr-Cyrl-RS"/>
               </w:rPr>
-              <w:t>(7)</w:t>
+              <w:t>(</w:t>
+            </w:r>
+            <w:r>
+              <w:rPr>
+                <w:lang w:val="sr-Cyrl-RS"/>
+              </w:rPr>
+              <w:t>13</w:t>
+            </w:r>
+            <w:r>
+              <w:rPr>
+                <w:lang w:val="sr-Cyrl-RS"/>
+              </w:rPr>
+              <w:t>)</w:t>
             </w:r>
           </w:p>
         </w:tc>
@@ -29701,7 +29854,21 @@
           <w:rFonts w:cs="Times New Roman"/>
           <w:lang w:val="sr-Cyrl-RS"/>
         </w:rPr>
-        <w:t xml:space="preserve"> Фракција конкордантних парова се рачуна на следећи начин:</w:t>
+        <w:t xml:space="preserve"> Фракција конкордантних парова се рачуна на начин</w:t>
+      </w:r>
+      <w:r>
+        <w:rPr>
+          <w:rFonts w:cs="Times New Roman"/>
+          <w:lang w:val="sr-Cyrl-RS"/>
+        </w:rPr>
+        <w:t xml:space="preserve"> који је описан формулом 14</w:t>
+      </w:r>
+      <w:r>
+        <w:rPr>
+          <w:rFonts w:cs="Times New Roman"/>
+          <w:lang w:val="sr-Cyrl-RS"/>
+        </w:rPr>
+        <w:t>:</w:t>
       </w:r>
     </w:p>
     <w:p>
@@ -29728,8 +29895,8 @@
         <w:tblLook w:val="04A0" w:firstRow="1" w:lastRow="0" w:firstColumn="1" w:lastColumn="0" w:noHBand="0" w:noVBand="1"/>
       </w:tblPr>
       <w:tblGrid>
-        <w:gridCol w:w="7792"/>
-        <w:gridCol w:w="567"/>
+        <w:gridCol w:w="7743"/>
+        <w:gridCol w:w="616"/>
       </w:tblGrid>
       <w:tr>
         <w:trPr>
@@ -29938,7 +30105,19 @@
               <w:rPr>
                 <w:lang w:val="sr-Cyrl-RS"/>
               </w:rPr>
-              <w:t>(8)</w:t>
+              <w:t>(</w:t>
+            </w:r>
+            <w:r>
+              <w:rPr>
+                <w:lang w:val="sr-Cyrl-RS"/>
+              </w:rPr>
+              <w:t>14</w:t>
+            </w:r>
+            <w:r>
+              <w:rPr>
+                <w:lang w:val="sr-Cyrl-RS"/>
+              </w:rPr>
+              <w:t>)</w:t>
             </w:r>
           </w:p>
         </w:tc>
@@ -30208,7 +30387,7 @@
           <w:lang w:val="sr-Cyrl-RS"/>
         </w:rPr>
         <w:drawing>
-          <wp:inline distT="0" distB="0" distL="0" distR="0" wp14:anchorId="7D5AF9AF" wp14:editId="6C88D690">
+          <wp:inline distT="0" distB="0" distL="0" distR="0" wp14:anchorId="7D5AF9AF" wp14:editId="283AF783">
             <wp:extent cx="5275660" cy="3185160"/>
             <wp:effectExtent l="0" t="0" r="1270" b="0"/>
             <wp:docPr id="7" name="Picture 7"/>
@@ -30543,7 +30722,7 @@
           <w:lang w:val="sr-Cyrl-RS"/>
         </w:rPr>
         <w:drawing>
-          <wp:inline distT="0" distB="0" distL="0" distR="0" wp14:anchorId="75622322" wp14:editId="3E26AB5D">
+          <wp:inline distT="0" distB="0" distL="0" distR="0" wp14:anchorId="75622322" wp14:editId="13A7D249">
             <wp:extent cx="4831080" cy="2576575"/>
             <wp:effectExtent l="0" t="0" r="7620" b="0"/>
             <wp:docPr id="9" name="Picture 9"/>
@@ -30815,7 +30994,7 @@
           <w:lang w:val="sr-Cyrl-RS"/>
         </w:rPr>
         <w:drawing>
-          <wp:inline distT="0" distB="0" distL="0" distR="0" wp14:anchorId="5685312B" wp14:editId="58BBF805">
+          <wp:inline distT="0" distB="0" distL="0" distR="0" wp14:anchorId="5685312B" wp14:editId="1DC46D75">
             <wp:extent cx="5165092" cy="2754716"/>
             <wp:effectExtent l="0" t="0" r="0" b="7620"/>
             <wp:docPr id="6" name="Picture 6"/>
@@ -31160,7 +31339,7 @@
           <w:lang w:val="sr-Cyrl-RS"/>
         </w:rPr>
         <w:drawing>
-          <wp:inline distT="0" distB="0" distL="0" distR="0" wp14:anchorId="28785063" wp14:editId="72022E6D">
+          <wp:inline distT="0" distB="0" distL="0" distR="0" wp14:anchorId="28785063" wp14:editId="3F118267">
             <wp:extent cx="5294493" cy="2823730"/>
             <wp:effectExtent l="0" t="0" r="1905" b="0"/>
             <wp:docPr id="8" name="Picture 8"/>

</xml_diff>

<commit_message>
chore: fix image and table captions
</commit_message>
<xml_diff>
--- a/thesis/Дипломски рад.docx
+++ b/thesis/Дипломски рад.docx
@@ -8660,7 +8660,17 @@
           <w:sz w:val="24"/>
           <w:szCs w:val="24"/>
         </w:rPr>
-        <w:t>2.1 -</w:t>
+        <w:t>2.1</w:t>
+      </w:r>
+      <w:r>
+        <w:rPr>
+          <w:b/>
+          <w:i w:val="0"/>
+          <w:color w:val="000000" w:themeColor="text1"/>
+          <w:sz w:val="24"/>
+          <w:szCs w:val="24"/>
+        </w:rPr>
+        <w:t>.</w:t>
       </w:r>
       <w:r>
         <w:rPr>
@@ -9084,7 +9094,7 @@
           <w:szCs w:val="24"/>
           <w:lang w:val="sr-Cyrl-RS"/>
         </w:rPr>
-        <w:t xml:space="preserve">2.1 </w:t>
+        <w:t>2.1</w:t>
       </w:r>
       <w:r>
         <w:rPr>
@@ -9095,7 +9105,18 @@
           <w:szCs w:val="24"/>
           <w:lang w:val="sr-Cyrl-RS"/>
         </w:rPr>
-        <w:t>– Пример матрице података прикупљених на имплицитан начин</w:t>
+        <w:t xml:space="preserve">. </w:t>
+      </w:r>
+      <w:r>
+        <w:rPr>
+          <w:b/>
+          <w:i w:val="0"/>
+          <w:color w:val="auto"/>
+          <w:sz w:val="24"/>
+          <w:szCs w:val="24"/>
+          <w:lang w:val="sr-Cyrl-RS"/>
+        </w:rPr>
+        <w:t>Пример матрице података прикупљених на имплицитан начин</w:t>
       </w:r>
       <w:r>
         <w:rPr>
@@ -10534,7 +10555,18 @@
           <w:szCs w:val="24"/>
           <w:lang w:val="sr-Cyrl-RS"/>
         </w:rPr>
-        <w:t xml:space="preserve"> – Пример матрице података прикупљених на експлицитан начин</w:t>
+        <w:t xml:space="preserve">. </w:t>
+      </w:r>
+      <w:r>
+        <w:rPr>
+          <w:b/>
+          <w:i w:val="0"/>
+          <w:color w:val="000000" w:themeColor="text1"/>
+          <w:sz w:val="24"/>
+          <w:szCs w:val="24"/>
+          <w:lang w:val="sr-Cyrl-RS"/>
+        </w:rPr>
+        <w:t>Пример матрице података прикупљених на експлицитан начин</w:t>
       </w:r>
     </w:p>
     <w:tbl>
@@ -13220,7 +13252,18 @@
           <w:szCs w:val="24"/>
           <w:lang w:val="sr-Cyrl-RS"/>
         </w:rPr>
-        <w:t xml:space="preserve"> - алгоритам филтрирања базираним на корисницима</w:t>
+        <w:t>.</w:t>
+      </w:r>
+      <w:r>
+        <w:rPr>
+          <w:b/>
+          <w:i w:val="0"/>
+          <w:color w:val="auto"/>
+          <w:sz w:val="24"/>
+          <w:szCs w:val="24"/>
+          <w:lang w:val="sr-Cyrl-RS"/>
+        </w:rPr>
+        <w:t xml:space="preserve"> алгоритам филтрирања базираним на корисницима</w:t>
       </w:r>
     </w:p>
     <w:bookmarkEnd w:id="4"/>
@@ -14233,7 +14276,29 @@
           <w:szCs w:val="22"/>
           <w:lang w:val="sr-Cyrl-RS"/>
         </w:rPr>
-        <w:t>3 - Пример рачунања сличности помоћу Жакаровог индекса</w:t>
+        <w:t>3</w:t>
+      </w:r>
+      <w:r>
+        <w:rPr>
+          <w:b/>
+          <w:i w:val="0"/>
+          <w:color w:val="000000" w:themeColor="text1"/>
+          <w:sz w:val="22"/>
+          <w:szCs w:val="22"/>
+          <w:lang w:val="sr-Cyrl-RS"/>
+        </w:rPr>
+        <w:t xml:space="preserve">. </w:t>
+      </w:r>
+      <w:r>
+        <w:rPr>
+          <w:b/>
+          <w:i w:val="0"/>
+          <w:color w:val="000000" w:themeColor="text1"/>
+          <w:sz w:val="22"/>
+          <w:szCs w:val="22"/>
+          <w:lang w:val="sr-Cyrl-RS"/>
+        </w:rPr>
+        <w:t>Пример рачунања сличности помоћу Жакаровог индекса</w:t>
       </w:r>
     </w:p>
     <w:tbl>
@@ -19312,18 +19377,7 @@
           <w:szCs w:val="24"/>
           <w:lang w:val="sr-Cyrl-RS"/>
         </w:rPr>
-        <w:t xml:space="preserve"> </w:t>
-      </w:r>
-      <w:r>
-        <w:rPr>
-          <w:b/>
-          <w:i w:val="0"/>
-          <w:color w:val="auto"/>
-          <w:sz w:val="24"/>
-          <w:szCs w:val="24"/>
-          <w:lang w:val="sr-Cyrl-RS"/>
-        </w:rPr>
-        <w:t>–</w:t>
+        <w:t>.</w:t>
       </w:r>
       <w:r>
         <w:rPr>
@@ -22557,7 +22611,7 @@
           <w:lang w:val="en-US"/>
         </w:rPr>
         <w:drawing>
-          <wp:inline distT="0" distB="0" distL="0" distR="0" wp14:anchorId="5D2B5430" wp14:editId="793630E2">
+          <wp:inline distT="0" distB="0" distL="0" distR="0" wp14:anchorId="5D2B5430" wp14:editId="36D278D4">
             <wp:extent cx="5274945" cy="3318510"/>
             <wp:effectExtent l="0" t="0" r="1905" b="0"/>
             <wp:docPr id="23" name="Picture 23"/>
@@ -22654,18 +22708,7 @@
           <w:szCs w:val="24"/>
           <w:lang w:val="sr-Cyrl-RS"/>
         </w:rPr>
-        <w:t xml:space="preserve"> </w:t>
-      </w:r>
-      <w:r>
-        <w:rPr>
-          <w:b/>
-          <w:i w:val="0"/>
-          <w:color w:val="auto"/>
-          <w:sz w:val="24"/>
-          <w:szCs w:val="24"/>
-          <w:lang w:val="sr-Cyrl-RS"/>
-        </w:rPr>
-        <w:t>–</w:t>
+        <w:t>.</w:t>
       </w:r>
       <w:r>
         <w:rPr>
@@ -23207,28 +23250,6 @@
           <w:lang w:val="sr-Cyrl-RS"/>
         </w:rPr>
         <w:t>3.1</w:t>
-      </w:r>
-      <w:r>
-        <w:rPr>
-          <w:b/>
-          <w:i w:val="0"/>
-          <w:color w:val="auto"/>
-          <w:sz w:val="24"/>
-          <w:szCs w:val="24"/>
-          <w:lang w:val="sr-Cyrl-RS"/>
-        </w:rPr>
-        <w:t xml:space="preserve"> </w:t>
-      </w:r>
-      <w:r>
-        <w:rPr>
-          <w:b/>
-          <w:i w:val="0"/>
-          <w:color w:val="auto"/>
-          <w:sz w:val="24"/>
-          <w:szCs w:val="24"/>
-          <w:lang w:val="sr-Cyrl-RS"/>
-        </w:rPr>
-        <w:t>–</w:t>
       </w:r>
       <w:r>
         <w:rPr>
@@ -23446,7 +23467,7 @@
           <w:szCs w:val="24"/>
           <w:lang w:val="sr-Cyrl-RS"/>
         </w:rPr>
-        <w:t xml:space="preserve"> </w:t>
+        <w:t>.</w:t>
       </w:r>
       <w:r>
         <w:rPr>
@@ -23456,17 +23477,6 @@
           <w:sz w:val="24"/>
           <w:szCs w:val="24"/>
           <w:lang w:val="sr-Cyrl-RS"/>
-        </w:rPr>
-        <w:t>–</w:t>
-      </w:r>
-      <w:r>
-        <w:rPr>
-          <w:b/>
-          <w:i w:val="0"/>
-          <w:color w:val="auto"/>
-          <w:sz w:val="24"/>
-          <w:szCs w:val="24"/>
-          <w:lang w:val="en-US"/>
         </w:rPr>
         <w:t xml:space="preserve"> </w:t>
       </w:r>
@@ -23614,21 +23624,7 @@
           <w:b/>
           <w:lang w:val="sr-Cyrl-RS"/>
         </w:rPr>
-        <w:t xml:space="preserve"> </w:t>
-      </w:r>
-      <w:r>
-        <w:rPr>
-          <w:b/>
-          <w:lang w:val="sr-Cyrl-RS"/>
-        </w:rPr>
-        <w:t>–</w:t>
-      </w:r>
-      <w:r>
-        <w:rPr>
-          <w:b/>
-          <w:lang w:val="en-US"/>
-        </w:rPr>
-        <w:t xml:space="preserve"> </w:t>
+        <w:t xml:space="preserve">. </w:t>
       </w:r>
       <w:r>
         <w:rPr>
@@ -23855,29 +23851,7 @@
           <w:szCs w:val="24"/>
           <w:lang w:val="sr-Cyrl-RS"/>
         </w:rPr>
-        <w:t xml:space="preserve"> </w:t>
-      </w:r>
-      <w:r>
-        <w:rPr>
-          <w:b/>
-          <w:i w:val="0"/>
-          <w:color w:val="auto"/>
-          <w:sz w:val="24"/>
-          <w:szCs w:val="24"/>
-          <w:lang w:val="sr-Cyrl-RS"/>
-        </w:rPr>
-        <w:t>–</w:t>
-      </w:r>
-      <w:r>
-        <w:rPr>
-          <w:b/>
-          <w:i w:val="0"/>
-          <w:color w:val="auto"/>
-          <w:sz w:val="24"/>
-          <w:szCs w:val="24"/>
-          <w:lang w:val="en-US"/>
-        </w:rPr>
-        <w:t xml:space="preserve"> </w:t>
+        <w:t xml:space="preserve">. </w:t>
       </w:r>
       <w:r>
         <w:rPr>
@@ -24080,18 +24054,7 @@
           <w:szCs w:val="24"/>
           <w:lang w:val="sr-Cyrl-RS"/>
         </w:rPr>
-        <w:t xml:space="preserve"> </w:t>
-      </w:r>
-      <w:r>
-        <w:rPr>
-          <w:b/>
-          <w:i w:val="0"/>
-          <w:color w:val="auto"/>
-          <w:sz w:val="24"/>
-          <w:szCs w:val="24"/>
-          <w:lang w:val="sr-Cyrl-RS"/>
-        </w:rPr>
-        <w:t>–</w:t>
+        <w:t>.</w:t>
       </w:r>
       <w:r>
         <w:rPr>
@@ -24624,29 +24587,7 @@
           <w:szCs w:val="22"/>
           <w:lang w:val="sr-Cyrl-RS"/>
         </w:rPr>
-        <w:t xml:space="preserve"> </w:t>
-      </w:r>
-      <w:r>
-        <w:rPr>
-          <w:b/>
-          <w:i w:val="0"/>
-          <w:color w:val="000000" w:themeColor="text1"/>
-          <w:sz w:val="22"/>
-          <w:szCs w:val="22"/>
-          <w:lang w:val="sr-Cyrl-RS"/>
-        </w:rPr>
-        <w:t>–</w:t>
-      </w:r>
-      <w:r>
-        <w:rPr>
-          <w:b/>
-          <w:i w:val="0"/>
-          <w:color w:val="000000" w:themeColor="text1"/>
-          <w:sz w:val="22"/>
-          <w:szCs w:val="22"/>
-          <w:lang w:val="sr-Cyrl-RS"/>
-        </w:rPr>
-        <w:t xml:space="preserve"> </w:t>
+        <w:t xml:space="preserve">. </w:t>
       </w:r>
       <w:r>
         <w:rPr>
@@ -25423,29 +25364,7 @@
           <w:szCs w:val="22"/>
           <w:lang w:val="sr-Cyrl-RS"/>
         </w:rPr>
-        <w:t xml:space="preserve"> </w:t>
-      </w:r>
-      <w:r>
-        <w:rPr>
-          <w:b/>
-          <w:i w:val="0"/>
-          <w:color w:val="000000" w:themeColor="text1"/>
-          <w:sz w:val="22"/>
-          <w:szCs w:val="22"/>
-          <w:lang w:val="sr-Cyrl-RS"/>
-        </w:rPr>
-        <w:t>–</w:t>
-      </w:r>
-      <w:r>
-        <w:rPr>
-          <w:b/>
-          <w:i w:val="0"/>
-          <w:color w:val="000000" w:themeColor="text1"/>
-          <w:sz w:val="22"/>
-          <w:szCs w:val="22"/>
-          <w:lang w:val="sr-Cyrl-RS"/>
-        </w:rPr>
-        <w:t xml:space="preserve"> </w:t>
+        <w:t xml:space="preserve">. </w:t>
       </w:r>
       <w:r>
         <w:rPr>
@@ -30387,7 +30306,7 @@
           <w:lang w:val="sr-Cyrl-RS"/>
         </w:rPr>
         <w:drawing>
-          <wp:inline distT="0" distB="0" distL="0" distR="0" wp14:anchorId="7D5AF9AF" wp14:editId="283AF783">
+          <wp:inline distT="0" distB="0" distL="0" distR="0" wp14:anchorId="7D5AF9AF" wp14:editId="3D95CC7C">
             <wp:extent cx="5275660" cy="3185160"/>
             <wp:effectExtent l="0" t="0" r="1270" b="0"/>
             <wp:docPr id="7" name="Picture 7"/>
@@ -30495,7 +30414,7 @@
           <w:szCs w:val="24"/>
           <w:lang w:val="sr-Cyrl-RS"/>
         </w:rPr>
-        <w:t xml:space="preserve"> - </w:t>
+        <w:t>.</w:t>
       </w:r>
       <w:r>
         <w:rPr>
@@ -30722,7 +30641,7 @@
           <w:lang w:val="sr-Cyrl-RS"/>
         </w:rPr>
         <w:drawing>
-          <wp:inline distT="0" distB="0" distL="0" distR="0" wp14:anchorId="75622322" wp14:editId="13A7D249">
+          <wp:inline distT="0" distB="0" distL="0" distR="0" wp14:anchorId="75622322" wp14:editId="66ED6DAF">
             <wp:extent cx="4831080" cy="2576575"/>
             <wp:effectExtent l="0" t="0" r="7620" b="0"/>
             <wp:docPr id="9" name="Picture 9"/>
@@ -30830,7 +30749,7 @@
           <w:szCs w:val="24"/>
           <w:lang w:val="sr-Cyrl-RS"/>
         </w:rPr>
-        <w:t xml:space="preserve"> -</w:t>
+        <w:t>.</w:t>
       </w:r>
       <w:r>
         <w:rPr>
@@ -30994,7 +30913,7 @@
           <w:lang w:val="sr-Cyrl-RS"/>
         </w:rPr>
         <w:drawing>
-          <wp:inline distT="0" distB="0" distL="0" distR="0" wp14:anchorId="5685312B" wp14:editId="1DC46D75">
+          <wp:inline distT="0" distB="0" distL="0" distR="0" wp14:anchorId="5685312B" wp14:editId="730D7925">
             <wp:extent cx="5165092" cy="2754716"/>
             <wp:effectExtent l="0" t="0" r="0" b="7620"/>
             <wp:docPr id="6" name="Picture 6"/>
@@ -31102,7 +31021,7 @@
           <w:szCs w:val="24"/>
           <w:lang w:val="sr-Cyrl-RS"/>
         </w:rPr>
-        <w:t xml:space="preserve"> -</w:t>
+        <w:t>.</w:t>
       </w:r>
       <w:r>
         <w:rPr>
@@ -31339,7 +31258,7 @@
           <w:lang w:val="sr-Cyrl-RS"/>
         </w:rPr>
         <w:drawing>
-          <wp:inline distT="0" distB="0" distL="0" distR="0" wp14:anchorId="28785063" wp14:editId="3F118267">
+          <wp:inline distT="0" distB="0" distL="0" distR="0" wp14:anchorId="28785063" wp14:editId="1BF7232F">
             <wp:extent cx="5294493" cy="2823730"/>
             <wp:effectExtent l="0" t="0" r="1905" b="0"/>
             <wp:docPr id="8" name="Picture 8"/>
@@ -31425,7 +31344,7 @@
           <w:szCs w:val="24"/>
           <w:lang w:val="sr-Cyrl-RS"/>
         </w:rPr>
-        <w:t xml:space="preserve"> -</w:t>
+        <w:t>.</w:t>
       </w:r>
       <w:r>
         <w:rPr>
@@ -31956,7 +31875,7 @@
           <w:szCs w:val="24"/>
           <w:lang w:val="sr-Cyrl-RS"/>
         </w:rPr>
-        <w:t xml:space="preserve"> </w:t>
+        <w:t>.</w:t>
       </w:r>
       <w:r>
         <w:rPr>
@@ -31967,7 +31886,7 @@
           <w:szCs w:val="24"/>
           <w:lang w:val="sr-Cyrl-RS"/>
         </w:rPr>
-        <w:t xml:space="preserve">- </w:t>
+        <w:t xml:space="preserve"> </w:t>
       </w:r>
       <w:r>
         <w:rPr>
@@ -32508,7 +32427,18 @@
           <w:szCs w:val="24"/>
           <w:lang w:val="sr-Cyrl-RS"/>
         </w:rPr>
-        <w:t xml:space="preserve"> – </w:t>
+        <w:t>.</w:t>
+      </w:r>
+      <w:r>
+        <w:rPr>
+          <w:b/>
+          <w:i w:val="0"/>
+          <w:color w:val="auto"/>
+          <w:sz w:val="24"/>
+          <w:szCs w:val="24"/>
+          <w:lang w:val="sr-Cyrl-RS"/>
+        </w:rPr>
+        <w:t xml:space="preserve"> </w:t>
       </w:r>
       <w:r>
         <w:rPr>
@@ -33047,7 +32977,18 @@
           <w:szCs w:val="24"/>
           <w:lang w:val="sr-Cyrl-RS"/>
         </w:rPr>
-        <w:t xml:space="preserve"> - </w:t>
+        <w:t>.</w:t>
+      </w:r>
+      <w:r>
+        <w:rPr>
+          <w:b/>
+          <w:i w:val="0"/>
+          <w:color w:val="auto"/>
+          <w:sz w:val="24"/>
+          <w:szCs w:val="24"/>
+          <w:lang w:val="sr-Cyrl-RS"/>
+        </w:rPr>
+        <w:t xml:space="preserve"> </w:t>
       </w:r>
       <w:r>
         <w:rPr>
@@ -33299,9 +33240,9 @@
           <w:color w:val="auto"/>
           <w:sz w:val="24"/>
           <w:szCs w:val="24"/>
-          <w:lang w:val="en-US"/>
-        </w:rPr>
-        <w:t xml:space="preserve"> - </w:t>
+          <w:lang w:val="sr-Cyrl-RS"/>
+        </w:rPr>
+        <w:t xml:space="preserve">. </w:t>
       </w:r>
       <w:r>
         <w:rPr>
@@ -34164,7 +34105,7 @@
           <w:szCs w:val="24"/>
           <w:lang w:val="sr-Cyrl-RS"/>
         </w:rPr>
-        <w:t xml:space="preserve"> -</w:t>
+        <w:t>.</w:t>
       </w:r>
       <w:r>
         <w:rPr>
@@ -34649,7 +34590,7 @@
           <w:szCs w:val="24"/>
           <w:lang w:val="sr-Cyrl-RS"/>
         </w:rPr>
-        <w:t xml:space="preserve"> -</w:t>
+        <w:t>.</w:t>
       </w:r>
       <w:r>
         <w:rPr>
@@ -34789,7 +34730,7 @@
           <w:szCs w:val="24"/>
           <w:lang w:val="sr-Cyrl-RS"/>
         </w:rPr>
-        <w:t xml:space="preserve"> -</w:t>
+        <w:t>.</w:t>
       </w:r>
       <w:r>
         <w:rPr>
@@ -35000,7 +34941,18 @@
           <w:szCs w:val="24"/>
           <w:lang w:val="sr-Cyrl-RS"/>
         </w:rPr>
-        <w:t xml:space="preserve"> - </w:t>
+        <w:t>.</w:t>
+      </w:r>
+      <w:r>
+        <w:rPr>
+          <w:b/>
+          <w:i w:val="0"/>
+          <w:color w:val="auto"/>
+          <w:sz w:val="24"/>
+          <w:szCs w:val="24"/>
+          <w:lang w:val="sr-Cyrl-RS"/>
+        </w:rPr>
+        <w:t xml:space="preserve"> </w:t>
       </w:r>
       <w:r>
         <w:rPr>
@@ -35168,7 +35120,7 @@
           <w:szCs w:val="24"/>
           <w:lang w:val="sr-Cyrl-RS"/>
         </w:rPr>
-        <w:t xml:space="preserve"> -</w:t>
+        <w:t>.</w:t>
       </w:r>
       <w:r>
         <w:rPr>
@@ -35366,7 +35318,7 @@
           <w:szCs w:val="24"/>
           <w:lang w:val="sr-Cyrl-RS"/>
         </w:rPr>
-        <w:t xml:space="preserve"> -</w:t>
+        <w:t>.</w:t>
       </w:r>
       <w:r>
         <w:rPr>
@@ -35531,29 +35483,7 @@
           <w:szCs w:val="24"/>
           <w:lang w:val="sr-Cyrl-RS"/>
         </w:rPr>
-        <w:t>.</w:t>
-      </w:r>
-      <w:r>
-        <w:rPr>
-          <w:b/>
-          <w:i w:val="0"/>
-          <w:color w:val="auto"/>
-          <w:sz w:val="24"/>
-          <w:szCs w:val="24"/>
-          <w:lang w:val="sr-Cyrl-RS"/>
-        </w:rPr>
-        <w:t xml:space="preserve"> -</w:t>
-      </w:r>
-      <w:r>
-        <w:rPr>
-          <w:b/>
-          <w:i w:val="0"/>
-          <w:color w:val="auto"/>
-          <w:sz w:val="24"/>
-          <w:szCs w:val="24"/>
-          <w:lang w:val="sr-Cyrl-RS"/>
-        </w:rPr>
-        <w:t xml:space="preserve"> </w:t>
+        <w:t xml:space="preserve">. </w:t>
       </w:r>
       <w:r>
         <w:rPr>
@@ -35646,7 +35576,7 @@
           <w:szCs w:val="24"/>
           <w:lang w:val="sr-Cyrl-RS"/>
         </w:rPr>
-        <w:t xml:space="preserve">5.3 </w:t>
+        <w:t>5.3</w:t>
       </w:r>
       <w:r>
         <w:rPr>
@@ -35657,7 +35587,18 @@
           <w:szCs w:val="24"/>
           <w:lang w:val="sr-Cyrl-RS"/>
         </w:rPr>
-        <w:t xml:space="preserve"> – Информације о најбоље рангираним конфигурацијама</w:t>
+        <w:t>.</w:t>
+      </w:r>
+      <w:r>
+        <w:rPr>
+          <w:b/>
+          <w:i w:val="0"/>
+          <w:color w:val="auto"/>
+          <w:sz w:val="24"/>
+          <w:szCs w:val="24"/>
+          <w:lang w:val="sr-Cyrl-RS"/>
+        </w:rPr>
+        <w:t xml:space="preserve"> Информације о најбоље рангираним конфигурацијама</w:t>
       </w:r>
     </w:p>
     <w:tbl>
@@ -36015,7 +35956,15 @@
                 <w:bCs w:val="0"/>
                 <w:lang w:val="en-US"/>
               </w:rPr>
-              <w:t>mistral</w:t>
+              <w:t>M</w:t>
+            </w:r>
+            <w:r>
+              <w:rPr>
+                <w:b w:val="0"/>
+                <w:bCs w:val="0"/>
+                <w:lang w:val="en-US"/>
+              </w:rPr>
+              <w:t>istral</w:t>
             </w:r>
           </w:p>
         </w:tc>

</xml_diff>

<commit_message>
chore: updated style of tables
</commit_message>
<xml_diff>
--- a/thesis/Дипломски рад.docx
+++ b/thesis/Дипломски рад.docx
@@ -350,7 +350,21 @@
           <w:sz w:val="36"/>
           <w:szCs w:val="36"/>
         </w:rPr>
-        <w:t>Нови Сад, 2024.</w:t>
+        <w:t>Нови Сад, 202</w:t>
+      </w:r>
+      <w:r>
+        <w:rPr>
+          <w:sz w:val="36"/>
+          <w:szCs w:val="36"/>
+        </w:rPr>
+        <w:t>5</w:t>
+      </w:r>
+      <w:r>
+        <w:rPr>
+          <w:sz w:val="36"/>
+          <w:szCs w:val="36"/>
+        </w:rPr>
+        <w:t>.</w:t>
       </w:r>
     </w:p>
     <w:p>
@@ -5495,7 +5509,21 @@
                 <w:rFonts w:ascii="Arial" w:hAnsi="Arial"/>
                 <w:lang w:val="sr-Cyrl-RS"/>
               </w:rPr>
-              <w:t>ИЗДАЈЕ СЕ ЗАДАТАК ЗА  МАСТЕР РАД, СА СЛЕДЕЋИМ ЕЛЕМЕНТИМА:</w:t>
+              <w:t xml:space="preserve">ИЗДАЈЕ СЕ ЗАДАТАК ЗА  </w:t>
+            </w:r>
+            <w:r>
+              <w:rPr>
+                <w:rFonts w:ascii="Arial" w:hAnsi="Arial"/>
+                <w:lang w:val="sr-Cyrl-RS"/>
+              </w:rPr>
+              <w:t>ДИПЛОМСКИ</w:t>
+            </w:r>
+            <w:r>
+              <w:rPr>
+                <w:rFonts w:ascii="Arial" w:hAnsi="Arial"/>
+                <w:lang w:val="sr-Cyrl-RS"/>
+              </w:rPr>
+              <w:t xml:space="preserve"> РАД, СА СЛЕДЕЋИМ ЕЛЕМЕНТИМА:</w:t>
             </w:r>
           </w:p>
           <w:p>
@@ -6158,7 +6186,7 @@
             </w:rPr>
             <w:fldChar w:fldCharType="separate"/>
           </w:r>
-          <w:hyperlink w:anchor="_Toc211939766" w:history="1">
+          <w:hyperlink w:anchor="_Toc212028715" w:history="1">
             <w:r>
               <w:rPr>
                 <w:rStyle w:val="Hyperlink"/>
@@ -6186,7 +6214,7 @@
                 <w:noProof/>
                 <w:webHidden/>
               </w:rPr>
-              <w:instrText xml:space="preserve"> PAGEREF _Toc211939766 \h </w:instrText>
+              <w:instrText xml:space="preserve"> PAGEREF _Toc212028715 \h </w:instrText>
             </w:r>
             <w:r>
               <w:rPr>
@@ -6228,7 +6256,7 @@
               <w14:ligatures w14:val="standardContextual"/>
             </w:rPr>
           </w:pPr>
-          <w:hyperlink w:anchor="_Toc211939767" w:history="1">
+          <w:hyperlink w:anchor="_Toc212028716" w:history="1">
             <w:r>
               <w:rPr>
                 <w:rStyle w:val="Hyperlink"/>
@@ -6263,7 +6291,7 @@
                 <w:noProof/>
                 <w:webHidden/>
               </w:rPr>
-              <w:instrText xml:space="preserve"> PAGEREF _Toc211939767 \h </w:instrText>
+              <w:instrText xml:space="preserve"> PAGEREF _Toc212028716 \h </w:instrText>
             </w:r>
             <w:r>
               <w:rPr>
@@ -6308,7 +6336,7 @@
               <w14:ligatures w14:val="standardContextual"/>
             </w:rPr>
           </w:pPr>
-          <w:hyperlink w:anchor="_Toc211939768" w:history="1">
+          <w:hyperlink w:anchor="_Toc212028717" w:history="1">
             <w:r>
               <w:rPr>
                 <w:rStyle w:val="Hyperlink"/>
@@ -6358,7 +6386,7 @@
                 <w:noProof/>
                 <w:webHidden/>
               </w:rPr>
-              <w:instrText xml:space="preserve"> PAGEREF _Toc211939768 \h </w:instrText>
+              <w:instrText xml:space="preserve"> PAGEREF _Toc212028717 \h </w:instrText>
             </w:r>
             <w:r>
               <w:rPr>
@@ -6403,7 +6431,7 @@
               <w14:ligatures w14:val="standardContextual"/>
             </w:rPr>
           </w:pPr>
-          <w:hyperlink w:anchor="_Toc211939769" w:history="1">
+          <w:hyperlink w:anchor="_Toc212028718" w:history="1">
             <w:r>
               <w:rPr>
                 <w:rStyle w:val="Hyperlink"/>
@@ -6453,7 +6481,7 @@
                 <w:noProof/>
                 <w:webHidden/>
               </w:rPr>
-              <w:instrText xml:space="preserve"> PAGEREF _Toc211939769 \h </w:instrText>
+              <w:instrText xml:space="preserve"> PAGEREF _Toc212028718 \h </w:instrText>
             </w:r>
             <w:r>
               <w:rPr>
@@ -6498,7 +6526,7 @@
               <w14:ligatures w14:val="standardContextual"/>
             </w:rPr>
           </w:pPr>
-          <w:hyperlink w:anchor="_Toc211939770" w:history="1">
+          <w:hyperlink w:anchor="_Toc212028719" w:history="1">
             <w:r>
               <w:rPr>
                 <w:rStyle w:val="Hyperlink"/>
@@ -6556,7 +6584,7 @@
                 <w:noProof/>
                 <w:webHidden/>
               </w:rPr>
-              <w:instrText xml:space="preserve"> PAGEREF _Toc211939770 \h </w:instrText>
+              <w:instrText xml:space="preserve"> PAGEREF _Toc212028719 \h </w:instrText>
             </w:r>
             <w:r>
               <w:rPr>
@@ -6601,7 +6629,7 @@
               <w14:ligatures w14:val="standardContextual"/>
             </w:rPr>
           </w:pPr>
-          <w:hyperlink w:anchor="_Toc211939771" w:history="1">
+          <w:hyperlink w:anchor="_Toc212028720" w:history="1">
             <w:r>
               <w:rPr>
                 <w:rStyle w:val="Hyperlink"/>
@@ -6651,7 +6679,7 @@
                 <w:noProof/>
                 <w:webHidden/>
               </w:rPr>
-              <w:instrText xml:space="preserve"> PAGEREF _Toc211939771 \h </w:instrText>
+              <w:instrText xml:space="preserve"> PAGEREF _Toc212028720 \h </w:instrText>
             </w:r>
             <w:r>
               <w:rPr>
@@ -6696,7 +6724,7 @@
               <w14:ligatures w14:val="standardContextual"/>
             </w:rPr>
           </w:pPr>
-          <w:hyperlink w:anchor="_Toc211939772" w:history="1">
+          <w:hyperlink w:anchor="_Toc212028721" w:history="1">
             <w:r>
               <w:rPr>
                 <w:rStyle w:val="Hyperlink"/>
@@ -6746,7 +6774,7 @@
                 <w:noProof/>
                 <w:webHidden/>
               </w:rPr>
-              <w:instrText xml:space="preserve"> PAGEREF _Toc211939772 \h </w:instrText>
+              <w:instrText xml:space="preserve"> PAGEREF _Toc212028721 \h </w:instrText>
             </w:r>
             <w:r>
               <w:rPr>
@@ -6791,7 +6819,7 @@
               <w14:ligatures w14:val="standardContextual"/>
             </w:rPr>
           </w:pPr>
-          <w:hyperlink w:anchor="_Toc211939773" w:history="1">
+          <w:hyperlink w:anchor="_Toc212028722" w:history="1">
             <w:r>
               <w:rPr>
                 <w:rStyle w:val="Hyperlink"/>
@@ -6849,7 +6877,7 @@
                 <w:noProof/>
                 <w:webHidden/>
               </w:rPr>
-              <w:instrText xml:space="preserve"> PAGEREF _Toc211939773 \h </w:instrText>
+              <w:instrText xml:space="preserve"> PAGEREF _Toc212028722 \h </w:instrText>
             </w:r>
             <w:r>
               <w:rPr>
@@ -6894,7 +6922,7 @@
               <w14:ligatures w14:val="standardContextual"/>
             </w:rPr>
           </w:pPr>
-          <w:hyperlink w:anchor="_Toc211939774" w:history="1">
+          <w:hyperlink w:anchor="_Toc212028723" w:history="1">
             <w:r>
               <w:rPr>
                 <w:rStyle w:val="Hyperlink"/>
@@ -6960,7 +6988,7 @@
                 <w:noProof/>
                 <w:webHidden/>
               </w:rPr>
-              <w:instrText xml:space="preserve"> PAGEREF _Toc211939774 \h </w:instrText>
+              <w:instrText xml:space="preserve"> PAGEREF _Toc212028723 \h </w:instrText>
             </w:r>
             <w:r>
               <w:rPr>
@@ -7005,7 +7033,7 @@
               <w14:ligatures w14:val="standardContextual"/>
             </w:rPr>
           </w:pPr>
-          <w:hyperlink w:anchor="_Toc211939775" w:history="1">
+          <w:hyperlink w:anchor="_Toc212028724" w:history="1">
             <w:r>
               <w:rPr>
                 <w:rStyle w:val="Hyperlink"/>
@@ -7071,7 +7099,7 @@
                 <w:noProof/>
                 <w:webHidden/>
               </w:rPr>
-              <w:instrText xml:space="preserve"> PAGEREF _Toc211939775 \h </w:instrText>
+              <w:instrText xml:space="preserve"> PAGEREF _Toc212028724 \h </w:instrText>
             </w:r>
             <w:r>
               <w:rPr>
@@ -7113,7 +7141,7 @@
               <w14:ligatures w14:val="standardContextual"/>
             </w:rPr>
           </w:pPr>
-          <w:hyperlink w:anchor="_Toc211939776" w:history="1">
+          <w:hyperlink w:anchor="_Toc212028725" w:history="1">
             <w:r>
               <w:rPr>
                 <w:rStyle w:val="Hyperlink"/>
@@ -7141,7 +7169,7 @@
                 <w:noProof/>
                 <w:webHidden/>
               </w:rPr>
-              <w:instrText xml:space="preserve"> PAGEREF _Toc211939776 \h </w:instrText>
+              <w:instrText xml:space="preserve"> PAGEREF _Toc212028725 \h </w:instrText>
             </w:r>
             <w:r>
               <w:rPr>
@@ -7186,7 +7214,7 @@
               <w14:ligatures w14:val="standardContextual"/>
             </w:rPr>
           </w:pPr>
-          <w:hyperlink w:anchor="_Toc211939777" w:history="1">
+          <w:hyperlink w:anchor="_Toc212028726" w:history="1">
             <w:r>
               <w:rPr>
                 <w:rStyle w:val="Hyperlink"/>
@@ -7229,7 +7257,7 @@
                 <w:noProof/>
                 <w:webHidden/>
               </w:rPr>
-              <w:instrText xml:space="preserve"> PAGEREF _Toc211939777 \h </w:instrText>
+              <w:instrText xml:space="preserve"> PAGEREF _Toc212028726 \h </w:instrText>
             </w:r>
             <w:r>
               <w:rPr>
@@ -7274,7 +7302,7 @@
               <w14:ligatures w14:val="standardContextual"/>
             </w:rPr>
           </w:pPr>
-          <w:hyperlink w:anchor="_Toc211939778" w:history="1">
+          <w:hyperlink w:anchor="_Toc212028727" w:history="1">
             <w:r>
               <w:rPr>
                 <w:rStyle w:val="Hyperlink"/>
@@ -7310,7 +7338,7 @@
                 <w:noProof/>
                 <w:webHidden/>
               </w:rPr>
-              <w:instrText xml:space="preserve"> PAGEREF _Toc211939778 \h </w:instrText>
+              <w:instrText xml:space="preserve"> PAGEREF _Toc212028727 \h </w:instrText>
             </w:r>
             <w:r>
               <w:rPr>
@@ -7352,7 +7380,7 @@
               <w14:ligatures w14:val="standardContextual"/>
             </w:rPr>
           </w:pPr>
-          <w:hyperlink w:anchor="_Toc211939779" w:history="1">
+          <w:hyperlink w:anchor="_Toc212028728" w:history="1">
             <w:r>
               <w:rPr>
                 <w:rStyle w:val="Hyperlink"/>
@@ -7380,7 +7408,7 @@
                 <w:noProof/>
                 <w:webHidden/>
               </w:rPr>
-              <w:instrText xml:space="preserve"> PAGEREF _Toc211939779 \h </w:instrText>
+              <w:instrText xml:space="preserve"> PAGEREF _Toc212028728 \h </w:instrText>
             </w:r>
             <w:r>
               <w:rPr>
@@ -7425,7 +7453,7 @@
               <w14:ligatures w14:val="standardContextual"/>
             </w:rPr>
           </w:pPr>
-          <w:hyperlink w:anchor="_Toc211939780" w:history="1">
+          <w:hyperlink w:anchor="_Toc212028729" w:history="1">
             <w:r>
               <w:rPr>
                 <w:rStyle w:val="Hyperlink"/>
@@ -7468,7 +7496,7 @@
                 <w:noProof/>
                 <w:webHidden/>
               </w:rPr>
-              <w:instrText xml:space="preserve"> PAGEREF _Toc211939780 \h </w:instrText>
+              <w:instrText xml:space="preserve"> PAGEREF _Toc212028729 \h </w:instrText>
             </w:r>
             <w:r>
               <w:rPr>
@@ -7513,7 +7541,7 @@
               <w14:ligatures w14:val="standardContextual"/>
             </w:rPr>
           </w:pPr>
-          <w:hyperlink w:anchor="_Toc211939781" w:history="1">
+          <w:hyperlink w:anchor="_Toc212028730" w:history="1">
             <w:r>
               <w:rPr>
                 <w:rStyle w:val="Hyperlink"/>
@@ -7571,7 +7599,7 @@
                 <w:noProof/>
                 <w:webHidden/>
               </w:rPr>
-              <w:instrText xml:space="preserve"> PAGEREF _Toc211939781 \h </w:instrText>
+              <w:instrText xml:space="preserve"> PAGEREF _Toc212028730 \h </w:instrText>
             </w:r>
             <w:r>
               <w:rPr>
@@ -7616,7 +7644,7 @@
               <w14:ligatures w14:val="standardContextual"/>
             </w:rPr>
           </w:pPr>
-          <w:hyperlink w:anchor="_Toc211939782" w:history="1">
+          <w:hyperlink w:anchor="_Toc212028731" w:history="1">
             <w:r>
               <w:rPr>
                 <w:rStyle w:val="Hyperlink"/>
@@ -7690,7 +7718,7 @@
                 <w:noProof/>
                 <w:webHidden/>
               </w:rPr>
-              <w:instrText xml:space="preserve"> PAGEREF _Toc211939782 \h </w:instrText>
+              <w:instrText xml:space="preserve"> PAGEREF _Toc212028731 \h </w:instrText>
             </w:r>
             <w:r>
               <w:rPr>
@@ -7732,7 +7760,7 @@
               <w14:ligatures w14:val="standardContextual"/>
             </w:rPr>
           </w:pPr>
-          <w:hyperlink w:anchor="_Toc211939783" w:history="1">
+          <w:hyperlink w:anchor="_Toc212028732" w:history="1">
             <w:r>
               <w:rPr>
                 <w:rStyle w:val="Hyperlink"/>
@@ -7767,7 +7795,7 @@
                 <w:noProof/>
                 <w:webHidden/>
               </w:rPr>
-              <w:instrText xml:space="preserve"> PAGEREF _Toc211939783 \h </w:instrText>
+              <w:instrText xml:space="preserve"> PAGEREF _Toc212028732 \h </w:instrText>
             </w:r>
             <w:r>
               <w:rPr>
@@ -7812,7 +7840,7 @@
               <w14:ligatures w14:val="standardContextual"/>
             </w:rPr>
           </w:pPr>
-          <w:hyperlink w:anchor="_Toc211939784" w:history="1">
+          <w:hyperlink w:anchor="_Toc212028733" w:history="1">
             <w:r>
               <w:rPr>
                 <w:rStyle w:val="Hyperlink"/>
@@ -7870,7 +7898,7 @@
                 <w:noProof/>
                 <w:webHidden/>
               </w:rPr>
-              <w:instrText xml:space="preserve"> PAGEREF _Toc211939784 \h </w:instrText>
+              <w:instrText xml:space="preserve"> PAGEREF _Toc212028733 \h </w:instrText>
             </w:r>
             <w:r>
               <w:rPr>
@@ -7915,7 +7943,7 @@
               <w14:ligatures w14:val="standardContextual"/>
             </w:rPr>
           </w:pPr>
-          <w:hyperlink w:anchor="_Toc211939785" w:history="1">
+          <w:hyperlink w:anchor="_Toc212028734" w:history="1">
             <w:r>
               <w:rPr>
                 <w:rStyle w:val="Hyperlink"/>
@@ -7973,7 +8001,7 @@
                 <w:noProof/>
                 <w:webHidden/>
               </w:rPr>
-              <w:instrText xml:space="preserve"> PAGEREF _Toc211939785 \h </w:instrText>
+              <w:instrText xml:space="preserve"> PAGEREF _Toc212028734 \h </w:instrText>
             </w:r>
             <w:r>
               <w:rPr>
@@ -8015,7 +8043,7 @@
               <w14:ligatures w14:val="standardContextual"/>
             </w:rPr>
           </w:pPr>
-          <w:hyperlink w:anchor="_Toc211939786" w:history="1">
+          <w:hyperlink w:anchor="_Toc212028735" w:history="1">
             <w:r>
               <w:rPr>
                 <w:rStyle w:val="Hyperlink"/>
@@ -8043,7 +8071,7 @@
                 <w:noProof/>
                 <w:webHidden/>
               </w:rPr>
-              <w:instrText xml:space="preserve"> PAGEREF _Toc211939786 \h </w:instrText>
+              <w:instrText xml:space="preserve"> PAGEREF _Toc212028735 \h </w:instrText>
             </w:r>
             <w:r>
               <w:rPr>
@@ -8085,7 +8113,7 @@
               <w14:ligatures w14:val="standardContextual"/>
             </w:rPr>
           </w:pPr>
-          <w:hyperlink w:anchor="_Toc211939787" w:history="1">
+          <w:hyperlink w:anchor="_Toc212028736" w:history="1">
             <w:r>
               <w:rPr>
                 <w:rStyle w:val="Hyperlink"/>
@@ -8113,7 +8141,7 @@
                 <w:noProof/>
                 <w:webHidden/>
               </w:rPr>
-              <w:instrText xml:space="preserve"> PAGEREF _Toc211939787 \h </w:instrText>
+              <w:instrText xml:space="preserve"> PAGEREF _Toc212028736 \h </w:instrText>
             </w:r>
             <w:r>
               <w:rPr>
@@ -8133,7 +8161,7 @@
                 <w:noProof/>
                 <w:webHidden/>
               </w:rPr>
-              <w:t>40</w:t>
+              <w:t>41</w:t>
             </w:r>
             <w:r>
               <w:rPr>
@@ -8199,7 +8227,7 @@
           <w:lang w:val="sr-Cyrl-RS"/>
         </w:rPr>
       </w:pPr>
-      <w:bookmarkStart w:id="1" w:name="_Toc211939766"/>
+      <w:bookmarkStart w:id="1" w:name="_Toc212028715"/>
       <w:r>
         <w:rPr>
           <w:lang w:val="sr-Cyrl-RS"/>
@@ -8322,7 +8350,7 @@
           <w:lang w:val="en-US"/>
         </w:rPr>
       </w:pPr>
-      <w:bookmarkStart w:id="2" w:name="_Toc211939767"/>
+      <w:bookmarkStart w:id="2" w:name="_Toc212028716"/>
       <w:r>
         <w:lastRenderedPageBreak/>
         <w:t xml:space="preserve">2. </w:t>
@@ -8373,7 +8401,14 @@
           <w:rFonts w:cs="Times New Roman"/>
           <w:lang w:val="sr-Cyrl-RS"/>
         </w:rPr>
-        <w:t>нтне за корисника</w:t>
+        <w:t>нтне корисник</w:t>
+      </w:r>
+      <w:r>
+        <w:rPr>
+          <w:rFonts w:cs="Times New Roman"/>
+          <w:lang w:val="sr-Cyrl-RS"/>
+        </w:rPr>
+        <w:t>у</w:t>
       </w:r>
       <w:r>
         <w:rPr>
@@ -8541,7 +8576,21 @@
           <w:rFonts w:cs="Times New Roman"/>
           <w:lang w:val="sr-Cyrl-RS"/>
         </w:rPr>
-        <w:t>Да би системи могли да раде, најпре је неопходно да се прикупе подаци. То су подаци о корисницима и ставкама, где сваки корисник оставља оцену</w:t>
+        <w:t xml:space="preserve">Да би системи могли да раде, </w:t>
+      </w:r>
+      <w:r>
+        <w:rPr>
+          <w:rFonts w:cs="Times New Roman"/>
+          <w:lang w:val="sr-Cyrl-RS"/>
+        </w:rPr>
+        <w:t>потребно</w:t>
+      </w:r>
+      <w:r>
+        <w:rPr>
+          <w:rFonts w:cs="Times New Roman"/>
+          <w:lang w:val="sr-Cyrl-RS"/>
+        </w:rPr>
+        <w:t xml:space="preserve"> да се прикупе подаци. То су подаци о корисницима и ставкама, где сваки корисник оставља оцену</w:t>
       </w:r>
       <w:r>
         <w:rPr>
@@ -8973,12 +9022,6 @@
         <w:rPr>
           <w:lang w:val="sr-Cyrl-RS"/>
         </w:rPr>
-        <w:t xml:space="preserve"> </w:t>
-      </w:r>
-      <w:r>
-        <w:rPr>
-          <w:lang w:val="sr-Cyrl-RS"/>
-        </w:rPr>
         <w:t xml:space="preserve"> или </w:t>
       </w:r>
       <w:r>
@@ -11889,29 +11932,18 @@
           <w:rFonts w:cs="Times New Roman"/>
           <w:lang w:val="sr-Cyrl-RS"/>
         </w:rPr>
-        <w:t xml:space="preserve">филтрирање базирано на садржају и </w:t>
-      </w:r>
-    </w:p>
-    <w:p>
-      <w:pPr>
-        <w:pStyle w:val="ListParagraph"/>
-        <w:numPr>
-          <w:ilvl w:val="0"/>
-          <w:numId w:val="2"/>
-        </w:numPr>
+        <w:t>филтрирање базирано на садржају</w:t>
+      </w:r>
+    </w:p>
+    <w:p>
+      <w:pPr>
+        <w:ind w:left="360"/>
         <w:jc w:val="both"/>
         <w:rPr>
           <w:rFonts w:cs="Times New Roman"/>
           <w:lang w:val="sr-Cyrl-RS"/>
         </w:rPr>
       </w:pPr>
-      <w:r>
-        <w:rPr>
-          <w:rFonts w:cs="Times New Roman"/>
-          <w:lang w:val="sr-Cyrl-RS"/>
-        </w:rPr>
-        <w:t xml:space="preserve">хибридан приступ. </w:t>
-      </w:r>
     </w:p>
     <w:p>
       <w:pPr>
@@ -11922,10 +11954,16 @@
           <w:lang w:val="sr-Cyrl-RS"/>
         </w:rPr>
       </w:pPr>
-    </w:p>
-    <w:p>
-      <w:pPr>
-        <w:ind w:left="360" w:firstLine="360"/>
+      <w:r>
+        <w:rPr>
+          <w:rFonts w:cs="Times New Roman"/>
+          <w:lang w:val="sr-Cyrl-RS"/>
+        </w:rPr>
+        <w:t>О овим приступима биће више речи у наредним секцијама.</w:t>
+      </w:r>
+    </w:p>
+    <w:p>
+      <w:pPr>
         <w:jc w:val="both"/>
         <w:rPr>
           <w:rFonts w:cs="Times New Roman"/>
@@ -11937,22 +11975,6 @@
           <w:rFonts w:cs="Times New Roman"/>
           <w:lang w:val="sr-Cyrl-RS"/>
         </w:rPr>
-        <w:t>О овим приступима биће више речи у наредним секцијама.</w:t>
-      </w:r>
-    </w:p>
-    <w:p>
-      <w:pPr>
-        <w:jc w:val="both"/>
-        <w:rPr>
-          <w:rFonts w:cs="Times New Roman"/>
-          <w:lang w:val="sr-Cyrl-RS"/>
-        </w:rPr>
-      </w:pPr>
-      <w:r>
-        <w:rPr>
-          <w:rFonts w:cs="Times New Roman"/>
-          <w:lang w:val="sr-Cyrl-RS"/>
-        </w:rPr>
         <w:br w:type="page"/>
       </w:r>
     </w:p>
@@ -11963,7 +11985,7 @@
           <w:lang w:val="sr-Cyrl-RS"/>
         </w:rPr>
       </w:pPr>
-      <w:bookmarkStart w:id="3" w:name="_Toc211939768"/>
+      <w:bookmarkStart w:id="3" w:name="_Toc212028717"/>
       <w:r>
         <w:lastRenderedPageBreak/>
         <w:t>2.</w:t>
@@ -12128,7 +12150,21 @@
           <w:rFonts w:cs="Times New Roman"/>
           <w:lang w:val="sr-Latn-RS"/>
         </w:rPr>
-        <w:t xml:space="preserve">ња није гледала ове филмове, али има сличан укус у филове као они, па ће их погледати и вероватно јој се свидети. </w:t>
+        <w:t>ња није гледала ове филмове, али има сличан укус у фил</w:t>
+      </w:r>
+      <w:r>
+        <w:rPr>
+          <w:rFonts w:cs="Times New Roman"/>
+          <w:lang w:val="sr-Cyrl-RS"/>
+        </w:rPr>
+        <w:t>м</w:t>
+      </w:r>
+      <w:r>
+        <w:rPr>
+          <w:rFonts w:cs="Times New Roman"/>
+          <w:lang w:val="sr-Latn-RS"/>
+        </w:rPr>
+        <w:t xml:space="preserve">ове као они, па ће их погледати и вероватно јој се свидети. </w:t>
       </w:r>
       <w:r>
         <w:rPr>
@@ -13339,7 +13375,29 @@
           <w:szCs w:val="24"/>
           <w:lang w:val="sr-Cyrl-RS"/>
         </w:rPr>
-        <w:t xml:space="preserve"> алгоритам филтрирања базираним на корисницима</w:t>
+        <w:t xml:space="preserve"> </w:t>
+      </w:r>
+      <w:r>
+        <w:rPr>
+          <w:b/>
+          <w:i w:val="0"/>
+          <w:color w:val="auto"/>
+          <w:sz w:val="24"/>
+          <w:szCs w:val="24"/>
+          <w:lang w:val="sr-Cyrl-RS"/>
+        </w:rPr>
+        <w:t>А</w:t>
+      </w:r>
+      <w:r>
+        <w:rPr>
+          <w:b/>
+          <w:i w:val="0"/>
+          <w:color w:val="auto"/>
+          <w:sz w:val="24"/>
+          <w:szCs w:val="24"/>
+          <w:lang w:val="sr-Cyrl-RS"/>
+        </w:rPr>
+        <w:t>лгоритам филтрирања базираним на корисницима</w:t>
       </w:r>
     </w:p>
     <w:bookmarkEnd w:id="4"/>
@@ -13638,7 +13696,7 @@
           <w:lang w:val="sr-Cyrl-RS"/>
         </w:rPr>
       </w:pPr>
-      <w:bookmarkStart w:id="5" w:name="_Toc211939769"/>
+      <w:bookmarkStart w:id="5" w:name="_Toc212028718"/>
       <w:r>
         <w:lastRenderedPageBreak/>
         <w:t>2.</w:t>
@@ -18390,7 +18448,7 @@
           <w:lang w:val="sr-Cyrl-RS"/>
         </w:rPr>
       </w:pPr>
-      <w:bookmarkStart w:id="6" w:name="_Toc211939770"/>
+      <w:bookmarkStart w:id="6" w:name="_Toc212028719"/>
       <w:r>
         <w:t>2.</w:t>
       </w:r>
@@ -18632,7 +18690,7 @@
           <w:lang w:val="sr-Cyrl-RS"/>
         </w:rPr>
       </w:pPr>
-      <w:bookmarkStart w:id="7" w:name="_Toc211939771"/>
+      <w:bookmarkStart w:id="7" w:name="_Toc212028720"/>
       <w:r>
         <w:lastRenderedPageBreak/>
         <w:t>2.</w:t>
@@ -18908,7 +18966,7 @@
           <w:lang w:val="sr-Cyrl-RS"/>
         </w:rPr>
       </w:pPr>
-      <w:bookmarkStart w:id="8" w:name="_Toc211939772"/>
+      <w:bookmarkStart w:id="8" w:name="_Toc212028721"/>
       <w:r>
         <w:t>2.</w:t>
       </w:r>
@@ -19178,7 +19236,7 @@
           <w:lang w:val="en-US"/>
         </w:rPr>
       </w:pPr>
-      <w:bookmarkStart w:id="9" w:name="_Toc211939773"/>
+      <w:bookmarkStart w:id="9" w:name="_Toc212028722"/>
       <w:r>
         <w:lastRenderedPageBreak/>
         <w:t>2.</w:t>
@@ -19580,7 +19638,7 @@
           <w:lang w:val="sr-Latn-RS"/>
         </w:rPr>
       </w:pPr>
-      <w:bookmarkStart w:id="10" w:name="_Toc211939774"/>
+      <w:bookmarkStart w:id="10" w:name="_Toc212028723"/>
       <w:r>
         <w:lastRenderedPageBreak/>
         <w:t>2.</w:t>
@@ -20975,7 +21033,7 @@
           <w:lang w:val="sr-Cyrl-RS"/>
         </w:rPr>
       </w:pPr>
-      <w:bookmarkStart w:id="12" w:name="_Toc211939775"/>
+      <w:bookmarkStart w:id="12" w:name="_Toc212028724"/>
       <w:r>
         <w:lastRenderedPageBreak/>
         <w:t>2.</w:t>
@@ -22047,14 +22105,6 @@
     </w:p>
     <w:p>
       <w:pPr>
-        <w:jc w:val="both"/>
-        <w:rPr>
-          <w:lang w:val="sr-Cyrl-RS"/>
-        </w:rPr>
-      </w:pPr>
-    </w:p>
-    <w:p>
-      <w:pPr>
         <w:pStyle w:val="Heading4"/>
         <w:rPr>
           <w:lang w:val="en-US"/>
@@ -22687,7 +22737,7 @@
           <w:lang w:val="en-US"/>
         </w:rPr>
         <w:drawing>
-          <wp:inline distT="0" distB="0" distL="0" distR="0" wp14:anchorId="5D2B5430" wp14:editId="4E000DC9">
+          <wp:inline distT="0" distB="0" distL="0" distR="0" wp14:anchorId="5D2B5430" wp14:editId="2CEFD7AE">
             <wp:extent cx="5274945" cy="3318510"/>
             <wp:effectExtent l="0" t="0" r="1905" b="0"/>
             <wp:docPr id="23" name="Picture 23"/>
@@ -23169,7 +23219,7 @@
           <w:lang w:val="en-US"/>
         </w:rPr>
       </w:pPr>
-      <w:bookmarkStart w:id="14" w:name="_Toc211939776"/>
+      <w:bookmarkStart w:id="14" w:name="_Toc212028725"/>
       <w:r>
         <w:rPr>
           <w:lang w:val="sr-Cyrl-RS"/>
@@ -23357,7 +23407,7 @@
           <w:lang w:val="sr-Cyrl-RS"/>
         </w:rPr>
       </w:pPr>
-      <w:bookmarkStart w:id="15" w:name="_Toc211939777"/>
+      <w:bookmarkStart w:id="15" w:name="_Toc212028726"/>
       <w:r>
         <w:rPr>
           <w:lang w:val="en-US"/>
@@ -23394,7 +23444,19 @@
         <w:rPr>
           <w:lang w:val="sr-Cyrl-RS"/>
         </w:rPr>
-        <w:t>Први део система односи се на случај где треба кориснику омогући колаборативно филтрирање. Најпре, потребно је омогућити да се изабере корисник, односно његов ИД. Овај део симулира пријављивања корисника на систем, пошто у систему постоје само ИД-еви корисника, али не и друге информације као што су корисничко име, лозинка, имејл и томе сл.</w:t>
+        <w:t>Први део система односи се на случај где треба кориснику омогући</w:t>
+      </w:r>
+      <w:r>
+        <w:rPr>
+          <w:lang w:val="sr-Cyrl-RS"/>
+        </w:rPr>
+        <w:t>ти</w:t>
+      </w:r>
+      <w:r>
+        <w:rPr>
+          <w:lang w:val="sr-Cyrl-RS"/>
+        </w:rPr>
+        <w:t xml:space="preserve"> колаборативно филтрирање. Најпре, потребно је омогућити да се изабере корисник, односно његов ИД. Овај део симулира пријављивања корисника на систем, пошто у систему постоје само ИД-еви корисника, али не и друге информације као што су корисничко име, лозинка, имејл и томе сл.</w:t>
       </w:r>
       <w:r>
         <w:rPr>
@@ -23717,7 +23779,7 @@
           <w:lang w:val="sr-Cyrl-RS"/>
         </w:rPr>
       </w:pPr>
-      <w:bookmarkStart w:id="16" w:name="_Toc211939778"/>
+      <w:bookmarkStart w:id="16" w:name="_Toc212028727"/>
       <w:r>
         <w:rPr>
           <w:lang w:val="en-US"/>
@@ -23780,7 +23842,19 @@
         <w:rPr>
           <w:lang w:val="sr-Cyrl-RS"/>
         </w:rPr>
-        <w:t xml:space="preserve"> помоћу кога ће се претраживати и препоручивати филмови. У овом случају, ради се о синопсису филма. Затим је потребно да се омогући да се та порука </w:t>
+        <w:t xml:space="preserve"> помоћу </w:t>
+      </w:r>
+      <w:r>
+        <w:rPr>
+          <w:lang w:val="sr-Cyrl-RS"/>
+        </w:rPr>
+        <w:t>које</w:t>
+      </w:r>
+      <w:r>
+        <w:rPr>
+          <w:lang w:val="sr-Cyrl-RS"/>
+        </w:rPr>
+        <w:t xml:space="preserve"> ће се претраживати и препоручивати филмови. У овом случају, ради се о синопсису филма. Затим је потребно да се омогући да се та порука </w:t>
       </w:r>
       <w:r>
         <w:rPr>
@@ -24179,7 +24253,7 @@
           <w:lang w:val="sr-Cyrl-RS"/>
         </w:rPr>
       </w:pPr>
-      <w:bookmarkStart w:id="18" w:name="_Toc211939779"/>
+      <w:bookmarkStart w:id="18" w:name="_Toc212028728"/>
       <w:r>
         <w:rPr>
           <w:lang w:val="sr-Cyrl-RS"/>
@@ -24231,7 +24305,7 @@
           <w:lang w:val="sr-Cyrl-RS"/>
         </w:rPr>
       </w:pPr>
-      <w:bookmarkStart w:id="19" w:name="_Toc211939780"/>
+      <w:bookmarkStart w:id="19" w:name="_Toc212028729"/>
       <w:r>
         <w:rPr>
           <w:lang w:val="sr-Cyrl-RS"/>
@@ -24467,7 +24541,7 @@
           <w:lang w:val="sr-Cyrl-RS"/>
         </w:rPr>
       </w:pPr>
-      <w:bookmarkStart w:id="20" w:name="_Toc211939781"/>
+      <w:bookmarkStart w:id="20" w:name="_Toc212028730"/>
       <w:r>
         <w:rPr>
           <w:lang w:val="sr-Cyrl-RS"/>
@@ -24708,7 +24782,7 @@
     </w:p>
     <w:tbl>
       <w:tblPr>
-        <w:tblStyle w:val="GridTable4-Accent1"/>
+        <w:tblStyle w:val="TableGrid"/>
         <w:tblW w:w="0" w:type="auto"/>
         <w:tblLook w:val="04A0" w:firstRow="1" w:lastRow="0" w:firstColumn="1" w:lastColumn="0" w:noHBand="0" w:noVBand="1"/>
       </w:tblPr>
@@ -24717,13 +24791,10 @@
         <w:gridCol w:w="4149"/>
       </w:tblGrid>
       <w:tr>
-        <w:trPr>
-          <w:cnfStyle w:val="100000000000" w:firstRow="1" w:lastRow="0" w:firstColumn="0" w:lastColumn="0" w:oddVBand="0" w:evenVBand="0" w:oddHBand="0" w:evenHBand="0" w:firstRowFirstColumn="0" w:firstRowLastColumn="0" w:lastRowFirstColumn="0" w:lastRowLastColumn="0"/>
-        </w:trPr>
         <w:tc>
           <w:tcPr>
-            <w:cnfStyle w:val="001000000000" w:firstRow="0" w:lastRow="0" w:firstColumn="1" w:lastColumn="0" w:oddVBand="0" w:evenVBand="0" w:oddHBand="0" w:evenHBand="0" w:firstRowFirstColumn="0" w:firstRowLastColumn="0" w:lastRowFirstColumn="0" w:lastRowLastColumn="0"/>
             <w:tcW w:w="4148" w:type="dxa"/>
+            <w:shd w:val="clear" w:color="auto" w:fill="BFBFBF"/>
           </w:tcPr>
           <w:p>
             <w:pPr>
@@ -24743,11 +24814,11 @@
         <w:tc>
           <w:tcPr>
             <w:tcW w:w="4149" w:type="dxa"/>
+            <w:shd w:val="clear" w:color="auto" w:fill="BFBFBF"/>
           </w:tcPr>
           <w:p>
             <w:pPr>
               <w:jc w:val="both"/>
-              <w:cnfStyle w:val="100000000000" w:firstRow="1" w:lastRow="0" w:firstColumn="0" w:lastColumn="0" w:oddVBand="0" w:evenVBand="0" w:oddHBand="0" w:evenHBand="0" w:firstRowFirstColumn="0" w:firstRowLastColumn="0" w:lastRowFirstColumn="0" w:lastRowLastColumn="0"/>
               <w:rPr>
                 <w:lang w:val="sr-Cyrl-RS"/>
               </w:rPr>
@@ -24762,12 +24833,8 @@
         </w:tc>
       </w:tr>
       <w:tr>
-        <w:trPr>
-          <w:cnfStyle w:val="000000100000" w:firstRow="0" w:lastRow="0" w:firstColumn="0" w:lastColumn="0" w:oddVBand="0" w:evenVBand="0" w:oddHBand="1" w:evenHBand="0" w:firstRowFirstColumn="0" w:firstRowLastColumn="0" w:lastRowFirstColumn="0" w:lastRowLastColumn="0"/>
-        </w:trPr>
         <w:tc>
           <w:tcPr>
-            <w:cnfStyle w:val="001000000000" w:firstRow="0" w:lastRow="0" w:firstColumn="1" w:lastColumn="0" w:oddVBand="0" w:evenVBand="0" w:oddHBand="0" w:evenHBand="0" w:firstRowFirstColumn="0" w:firstRowLastColumn="0" w:lastRowFirstColumn="0" w:lastRowLastColumn="0"/>
             <w:tcW w:w="4148" w:type="dxa"/>
           </w:tcPr>
           <w:p>
@@ -24791,7 +24858,6 @@
           <w:p>
             <w:pPr>
               <w:jc w:val="both"/>
-              <w:cnfStyle w:val="000000100000" w:firstRow="0" w:lastRow="0" w:firstColumn="0" w:lastColumn="0" w:oddVBand="0" w:evenVBand="0" w:oddHBand="1" w:evenHBand="0" w:firstRowFirstColumn="0" w:firstRowLastColumn="0" w:lastRowFirstColumn="0" w:lastRowLastColumn="0"/>
               <w:rPr>
                 <w:lang w:val="sr-Cyrl-RS"/>
               </w:rPr>
@@ -24808,7 +24874,6 @@
       <w:tr>
         <w:tc>
           <w:tcPr>
-            <w:cnfStyle w:val="001000000000" w:firstRow="0" w:lastRow="0" w:firstColumn="1" w:lastColumn="0" w:oddVBand="0" w:evenVBand="0" w:oddHBand="0" w:evenHBand="0" w:firstRowFirstColumn="0" w:firstRowLastColumn="0" w:lastRowFirstColumn="0" w:lastRowLastColumn="0"/>
             <w:tcW w:w="4148" w:type="dxa"/>
           </w:tcPr>
           <w:p>
@@ -24830,7 +24895,6 @@
           <w:p>
             <w:pPr>
               <w:jc w:val="both"/>
-              <w:cnfStyle w:val="000000000000" w:firstRow="0" w:lastRow="0" w:firstColumn="0" w:lastColumn="0" w:oddVBand="0" w:evenVBand="0" w:oddHBand="0" w:evenHBand="0" w:firstRowFirstColumn="0" w:firstRowLastColumn="0" w:lastRowFirstColumn="0" w:lastRowLastColumn="0"/>
               <w:rPr>
                 <w:lang w:val="sr-Cyrl-RS"/>
               </w:rPr>
@@ -24845,12 +24909,8 @@
         </w:tc>
       </w:tr>
       <w:tr>
-        <w:trPr>
-          <w:cnfStyle w:val="000000100000" w:firstRow="0" w:lastRow="0" w:firstColumn="0" w:lastColumn="0" w:oddVBand="0" w:evenVBand="0" w:oddHBand="1" w:evenHBand="0" w:firstRowFirstColumn="0" w:firstRowLastColumn="0" w:lastRowFirstColumn="0" w:lastRowLastColumn="0"/>
-        </w:trPr>
         <w:tc>
           <w:tcPr>
-            <w:cnfStyle w:val="001000000000" w:firstRow="0" w:lastRow="0" w:firstColumn="1" w:lastColumn="0" w:oddVBand="0" w:evenVBand="0" w:oddHBand="0" w:evenHBand="0" w:firstRowFirstColumn="0" w:firstRowLastColumn="0" w:lastRowFirstColumn="0" w:lastRowLastColumn="0"/>
             <w:tcW w:w="4148" w:type="dxa"/>
           </w:tcPr>
           <w:p>
@@ -24872,7 +24932,6 @@
           <w:p>
             <w:pPr>
               <w:jc w:val="both"/>
-              <w:cnfStyle w:val="000000100000" w:firstRow="0" w:lastRow="0" w:firstColumn="0" w:lastColumn="0" w:oddVBand="0" w:evenVBand="0" w:oddHBand="1" w:evenHBand="0" w:firstRowFirstColumn="0" w:firstRowLastColumn="0" w:lastRowFirstColumn="0" w:lastRowLastColumn="0"/>
               <w:rPr>
                 <w:lang w:val="sr-Cyrl-RS"/>
               </w:rPr>
@@ -24889,7 +24948,6 @@
       <w:tr>
         <w:tc>
           <w:tcPr>
-            <w:cnfStyle w:val="001000000000" w:firstRow="0" w:lastRow="0" w:firstColumn="1" w:lastColumn="0" w:oddVBand="0" w:evenVBand="0" w:oddHBand="0" w:evenHBand="0" w:firstRowFirstColumn="0" w:firstRowLastColumn="0" w:lastRowFirstColumn="0" w:lastRowLastColumn="0"/>
             <w:tcW w:w="4148" w:type="dxa"/>
           </w:tcPr>
           <w:p>
@@ -24911,7 +24969,6 @@
           <w:p>
             <w:pPr>
               <w:jc w:val="both"/>
-              <w:cnfStyle w:val="000000000000" w:firstRow="0" w:lastRow="0" w:firstColumn="0" w:lastColumn="0" w:oddVBand="0" w:evenVBand="0" w:oddHBand="0" w:evenHBand="0" w:firstRowFirstColumn="0" w:firstRowLastColumn="0" w:lastRowFirstColumn="0" w:lastRowLastColumn="0"/>
               <w:rPr>
                 <w:lang w:val="sr-Latn-RS"/>
               </w:rPr>
@@ -24956,12 +25013,8 @@
         </w:tc>
       </w:tr>
       <w:tr>
-        <w:trPr>
-          <w:cnfStyle w:val="000000100000" w:firstRow="0" w:lastRow="0" w:firstColumn="0" w:lastColumn="0" w:oddVBand="0" w:evenVBand="0" w:oddHBand="1" w:evenHBand="0" w:firstRowFirstColumn="0" w:firstRowLastColumn="0" w:lastRowFirstColumn="0" w:lastRowLastColumn="0"/>
-        </w:trPr>
         <w:tc>
           <w:tcPr>
-            <w:cnfStyle w:val="001000000000" w:firstRow="0" w:lastRow="0" w:firstColumn="1" w:lastColumn="0" w:oddVBand="0" w:evenVBand="0" w:oddHBand="0" w:evenHBand="0" w:firstRowFirstColumn="0" w:firstRowLastColumn="0" w:lastRowFirstColumn="0" w:lastRowLastColumn="0"/>
             <w:tcW w:w="4148" w:type="dxa"/>
           </w:tcPr>
           <w:p>
@@ -24983,7 +25036,6 @@
           <w:p>
             <w:pPr>
               <w:jc w:val="both"/>
-              <w:cnfStyle w:val="000000100000" w:firstRow="0" w:lastRow="0" w:firstColumn="0" w:lastColumn="0" w:oddVBand="0" w:evenVBand="0" w:oddHBand="1" w:evenHBand="0" w:firstRowFirstColumn="0" w:firstRowLastColumn="0" w:lastRowFirstColumn="0" w:lastRowLastColumn="0"/>
               <w:rPr>
                 <w:lang w:val="sr-Cyrl-RS"/>
               </w:rPr>
@@ -25024,7 +25076,6 @@
       <w:tr>
         <w:tc>
           <w:tcPr>
-            <w:cnfStyle w:val="001000000000" w:firstRow="0" w:lastRow="0" w:firstColumn="1" w:lastColumn="0" w:oddVBand="0" w:evenVBand="0" w:oddHBand="0" w:evenHBand="0" w:firstRowFirstColumn="0" w:firstRowLastColumn="0" w:lastRowFirstColumn="0" w:lastRowLastColumn="0"/>
             <w:tcW w:w="4148" w:type="dxa"/>
           </w:tcPr>
           <w:p>
@@ -25049,7 +25100,6 @@
           <w:p>
             <w:pPr>
               <w:jc w:val="both"/>
-              <w:cnfStyle w:val="000000000000" w:firstRow="0" w:lastRow="0" w:firstColumn="0" w:lastColumn="0" w:oddVBand="0" w:evenVBand="0" w:oddHBand="0" w:evenHBand="0" w:firstRowFirstColumn="0" w:firstRowLastColumn="0" w:lastRowFirstColumn="0" w:lastRowLastColumn="0"/>
               <w:rPr>
                 <w:lang w:val="sr-Cyrl-RS"/>
               </w:rPr>
@@ -25065,12 +25115,10 @@
       </w:tr>
       <w:tr>
         <w:trPr>
-          <w:cnfStyle w:val="000000100000" w:firstRow="0" w:lastRow="0" w:firstColumn="0" w:lastColumn="0" w:oddVBand="0" w:evenVBand="0" w:oddHBand="1" w:evenHBand="0" w:firstRowFirstColumn="0" w:firstRowLastColumn="0" w:lastRowFirstColumn="0" w:lastRowLastColumn="0"/>
           <w:trHeight w:val="165"/>
         </w:trPr>
         <w:tc>
           <w:tcPr>
-            <w:cnfStyle w:val="001000000000" w:firstRow="0" w:lastRow="0" w:firstColumn="1" w:lastColumn="0" w:oddVBand="0" w:evenVBand="0" w:oddHBand="0" w:evenHBand="0" w:firstRowFirstColumn="0" w:firstRowLastColumn="0" w:lastRowFirstColumn="0" w:lastRowLastColumn="0"/>
             <w:tcW w:w="4148" w:type="dxa"/>
           </w:tcPr>
           <w:p>
@@ -25095,7 +25143,6 @@
           <w:p>
             <w:pPr>
               <w:jc w:val="both"/>
-              <w:cnfStyle w:val="000000100000" w:firstRow="0" w:lastRow="0" w:firstColumn="0" w:lastColumn="0" w:oddVBand="0" w:evenVBand="0" w:oddHBand="1" w:evenHBand="0" w:firstRowFirstColumn="0" w:firstRowLastColumn="0" w:lastRowFirstColumn="0" w:lastRowLastColumn="0"/>
               <w:rPr>
                 <w:lang w:val="sr-Cyrl-RS"/>
               </w:rPr>
@@ -25507,7 +25554,7 @@
     </w:p>
     <w:tbl>
       <w:tblPr>
-        <w:tblStyle w:val="GridTable4-Accent1"/>
+        <w:tblStyle w:val="TableGrid"/>
         <w:tblW w:w="0" w:type="auto"/>
         <w:tblLook w:val="04A0" w:firstRow="1" w:lastRow="0" w:firstColumn="1" w:lastColumn="0" w:noHBand="0" w:noVBand="1"/>
       </w:tblPr>
@@ -25516,12 +25563,54 @@
         <w:gridCol w:w="4149"/>
       </w:tblGrid>
       <w:tr>
-        <w:trPr>
-          <w:cnfStyle w:val="100000000000" w:firstRow="1" w:lastRow="0" w:firstColumn="0" w:lastColumn="0" w:oddVBand="0" w:evenVBand="0" w:oddHBand="0" w:evenHBand="0" w:firstRowFirstColumn="0" w:firstRowLastColumn="0" w:lastRowFirstColumn="0" w:lastRowLastColumn="0"/>
-        </w:trPr>
         <w:tc>
           <w:tcPr>
-            <w:cnfStyle w:val="001000000000" w:firstRow="0" w:lastRow="0" w:firstColumn="1" w:lastColumn="0" w:oddVBand="0" w:evenVBand="0" w:oddHBand="0" w:evenHBand="0" w:firstRowFirstColumn="0" w:firstRowLastColumn="0" w:lastRowFirstColumn="0" w:lastRowLastColumn="0"/>
+            <w:tcW w:w="4148" w:type="dxa"/>
+            <w:shd w:val="clear" w:color="auto" w:fill="BFBFBF"/>
+          </w:tcPr>
+          <w:p>
+            <w:pPr>
+              <w:pStyle w:val="ListParagraph"/>
+              <w:ind w:left="0"/>
+              <w:jc w:val="both"/>
+              <w:rPr>
+                <w:lang w:val="sr-Cyrl-RS"/>
+              </w:rPr>
+            </w:pPr>
+            <w:r>
+              <w:rPr>
+                <w:lang w:val="sr-Cyrl-RS"/>
+              </w:rPr>
+              <w:t>Назив колоне</w:t>
+            </w:r>
+          </w:p>
+        </w:tc>
+        <w:tc>
+          <w:tcPr>
+            <w:tcW w:w="4149" w:type="dxa"/>
+            <w:shd w:val="clear" w:color="auto" w:fill="BFBFBF"/>
+          </w:tcPr>
+          <w:p>
+            <w:pPr>
+              <w:pStyle w:val="ListParagraph"/>
+              <w:ind w:left="0"/>
+              <w:jc w:val="both"/>
+              <w:rPr>
+                <w:lang w:val="sr-Cyrl-RS"/>
+              </w:rPr>
+            </w:pPr>
+            <w:r>
+              <w:rPr>
+                <w:lang w:val="sr-Cyrl-RS"/>
+              </w:rPr>
+              <w:t>Опис</w:t>
+            </w:r>
+          </w:p>
+        </w:tc>
+      </w:tr>
+      <w:tr>
+        <w:tc>
+          <w:tcPr>
             <w:tcW w:w="4148" w:type="dxa"/>
           </w:tcPr>
           <w:p>
@@ -25537,7 +25626,7 @@
               <w:rPr>
                 <w:lang w:val="sr-Cyrl-RS"/>
               </w:rPr>
-              <w:t>Назив колоне</w:t>
+              <w:t>adult</w:t>
             </w:r>
           </w:p>
         </w:tc>
@@ -25550,7 +25639,6 @@
               <w:pStyle w:val="ListParagraph"/>
               <w:ind w:left="0"/>
               <w:jc w:val="both"/>
-              <w:cnfStyle w:val="100000000000" w:firstRow="1" w:lastRow="0" w:firstColumn="0" w:lastColumn="0" w:oddVBand="0" w:evenVBand="0" w:oddHBand="0" w:evenHBand="0" w:firstRowFirstColumn="0" w:firstRowLastColumn="0" w:lastRowFirstColumn="0" w:lastRowLastColumn="0"/>
               <w:rPr>
                 <w:lang w:val="sr-Cyrl-RS"/>
               </w:rPr>
@@ -25559,18 +25647,14 @@
               <w:rPr>
                 <w:lang w:val="sr-Cyrl-RS"/>
               </w:rPr>
-              <w:t>Опис</w:t>
+              <w:t>Представља да ли је у питању филм за одрасле</w:t>
             </w:r>
           </w:p>
         </w:tc>
       </w:tr>
       <w:tr>
-        <w:trPr>
-          <w:cnfStyle w:val="000000100000" w:firstRow="0" w:lastRow="0" w:firstColumn="0" w:lastColumn="0" w:oddVBand="0" w:evenVBand="0" w:oddHBand="1" w:evenHBand="0" w:firstRowFirstColumn="0" w:firstRowLastColumn="0" w:lastRowFirstColumn="0" w:lastRowLastColumn="0"/>
-        </w:trPr>
         <w:tc>
           <w:tcPr>
-            <w:cnfStyle w:val="001000000000" w:firstRow="0" w:lastRow="0" w:firstColumn="1" w:lastColumn="0" w:oddVBand="0" w:evenVBand="0" w:oddHBand="0" w:evenHBand="0" w:firstRowFirstColumn="0" w:firstRowLastColumn="0" w:lastRowFirstColumn="0" w:lastRowLastColumn="0"/>
             <w:tcW w:w="4148" w:type="dxa"/>
           </w:tcPr>
           <w:p>
@@ -25586,7 +25670,7 @@
               <w:rPr>
                 <w:lang w:val="sr-Cyrl-RS"/>
               </w:rPr>
-              <w:t>adult</w:t>
+              <w:t>belongs_to_collection</w:t>
             </w:r>
           </w:p>
         </w:tc>
@@ -25599,7 +25683,6 @@
               <w:pStyle w:val="ListParagraph"/>
               <w:ind w:left="0"/>
               <w:jc w:val="both"/>
-              <w:cnfStyle w:val="000000100000" w:firstRow="0" w:lastRow="0" w:firstColumn="0" w:lastColumn="0" w:oddVBand="0" w:evenVBand="0" w:oddHBand="1" w:evenHBand="0" w:firstRowFirstColumn="0" w:firstRowLastColumn="0" w:lastRowFirstColumn="0" w:lastRowLastColumn="0"/>
               <w:rPr>
                 <w:lang w:val="sr-Cyrl-RS"/>
               </w:rPr>
@@ -25608,7 +25691,7 @@
               <w:rPr>
                 <w:lang w:val="sr-Cyrl-RS"/>
               </w:rPr>
-              <w:t>Представља да ли је у питању филм за одрасле</w:t>
+              <w:t>Информација да ли припада некој колекцији филмова и којој припада(нпр. „Спајдермен“, „Прича о играчкама“ и сл.)</w:t>
             </w:r>
           </w:p>
         </w:tc>
@@ -25616,7 +25699,6 @@
       <w:tr>
         <w:tc>
           <w:tcPr>
-            <w:cnfStyle w:val="001000000000" w:firstRow="0" w:lastRow="0" w:firstColumn="1" w:lastColumn="0" w:oddVBand="0" w:evenVBand="0" w:oddHBand="0" w:evenHBand="0" w:firstRowFirstColumn="0" w:firstRowLastColumn="0" w:lastRowFirstColumn="0" w:lastRowLastColumn="0"/>
             <w:tcW w:w="4148" w:type="dxa"/>
           </w:tcPr>
           <w:p>
@@ -25632,7 +25714,7 @@
               <w:rPr>
                 <w:lang w:val="sr-Cyrl-RS"/>
               </w:rPr>
-              <w:t>belongs_to_collection</w:t>
+              <w:t>budget</w:t>
             </w:r>
           </w:p>
         </w:tc>
@@ -25645,7 +25727,6 @@
               <w:pStyle w:val="ListParagraph"/>
               <w:ind w:left="0"/>
               <w:jc w:val="both"/>
-              <w:cnfStyle w:val="000000000000" w:firstRow="0" w:lastRow="0" w:firstColumn="0" w:lastColumn="0" w:oddVBand="0" w:evenVBand="0" w:oddHBand="0" w:evenHBand="0" w:firstRowFirstColumn="0" w:firstRowLastColumn="0" w:lastRowFirstColumn="0" w:lastRowLastColumn="0"/>
               <w:rPr>
                 <w:lang w:val="sr-Cyrl-RS"/>
               </w:rPr>
@@ -25654,18 +25735,14 @@
               <w:rPr>
                 <w:lang w:val="sr-Cyrl-RS"/>
               </w:rPr>
-              <w:t>Информација да ли припада некој колекцији филмова и којој припада(нпр. „Спајдермен“, „Прича о играчкама“ и сл.)</w:t>
+              <w:t>Колико је буџет филма</w:t>
             </w:r>
           </w:p>
         </w:tc>
       </w:tr>
       <w:tr>
-        <w:trPr>
-          <w:cnfStyle w:val="000000100000" w:firstRow="0" w:lastRow="0" w:firstColumn="0" w:lastColumn="0" w:oddVBand="0" w:evenVBand="0" w:oddHBand="1" w:evenHBand="0" w:firstRowFirstColumn="0" w:firstRowLastColumn="0" w:lastRowFirstColumn="0" w:lastRowLastColumn="0"/>
-        </w:trPr>
         <w:tc>
           <w:tcPr>
-            <w:cnfStyle w:val="001000000000" w:firstRow="0" w:lastRow="0" w:firstColumn="1" w:lastColumn="0" w:oddVBand="0" w:evenVBand="0" w:oddHBand="0" w:evenHBand="0" w:firstRowFirstColumn="0" w:firstRowLastColumn="0" w:lastRowFirstColumn="0" w:lastRowLastColumn="0"/>
             <w:tcW w:w="4148" w:type="dxa"/>
           </w:tcPr>
           <w:p>
@@ -25681,7 +25758,7 @@
               <w:rPr>
                 <w:lang w:val="sr-Cyrl-RS"/>
               </w:rPr>
-              <w:t>budget</w:t>
+              <w:t>genres</w:t>
             </w:r>
           </w:p>
         </w:tc>
@@ -25694,7 +25771,6 @@
               <w:pStyle w:val="ListParagraph"/>
               <w:ind w:left="0"/>
               <w:jc w:val="both"/>
-              <w:cnfStyle w:val="000000100000" w:firstRow="0" w:lastRow="0" w:firstColumn="0" w:lastColumn="0" w:oddVBand="0" w:evenVBand="0" w:oddHBand="1" w:evenHBand="0" w:firstRowFirstColumn="0" w:firstRowLastColumn="0" w:lastRowFirstColumn="0" w:lastRowLastColumn="0"/>
               <w:rPr>
                 <w:lang w:val="sr-Cyrl-RS"/>
               </w:rPr>
@@ -25703,7 +25779,7 @@
               <w:rPr>
                 <w:lang w:val="sr-Cyrl-RS"/>
               </w:rPr>
-              <w:t>Колико је буџет филма</w:t>
+              <w:t>Листа жанрова коме филм припада</w:t>
             </w:r>
           </w:p>
         </w:tc>
@@ -25711,7 +25787,6 @@
       <w:tr>
         <w:tc>
           <w:tcPr>
-            <w:cnfStyle w:val="001000000000" w:firstRow="0" w:lastRow="0" w:firstColumn="1" w:lastColumn="0" w:oddVBand="0" w:evenVBand="0" w:oddHBand="0" w:evenHBand="0" w:firstRowFirstColumn="0" w:firstRowLastColumn="0" w:lastRowFirstColumn="0" w:lastRowLastColumn="0"/>
             <w:tcW w:w="4148" w:type="dxa"/>
           </w:tcPr>
           <w:p>
@@ -25727,7 +25802,7 @@
               <w:rPr>
                 <w:lang w:val="sr-Cyrl-RS"/>
               </w:rPr>
-              <w:t>genres</w:t>
+              <w:t>homepage</w:t>
             </w:r>
           </w:p>
         </w:tc>
@@ -25740,7 +25815,6 @@
               <w:pStyle w:val="ListParagraph"/>
               <w:ind w:left="0"/>
               <w:jc w:val="both"/>
-              <w:cnfStyle w:val="000000000000" w:firstRow="0" w:lastRow="0" w:firstColumn="0" w:lastColumn="0" w:oddVBand="0" w:evenVBand="0" w:oddHBand="0" w:evenHBand="0" w:firstRowFirstColumn="0" w:firstRowLastColumn="0" w:lastRowFirstColumn="0" w:lastRowLastColumn="0"/>
               <w:rPr>
                 <w:lang w:val="sr-Cyrl-RS"/>
               </w:rPr>
@@ -25749,24 +25823,18 @@
               <w:rPr>
                 <w:lang w:val="sr-Cyrl-RS"/>
               </w:rPr>
-              <w:t>Листа жанрова коме филм припада</w:t>
+              <w:t>Почетна страна филма, уколико постоји</w:t>
             </w:r>
           </w:p>
         </w:tc>
       </w:tr>
       <w:tr>
-        <w:trPr>
-          <w:cnfStyle w:val="000000100000" w:firstRow="0" w:lastRow="0" w:firstColumn="0" w:lastColumn="0" w:oddVBand="0" w:evenVBand="0" w:oddHBand="1" w:evenHBand="0" w:firstRowFirstColumn="0" w:firstRowLastColumn="0" w:lastRowFirstColumn="0" w:lastRowLastColumn="0"/>
-        </w:trPr>
         <w:tc>
           <w:tcPr>
-            <w:cnfStyle w:val="001000000000" w:firstRow="0" w:lastRow="0" w:firstColumn="1" w:lastColumn="0" w:oddVBand="0" w:evenVBand="0" w:oddHBand="0" w:evenHBand="0" w:firstRowFirstColumn="0" w:firstRowLastColumn="0" w:lastRowFirstColumn="0" w:lastRowLastColumn="0"/>
             <w:tcW w:w="4148" w:type="dxa"/>
           </w:tcPr>
           <w:p>
             <w:pPr>
-              <w:pStyle w:val="ListParagraph"/>
-              <w:ind w:left="0"/>
               <w:jc w:val="both"/>
               <w:rPr>
                 <w:lang w:val="sr-Cyrl-RS"/>
@@ -25776,7 +25844,7 @@
               <w:rPr>
                 <w:lang w:val="sr-Cyrl-RS"/>
               </w:rPr>
-              <w:t>homepage</w:t>
+              <w:t>id</w:t>
             </w:r>
           </w:p>
         </w:tc>
@@ -25789,16 +25857,21 @@
               <w:pStyle w:val="ListParagraph"/>
               <w:ind w:left="0"/>
               <w:jc w:val="both"/>
-              <w:cnfStyle w:val="000000100000" w:firstRow="0" w:lastRow="0" w:firstColumn="0" w:lastColumn="0" w:oddVBand="0" w:evenVBand="0" w:oddHBand="1" w:evenHBand="0" w:firstRowFirstColumn="0" w:firstRowLastColumn="0" w:lastRowFirstColumn="0" w:lastRowLastColumn="0"/>
               <w:rPr>
                 <w:lang w:val="sr-Cyrl-RS"/>
               </w:rPr>
             </w:pPr>
             <w:r>
               <w:rPr>
-                <w:lang w:val="sr-Cyrl-RS"/>
-              </w:rPr>
-              <w:t>Почетна страна филма, уколико постоји</w:t>
+                <w:lang w:val="en-US"/>
+              </w:rPr>
+              <w:t xml:space="preserve">ID </w:t>
+            </w:r>
+            <w:r>
+              <w:rPr>
+                <w:lang w:val="sr-Cyrl-RS"/>
+              </w:rPr>
+              <w:t>филма</w:t>
             </w:r>
           </w:p>
         </w:tc>
@@ -25806,11 +25879,12 @@
       <w:tr>
         <w:tc>
           <w:tcPr>
-            <w:cnfStyle w:val="001000000000" w:firstRow="0" w:lastRow="0" w:firstColumn="1" w:lastColumn="0" w:oddVBand="0" w:evenVBand="0" w:oddHBand="0" w:evenHBand="0" w:firstRowFirstColumn="0" w:firstRowLastColumn="0" w:lastRowFirstColumn="0" w:lastRowLastColumn="0"/>
             <w:tcW w:w="4148" w:type="dxa"/>
           </w:tcPr>
           <w:p>
             <w:pPr>
+              <w:pStyle w:val="ListParagraph"/>
+              <w:ind w:left="0"/>
               <w:jc w:val="both"/>
               <w:rPr>
                 <w:lang w:val="sr-Cyrl-RS"/>
@@ -25820,7 +25894,7 @@
               <w:rPr>
                 <w:lang w:val="sr-Cyrl-RS"/>
               </w:rPr>
-              <w:t>id</w:t>
+              <w:t>imdb_id</w:t>
             </w:r>
           </w:p>
         </w:tc>
@@ -25833,7 +25907,6 @@
               <w:pStyle w:val="ListParagraph"/>
               <w:ind w:left="0"/>
               <w:jc w:val="both"/>
-              <w:cnfStyle w:val="000000000000" w:firstRow="0" w:lastRow="0" w:firstColumn="0" w:lastColumn="0" w:oddVBand="0" w:evenVBand="0" w:oddHBand="0" w:evenHBand="0" w:firstRowFirstColumn="0" w:firstRowLastColumn="0" w:lastRowFirstColumn="0" w:lastRowLastColumn="0"/>
               <w:rPr>
                 <w:lang w:val="sr-Cyrl-RS"/>
               </w:rPr>
@@ -25848,18 +25921,26 @@
               <w:rPr>
                 <w:lang w:val="sr-Cyrl-RS"/>
               </w:rPr>
-              <w:t>филма</w:t>
+              <w:t xml:space="preserve">филма на </w:t>
+            </w:r>
+            <w:r>
+              <w:rPr>
+                <w:lang w:val="en-US"/>
+              </w:rPr>
+              <w:t>IMDB-</w:t>
+            </w:r>
+            <w:r>
+              <w:rPr>
+                <w:lang w:val="sr-Cyrl-RS"/>
+              </w:rPr>
+              <w:t>у</w:t>
             </w:r>
           </w:p>
         </w:tc>
       </w:tr>
       <w:tr>
-        <w:trPr>
-          <w:cnfStyle w:val="000000100000" w:firstRow="0" w:lastRow="0" w:firstColumn="0" w:lastColumn="0" w:oddVBand="0" w:evenVBand="0" w:oddHBand="1" w:evenHBand="0" w:firstRowFirstColumn="0" w:firstRowLastColumn="0" w:lastRowFirstColumn="0" w:lastRowLastColumn="0"/>
-        </w:trPr>
         <w:tc>
           <w:tcPr>
-            <w:cnfStyle w:val="001000000000" w:firstRow="0" w:lastRow="0" w:firstColumn="1" w:lastColumn="0" w:oddVBand="0" w:evenVBand="0" w:oddHBand="0" w:evenHBand="0" w:firstRowFirstColumn="0" w:firstRowLastColumn="0" w:lastRowFirstColumn="0" w:lastRowLastColumn="0"/>
             <w:tcW w:w="4148" w:type="dxa"/>
           </w:tcPr>
           <w:p>
@@ -25875,7 +25956,7 @@
               <w:rPr>
                 <w:lang w:val="sr-Cyrl-RS"/>
               </w:rPr>
-              <w:t>imdb_id</w:t>
+              <w:t>original_language</w:t>
             </w:r>
           </w:p>
         </w:tc>
@@ -25888,34 +25969,15 @@
               <w:pStyle w:val="ListParagraph"/>
               <w:ind w:left="0"/>
               <w:jc w:val="both"/>
-              <w:cnfStyle w:val="000000100000" w:firstRow="0" w:lastRow="0" w:firstColumn="0" w:lastColumn="0" w:oddVBand="0" w:evenVBand="0" w:oddHBand="1" w:evenHBand="0" w:firstRowFirstColumn="0" w:firstRowLastColumn="0" w:lastRowFirstColumn="0" w:lastRowLastColumn="0"/>
               <w:rPr>
                 <w:lang w:val="sr-Cyrl-RS"/>
               </w:rPr>
             </w:pPr>
             <w:r>
               <w:rPr>
-                <w:lang w:val="en-US"/>
-              </w:rPr>
-              <w:t xml:space="preserve">ID </w:t>
-            </w:r>
-            <w:r>
-              <w:rPr>
-                <w:lang w:val="sr-Cyrl-RS"/>
-              </w:rPr>
-              <w:t xml:space="preserve">филма на </w:t>
-            </w:r>
-            <w:r>
-              <w:rPr>
-                <w:lang w:val="en-US"/>
-              </w:rPr>
-              <w:t>IMDB-</w:t>
-            </w:r>
-            <w:r>
-              <w:rPr>
-                <w:lang w:val="sr-Cyrl-RS"/>
-              </w:rPr>
-              <w:t>у</w:t>
+                <w:lang w:val="sr-Cyrl-RS"/>
+              </w:rPr>
+              <w:t>Језик наслова оригинала</w:t>
             </w:r>
           </w:p>
         </w:tc>
@@ -25923,7 +25985,6 @@
       <w:tr>
         <w:tc>
           <w:tcPr>
-            <w:cnfStyle w:val="001000000000" w:firstRow="0" w:lastRow="0" w:firstColumn="1" w:lastColumn="0" w:oddVBand="0" w:evenVBand="0" w:oddHBand="0" w:evenHBand="0" w:firstRowFirstColumn="0" w:firstRowLastColumn="0" w:lastRowFirstColumn="0" w:lastRowLastColumn="0"/>
             <w:tcW w:w="4148" w:type="dxa"/>
           </w:tcPr>
           <w:p>
@@ -25939,7 +26000,7 @@
               <w:rPr>
                 <w:lang w:val="sr-Cyrl-RS"/>
               </w:rPr>
-              <w:t>original_language</w:t>
+              <w:t>original_title</w:t>
             </w:r>
           </w:p>
         </w:tc>
@@ -25952,7 +26013,6 @@
               <w:pStyle w:val="ListParagraph"/>
               <w:ind w:left="0"/>
               <w:jc w:val="both"/>
-              <w:cnfStyle w:val="000000000000" w:firstRow="0" w:lastRow="0" w:firstColumn="0" w:lastColumn="0" w:oddVBand="0" w:evenVBand="0" w:oddHBand="0" w:evenHBand="0" w:firstRowFirstColumn="0" w:firstRowLastColumn="0" w:lastRowFirstColumn="0" w:lastRowLastColumn="0"/>
               <w:rPr>
                 <w:lang w:val="sr-Cyrl-RS"/>
               </w:rPr>
@@ -25961,18 +26021,14 @@
               <w:rPr>
                 <w:lang w:val="sr-Cyrl-RS"/>
               </w:rPr>
-              <w:t>Језик наслова оригинала</w:t>
+              <w:t>Наслов оригинала</w:t>
             </w:r>
           </w:p>
         </w:tc>
       </w:tr>
       <w:tr>
-        <w:trPr>
-          <w:cnfStyle w:val="000000100000" w:firstRow="0" w:lastRow="0" w:firstColumn="0" w:lastColumn="0" w:oddVBand="0" w:evenVBand="0" w:oddHBand="1" w:evenHBand="0" w:firstRowFirstColumn="0" w:firstRowLastColumn="0" w:lastRowFirstColumn="0" w:lastRowLastColumn="0"/>
-        </w:trPr>
         <w:tc>
           <w:tcPr>
-            <w:cnfStyle w:val="001000000000" w:firstRow="0" w:lastRow="0" w:firstColumn="1" w:lastColumn="0" w:oddVBand="0" w:evenVBand="0" w:oddHBand="0" w:evenHBand="0" w:firstRowFirstColumn="0" w:firstRowLastColumn="0" w:lastRowFirstColumn="0" w:lastRowLastColumn="0"/>
             <w:tcW w:w="4148" w:type="dxa"/>
           </w:tcPr>
           <w:p>
@@ -25988,7 +26044,7 @@
               <w:rPr>
                 <w:lang w:val="sr-Cyrl-RS"/>
               </w:rPr>
-              <w:t>original_title</w:t>
+              <w:t>overview</w:t>
             </w:r>
           </w:p>
         </w:tc>
@@ -26001,7 +26057,6 @@
               <w:pStyle w:val="ListParagraph"/>
               <w:ind w:left="0"/>
               <w:jc w:val="both"/>
-              <w:cnfStyle w:val="000000100000" w:firstRow="0" w:lastRow="0" w:firstColumn="0" w:lastColumn="0" w:oddVBand="0" w:evenVBand="0" w:oddHBand="1" w:evenHBand="0" w:firstRowFirstColumn="0" w:firstRowLastColumn="0" w:lastRowFirstColumn="0" w:lastRowLastColumn="0"/>
               <w:rPr>
                 <w:lang w:val="sr-Cyrl-RS"/>
               </w:rPr>
@@ -26010,7 +26065,7 @@
               <w:rPr>
                 <w:lang w:val="sr-Cyrl-RS"/>
               </w:rPr>
-              <w:t>Наслов оригинала</w:t>
+              <w:t>Синопсис</w:t>
             </w:r>
           </w:p>
         </w:tc>
@@ -26018,7 +26073,6 @@
       <w:tr>
         <w:tc>
           <w:tcPr>
-            <w:cnfStyle w:val="001000000000" w:firstRow="0" w:lastRow="0" w:firstColumn="1" w:lastColumn="0" w:oddVBand="0" w:evenVBand="0" w:oddHBand="0" w:evenHBand="0" w:firstRowFirstColumn="0" w:firstRowLastColumn="0" w:lastRowFirstColumn="0" w:lastRowLastColumn="0"/>
             <w:tcW w:w="4148" w:type="dxa"/>
           </w:tcPr>
           <w:p>
@@ -26034,7 +26088,7 @@
               <w:rPr>
                 <w:lang w:val="sr-Cyrl-RS"/>
               </w:rPr>
-              <w:t>overview</w:t>
+              <w:t>popularity</w:t>
             </w:r>
           </w:p>
         </w:tc>
@@ -26047,7 +26101,6 @@
               <w:pStyle w:val="ListParagraph"/>
               <w:ind w:left="0"/>
               <w:jc w:val="both"/>
-              <w:cnfStyle w:val="000000000000" w:firstRow="0" w:lastRow="0" w:firstColumn="0" w:lastColumn="0" w:oddVBand="0" w:evenVBand="0" w:oddHBand="0" w:evenHBand="0" w:firstRowFirstColumn="0" w:firstRowLastColumn="0" w:lastRowFirstColumn="0" w:lastRowLastColumn="0"/>
               <w:rPr>
                 <w:lang w:val="sr-Cyrl-RS"/>
               </w:rPr>
@@ -26056,18 +26109,14 @@
               <w:rPr>
                 <w:lang w:val="sr-Cyrl-RS"/>
               </w:rPr>
-              <w:t>Синопсис</w:t>
+              <w:t>Популарност</w:t>
             </w:r>
           </w:p>
         </w:tc>
       </w:tr>
       <w:tr>
-        <w:trPr>
-          <w:cnfStyle w:val="000000100000" w:firstRow="0" w:lastRow="0" w:firstColumn="0" w:lastColumn="0" w:oddVBand="0" w:evenVBand="0" w:oddHBand="1" w:evenHBand="0" w:firstRowFirstColumn="0" w:firstRowLastColumn="0" w:lastRowFirstColumn="0" w:lastRowLastColumn="0"/>
-        </w:trPr>
         <w:tc>
           <w:tcPr>
-            <w:cnfStyle w:val="001000000000" w:firstRow="0" w:lastRow="0" w:firstColumn="1" w:lastColumn="0" w:oddVBand="0" w:evenVBand="0" w:oddHBand="0" w:evenHBand="0" w:firstRowFirstColumn="0" w:firstRowLastColumn="0" w:lastRowFirstColumn="0" w:lastRowLastColumn="0"/>
             <w:tcW w:w="4148" w:type="dxa"/>
           </w:tcPr>
           <w:p>
@@ -26083,7 +26132,7 @@
               <w:rPr>
                 <w:lang w:val="sr-Cyrl-RS"/>
               </w:rPr>
-              <w:t>popularity</w:t>
+              <w:t>poster_path</w:t>
             </w:r>
           </w:p>
         </w:tc>
@@ -26096,7 +26145,6 @@
               <w:pStyle w:val="ListParagraph"/>
               <w:ind w:left="0"/>
               <w:jc w:val="both"/>
-              <w:cnfStyle w:val="000000100000" w:firstRow="0" w:lastRow="0" w:firstColumn="0" w:lastColumn="0" w:oddVBand="0" w:evenVBand="0" w:oddHBand="1" w:evenHBand="0" w:firstRowFirstColumn="0" w:firstRowLastColumn="0" w:lastRowFirstColumn="0" w:lastRowLastColumn="0"/>
               <w:rPr>
                 <w:lang w:val="sr-Cyrl-RS"/>
               </w:rPr>
@@ -26105,7 +26153,7 @@
               <w:rPr>
                 <w:lang w:val="sr-Cyrl-RS"/>
               </w:rPr>
-              <w:t>Популарност</w:t>
+              <w:t>Путања до постера (одакле се преузима слика)</w:t>
             </w:r>
           </w:p>
         </w:tc>
@@ -26113,7 +26161,6 @@
       <w:tr>
         <w:tc>
           <w:tcPr>
-            <w:cnfStyle w:val="001000000000" w:firstRow="0" w:lastRow="0" w:firstColumn="1" w:lastColumn="0" w:oddVBand="0" w:evenVBand="0" w:oddHBand="0" w:evenHBand="0" w:firstRowFirstColumn="0" w:firstRowLastColumn="0" w:lastRowFirstColumn="0" w:lastRowLastColumn="0"/>
             <w:tcW w:w="4148" w:type="dxa"/>
           </w:tcPr>
           <w:p>
@@ -26129,7 +26176,7 @@
               <w:rPr>
                 <w:lang w:val="sr-Cyrl-RS"/>
               </w:rPr>
-              <w:t>poster_path</w:t>
+              <w:t>production_companies</w:t>
             </w:r>
           </w:p>
         </w:tc>
@@ -26142,7 +26189,6 @@
               <w:pStyle w:val="ListParagraph"/>
               <w:ind w:left="0"/>
               <w:jc w:val="both"/>
-              <w:cnfStyle w:val="000000000000" w:firstRow="0" w:lastRow="0" w:firstColumn="0" w:lastColumn="0" w:oddVBand="0" w:evenVBand="0" w:oddHBand="0" w:evenHBand="0" w:firstRowFirstColumn="0" w:firstRowLastColumn="0" w:lastRowFirstColumn="0" w:lastRowLastColumn="0"/>
               <w:rPr>
                 <w:lang w:val="sr-Cyrl-RS"/>
               </w:rPr>
@@ -26151,18 +26197,14 @@
               <w:rPr>
                 <w:lang w:val="sr-Cyrl-RS"/>
               </w:rPr>
-              <w:t>Путања до постера (одакле се преузима слика)</w:t>
+              <w:t>Продукцијске компаније</w:t>
             </w:r>
           </w:p>
         </w:tc>
       </w:tr>
       <w:tr>
-        <w:trPr>
-          <w:cnfStyle w:val="000000100000" w:firstRow="0" w:lastRow="0" w:firstColumn="0" w:lastColumn="0" w:oddVBand="0" w:evenVBand="0" w:oddHBand="1" w:evenHBand="0" w:firstRowFirstColumn="0" w:firstRowLastColumn="0" w:lastRowFirstColumn="0" w:lastRowLastColumn="0"/>
-        </w:trPr>
         <w:tc>
           <w:tcPr>
-            <w:cnfStyle w:val="001000000000" w:firstRow="0" w:lastRow="0" w:firstColumn="1" w:lastColumn="0" w:oddVBand="0" w:evenVBand="0" w:oddHBand="0" w:evenHBand="0" w:firstRowFirstColumn="0" w:firstRowLastColumn="0" w:lastRowFirstColumn="0" w:lastRowLastColumn="0"/>
             <w:tcW w:w="4148" w:type="dxa"/>
           </w:tcPr>
           <w:p>
@@ -26178,7 +26220,7 @@
               <w:rPr>
                 <w:lang w:val="sr-Cyrl-RS"/>
               </w:rPr>
-              <w:t>production_companies</w:t>
+              <w:t>production_countries</w:t>
             </w:r>
           </w:p>
         </w:tc>
@@ -26191,7 +26233,6 @@
               <w:pStyle w:val="ListParagraph"/>
               <w:ind w:left="0"/>
               <w:jc w:val="both"/>
-              <w:cnfStyle w:val="000000100000" w:firstRow="0" w:lastRow="0" w:firstColumn="0" w:lastColumn="0" w:oddVBand="0" w:evenVBand="0" w:oddHBand="1" w:evenHBand="0" w:firstRowFirstColumn="0" w:firstRowLastColumn="0" w:lastRowFirstColumn="0" w:lastRowLastColumn="0"/>
               <w:rPr>
                 <w:lang w:val="sr-Cyrl-RS"/>
               </w:rPr>
@@ -26200,7 +26241,7 @@
               <w:rPr>
                 <w:lang w:val="sr-Cyrl-RS"/>
               </w:rPr>
-              <w:t>Продукцијске компаније</w:t>
+              <w:t>Државе из које су продукцијске компаније</w:t>
             </w:r>
           </w:p>
         </w:tc>
@@ -26208,7 +26249,6 @@
       <w:tr>
         <w:tc>
           <w:tcPr>
-            <w:cnfStyle w:val="001000000000" w:firstRow="0" w:lastRow="0" w:firstColumn="1" w:lastColumn="0" w:oddVBand="0" w:evenVBand="0" w:oddHBand="0" w:evenHBand="0" w:firstRowFirstColumn="0" w:firstRowLastColumn="0" w:lastRowFirstColumn="0" w:lastRowLastColumn="0"/>
             <w:tcW w:w="4148" w:type="dxa"/>
           </w:tcPr>
           <w:p>
@@ -26224,7 +26264,7 @@
               <w:rPr>
                 <w:lang w:val="sr-Cyrl-RS"/>
               </w:rPr>
-              <w:t>production_countries</w:t>
+              <w:t>release_date</w:t>
             </w:r>
           </w:p>
         </w:tc>
@@ -26237,7 +26277,6 @@
               <w:pStyle w:val="ListParagraph"/>
               <w:ind w:left="0"/>
               <w:jc w:val="both"/>
-              <w:cnfStyle w:val="000000000000" w:firstRow="0" w:lastRow="0" w:firstColumn="0" w:lastColumn="0" w:oddVBand="0" w:evenVBand="0" w:oddHBand="0" w:evenHBand="0" w:firstRowFirstColumn="0" w:firstRowLastColumn="0" w:lastRowFirstColumn="0" w:lastRowLastColumn="0"/>
               <w:rPr>
                 <w:lang w:val="sr-Cyrl-RS"/>
               </w:rPr>
@@ -26246,18 +26285,14 @@
               <w:rPr>
                 <w:lang w:val="sr-Cyrl-RS"/>
               </w:rPr>
-              <w:t>Државе из које су продукцијске компаније</w:t>
+              <w:t>Датум објављивања</w:t>
             </w:r>
           </w:p>
         </w:tc>
       </w:tr>
       <w:tr>
-        <w:trPr>
-          <w:cnfStyle w:val="000000100000" w:firstRow="0" w:lastRow="0" w:firstColumn="0" w:lastColumn="0" w:oddVBand="0" w:evenVBand="0" w:oddHBand="1" w:evenHBand="0" w:firstRowFirstColumn="0" w:firstRowLastColumn="0" w:lastRowFirstColumn="0" w:lastRowLastColumn="0"/>
-        </w:trPr>
         <w:tc>
           <w:tcPr>
-            <w:cnfStyle w:val="001000000000" w:firstRow="0" w:lastRow="0" w:firstColumn="1" w:lastColumn="0" w:oddVBand="0" w:evenVBand="0" w:oddHBand="0" w:evenHBand="0" w:firstRowFirstColumn="0" w:firstRowLastColumn="0" w:lastRowFirstColumn="0" w:lastRowLastColumn="0"/>
             <w:tcW w:w="4148" w:type="dxa"/>
           </w:tcPr>
           <w:p>
@@ -26273,7 +26308,7 @@
               <w:rPr>
                 <w:lang w:val="sr-Cyrl-RS"/>
               </w:rPr>
-              <w:t>release_date</w:t>
+              <w:t>revenue</w:t>
             </w:r>
           </w:p>
         </w:tc>
@@ -26286,7 +26321,6 @@
               <w:pStyle w:val="ListParagraph"/>
               <w:ind w:left="0"/>
               <w:jc w:val="both"/>
-              <w:cnfStyle w:val="000000100000" w:firstRow="0" w:lastRow="0" w:firstColumn="0" w:lastColumn="0" w:oddVBand="0" w:evenVBand="0" w:oddHBand="1" w:evenHBand="0" w:firstRowFirstColumn="0" w:firstRowLastColumn="0" w:lastRowFirstColumn="0" w:lastRowLastColumn="0"/>
               <w:rPr>
                 <w:lang w:val="sr-Cyrl-RS"/>
               </w:rPr>
@@ -26295,7 +26329,7 @@
               <w:rPr>
                 <w:lang w:val="sr-Cyrl-RS"/>
               </w:rPr>
-              <w:t>Датум објављивања</w:t>
+              <w:t>Приходи филма</w:t>
             </w:r>
           </w:p>
         </w:tc>
@@ -26303,7 +26337,6 @@
       <w:tr>
         <w:tc>
           <w:tcPr>
-            <w:cnfStyle w:val="001000000000" w:firstRow="0" w:lastRow="0" w:firstColumn="1" w:lastColumn="0" w:oddVBand="0" w:evenVBand="0" w:oddHBand="0" w:evenHBand="0" w:firstRowFirstColumn="0" w:firstRowLastColumn="0" w:lastRowFirstColumn="0" w:lastRowLastColumn="0"/>
             <w:tcW w:w="4148" w:type="dxa"/>
           </w:tcPr>
           <w:p>
@@ -26319,7 +26352,7 @@
               <w:rPr>
                 <w:lang w:val="sr-Cyrl-RS"/>
               </w:rPr>
-              <w:t>revenue</w:t>
+              <w:t>runtime</w:t>
             </w:r>
           </w:p>
         </w:tc>
@@ -26332,7 +26365,6 @@
               <w:pStyle w:val="ListParagraph"/>
               <w:ind w:left="0"/>
               <w:jc w:val="both"/>
-              <w:cnfStyle w:val="000000000000" w:firstRow="0" w:lastRow="0" w:firstColumn="0" w:lastColumn="0" w:oddVBand="0" w:evenVBand="0" w:oddHBand="0" w:evenHBand="0" w:firstRowFirstColumn="0" w:firstRowLastColumn="0" w:lastRowFirstColumn="0" w:lastRowLastColumn="0"/>
               <w:rPr>
                 <w:lang w:val="sr-Cyrl-RS"/>
               </w:rPr>
@@ -26341,18 +26373,14 @@
               <w:rPr>
                 <w:lang w:val="sr-Cyrl-RS"/>
               </w:rPr>
-              <w:t>Приходи филма</w:t>
+              <w:t>Дужина трајања филма</w:t>
             </w:r>
           </w:p>
         </w:tc>
       </w:tr>
       <w:tr>
-        <w:trPr>
-          <w:cnfStyle w:val="000000100000" w:firstRow="0" w:lastRow="0" w:firstColumn="0" w:lastColumn="0" w:oddVBand="0" w:evenVBand="0" w:oddHBand="1" w:evenHBand="0" w:firstRowFirstColumn="0" w:firstRowLastColumn="0" w:lastRowFirstColumn="0" w:lastRowLastColumn="0"/>
-        </w:trPr>
         <w:tc>
           <w:tcPr>
-            <w:cnfStyle w:val="001000000000" w:firstRow="0" w:lastRow="0" w:firstColumn="1" w:lastColumn="0" w:oddVBand="0" w:evenVBand="0" w:oddHBand="0" w:evenHBand="0" w:firstRowFirstColumn="0" w:firstRowLastColumn="0" w:lastRowFirstColumn="0" w:lastRowLastColumn="0"/>
             <w:tcW w:w="4148" w:type="dxa"/>
           </w:tcPr>
           <w:p>
@@ -26368,7 +26396,7 @@
               <w:rPr>
                 <w:lang w:val="sr-Cyrl-RS"/>
               </w:rPr>
-              <w:t>runtime</w:t>
+              <w:t>spoken_languages</w:t>
             </w:r>
           </w:p>
         </w:tc>
@@ -26381,7 +26409,6 @@
               <w:pStyle w:val="ListParagraph"/>
               <w:ind w:left="0"/>
               <w:jc w:val="both"/>
-              <w:cnfStyle w:val="000000100000" w:firstRow="0" w:lastRow="0" w:firstColumn="0" w:lastColumn="0" w:oddVBand="0" w:evenVBand="0" w:oddHBand="1" w:evenHBand="0" w:firstRowFirstColumn="0" w:firstRowLastColumn="0" w:lastRowFirstColumn="0" w:lastRowLastColumn="0"/>
               <w:rPr>
                 <w:lang w:val="sr-Cyrl-RS"/>
               </w:rPr>
@@ -26390,7 +26417,7 @@
               <w:rPr>
                 <w:lang w:val="sr-Cyrl-RS"/>
               </w:rPr>
-              <w:t>Дужина трајања филма</w:t>
+              <w:t>Језици који се говоре у филму</w:t>
             </w:r>
           </w:p>
         </w:tc>
@@ -26398,7 +26425,6 @@
       <w:tr>
         <w:tc>
           <w:tcPr>
-            <w:cnfStyle w:val="001000000000" w:firstRow="0" w:lastRow="0" w:firstColumn="1" w:lastColumn="0" w:oddVBand="0" w:evenVBand="0" w:oddHBand="0" w:evenHBand="0" w:firstRowFirstColumn="0" w:firstRowLastColumn="0" w:lastRowFirstColumn="0" w:lastRowLastColumn="0"/>
             <w:tcW w:w="4148" w:type="dxa"/>
           </w:tcPr>
           <w:p>
@@ -26414,7 +26440,7 @@
               <w:rPr>
                 <w:lang w:val="sr-Cyrl-RS"/>
               </w:rPr>
-              <w:t>spoken_languages</w:t>
+              <w:t>status</w:t>
             </w:r>
           </w:p>
         </w:tc>
@@ -26427,7 +26453,6 @@
               <w:pStyle w:val="ListParagraph"/>
               <w:ind w:left="0"/>
               <w:jc w:val="both"/>
-              <w:cnfStyle w:val="000000000000" w:firstRow="0" w:lastRow="0" w:firstColumn="0" w:lastColumn="0" w:oddVBand="0" w:evenVBand="0" w:oddHBand="0" w:evenHBand="0" w:firstRowFirstColumn="0" w:firstRowLastColumn="0" w:lastRowFirstColumn="0" w:lastRowLastColumn="0"/>
               <w:rPr>
                 <w:lang w:val="sr-Cyrl-RS"/>
               </w:rPr>
@@ -26436,24 +26461,18 @@
               <w:rPr>
                 <w:lang w:val="sr-Cyrl-RS"/>
               </w:rPr>
-              <w:t>Језици који се говоре у филму</w:t>
+              <w:t>Информација да ли је филм објављен или не</w:t>
             </w:r>
           </w:p>
         </w:tc>
       </w:tr>
       <w:tr>
-        <w:trPr>
-          <w:cnfStyle w:val="000000100000" w:firstRow="0" w:lastRow="0" w:firstColumn="0" w:lastColumn="0" w:oddVBand="0" w:evenVBand="0" w:oddHBand="1" w:evenHBand="0" w:firstRowFirstColumn="0" w:firstRowLastColumn="0" w:lastRowFirstColumn="0" w:lastRowLastColumn="0"/>
-        </w:trPr>
         <w:tc>
           <w:tcPr>
-            <w:cnfStyle w:val="001000000000" w:firstRow="0" w:lastRow="0" w:firstColumn="1" w:lastColumn="0" w:oddVBand="0" w:evenVBand="0" w:oddHBand="0" w:evenHBand="0" w:firstRowFirstColumn="0" w:firstRowLastColumn="0" w:lastRowFirstColumn="0" w:lastRowLastColumn="0"/>
             <w:tcW w:w="4148" w:type="dxa"/>
           </w:tcPr>
           <w:p>
             <w:pPr>
-              <w:pStyle w:val="ListParagraph"/>
-              <w:ind w:left="0"/>
               <w:jc w:val="both"/>
               <w:rPr>
                 <w:lang w:val="sr-Cyrl-RS"/>
@@ -26463,7 +26482,7 @@
               <w:rPr>
                 <w:lang w:val="sr-Cyrl-RS"/>
               </w:rPr>
-              <w:t>status</w:t>
+              <w:t>tagline</w:t>
             </w:r>
           </w:p>
         </w:tc>
@@ -26476,7 +26495,6 @@
               <w:pStyle w:val="ListParagraph"/>
               <w:ind w:left="0"/>
               <w:jc w:val="both"/>
-              <w:cnfStyle w:val="000000100000" w:firstRow="0" w:lastRow="0" w:firstColumn="0" w:lastColumn="0" w:oddVBand="0" w:evenVBand="0" w:oddHBand="1" w:evenHBand="0" w:firstRowFirstColumn="0" w:firstRowLastColumn="0" w:lastRowFirstColumn="0" w:lastRowLastColumn="0"/>
               <w:rPr>
                 <w:lang w:val="sr-Cyrl-RS"/>
               </w:rPr>
@@ -26485,7 +26503,7 @@
               <w:rPr>
                 <w:lang w:val="sr-Cyrl-RS"/>
               </w:rPr>
-              <w:t>Информација да ли је филм објављен или не</w:t>
+              <w:t>Слоган филма</w:t>
             </w:r>
           </w:p>
         </w:tc>
@@ -26493,11 +26511,12 @@
       <w:tr>
         <w:tc>
           <w:tcPr>
-            <w:cnfStyle w:val="001000000000" w:firstRow="0" w:lastRow="0" w:firstColumn="1" w:lastColumn="0" w:oddVBand="0" w:evenVBand="0" w:oddHBand="0" w:evenHBand="0" w:firstRowFirstColumn="0" w:firstRowLastColumn="0" w:lastRowFirstColumn="0" w:lastRowLastColumn="0"/>
             <w:tcW w:w="4148" w:type="dxa"/>
           </w:tcPr>
           <w:p>
             <w:pPr>
+              <w:pStyle w:val="ListParagraph"/>
+              <w:ind w:left="0"/>
               <w:jc w:val="both"/>
               <w:rPr>
                 <w:lang w:val="sr-Cyrl-RS"/>
@@ -26507,7 +26526,7 @@
               <w:rPr>
                 <w:lang w:val="sr-Cyrl-RS"/>
               </w:rPr>
-              <w:t>tagline</w:t>
+              <w:t>title</w:t>
             </w:r>
           </w:p>
         </w:tc>
@@ -26520,7 +26539,6 @@
               <w:pStyle w:val="ListParagraph"/>
               <w:ind w:left="0"/>
               <w:jc w:val="both"/>
-              <w:cnfStyle w:val="000000000000" w:firstRow="0" w:lastRow="0" w:firstColumn="0" w:lastColumn="0" w:oddVBand="0" w:evenVBand="0" w:oddHBand="0" w:evenHBand="0" w:firstRowFirstColumn="0" w:firstRowLastColumn="0" w:lastRowFirstColumn="0" w:lastRowLastColumn="0"/>
               <w:rPr>
                 <w:lang w:val="sr-Cyrl-RS"/>
               </w:rPr>
@@ -26529,23 +26547,22 @@
               <w:rPr>
                 <w:lang w:val="sr-Cyrl-RS"/>
               </w:rPr>
-              <w:t>Слоган филма</w:t>
+              <w:t>Наслов</w:t>
             </w:r>
           </w:p>
         </w:tc>
       </w:tr>
       <w:tr>
-        <w:trPr>
-          <w:cnfStyle w:val="000000100000" w:firstRow="0" w:lastRow="0" w:firstColumn="0" w:lastColumn="0" w:oddVBand="0" w:evenVBand="0" w:oddHBand="1" w:evenHBand="0" w:firstRowFirstColumn="0" w:firstRowLastColumn="0" w:lastRowFirstColumn="0" w:lastRowLastColumn="0"/>
-        </w:trPr>
         <w:tc>
           <w:tcPr>
-            <w:cnfStyle w:val="001000000000" w:firstRow="0" w:lastRow="0" w:firstColumn="1" w:lastColumn="0" w:oddVBand="0" w:evenVBand="0" w:oddHBand="0" w:evenHBand="0" w:firstRowFirstColumn="0" w:firstRowLastColumn="0" w:lastRowFirstColumn="0" w:lastRowLastColumn="0"/>
             <w:tcW w:w="4148" w:type="dxa"/>
           </w:tcPr>
           <w:p>
             <w:pPr>
               <w:pStyle w:val="ListParagraph"/>
+              <w:tabs>
+                <w:tab w:val="left" w:pos="1032"/>
+              </w:tabs>
               <w:ind w:left="0"/>
               <w:jc w:val="both"/>
               <w:rPr>
@@ -26556,7 +26573,7 @@
               <w:rPr>
                 <w:lang w:val="sr-Cyrl-RS"/>
               </w:rPr>
-              <w:t>title</w:t>
+              <w:t>video</w:t>
             </w:r>
           </w:p>
         </w:tc>
@@ -26569,7 +26586,6 @@
               <w:pStyle w:val="ListParagraph"/>
               <w:ind w:left="0"/>
               <w:jc w:val="both"/>
-              <w:cnfStyle w:val="000000100000" w:firstRow="0" w:lastRow="0" w:firstColumn="0" w:lastColumn="0" w:oddVBand="0" w:evenVBand="0" w:oddHBand="1" w:evenHBand="0" w:firstRowFirstColumn="0" w:firstRowLastColumn="0" w:lastRowFirstColumn="0" w:lastRowLastColumn="0"/>
               <w:rPr>
                 <w:lang w:val="sr-Cyrl-RS"/>
               </w:rPr>
@@ -26578,7 +26594,7 @@
               <w:rPr>
                 <w:lang w:val="sr-Cyrl-RS"/>
               </w:rPr>
-              <w:t>Наслов</w:t>
+              <w:t>Информација да ли има трејлер</w:t>
             </w:r>
           </w:p>
         </w:tc>
@@ -26586,15 +26602,11 @@
       <w:tr>
         <w:tc>
           <w:tcPr>
-            <w:cnfStyle w:val="001000000000" w:firstRow="0" w:lastRow="0" w:firstColumn="1" w:lastColumn="0" w:oddVBand="0" w:evenVBand="0" w:oddHBand="0" w:evenHBand="0" w:firstRowFirstColumn="0" w:firstRowLastColumn="0" w:lastRowFirstColumn="0" w:lastRowLastColumn="0"/>
             <w:tcW w:w="4148" w:type="dxa"/>
           </w:tcPr>
           <w:p>
             <w:pPr>
               <w:pStyle w:val="ListParagraph"/>
-              <w:tabs>
-                <w:tab w:val="left" w:pos="1032"/>
-              </w:tabs>
               <w:ind w:left="0"/>
               <w:jc w:val="both"/>
               <w:rPr>
@@ -26605,7 +26617,7 @@
               <w:rPr>
                 <w:lang w:val="sr-Cyrl-RS"/>
               </w:rPr>
-              <w:t>video</w:t>
+              <w:t>vote_average</w:t>
             </w:r>
           </w:p>
         </w:tc>
@@ -26618,7 +26630,6 @@
               <w:pStyle w:val="ListParagraph"/>
               <w:ind w:left="0"/>
               <w:jc w:val="both"/>
-              <w:cnfStyle w:val="000000000000" w:firstRow="0" w:lastRow="0" w:firstColumn="0" w:lastColumn="0" w:oddVBand="0" w:evenVBand="0" w:oddHBand="0" w:evenHBand="0" w:firstRowFirstColumn="0" w:firstRowLastColumn="0" w:lastRowFirstColumn="0" w:lastRowLastColumn="0"/>
               <w:rPr>
                 <w:lang w:val="sr-Cyrl-RS"/>
               </w:rPr>
@@ -26627,25 +26638,20 @@
               <w:rPr>
                 <w:lang w:val="sr-Cyrl-RS"/>
               </w:rPr>
-              <w:t>Информација да ли има трејлер</w:t>
+              <w:t>Просечна оцена</w:t>
             </w:r>
           </w:p>
         </w:tc>
       </w:tr>
       <w:tr>
-        <w:trPr>
-          <w:cnfStyle w:val="000000100000" w:firstRow="0" w:lastRow="0" w:firstColumn="0" w:lastColumn="0" w:oddVBand="0" w:evenVBand="0" w:oddHBand="1" w:evenHBand="0" w:firstRowFirstColumn="0" w:firstRowLastColumn="0" w:lastRowFirstColumn="0" w:lastRowLastColumn="0"/>
-        </w:trPr>
         <w:tc>
           <w:tcPr>
-            <w:cnfStyle w:val="001000000000" w:firstRow="0" w:lastRow="0" w:firstColumn="1" w:lastColumn="0" w:oddVBand="0" w:evenVBand="0" w:oddHBand="0" w:evenHBand="0" w:firstRowFirstColumn="0" w:firstRowLastColumn="0" w:lastRowFirstColumn="0" w:lastRowLastColumn="0"/>
             <w:tcW w:w="4148" w:type="dxa"/>
           </w:tcPr>
           <w:p>
             <w:pPr>
               <w:pStyle w:val="ListParagraph"/>
               <w:ind w:left="0"/>
-              <w:jc w:val="both"/>
               <w:rPr>
                 <w:lang w:val="sr-Cyrl-RS"/>
               </w:rPr>
@@ -26654,7 +26660,7 @@
               <w:rPr>
                 <w:lang w:val="sr-Cyrl-RS"/>
               </w:rPr>
-              <w:t>vote_average</w:t>
+              <w:t>vote_count</w:t>
             </w:r>
           </w:p>
         </w:tc>
@@ -26667,52 +26673,6 @@
               <w:pStyle w:val="ListParagraph"/>
               <w:ind w:left="0"/>
               <w:jc w:val="both"/>
-              <w:cnfStyle w:val="000000100000" w:firstRow="0" w:lastRow="0" w:firstColumn="0" w:lastColumn="0" w:oddVBand="0" w:evenVBand="0" w:oddHBand="1" w:evenHBand="0" w:firstRowFirstColumn="0" w:firstRowLastColumn="0" w:lastRowFirstColumn="0" w:lastRowLastColumn="0"/>
-              <w:rPr>
-                <w:lang w:val="sr-Cyrl-RS"/>
-              </w:rPr>
-            </w:pPr>
-            <w:r>
-              <w:rPr>
-                <w:lang w:val="sr-Cyrl-RS"/>
-              </w:rPr>
-              <w:t>Просечна оцена</w:t>
-            </w:r>
-          </w:p>
-        </w:tc>
-      </w:tr>
-      <w:tr>
-        <w:tc>
-          <w:tcPr>
-            <w:cnfStyle w:val="001000000000" w:firstRow="0" w:lastRow="0" w:firstColumn="1" w:lastColumn="0" w:oddVBand="0" w:evenVBand="0" w:oddHBand="0" w:evenHBand="0" w:firstRowFirstColumn="0" w:firstRowLastColumn="0" w:lastRowFirstColumn="0" w:lastRowLastColumn="0"/>
-            <w:tcW w:w="4148" w:type="dxa"/>
-          </w:tcPr>
-          <w:p>
-            <w:pPr>
-              <w:pStyle w:val="ListParagraph"/>
-              <w:ind w:left="0"/>
-              <w:rPr>
-                <w:lang w:val="sr-Cyrl-RS"/>
-              </w:rPr>
-            </w:pPr>
-            <w:r>
-              <w:rPr>
-                <w:lang w:val="sr-Cyrl-RS"/>
-              </w:rPr>
-              <w:t>vote_count</w:t>
-            </w:r>
-          </w:p>
-        </w:tc>
-        <w:tc>
-          <w:tcPr>
-            <w:tcW w:w="4149" w:type="dxa"/>
-          </w:tcPr>
-          <w:p>
-            <w:pPr>
-              <w:pStyle w:val="ListParagraph"/>
-              <w:ind w:left="0"/>
-              <w:jc w:val="both"/>
-              <w:cnfStyle w:val="000000000000" w:firstRow="0" w:lastRow="0" w:firstColumn="0" w:lastColumn="0" w:oddVBand="0" w:evenVBand="0" w:oddHBand="0" w:evenHBand="0" w:firstRowFirstColumn="0" w:firstRowLastColumn="0" w:lastRowFirstColumn="0" w:lastRowLastColumn="0"/>
               <w:rPr>
                 <w:lang w:val="sr-Cyrl-RS"/>
               </w:rPr>
@@ -27120,7 +27080,7 @@
           <w:iCs/>
           <w:lang w:val="en-US"/>
         </w:rPr>
-        <w:t>What are raw and inner ids¶, 2015</w:t>
+        <w:t>What are raw and inner ids, 2015</w:t>
       </w:r>
       <w:r>
         <w:rPr>
@@ -27586,7 +27546,7 @@
           <w:lang w:val="sr-Cyrl-RS"/>
         </w:rPr>
       </w:pPr>
-      <w:bookmarkStart w:id="25" w:name="_Toc211939782"/>
+      <w:bookmarkStart w:id="25" w:name="_Toc212028731"/>
       <w:r>
         <w:rPr>
           <w:lang w:val="sr-Cyrl-RS"/>
@@ -27621,7 +27581,7 @@
         <w:rPr>
           <w:lang w:val="sr-Cyrl-RS"/>
         </w:rPr>
-        <w:t>базираног на садржају</w:t>
+        <w:t>базиран на садржају</w:t>
       </w:r>
       <w:bookmarkEnd w:id="25"/>
     </w:p>
@@ -28020,7 +27980,7 @@
         </w:rPr>
         <w:br w:type="page"/>
       </w:r>
-      <w:bookmarkStart w:id="26" w:name="_Toc211939783"/>
+      <w:bookmarkStart w:id="26" w:name="_Toc212028732"/>
       <w:r>
         <w:rPr>
           <w:lang w:val="sr-Cyrl-RS"/>
@@ -28071,7 +28031,13 @@
           <w:lang w:val="sr-Cyrl-RS"/>
         </w:rPr>
       </w:pPr>
-      <w:bookmarkStart w:id="27" w:name="_Toc211939784"/>
+      <w:bookmarkStart w:id="27" w:name="_Toc212028733"/>
+      <w:r>
+        <w:rPr>
+          <w:lang w:val="en-US"/>
+        </w:rPr>
+        <w:t>C</w:t>
+      </w:r>
       <w:r>
         <w:rPr>
           <w:lang w:val="sr-Cyrl-RS"/>
@@ -28189,7 +28155,7 @@
         <w:rPr>
           <w:lang w:val="sr-Cyrl-RS"/>
         </w:rPr>
-        <w:t xml:space="preserve"> ове метрике</w:t>
+        <w:t>.</w:t>
       </w:r>
     </w:p>
     <w:p>
@@ -30447,7 +30413,7 @@
           <w:lang w:val="sr-Cyrl-RS"/>
         </w:rPr>
         <w:drawing>
-          <wp:inline distT="0" distB="0" distL="0" distR="0" wp14:anchorId="7D5AF9AF" wp14:editId="3120AFAB">
+          <wp:inline distT="0" distB="0" distL="0" distR="0" wp14:anchorId="7D5AF9AF" wp14:editId="150CF3C0">
             <wp:extent cx="5275660" cy="3185160"/>
             <wp:effectExtent l="0" t="0" r="1270" b="0"/>
             <wp:docPr id="7" name="Picture 7"/>
@@ -30782,7 +30748,7 @@
           <w:lang w:val="sr-Cyrl-RS"/>
         </w:rPr>
         <w:drawing>
-          <wp:inline distT="0" distB="0" distL="0" distR="0" wp14:anchorId="75622322" wp14:editId="679097E9">
+          <wp:inline distT="0" distB="0" distL="0" distR="0" wp14:anchorId="75622322" wp14:editId="21354E63">
             <wp:extent cx="4831080" cy="2576575"/>
             <wp:effectExtent l="0" t="0" r="7620" b="0"/>
             <wp:docPr id="9" name="Picture 9"/>
@@ -31054,7 +31020,7 @@
           <w:lang w:val="sr-Cyrl-RS"/>
         </w:rPr>
         <w:drawing>
-          <wp:inline distT="0" distB="0" distL="0" distR="0" wp14:anchorId="5685312B" wp14:editId="7D3B509D">
+          <wp:inline distT="0" distB="0" distL="0" distR="0" wp14:anchorId="5685312B" wp14:editId="02C02AC4">
             <wp:extent cx="5165092" cy="2754716"/>
             <wp:effectExtent l="0" t="0" r="0" b="7620"/>
             <wp:docPr id="6" name="Picture 6"/>
@@ -31399,7 +31365,7 @@
           <w:lang w:val="sr-Cyrl-RS"/>
         </w:rPr>
         <w:drawing>
-          <wp:inline distT="0" distB="0" distL="0" distR="0" wp14:anchorId="28785063" wp14:editId="323D859B">
+          <wp:inline distT="0" distB="0" distL="0" distR="0" wp14:anchorId="28785063" wp14:editId="7AD2C443">
             <wp:extent cx="5294493" cy="2823730"/>
             <wp:effectExtent l="0" t="0" r="1905" b="0"/>
             <wp:docPr id="8" name="Picture 8"/>
@@ -32618,6 +32584,7 @@
               </w:rPr>
             </w:pPr>
             <w:bookmarkStart w:id="29" w:name="_Hlk200292756"/>
+            <w:bookmarkStart w:id="30" w:name="_Hlk212193533"/>
             <w:bookmarkEnd w:id="28"/>
             <w:r>
               <w:rPr>
@@ -32876,6 +32843,7 @@
           </w:p>
         </w:tc>
       </w:tr>
+      <w:bookmarkEnd w:id="30"/>
     </w:tbl>
     <w:p>
       <w:pPr>
@@ -32895,7 +32863,7 @@
           <w:lang w:val="sr-Cyrl-RS"/>
         </w:rPr>
       </w:pPr>
-      <w:bookmarkStart w:id="30" w:name="_Hlk205806821"/>
+      <w:bookmarkStart w:id="31" w:name="_Hlk205806821"/>
       <w:r>
         <w:rPr>
           <w:rFonts w:cs="Times New Roman"/>
@@ -33016,7 +32984,7 @@
         <w:t xml:space="preserve">износи 76,5%, што и није лош резултат. </w:t>
       </w:r>
     </w:p>
-    <w:bookmarkEnd w:id="30"/>
+    <w:bookmarkEnd w:id="31"/>
     <w:p>
       <w:pPr>
         <w:jc w:val="both"/>
@@ -33180,7 +33148,7 @@
           <w:lang w:val="sr-Cyrl-RS"/>
         </w:rPr>
       </w:pPr>
-      <w:bookmarkStart w:id="31" w:name="_Toc211939785"/>
+      <w:bookmarkStart w:id="32" w:name="_Toc212028734"/>
       <w:r>
         <w:rPr>
           <w:lang w:val="sr-Cyrl-RS"/>
@@ -33205,7 +33173,7 @@
         </w:rPr>
         <w:t>Верификација филтрирања базираног на садржају</w:t>
       </w:r>
-      <w:bookmarkEnd w:id="31"/>
+      <w:bookmarkEnd w:id="32"/>
     </w:p>
     <w:p>
       <w:pPr>
@@ -33421,7 +33389,7 @@
     </w:p>
     <w:tbl>
       <w:tblPr>
-        <w:tblStyle w:val="GridTable4-Accent5"/>
+        <w:tblStyle w:val="TableGrid"/>
         <w:tblW w:w="8358" w:type="dxa"/>
         <w:tblLook w:val="04A0" w:firstRow="1" w:lastRow="0" w:firstColumn="1" w:lastColumn="0" w:noHBand="0" w:noVBand="1"/>
       </w:tblPr>
@@ -33433,12 +33401,186 @@
       </w:tblGrid>
       <w:tr>
         <w:trPr>
-          <w:cnfStyle w:val="100000000000" w:firstRow="1" w:lastRow="0" w:firstColumn="0" w:lastColumn="0" w:oddVBand="0" w:evenVBand="0" w:oddHBand="0" w:evenHBand="0" w:firstRowFirstColumn="0" w:firstRowLastColumn="0" w:lastRowFirstColumn="0" w:lastRowLastColumn="0"/>
           <w:trHeight w:val="288"/>
         </w:trPr>
         <w:tc>
           <w:tcPr>
-            <w:cnfStyle w:val="001000000000" w:firstRow="0" w:lastRow="0" w:firstColumn="1" w:lastColumn="0" w:oddVBand="0" w:evenVBand="0" w:oddHBand="0" w:evenHBand="0" w:firstRowFirstColumn="0" w:firstRowLastColumn="0" w:lastRowFirstColumn="0" w:lastRowLastColumn="0"/>
+            <w:tcW w:w="1818" w:type="dxa"/>
+            <w:shd w:val="clear" w:color="auto" w:fill="BFBFBF"/>
+            <w:noWrap/>
+            <w:hideMark/>
+          </w:tcPr>
+          <w:p>
+            <w:pPr>
+              <w:jc w:val="center"/>
+              <w:rPr>
+                <w:rFonts w:eastAsia="Times New Roman" w:cs="Times New Roman"/>
+                <w:color w:val="000000" w:themeColor="text1"/>
+                <w:sz w:val="20"/>
+                <w:szCs w:val="20"/>
+                <w:lang w:val="sr-Latn-RS" w:eastAsia="sr-Latn-RS"/>
+              </w:rPr>
+            </w:pPr>
+            <w:r>
+              <w:rPr>
+                <w:rFonts w:eastAsia="Times New Roman" w:cs="Times New Roman"/>
+                <w:color w:val="000000" w:themeColor="text1"/>
+                <w:sz w:val="20"/>
+                <w:szCs w:val="20"/>
+                <w:lang w:val="sr-Latn-RS" w:eastAsia="sr-Latn-RS"/>
+              </w:rPr>
+              <w:t>Модел</w:t>
+            </w:r>
+          </w:p>
+        </w:tc>
+        <w:tc>
+          <w:tcPr>
+            <w:tcW w:w="2180" w:type="dxa"/>
+            <w:shd w:val="clear" w:color="auto" w:fill="BFBFBF"/>
+            <w:noWrap/>
+            <w:hideMark/>
+          </w:tcPr>
+          <w:p>
+            <w:pPr>
+              <w:jc w:val="center"/>
+              <w:rPr>
+                <w:rFonts w:eastAsia="Times New Roman" w:cs="Times New Roman"/>
+                <w:color w:val="000000" w:themeColor="text1"/>
+                <w:sz w:val="20"/>
+                <w:szCs w:val="20"/>
+                <w:lang w:val="sr-Latn-RS" w:eastAsia="sr-Latn-RS"/>
+              </w:rPr>
+            </w:pPr>
+            <w:r>
+              <w:rPr>
+                <w:rFonts w:eastAsia="Times New Roman" w:cs="Times New Roman"/>
+                <w:color w:val="000000" w:themeColor="text1"/>
+                <w:sz w:val="20"/>
+                <w:szCs w:val="20"/>
+                <w:lang w:val="sr-Latn-RS" w:eastAsia="sr-Latn-RS"/>
+              </w:rPr>
+              <w:t>Димензија вектора</w:t>
+            </w:r>
+          </w:p>
+        </w:tc>
+        <w:tc>
+          <w:tcPr>
+            <w:tcW w:w="2665" w:type="dxa"/>
+            <w:shd w:val="clear" w:color="auto" w:fill="BFBFBF"/>
+          </w:tcPr>
+          <w:p>
+            <w:pPr>
+              <w:jc w:val="center"/>
+              <w:rPr>
+                <w:rFonts w:eastAsia="Times New Roman" w:cs="Times New Roman"/>
+                <w:color w:val="000000" w:themeColor="text1"/>
+                <w:sz w:val="20"/>
+                <w:szCs w:val="20"/>
+                <w:lang w:val="en-US" w:eastAsia="sr-Latn-RS"/>
+              </w:rPr>
+            </w:pPr>
+            <w:r>
+              <w:rPr>
+                <w:rFonts w:eastAsia="Times New Roman" w:cs="Times New Roman"/>
+                <w:color w:val="000000" w:themeColor="text1"/>
+                <w:sz w:val="20"/>
+                <w:szCs w:val="20"/>
+                <w:lang w:val="sr-Cyrl-RS" w:eastAsia="sr-Latn-RS"/>
+              </w:rPr>
+              <w:t xml:space="preserve">Број параметара </w:t>
+            </w:r>
+          </w:p>
+          <w:p>
+            <w:pPr>
+              <w:jc w:val="center"/>
+              <w:rPr>
+                <w:rFonts w:eastAsia="Times New Roman" w:cs="Times New Roman"/>
+                <w:b/>
+                <w:bCs/>
+                <w:color w:val="000000" w:themeColor="text1"/>
+                <w:sz w:val="20"/>
+                <w:szCs w:val="20"/>
+                <w:lang w:val="sr-Cyrl-RS" w:eastAsia="sr-Latn-RS"/>
+              </w:rPr>
+            </w:pPr>
+            <w:r>
+              <w:rPr>
+                <w:rFonts w:eastAsia="Times New Roman" w:cs="Times New Roman"/>
+                <w:color w:val="000000" w:themeColor="text1"/>
+                <w:sz w:val="20"/>
+                <w:szCs w:val="20"/>
+                <w:lang w:val="sr-Cyrl-RS" w:eastAsia="sr-Latn-RS"/>
+              </w:rPr>
+              <w:t>(</w:t>
+            </w:r>
+            <w:r>
+              <w:rPr>
+                <w:rFonts w:eastAsia="Times New Roman" w:cs="Times New Roman"/>
+                <w:color w:val="000000" w:themeColor="text1"/>
+                <w:sz w:val="20"/>
+                <w:szCs w:val="20"/>
+                <w:lang w:val="en-US" w:eastAsia="sr-Latn-RS"/>
+              </w:rPr>
+              <w:t>B= 1</w:t>
+            </w:r>
+            <w:r>
+              <w:rPr>
+                <w:rFonts w:eastAsia="Times New Roman" w:cs="Times New Roman"/>
+                <w:color w:val="000000" w:themeColor="text1"/>
+                <w:sz w:val="20"/>
+                <w:szCs w:val="20"/>
+                <w:lang w:val="en-US" w:eastAsia="sr-Latn-RS"/>
+              </w:rPr>
+              <w:t xml:space="preserve"> </w:t>
+            </w:r>
+            <w:r>
+              <w:rPr>
+                <w:rFonts w:eastAsia="Times New Roman" w:cs="Times New Roman"/>
+                <w:color w:val="000000" w:themeColor="text1"/>
+                <w:sz w:val="20"/>
+                <w:szCs w:val="20"/>
+                <w:lang w:val="sr-Cyrl-RS" w:eastAsia="sr-Latn-RS"/>
+              </w:rPr>
+              <w:t>милијарда)</w:t>
+            </w:r>
+          </w:p>
+        </w:tc>
+        <w:tc>
+          <w:tcPr>
+            <w:tcW w:w="1695" w:type="dxa"/>
+            <w:shd w:val="clear" w:color="auto" w:fill="BFBFBF"/>
+          </w:tcPr>
+          <w:p>
+            <w:pPr>
+              <w:rPr>
+                <w:rFonts w:eastAsia="Times New Roman" w:cs="Times New Roman"/>
+                <w:b/>
+                <w:bCs/>
+                <w:color w:val="000000" w:themeColor="text1"/>
+                <w:sz w:val="20"/>
+                <w:szCs w:val="20"/>
+                <w:lang w:val="sr-Cyrl-RS" w:eastAsia="sr-Latn-RS"/>
+              </w:rPr>
+            </w:pPr>
+            <w:r>
+              <w:rPr>
+                <w:rFonts w:eastAsia="Times New Roman" w:cs="Times New Roman"/>
+                <w:color w:val="000000" w:themeColor="text1"/>
+                <w:sz w:val="20"/>
+                <w:szCs w:val="20"/>
+                <w:lang w:val="sr-Cyrl-RS" w:eastAsia="sr-Latn-RS"/>
+              </w:rPr>
+              <w:t>Ко је развио модел</w:t>
+            </w:r>
+          </w:p>
+        </w:tc>
+      </w:tr>
+      <w:tr>
+        <w:trPr>
+          <w:trHeight w:val="288"/>
+        </w:trPr>
+        <w:tc>
+          <w:tcPr>
             <w:tcW w:w="1818" w:type="dxa"/>
             <w:noWrap/>
             <w:vAlign w:val="center"/>
@@ -33448,8 +33590,8 @@
             <w:pPr>
               <w:jc w:val="center"/>
               <w:rPr>
-                <w:rFonts w:ascii="Aptos Narrow" w:eastAsia="Times New Roman" w:hAnsi="Aptos Narrow" w:cs="Times New Roman"/>
-                <w:color w:val="FFFFFF"/>
+                <w:rFonts w:eastAsia="Times New Roman" w:cs="Times New Roman"/>
+                <w:color w:val="000000"/>
                 <w:sz w:val="20"/>
                 <w:szCs w:val="20"/>
                 <w:lang w:val="sr-Latn-RS" w:eastAsia="sr-Latn-RS"/>
@@ -33457,13 +33599,13 @@
             </w:pPr>
             <w:r>
               <w:rPr>
-                <w:rFonts w:ascii="Aptos Narrow" w:eastAsia="Times New Roman" w:hAnsi="Aptos Narrow" w:cs="Times New Roman"/>
-                <w:color w:val="FFFFFF"/>
+                <w:rFonts w:eastAsia="Times New Roman" w:cs="Times New Roman"/>
+                <w:color w:val="000000"/>
                 <w:sz w:val="20"/>
                 <w:szCs w:val="20"/>
                 <w:lang w:val="sr-Latn-RS" w:eastAsia="sr-Latn-RS"/>
               </w:rPr>
-              <w:t>Модел</w:t>
+              <w:t>llama3.2</w:t>
             </w:r>
           </w:p>
         </w:tc>
@@ -33477,10 +33619,9 @@
           <w:p>
             <w:pPr>
               <w:jc w:val="center"/>
-              <w:cnfStyle w:val="100000000000" w:firstRow="1" w:lastRow="0" w:firstColumn="0" w:lastColumn="0" w:oddVBand="0" w:evenVBand="0" w:oddHBand="0" w:evenHBand="0" w:firstRowFirstColumn="0" w:firstRowLastColumn="0" w:lastRowFirstColumn="0" w:lastRowLastColumn="0"/>
-              <w:rPr>
-                <w:rFonts w:ascii="Aptos Narrow" w:eastAsia="Times New Roman" w:hAnsi="Aptos Narrow" w:cs="Times New Roman"/>
-                <w:color w:val="FFFFFF"/>
+              <w:rPr>
+                <w:rFonts w:eastAsia="Times New Roman" w:cs="Times New Roman"/>
+                <w:color w:val="000000"/>
                 <w:sz w:val="20"/>
                 <w:szCs w:val="20"/>
                 <w:lang w:val="sr-Latn-RS" w:eastAsia="sr-Latn-RS"/>
@@ -33488,13 +33629,13 @@
             </w:pPr>
             <w:r>
               <w:rPr>
-                <w:rFonts w:ascii="Aptos Narrow" w:eastAsia="Times New Roman" w:hAnsi="Aptos Narrow" w:cs="Times New Roman"/>
-                <w:color w:val="FFFFFF"/>
+                <w:rFonts w:eastAsia="Times New Roman" w:cs="Times New Roman"/>
+                <w:color w:val="000000"/>
                 <w:sz w:val="20"/>
                 <w:szCs w:val="20"/>
                 <w:lang w:val="sr-Latn-RS" w:eastAsia="sr-Latn-RS"/>
               </w:rPr>
-              <w:t>Димензија вектора</w:t>
+              <w:t>3072</w:t>
             </w:r>
           </w:p>
         </w:tc>
@@ -33506,132 +33647,61 @@
           <w:p>
             <w:pPr>
               <w:jc w:val="center"/>
-              <w:cnfStyle w:val="100000000000" w:firstRow="1" w:lastRow="0" w:firstColumn="0" w:lastColumn="0" w:oddVBand="0" w:evenVBand="0" w:oddHBand="0" w:evenHBand="0" w:firstRowFirstColumn="0" w:firstRowLastColumn="0" w:lastRowFirstColumn="0" w:lastRowLastColumn="0"/>
-              <w:rPr>
-                <w:rFonts w:ascii="Aptos Narrow" w:eastAsia="Times New Roman" w:hAnsi="Aptos Narrow" w:cs="Times New Roman"/>
-                <w:color w:val="FFFFFF"/>
+              <w:rPr>
+                <w:rFonts w:eastAsia="Times New Roman" w:cs="Times New Roman"/>
+                <w:color w:val="000000"/>
                 <w:sz w:val="20"/>
                 <w:szCs w:val="20"/>
-                <w:lang w:val="en-US" w:eastAsia="sr-Latn-RS"/>
+                <w:lang w:val="sr-Latn-RS" w:eastAsia="sr-Latn-RS"/>
               </w:rPr>
             </w:pPr>
             <w:r>
               <w:rPr>
-                <w:rFonts w:ascii="Aptos Narrow" w:eastAsia="Times New Roman" w:hAnsi="Aptos Narrow" w:cs="Times New Roman"/>
-                <w:b w:val="0"/>
-                <w:bCs w:val="0"/>
-                <w:color w:val="FFFFFF"/>
+                <w:rFonts w:eastAsia="Times New Roman" w:cs="Times New Roman"/>
+                <w:color w:val="000000"/>
                 <w:sz w:val="20"/>
                 <w:szCs w:val="20"/>
-                <w:lang w:val="sr-Cyrl-RS" w:eastAsia="sr-Latn-RS"/>
-              </w:rPr>
-              <w:t xml:space="preserve">Број параметара </w:t>
-            </w:r>
-          </w:p>
-          <w:p>
-            <w:pPr>
-              <w:jc w:val="center"/>
-              <w:cnfStyle w:val="100000000000" w:firstRow="1" w:lastRow="0" w:firstColumn="0" w:lastColumn="0" w:oddVBand="0" w:evenVBand="0" w:oddHBand="0" w:evenHBand="0" w:firstRowFirstColumn="0" w:firstRowLastColumn="0" w:lastRowFirstColumn="0" w:lastRowLastColumn="0"/>
-              <w:rPr>
-                <w:rFonts w:ascii="Aptos Narrow" w:eastAsia="Times New Roman" w:hAnsi="Aptos Narrow" w:cs="Times New Roman"/>
-                <w:b w:val="0"/>
-                <w:bCs w:val="0"/>
-                <w:color w:val="FFFFFF"/>
-                <w:sz w:val="20"/>
-                <w:szCs w:val="20"/>
-                <w:lang w:val="sr-Cyrl-RS" w:eastAsia="sr-Latn-RS"/>
-              </w:rPr>
-            </w:pPr>
-            <w:r>
-              <w:rPr>
-                <w:rFonts w:ascii="Aptos Narrow" w:eastAsia="Times New Roman" w:hAnsi="Aptos Narrow" w:cs="Times New Roman"/>
-                <w:b w:val="0"/>
-                <w:bCs w:val="0"/>
-                <w:color w:val="FFFFFF"/>
-                <w:sz w:val="20"/>
-                <w:szCs w:val="20"/>
-                <w:lang w:val="sr-Cyrl-RS" w:eastAsia="sr-Latn-RS"/>
-              </w:rPr>
-              <w:t>(</w:t>
-            </w:r>
-            <w:r>
-              <w:rPr>
-                <w:rFonts w:ascii="Aptos Narrow" w:eastAsia="Times New Roman" w:hAnsi="Aptos Narrow" w:cs="Times New Roman"/>
-                <w:b w:val="0"/>
-                <w:bCs w:val="0"/>
-                <w:color w:val="FFFFFF"/>
-                <w:sz w:val="20"/>
-                <w:szCs w:val="20"/>
-                <w:lang w:val="en-US" w:eastAsia="sr-Latn-RS"/>
-              </w:rPr>
-              <w:t>B= 1</w:t>
-            </w:r>
-            <w:r>
-              <w:rPr>
-                <w:rFonts w:ascii="Aptos Narrow" w:eastAsia="Times New Roman" w:hAnsi="Aptos Narrow" w:cs="Times New Roman"/>
-                <w:b w:val="0"/>
-                <w:bCs w:val="0"/>
-                <w:color w:val="FFFFFF"/>
-                <w:sz w:val="20"/>
-                <w:szCs w:val="20"/>
-                <w:lang w:val="en-US" w:eastAsia="sr-Latn-RS"/>
-              </w:rPr>
-              <w:t xml:space="preserve"> </w:t>
-            </w:r>
-            <w:r>
-              <w:rPr>
-                <w:rFonts w:ascii="Aptos Narrow" w:eastAsia="Times New Roman" w:hAnsi="Aptos Narrow" w:cs="Times New Roman"/>
-                <w:b w:val="0"/>
-                <w:bCs w:val="0"/>
-                <w:color w:val="FFFFFF"/>
-                <w:sz w:val="20"/>
-                <w:szCs w:val="20"/>
-                <w:lang w:val="sr-Cyrl-RS" w:eastAsia="sr-Latn-RS"/>
-              </w:rPr>
-              <w:t>милијарда)</w:t>
+                <w:lang w:eastAsia="sr-Latn-RS"/>
+              </w:rPr>
+              <w:t>3.2 B</w:t>
             </w:r>
           </w:p>
         </w:tc>
         <w:tc>
           <w:tcPr>
             <w:tcW w:w="1695" w:type="dxa"/>
+            <w:vAlign w:val="center"/>
           </w:tcPr>
           <w:p>
             <w:pPr>
-              <w:cnfStyle w:val="100000000000" w:firstRow="1" w:lastRow="0" w:firstColumn="0" w:lastColumn="0" w:oddVBand="0" w:evenVBand="0" w:oddHBand="0" w:evenHBand="0" w:firstRowFirstColumn="0" w:firstRowLastColumn="0" w:lastRowFirstColumn="0" w:lastRowLastColumn="0"/>
-              <w:rPr>
-                <w:rFonts w:ascii="Aptos Narrow" w:eastAsia="Times New Roman" w:hAnsi="Aptos Narrow" w:cs="Times New Roman"/>
-                <w:b w:val="0"/>
-                <w:bCs w:val="0"/>
-                <w:color w:val="FFFFFF"/>
+              <w:jc w:val="center"/>
+              <w:rPr>
+                <w:rFonts w:eastAsia="Times New Roman" w:cs="Times New Roman"/>
+                <w:color w:val="000000"/>
                 <w:sz w:val="20"/>
                 <w:szCs w:val="20"/>
-                <w:lang w:val="sr-Cyrl-RS" w:eastAsia="sr-Latn-RS"/>
+                <w:lang w:val="sr-Latn-RS" w:eastAsia="sr-Latn-RS"/>
               </w:rPr>
             </w:pPr>
             <w:r>
               <w:rPr>
-                <w:rFonts w:ascii="Aptos Narrow" w:eastAsia="Times New Roman" w:hAnsi="Aptos Narrow" w:cs="Times New Roman"/>
-                <w:b w:val="0"/>
-                <w:bCs w:val="0"/>
-                <w:color w:val="FFFFFF"/>
+                <w:rFonts w:eastAsia="Times New Roman" w:cs="Times New Roman"/>
+                <w:color w:val="000000"/>
                 <w:sz w:val="20"/>
                 <w:szCs w:val="20"/>
-                <w:lang w:val="sr-Cyrl-RS" w:eastAsia="sr-Latn-RS"/>
-              </w:rPr>
-              <w:t>Ко је развио модел</w:t>
+                <w:lang w:val="sr-Latn-RS" w:eastAsia="sr-Latn-RS"/>
+              </w:rPr>
+              <w:t>Meta</w:t>
             </w:r>
           </w:p>
         </w:tc>
       </w:tr>
       <w:tr>
         <w:trPr>
-          <w:cnfStyle w:val="000000100000" w:firstRow="0" w:lastRow="0" w:firstColumn="0" w:lastColumn="0" w:oddVBand="0" w:evenVBand="0" w:oddHBand="1" w:evenHBand="0" w:firstRowFirstColumn="0" w:firstRowLastColumn="0" w:lastRowFirstColumn="0" w:lastRowLastColumn="0"/>
           <w:trHeight w:val="288"/>
         </w:trPr>
         <w:tc>
           <w:tcPr>
-            <w:cnfStyle w:val="001000000000" w:firstRow="0" w:lastRow="0" w:firstColumn="1" w:lastColumn="0" w:oddVBand="0" w:evenVBand="0" w:oddHBand="0" w:evenHBand="0" w:firstRowFirstColumn="0" w:firstRowLastColumn="0" w:lastRowFirstColumn="0" w:lastRowLastColumn="0"/>
             <w:tcW w:w="1818" w:type="dxa"/>
             <w:noWrap/>
             <w:vAlign w:val="center"/>
@@ -33641,7 +33711,7 @@
             <w:pPr>
               <w:jc w:val="center"/>
               <w:rPr>
-                <w:rFonts w:ascii="Aptos Narrow" w:eastAsia="Times New Roman" w:hAnsi="Aptos Narrow" w:cs="Times New Roman"/>
+                <w:rFonts w:eastAsia="Times New Roman" w:cs="Times New Roman"/>
                 <w:color w:val="000000"/>
                 <w:sz w:val="20"/>
                 <w:szCs w:val="20"/>
@@ -33650,13 +33720,13 @@
             </w:pPr>
             <w:r>
               <w:rPr>
-                <w:rFonts w:ascii="Aptos Narrow" w:eastAsia="Times New Roman" w:hAnsi="Aptos Narrow" w:cs="Times New Roman"/>
+                <w:rFonts w:eastAsia="Times New Roman" w:cs="Times New Roman"/>
                 <w:color w:val="000000"/>
                 <w:sz w:val="20"/>
                 <w:szCs w:val="20"/>
                 <w:lang w:val="sr-Latn-RS" w:eastAsia="sr-Latn-RS"/>
               </w:rPr>
-              <w:t>llama3.2</w:t>
+              <w:t>mistral</w:t>
             </w:r>
           </w:p>
         </w:tc>
@@ -33670,9 +33740,8 @@
           <w:p>
             <w:pPr>
               <w:jc w:val="center"/>
-              <w:cnfStyle w:val="000000100000" w:firstRow="0" w:lastRow="0" w:firstColumn="0" w:lastColumn="0" w:oddVBand="0" w:evenVBand="0" w:oddHBand="1" w:evenHBand="0" w:firstRowFirstColumn="0" w:firstRowLastColumn="0" w:lastRowFirstColumn="0" w:lastRowLastColumn="0"/>
-              <w:rPr>
-                <w:rFonts w:ascii="Aptos Narrow" w:eastAsia="Times New Roman" w:hAnsi="Aptos Narrow" w:cs="Times New Roman"/>
+              <w:rPr>
+                <w:rFonts w:eastAsia="Times New Roman" w:cs="Times New Roman"/>
                 <w:color w:val="000000"/>
                 <w:sz w:val="20"/>
                 <w:szCs w:val="20"/>
@@ -33681,13 +33750,13 @@
             </w:pPr>
             <w:r>
               <w:rPr>
-                <w:rFonts w:ascii="Aptos Narrow" w:eastAsia="Times New Roman" w:hAnsi="Aptos Narrow" w:cs="Times New Roman"/>
+                <w:rFonts w:eastAsia="Times New Roman" w:cs="Times New Roman"/>
                 <w:color w:val="000000"/>
                 <w:sz w:val="20"/>
                 <w:szCs w:val="20"/>
                 <w:lang w:val="sr-Latn-RS" w:eastAsia="sr-Latn-RS"/>
               </w:rPr>
-              <w:t>3072</w:t>
+              <w:t>4096</w:t>
             </w:r>
           </w:p>
         </w:tc>
@@ -33699,9 +33768,8 @@
           <w:p>
             <w:pPr>
               <w:jc w:val="center"/>
-              <w:cnfStyle w:val="000000100000" w:firstRow="0" w:lastRow="0" w:firstColumn="0" w:lastColumn="0" w:oddVBand="0" w:evenVBand="0" w:oddHBand="1" w:evenHBand="0" w:firstRowFirstColumn="0" w:firstRowLastColumn="0" w:lastRowFirstColumn="0" w:lastRowLastColumn="0"/>
-              <w:rPr>
-                <w:rFonts w:ascii="Aptos Narrow" w:eastAsia="Times New Roman" w:hAnsi="Aptos Narrow" w:cs="Times New Roman"/>
+              <w:rPr>
+                <w:rFonts w:eastAsia="Times New Roman" w:cs="Times New Roman"/>
                 <w:color w:val="000000"/>
                 <w:sz w:val="20"/>
                 <w:szCs w:val="20"/>
@@ -33710,40 +33778,41 @@
             </w:pPr>
             <w:r>
               <w:rPr>
-                <w:rFonts w:ascii="Aptos Narrow" w:eastAsia="Times New Roman" w:hAnsi="Aptos Narrow" w:cs="Times New Roman"/>
+                <w:rFonts w:eastAsia="Times New Roman" w:cs="Times New Roman"/>
                 <w:color w:val="000000"/>
                 <w:sz w:val="20"/>
                 <w:szCs w:val="20"/>
                 <w:lang w:eastAsia="sr-Latn-RS"/>
               </w:rPr>
-              <w:t>3.2 B</w:t>
+              <w:t>7 B</w:t>
             </w:r>
           </w:p>
         </w:tc>
         <w:tc>
           <w:tcPr>
             <w:tcW w:w="1695" w:type="dxa"/>
+            <w:vAlign w:val="center"/>
           </w:tcPr>
           <w:p>
             <w:pPr>
-              <w:cnfStyle w:val="000000100000" w:firstRow="0" w:lastRow="0" w:firstColumn="0" w:lastColumn="0" w:oddVBand="0" w:evenVBand="0" w:oddHBand="1" w:evenHBand="0" w:firstRowFirstColumn="0" w:firstRowLastColumn="0" w:lastRowFirstColumn="0" w:lastRowLastColumn="0"/>
-              <w:rPr>
-                <w:rFonts w:ascii="Aptos Narrow" w:eastAsia="Times New Roman" w:hAnsi="Aptos Narrow" w:cs="Times New Roman"/>
+              <w:jc w:val="center"/>
+              <w:rPr>
+                <w:rFonts w:eastAsia="Times New Roman" w:cs="Times New Roman"/>
                 <w:color w:val="000000"/>
                 <w:sz w:val="20"/>
                 <w:szCs w:val="20"/>
-                <w:lang w:val="sr-Latn-RS" w:eastAsia="sr-Latn-RS"/>
+                <w:lang w:eastAsia="sr-Latn-RS"/>
               </w:rPr>
             </w:pPr>
             <w:r>
               <w:rPr>
-                <w:rFonts w:ascii="Aptos Narrow" w:eastAsia="Times New Roman" w:hAnsi="Aptos Narrow" w:cs="Times New Roman"/>
+                <w:rFonts w:eastAsia="Times New Roman" w:cs="Times New Roman"/>
                 <w:color w:val="000000"/>
                 <w:sz w:val="20"/>
                 <w:szCs w:val="20"/>
-                <w:lang w:val="sr-Latn-RS" w:eastAsia="sr-Latn-RS"/>
-              </w:rPr>
-              <w:t>Meta</w:t>
+                <w:lang w:eastAsia="sr-Latn-RS"/>
+              </w:rPr>
+              <w:t>Arthur Mensch, Guillaume Lample, and Timothée Lacroix</w:t>
             </w:r>
           </w:p>
         </w:tc>
@@ -33754,7 +33823,6 @@
         </w:trPr>
         <w:tc>
           <w:tcPr>
-            <w:cnfStyle w:val="001000000000" w:firstRow="0" w:lastRow="0" w:firstColumn="1" w:lastColumn="0" w:oddVBand="0" w:evenVBand="0" w:oddHBand="0" w:evenHBand="0" w:firstRowFirstColumn="0" w:firstRowLastColumn="0" w:lastRowFirstColumn="0" w:lastRowLastColumn="0"/>
             <w:tcW w:w="1818" w:type="dxa"/>
             <w:noWrap/>
             <w:vAlign w:val="center"/>
@@ -33764,7 +33832,7 @@
             <w:pPr>
               <w:jc w:val="center"/>
               <w:rPr>
-                <w:rFonts w:ascii="Aptos Narrow" w:eastAsia="Times New Roman" w:hAnsi="Aptos Narrow" w:cs="Times New Roman"/>
+                <w:rFonts w:eastAsia="Times New Roman" w:cs="Times New Roman"/>
                 <w:color w:val="000000"/>
                 <w:sz w:val="20"/>
                 <w:szCs w:val="20"/>
@@ -33773,13 +33841,13 @@
             </w:pPr>
             <w:r>
               <w:rPr>
-                <w:rFonts w:ascii="Aptos Narrow" w:eastAsia="Times New Roman" w:hAnsi="Aptos Narrow" w:cs="Times New Roman"/>
+                <w:rFonts w:eastAsia="Times New Roman" w:cs="Times New Roman"/>
                 <w:color w:val="000000"/>
                 <w:sz w:val="20"/>
                 <w:szCs w:val="20"/>
                 <w:lang w:val="sr-Latn-RS" w:eastAsia="sr-Latn-RS"/>
               </w:rPr>
-              <w:t>mistral</w:t>
+              <w:t>granite3.3</w:t>
             </w:r>
           </w:p>
         </w:tc>
@@ -33793,9 +33861,8 @@
           <w:p>
             <w:pPr>
               <w:jc w:val="center"/>
-              <w:cnfStyle w:val="000000000000" w:firstRow="0" w:lastRow="0" w:firstColumn="0" w:lastColumn="0" w:oddVBand="0" w:evenVBand="0" w:oddHBand="0" w:evenHBand="0" w:firstRowFirstColumn="0" w:firstRowLastColumn="0" w:lastRowFirstColumn="0" w:lastRowLastColumn="0"/>
-              <w:rPr>
-                <w:rFonts w:ascii="Aptos Narrow" w:eastAsia="Times New Roman" w:hAnsi="Aptos Narrow" w:cs="Times New Roman"/>
+              <w:rPr>
+                <w:rFonts w:eastAsia="Times New Roman" w:cs="Times New Roman"/>
                 <w:color w:val="000000"/>
                 <w:sz w:val="20"/>
                 <w:szCs w:val="20"/>
@@ -33804,7 +33871,7 @@
             </w:pPr>
             <w:r>
               <w:rPr>
-                <w:rFonts w:ascii="Aptos Narrow" w:eastAsia="Times New Roman" w:hAnsi="Aptos Narrow" w:cs="Times New Roman"/>
+                <w:rFonts w:eastAsia="Times New Roman" w:cs="Times New Roman"/>
                 <w:color w:val="000000"/>
                 <w:sz w:val="20"/>
                 <w:szCs w:val="20"/>
@@ -33822,9 +33889,8 @@
           <w:p>
             <w:pPr>
               <w:jc w:val="center"/>
-              <w:cnfStyle w:val="000000000000" w:firstRow="0" w:lastRow="0" w:firstColumn="0" w:lastColumn="0" w:oddVBand="0" w:evenVBand="0" w:oddHBand="0" w:evenHBand="0" w:firstRowFirstColumn="0" w:firstRowLastColumn="0" w:lastRowFirstColumn="0" w:lastRowLastColumn="0"/>
-              <w:rPr>
-                <w:rFonts w:ascii="Aptos Narrow" w:eastAsia="Times New Roman" w:hAnsi="Aptos Narrow" w:cs="Times New Roman"/>
+              <w:rPr>
+                <w:rFonts w:eastAsia="Times New Roman" w:cs="Times New Roman"/>
                 <w:color w:val="000000"/>
                 <w:sz w:val="20"/>
                 <w:szCs w:val="20"/>
@@ -33833,25 +33899,26 @@
             </w:pPr>
             <w:r>
               <w:rPr>
-                <w:rFonts w:ascii="Aptos Narrow" w:eastAsia="Times New Roman" w:hAnsi="Aptos Narrow" w:cs="Times New Roman"/>
+                <w:rFonts w:eastAsia="Times New Roman" w:cs="Times New Roman"/>
                 <w:color w:val="000000"/>
                 <w:sz w:val="20"/>
                 <w:szCs w:val="20"/>
                 <w:lang w:eastAsia="sr-Latn-RS"/>
               </w:rPr>
-              <w:t>7 B</w:t>
+              <w:t>8 B</w:t>
             </w:r>
           </w:p>
         </w:tc>
         <w:tc>
           <w:tcPr>
             <w:tcW w:w="1695" w:type="dxa"/>
+            <w:vAlign w:val="center"/>
           </w:tcPr>
           <w:p>
             <w:pPr>
-              <w:cnfStyle w:val="000000000000" w:firstRow="0" w:lastRow="0" w:firstColumn="0" w:lastColumn="0" w:oddVBand="0" w:evenVBand="0" w:oddHBand="0" w:evenHBand="0" w:firstRowFirstColumn="0" w:firstRowLastColumn="0" w:lastRowFirstColumn="0" w:lastRowLastColumn="0"/>
-              <w:rPr>
-                <w:rFonts w:ascii="Aptos Narrow" w:eastAsia="Times New Roman" w:hAnsi="Aptos Narrow" w:cs="Times New Roman"/>
+              <w:jc w:val="center"/>
+              <w:rPr>
+                <w:rFonts w:eastAsia="Times New Roman" w:cs="Times New Roman"/>
                 <w:color w:val="000000"/>
                 <w:sz w:val="20"/>
                 <w:szCs w:val="20"/>
@@ -33860,25 +33927,23 @@
             </w:pPr>
             <w:r>
               <w:rPr>
-                <w:rFonts w:ascii="Aptos Narrow" w:eastAsia="Times New Roman" w:hAnsi="Aptos Narrow" w:cs="Times New Roman"/>
+                <w:rFonts w:eastAsia="Times New Roman" w:cs="Times New Roman"/>
                 <w:color w:val="000000"/>
                 <w:sz w:val="20"/>
                 <w:szCs w:val="20"/>
                 <w:lang w:eastAsia="sr-Latn-RS"/>
               </w:rPr>
-              <w:t> Arthur Mensch, Guillaume Lample, and Timothée Lacroix</w:t>
+              <w:t>IBM</w:t>
             </w:r>
           </w:p>
         </w:tc>
       </w:tr>
       <w:tr>
         <w:trPr>
-          <w:cnfStyle w:val="000000100000" w:firstRow="0" w:lastRow="0" w:firstColumn="0" w:lastColumn="0" w:oddVBand="0" w:evenVBand="0" w:oddHBand="1" w:evenHBand="0" w:firstRowFirstColumn="0" w:firstRowLastColumn="0" w:lastRowFirstColumn="0" w:lastRowLastColumn="0"/>
           <w:trHeight w:val="288"/>
         </w:trPr>
         <w:tc>
           <w:tcPr>
-            <w:cnfStyle w:val="001000000000" w:firstRow="0" w:lastRow="0" w:firstColumn="1" w:lastColumn="0" w:oddVBand="0" w:evenVBand="0" w:oddHBand="0" w:evenHBand="0" w:firstRowFirstColumn="0" w:firstRowLastColumn="0" w:lastRowFirstColumn="0" w:lastRowLastColumn="0"/>
             <w:tcW w:w="1818" w:type="dxa"/>
             <w:noWrap/>
             <w:vAlign w:val="center"/>
@@ -33888,7 +33953,7 @@
             <w:pPr>
               <w:jc w:val="center"/>
               <w:rPr>
-                <w:rFonts w:ascii="Aptos Narrow" w:eastAsia="Times New Roman" w:hAnsi="Aptos Narrow" w:cs="Times New Roman"/>
+                <w:rFonts w:eastAsia="Times New Roman" w:cs="Times New Roman"/>
                 <w:color w:val="000000"/>
                 <w:sz w:val="20"/>
                 <w:szCs w:val="20"/>
@@ -33897,13 +33962,13 @@
             </w:pPr>
             <w:r>
               <w:rPr>
-                <w:rFonts w:ascii="Aptos Narrow" w:eastAsia="Times New Roman" w:hAnsi="Aptos Narrow" w:cs="Times New Roman"/>
+                <w:rFonts w:eastAsia="Times New Roman" w:cs="Times New Roman"/>
                 <w:color w:val="000000"/>
                 <w:sz w:val="20"/>
                 <w:szCs w:val="20"/>
                 <w:lang w:val="sr-Latn-RS" w:eastAsia="sr-Latn-RS"/>
               </w:rPr>
-              <w:t>granite3.3</w:t>
+              <w:t>qwen3:4b</w:t>
             </w:r>
           </w:p>
         </w:tc>
@@ -33917,9 +33982,8 @@
           <w:p>
             <w:pPr>
               <w:jc w:val="center"/>
-              <w:cnfStyle w:val="000000100000" w:firstRow="0" w:lastRow="0" w:firstColumn="0" w:lastColumn="0" w:oddVBand="0" w:evenVBand="0" w:oddHBand="1" w:evenHBand="0" w:firstRowFirstColumn="0" w:firstRowLastColumn="0" w:lastRowFirstColumn="0" w:lastRowLastColumn="0"/>
-              <w:rPr>
-                <w:rFonts w:ascii="Aptos Narrow" w:eastAsia="Times New Roman" w:hAnsi="Aptos Narrow" w:cs="Times New Roman"/>
+              <w:rPr>
+                <w:rFonts w:eastAsia="Times New Roman" w:cs="Times New Roman"/>
                 <w:color w:val="000000"/>
                 <w:sz w:val="20"/>
                 <w:szCs w:val="20"/>
@@ -33928,13 +33992,13 @@
             </w:pPr>
             <w:r>
               <w:rPr>
-                <w:rFonts w:ascii="Aptos Narrow" w:eastAsia="Times New Roman" w:hAnsi="Aptos Narrow" w:cs="Times New Roman"/>
+                <w:rFonts w:eastAsia="Times New Roman" w:cs="Times New Roman"/>
                 <w:color w:val="000000"/>
                 <w:sz w:val="20"/>
                 <w:szCs w:val="20"/>
                 <w:lang w:val="sr-Latn-RS" w:eastAsia="sr-Latn-RS"/>
               </w:rPr>
-              <w:t>4096</w:t>
+              <w:t>2560</w:t>
             </w:r>
           </w:p>
         </w:tc>
@@ -33946,9 +34010,8 @@
           <w:p>
             <w:pPr>
               <w:jc w:val="center"/>
-              <w:cnfStyle w:val="000000100000" w:firstRow="0" w:lastRow="0" w:firstColumn="0" w:lastColumn="0" w:oddVBand="0" w:evenVBand="0" w:oddHBand="1" w:evenHBand="0" w:firstRowFirstColumn="0" w:firstRowLastColumn="0" w:lastRowFirstColumn="0" w:lastRowLastColumn="0"/>
-              <w:rPr>
-                <w:rFonts w:ascii="Aptos Narrow" w:eastAsia="Times New Roman" w:hAnsi="Aptos Narrow" w:cs="Times New Roman"/>
+              <w:rPr>
+                <w:rFonts w:eastAsia="Times New Roman" w:cs="Times New Roman"/>
                 <w:color w:val="000000"/>
                 <w:sz w:val="20"/>
                 <w:szCs w:val="20"/>
@@ -33957,121 +34020,26 @@
             </w:pPr>
             <w:r>
               <w:rPr>
-                <w:rFonts w:ascii="Aptos Narrow" w:eastAsia="Times New Roman" w:hAnsi="Aptos Narrow" w:cs="Times New Roman"/>
+                <w:rFonts w:eastAsia="Times New Roman" w:cs="Times New Roman"/>
                 <w:color w:val="000000"/>
                 <w:sz w:val="20"/>
                 <w:szCs w:val="20"/>
-                <w:lang w:eastAsia="sr-Latn-RS"/>
-              </w:rPr>
-              <w:t>8 B</w:t>
+                <w:lang w:val="sr-Latn-RS" w:eastAsia="sr-Latn-RS"/>
+              </w:rPr>
+              <w:t>4 B</w:t>
             </w:r>
           </w:p>
         </w:tc>
         <w:tc>
           <w:tcPr>
             <w:tcW w:w="1695" w:type="dxa"/>
-          </w:tcPr>
-          <w:p>
-            <w:pPr>
-              <w:cnfStyle w:val="000000100000" w:firstRow="0" w:lastRow="0" w:firstColumn="0" w:lastColumn="0" w:oddVBand="0" w:evenVBand="0" w:oddHBand="1" w:evenHBand="0" w:firstRowFirstColumn="0" w:firstRowLastColumn="0" w:lastRowFirstColumn="0" w:lastRowLastColumn="0"/>
-              <w:rPr>
-                <w:rFonts w:ascii="Aptos Narrow" w:eastAsia="Times New Roman" w:hAnsi="Aptos Narrow" w:cs="Times New Roman"/>
-                <w:color w:val="000000"/>
-                <w:sz w:val="20"/>
-                <w:szCs w:val="20"/>
-                <w:lang w:eastAsia="sr-Latn-RS"/>
-              </w:rPr>
-            </w:pPr>
-            <w:r>
-              <w:rPr>
-                <w:rFonts w:ascii="Aptos Narrow" w:eastAsia="Times New Roman" w:hAnsi="Aptos Narrow" w:cs="Times New Roman"/>
-                <w:color w:val="000000"/>
-                <w:sz w:val="20"/>
-                <w:szCs w:val="20"/>
-                <w:lang w:eastAsia="sr-Latn-RS"/>
-              </w:rPr>
-              <w:t>IBM</w:t>
-            </w:r>
-          </w:p>
-        </w:tc>
-      </w:tr>
-      <w:tr>
-        <w:trPr>
-          <w:trHeight w:val="288"/>
-        </w:trPr>
-        <w:tc>
-          <w:tcPr>
-            <w:cnfStyle w:val="001000000000" w:firstRow="0" w:lastRow="0" w:firstColumn="1" w:lastColumn="0" w:oddVBand="0" w:evenVBand="0" w:oddHBand="0" w:evenHBand="0" w:firstRowFirstColumn="0" w:firstRowLastColumn="0" w:lastRowFirstColumn="0" w:lastRowLastColumn="0"/>
-            <w:tcW w:w="1818" w:type="dxa"/>
-            <w:noWrap/>
-            <w:vAlign w:val="center"/>
-            <w:hideMark/>
-          </w:tcPr>
-          <w:p>
-            <w:pPr>
-              <w:jc w:val="center"/>
-              <w:rPr>
-                <w:rFonts w:ascii="Aptos Narrow" w:eastAsia="Times New Roman" w:hAnsi="Aptos Narrow" w:cs="Times New Roman"/>
-                <w:color w:val="000000"/>
-                <w:sz w:val="20"/>
-                <w:szCs w:val="20"/>
-                <w:lang w:val="sr-Latn-RS" w:eastAsia="sr-Latn-RS"/>
-              </w:rPr>
-            </w:pPr>
-            <w:r>
-              <w:rPr>
-                <w:rFonts w:ascii="Aptos Narrow" w:eastAsia="Times New Roman" w:hAnsi="Aptos Narrow" w:cs="Times New Roman"/>
-                <w:color w:val="000000"/>
-                <w:sz w:val="20"/>
-                <w:szCs w:val="20"/>
-                <w:lang w:val="sr-Latn-RS" w:eastAsia="sr-Latn-RS"/>
-              </w:rPr>
-              <w:t>qwen3:4b</w:t>
-            </w:r>
-          </w:p>
-        </w:tc>
-        <w:tc>
-          <w:tcPr>
-            <w:tcW w:w="2180" w:type="dxa"/>
-            <w:noWrap/>
-            <w:vAlign w:val="center"/>
-            <w:hideMark/>
-          </w:tcPr>
-          <w:p>
-            <w:pPr>
-              <w:jc w:val="center"/>
-              <w:cnfStyle w:val="000000000000" w:firstRow="0" w:lastRow="0" w:firstColumn="0" w:lastColumn="0" w:oddVBand="0" w:evenVBand="0" w:oddHBand="0" w:evenHBand="0" w:firstRowFirstColumn="0" w:firstRowLastColumn="0" w:lastRowFirstColumn="0" w:lastRowLastColumn="0"/>
-              <w:rPr>
-                <w:rFonts w:ascii="Aptos Narrow" w:eastAsia="Times New Roman" w:hAnsi="Aptos Narrow" w:cs="Times New Roman"/>
-                <w:color w:val="000000"/>
-                <w:sz w:val="20"/>
-                <w:szCs w:val="20"/>
-                <w:lang w:val="sr-Latn-RS" w:eastAsia="sr-Latn-RS"/>
-              </w:rPr>
-            </w:pPr>
-            <w:r>
-              <w:rPr>
-                <w:rFonts w:ascii="Aptos Narrow" w:eastAsia="Times New Roman" w:hAnsi="Aptos Narrow" w:cs="Times New Roman"/>
-                <w:color w:val="000000"/>
-                <w:sz w:val="20"/>
-                <w:szCs w:val="20"/>
-                <w:lang w:val="sr-Latn-RS" w:eastAsia="sr-Latn-RS"/>
-              </w:rPr>
-              <w:t>2560</w:t>
-            </w:r>
-          </w:p>
-        </w:tc>
-        <w:tc>
-          <w:tcPr>
-            <w:tcW w:w="2665" w:type="dxa"/>
             <w:vAlign w:val="center"/>
           </w:tcPr>
           <w:p>
             <w:pPr>
               <w:jc w:val="center"/>
-              <w:cnfStyle w:val="000000000000" w:firstRow="0" w:lastRow="0" w:firstColumn="0" w:lastColumn="0" w:oddVBand="0" w:evenVBand="0" w:oddHBand="0" w:evenHBand="0" w:firstRowFirstColumn="0" w:firstRowLastColumn="0" w:lastRowFirstColumn="0" w:lastRowLastColumn="0"/>
-              <w:rPr>
-                <w:rFonts w:ascii="Aptos Narrow" w:eastAsia="Times New Roman" w:hAnsi="Aptos Narrow" w:cs="Times New Roman"/>
+              <w:rPr>
+                <w:rFonts w:eastAsia="Times New Roman" w:cs="Times New Roman"/>
                 <w:color w:val="000000"/>
                 <w:sz w:val="20"/>
                 <w:szCs w:val="20"/>
@@ -34080,34 +34048,7 @@
             </w:pPr>
             <w:r>
               <w:rPr>
-                <w:rFonts w:ascii="Aptos Narrow" w:eastAsia="Times New Roman" w:hAnsi="Aptos Narrow" w:cs="Times New Roman"/>
-                <w:color w:val="000000"/>
-                <w:sz w:val="20"/>
-                <w:szCs w:val="20"/>
-                <w:lang w:val="sr-Latn-RS" w:eastAsia="sr-Latn-RS"/>
-              </w:rPr>
-              <w:t>4 B</w:t>
-            </w:r>
-          </w:p>
-        </w:tc>
-        <w:tc>
-          <w:tcPr>
-            <w:tcW w:w="1695" w:type="dxa"/>
-          </w:tcPr>
-          <w:p>
-            <w:pPr>
-              <w:cnfStyle w:val="000000000000" w:firstRow="0" w:lastRow="0" w:firstColumn="0" w:lastColumn="0" w:oddVBand="0" w:evenVBand="0" w:oddHBand="0" w:evenHBand="0" w:firstRowFirstColumn="0" w:firstRowLastColumn="0" w:lastRowFirstColumn="0" w:lastRowLastColumn="0"/>
-              <w:rPr>
-                <w:rFonts w:ascii="Aptos Narrow" w:eastAsia="Times New Roman" w:hAnsi="Aptos Narrow" w:cs="Times New Roman"/>
-                <w:color w:val="000000"/>
-                <w:sz w:val="20"/>
-                <w:szCs w:val="20"/>
-                <w:lang w:val="sr-Latn-RS" w:eastAsia="sr-Latn-RS"/>
-              </w:rPr>
-            </w:pPr>
-            <w:r>
-              <w:rPr>
-                <w:rFonts w:ascii="Aptos Narrow" w:eastAsia="Times New Roman" w:hAnsi="Aptos Narrow" w:cs="Times New Roman"/>
+                <w:rFonts w:eastAsia="Times New Roman" w:cs="Times New Roman"/>
                 <w:color w:val="000000"/>
                 <w:sz w:val="20"/>
                 <w:szCs w:val="20"/>
@@ -34270,7 +34211,7 @@
         </w:rPr>
         <w:t xml:space="preserve">Резултати тестирања са различитим метрикама за модел </w:t>
       </w:r>
-      <w:bookmarkStart w:id="32" w:name="_Hlk205810646"/>
+      <w:bookmarkStart w:id="33" w:name="_Hlk205810646"/>
       <w:r>
         <w:rPr>
           <w:b/>
@@ -34282,7 +34223,7 @@
         </w:rPr>
         <w:t>granite3.3</w:t>
       </w:r>
-      <w:bookmarkEnd w:id="32"/>
+      <w:bookmarkEnd w:id="33"/>
     </w:p>
     <w:p>
       <w:pPr>
@@ -35510,7 +35451,7 @@
           <w:lang w:val="sr-Cyrl-RS"/>
         </w:rPr>
       </w:pPr>
-      <w:bookmarkStart w:id="33" w:name="_Hlk206429054"/>
+      <w:bookmarkStart w:id="34" w:name="_Hlk206429054"/>
       <w:r>
         <w:rPr>
           <w:lang w:val="sr-Cyrl-RS"/>
@@ -35526,7 +35467,7 @@
         </w:rPr>
       </w:pPr>
     </w:p>
-    <w:bookmarkEnd w:id="33"/>
+    <w:bookmarkEnd w:id="34"/>
     <w:p>
       <w:pPr>
         <w:keepNext/>
@@ -35744,16 +35685,8 @@
     </w:p>
     <w:tbl>
       <w:tblPr>
-        <w:tblStyle w:val="ListTable4-Accent4"/>
+        <w:tblStyle w:val="TableGrid"/>
         <w:tblW w:w="0" w:type="auto"/>
-        <w:tblBorders>
-          <w:top w:val="single" w:sz="4" w:space="0" w:color="auto"/>
-          <w:left w:val="single" w:sz="4" w:space="0" w:color="auto"/>
-          <w:bottom w:val="single" w:sz="4" w:space="0" w:color="auto"/>
-          <w:right w:val="single" w:sz="4" w:space="0" w:color="auto"/>
-          <w:insideH w:val="single" w:sz="4" w:space="0" w:color="auto"/>
-          <w:insideV w:val="single" w:sz="4" w:space="0" w:color="auto"/>
-        </w:tblBorders>
         <w:tblLook w:val="04A0" w:firstRow="1" w:lastRow="0" w:firstColumn="1" w:lastColumn="0" w:noHBand="0" w:noVBand="1"/>
       </w:tblPr>
       <w:tblGrid>
@@ -35762,18 +35695,10 @@
         <w:gridCol w:w="2766"/>
       </w:tblGrid>
       <w:tr>
-        <w:trPr>
-          <w:cnfStyle w:val="100000000000" w:firstRow="1" w:lastRow="0" w:firstColumn="0" w:lastColumn="0" w:oddVBand="0" w:evenVBand="0" w:oddHBand="0" w:evenHBand="0" w:firstRowFirstColumn="0" w:firstRowLastColumn="0" w:lastRowFirstColumn="0" w:lastRowLastColumn="0"/>
-        </w:trPr>
         <w:tc>
           <w:tcPr>
-            <w:cnfStyle w:val="001000000000" w:firstRow="0" w:lastRow="0" w:firstColumn="1" w:lastColumn="0" w:oddVBand="0" w:evenVBand="0" w:oddHBand="0" w:evenHBand="0" w:firstRowFirstColumn="0" w:firstRowLastColumn="0" w:lastRowFirstColumn="0" w:lastRowLastColumn="0"/>
             <w:tcW w:w="2765" w:type="dxa"/>
-            <w:tcBorders>
-              <w:top w:val="none" w:sz="0" w:space="0" w:color="auto"/>
-              <w:left w:val="none" w:sz="0" w:space="0" w:color="auto"/>
-              <w:bottom w:val="none" w:sz="0" w:space="0" w:color="auto"/>
-            </w:tcBorders>
+            <w:shd w:val="clear" w:color="auto" w:fill="BFBFBF"/>
           </w:tcPr>
           <w:p>
             <w:pPr>
@@ -35793,15 +35718,11 @@
         <w:tc>
           <w:tcPr>
             <w:tcW w:w="2766" w:type="dxa"/>
-            <w:tcBorders>
-              <w:top w:val="none" w:sz="0" w:space="0" w:color="auto"/>
-              <w:bottom w:val="none" w:sz="0" w:space="0" w:color="auto"/>
-            </w:tcBorders>
+            <w:shd w:val="clear" w:color="auto" w:fill="BFBFBF"/>
           </w:tcPr>
           <w:p>
             <w:pPr>
               <w:jc w:val="both"/>
-              <w:cnfStyle w:val="100000000000" w:firstRow="1" w:lastRow="0" w:firstColumn="0" w:lastColumn="0" w:oddVBand="0" w:evenVBand="0" w:oddHBand="0" w:evenHBand="0" w:firstRowFirstColumn="0" w:firstRowLastColumn="0" w:lastRowFirstColumn="0" w:lastRowLastColumn="0"/>
               <w:rPr>
                 <w:lang w:val="sr-Cyrl-RS"/>
               </w:rPr>
@@ -35817,16 +35738,11 @@
         <w:tc>
           <w:tcPr>
             <w:tcW w:w="2766" w:type="dxa"/>
-            <w:tcBorders>
-              <w:top w:val="none" w:sz="0" w:space="0" w:color="auto"/>
-              <w:bottom w:val="none" w:sz="0" w:space="0" w:color="auto"/>
-              <w:right w:val="none" w:sz="0" w:space="0" w:color="auto"/>
-            </w:tcBorders>
+            <w:shd w:val="clear" w:color="auto" w:fill="BFBFBF"/>
           </w:tcPr>
           <w:p>
             <w:pPr>
               <w:jc w:val="both"/>
-              <w:cnfStyle w:val="100000000000" w:firstRow="1" w:lastRow="0" w:firstColumn="0" w:lastColumn="0" w:oddVBand="0" w:evenVBand="0" w:oddHBand="0" w:evenHBand="0" w:firstRowFirstColumn="0" w:firstRowLastColumn="0" w:lastRowFirstColumn="0" w:lastRowLastColumn="0"/>
               <w:rPr>
                 <w:lang w:val="sr-Cyrl-RS"/>
               </w:rPr>
@@ -35841,27 +35757,21 @@
         </w:tc>
       </w:tr>
       <w:tr>
-        <w:trPr>
-          <w:cnfStyle w:val="000000100000" w:firstRow="0" w:lastRow="0" w:firstColumn="0" w:lastColumn="0" w:oddVBand="0" w:evenVBand="0" w:oddHBand="1" w:evenHBand="0" w:firstRowFirstColumn="0" w:firstRowLastColumn="0" w:lastRowFirstColumn="0" w:lastRowLastColumn="0"/>
-        </w:trPr>
         <w:tc>
           <w:tcPr>
-            <w:cnfStyle w:val="001000000000" w:firstRow="0" w:lastRow="0" w:firstColumn="1" w:lastColumn="0" w:oddVBand="0" w:evenVBand="0" w:oddHBand="0" w:evenHBand="0" w:firstRowFirstColumn="0" w:firstRowLastColumn="0" w:lastRowFirstColumn="0" w:lastRowLastColumn="0"/>
             <w:tcW w:w="2765" w:type="dxa"/>
           </w:tcPr>
           <w:p>
             <w:pPr>
               <w:jc w:val="both"/>
               <w:rPr>
-                <w:b w:val="0"/>
-                <w:bCs w:val="0"/>
+                <w:b/>
+                <w:bCs/>
                 <w:lang w:val="sr-Cyrl-RS"/>
               </w:rPr>
             </w:pPr>
             <w:r>
               <w:rPr>
-                <w:b w:val="0"/>
-                <w:bCs w:val="0"/>
                 <w:lang w:val="sr-Cyrl-RS"/>
               </w:rPr>
               <w:t>llama3.2</w:t>
@@ -35875,7 +35785,6 @@
           <w:p>
             <w:pPr>
               <w:jc w:val="both"/>
-              <w:cnfStyle w:val="000000100000" w:firstRow="0" w:lastRow="0" w:firstColumn="0" w:lastColumn="0" w:oddVBand="0" w:evenVBand="0" w:oddHBand="1" w:evenHBand="0" w:firstRowFirstColumn="0" w:firstRowLastColumn="0" w:lastRowFirstColumn="0" w:lastRowLastColumn="0"/>
               <w:rPr>
                 <w:lang w:val="en-US"/>
               </w:rPr>
@@ -35907,7 +35816,6 @@
           <w:p>
             <w:pPr>
               <w:jc w:val="both"/>
-              <w:cnfStyle w:val="000000100000" w:firstRow="0" w:lastRow="0" w:firstColumn="0" w:lastColumn="0" w:oddVBand="0" w:evenVBand="0" w:oddHBand="1" w:evenHBand="0" w:firstRowFirstColumn="0" w:firstRowLastColumn="0" w:lastRowFirstColumn="0" w:lastRowLastColumn="0"/>
               <w:rPr>
                 <w:lang w:val="en-US"/>
               </w:rPr>
@@ -35924,22 +35832,19 @@
       <w:tr>
         <w:tc>
           <w:tcPr>
-            <w:cnfStyle w:val="001000000000" w:firstRow="0" w:lastRow="0" w:firstColumn="1" w:lastColumn="0" w:oddVBand="0" w:evenVBand="0" w:oddHBand="0" w:evenHBand="0" w:firstRowFirstColumn="0" w:firstRowLastColumn="0" w:lastRowFirstColumn="0" w:lastRowLastColumn="0"/>
             <w:tcW w:w="2765" w:type="dxa"/>
           </w:tcPr>
           <w:p>
             <w:pPr>
               <w:jc w:val="both"/>
               <w:rPr>
-                <w:b w:val="0"/>
-                <w:bCs w:val="0"/>
+                <w:b/>
+                <w:bCs/>
                 <w:lang w:val="sr-Cyrl-RS"/>
               </w:rPr>
             </w:pPr>
             <w:r>
               <w:rPr>
-                <w:b w:val="0"/>
-                <w:bCs w:val="0"/>
                 <w:lang w:val="sr-Cyrl-RS"/>
               </w:rPr>
               <w:t>granite3.3</w:t>
@@ -35953,7 +35858,6 @@
           <w:p>
             <w:pPr>
               <w:jc w:val="both"/>
-              <w:cnfStyle w:val="000000000000" w:firstRow="0" w:lastRow="0" w:firstColumn="0" w:lastColumn="0" w:oddVBand="0" w:evenVBand="0" w:oddHBand="0" w:evenHBand="0" w:firstRowFirstColumn="0" w:firstRowLastColumn="0" w:lastRowFirstColumn="0" w:lastRowLastColumn="0"/>
               <w:rPr>
                 <w:lang w:val="sr-Cyrl-RS"/>
               </w:rPr>
@@ -35979,7 +35883,6 @@
           <w:p>
             <w:pPr>
               <w:jc w:val="both"/>
-              <w:cnfStyle w:val="000000000000" w:firstRow="0" w:lastRow="0" w:firstColumn="0" w:lastColumn="0" w:oddVBand="0" w:evenVBand="0" w:oddHBand="0" w:evenHBand="0" w:firstRowFirstColumn="0" w:firstRowLastColumn="0" w:lastRowFirstColumn="0" w:lastRowLastColumn="0"/>
               <w:rPr>
                 <w:lang w:val="en-US"/>
               </w:rPr>
@@ -35994,35 +35897,27 @@
         </w:tc>
       </w:tr>
       <w:tr>
-        <w:trPr>
-          <w:cnfStyle w:val="000000100000" w:firstRow="0" w:lastRow="0" w:firstColumn="0" w:lastColumn="0" w:oddVBand="0" w:evenVBand="0" w:oddHBand="1" w:evenHBand="0" w:firstRowFirstColumn="0" w:firstRowLastColumn="0" w:lastRowFirstColumn="0" w:lastRowLastColumn="0"/>
-        </w:trPr>
         <w:tc>
           <w:tcPr>
-            <w:cnfStyle w:val="001000000000" w:firstRow="0" w:lastRow="0" w:firstColumn="1" w:lastColumn="0" w:oddVBand="0" w:evenVBand="0" w:oddHBand="0" w:evenHBand="0" w:firstRowFirstColumn="0" w:firstRowLastColumn="0" w:lastRowFirstColumn="0" w:lastRowLastColumn="0"/>
             <w:tcW w:w="2765" w:type="dxa"/>
           </w:tcPr>
           <w:p>
             <w:pPr>
               <w:jc w:val="both"/>
               <w:rPr>
-                <w:b w:val="0"/>
-                <w:bCs w:val="0"/>
+                <w:b/>
+                <w:bCs/>
                 <w:lang w:val="en-US"/>
               </w:rPr>
             </w:pPr>
             <w:r>
               <w:rPr>
-                <w:b w:val="0"/>
-                <w:bCs w:val="0"/>
                 <w:lang w:val="en-US"/>
               </w:rPr>
               <w:t>qwen</w:t>
             </w:r>
             <w:r>
               <w:rPr>
-                <w:b w:val="0"/>
-                <w:bCs w:val="0"/>
                 <w:lang w:val="en-US"/>
               </w:rPr>
               <w:t>3:4b</w:t>
@@ -36036,7 +35931,6 @@
           <w:p>
             <w:pPr>
               <w:jc w:val="both"/>
-              <w:cnfStyle w:val="000000100000" w:firstRow="0" w:lastRow="0" w:firstColumn="0" w:lastColumn="0" w:oddVBand="0" w:evenVBand="0" w:oddHBand="1" w:evenHBand="0" w:firstRowFirstColumn="0" w:firstRowLastColumn="0" w:lastRowFirstColumn="0" w:lastRowLastColumn="0"/>
               <w:rPr>
                 <w:lang w:val="sr-Cyrl-RS"/>
               </w:rPr>
@@ -36062,7 +35956,6 @@
           <w:p>
             <w:pPr>
               <w:jc w:val="both"/>
-              <w:cnfStyle w:val="000000100000" w:firstRow="0" w:lastRow="0" w:firstColumn="0" w:lastColumn="0" w:oddVBand="0" w:evenVBand="0" w:oddHBand="1" w:evenHBand="0" w:firstRowFirstColumn="0" w:firstRowLastColumn="0" w:lastRowFirstColumn="0" w:lastRowLastColumn="0"/>
               <w:rPr>
                 <w:lang w:val="en-US"/>
               </w:rPr>
@@ -36079,30 +35972,25 @@
       <w:tr>
         <w:tc>
           <w:tcPr>
-            <w:cnfStyle w:val="001000000000" w:firstRow="0" w:lastRow="0" w:firstColumn="1" w:lastColumn="0" w:oddVBand="0" w:evenVBand="0" w:oddHBand="0" w:evenHBand="0" w:firstRowFirstColumn="0" w:firstRowLastColumn="0" w:lastRowFirstColumn="0" w:lastRowLastColumn="0"/>
             <w:tcW w:w="2765" w:type="dxa"/>
           </w:tcPr>
           <w:p>
             <w:pPr>
               <w:jc w:val="both"/>
               <w:rPr>
-                <w:b w:val="0"/>
-                <w:bCs w:val="0"/>
+                <w:b/>
+                <w:bCs/>
                 <w:lang w:val="en-US"/>
               </w:rPr>
             </w:pPr>
             <w:r>
               <w:rPr>
-                <w:b w:val="0"/>
-                <w:bCs w:val="0"/>
                 <w:lang w:val="en-US"/>
               </w:rPr>
               <w:t>M</w:t>
             </w:r>
             <w:r>
               <w:rPr>
-                <w:b w:val="0"/>
-                <w:bCs w:val="0"/>
                 <w:lang w:val="en-US"/>
               </w:rPr>
               <w:t>istral</w:t>
@@ -36116,7 +36004,6 @@
           <w:p>
             <w:pPr>
               <w:jc w:val="both"/>
-              <w:cnfStyle w:val="000000000000" w:firstRow="0" w:lastRow="0" w:firstColumn="0" w:lastColumn="0" w:oddVBand="0" w:evenVBand="0" w:oddHBand="0" w:evenHBand="0" w:firstRowFirstColumn="0" w:firstRowLastColumn="0" w:lastRowFirstColumn="0" w:lastRowLastColumn="0"/>
               <w:rPr>
                 <w:lang w:val="en-US"/>
               </w:rPr>
@@ -36136,7 +36023,6 @@
           <w:p>
             <w:pPr>
               <w:jc w:val="both"/>
-              <w:cnfStyle w:val="000000000000" w:firstRow="0" w:lastRow="0" w:firstColumn="0" w:lastColumn="0" w:oddVBand="0" w:evenVBand="0" w:oddHBand="0" w:evenHBand="0" w:firstRowFirstColumn="0" w:firstRowLastColumn="0" w:lastRowFirstColumn="0" w:lastRowLastColumn="0"/>
               <w:rPr>
                 <w:lang w:val="en-US"/>
               </w:rPr>
@@ -36192,7 +36078,7 @@
           <w:lang w:val="en-US"/>
         </w:rPr>
       </w:pPr>
-      <w:bookmarkStart w:id="34" w:name="_Toc211939786"/>
+      <w:bookmarkStart w:id="35" w:name="_Toc212028735"/>
       <w:r>
         <w:rPr>
           <w:lang w:val="sr-Cyrl-RS"/>
@@ -36220,7 +36106,7 @@
         </w:rPr>
         <w:t>Закључак</w:t>
       </w:r>
-      <w:bookmarkEnd w:id="34"/>
+      <w:bookmarkEnd w:id="35"/>
     </w:p>
     <w:p>
       <w:pPr>
@@ -36736,14 +36622,14 @@
           <w:lang w:val="sr-Cyrl-RS"/>
         </w:rPr>
       </w:pPr>
-      <w:bookmarkStart w:id="35" w:name="_Toc211939787"/>
+      <w:bookmarkStart w:id="36" w:name="_Toc212028736"/>
       <w:r>
         <w:rPr>
           <w:lang w:val="sr-Cyrl-RS"/>
         </w:rPr>
         <w:t>Литература</w:t>
       </w:r>
-      <w:bookmarkEnd w:id="35"/>
+      <w:bookmarkEnd w:id="36"/>
     </w:p>
     <w:p>
       <w:pPr>
@@ -41777,6 +41663,196 @@
       </w:tcPr>
     </w:tblStylePr>
   </w:style>
+  <w:style w:type="table" w:styleId="GridTable4">
+    <w:name w:val="Grid Table 4"/>
+    <w:basedOn w:val="TableNormal"/>
+    <w:uiPriority w:val="49"/>
+    <w:rsid w:val="00E604E2"/>
+    <w:pPr>
+      <w:spacing w:line="240" w:lineRule="auto"/>
+    </w:pPr>
+    <w:tblPr>
+      <w:tblStyleRowBandSize w:val="1"/>
+      <w:tblStyleColBandSize w:val="1"/>
+      <w:tblBorders>
+        <w:top w:val="single" w:sz="4" w:space="0" w:color="666666" w:themeColor="text1" w:themeTint="99"/>
+        <w:left w:val="single" w:sz="4" w:space="0" w:color="666666" w:themeColor="text1" w:themeTint="99"/>
+        <w:bottom w:val="single" w:sz="4" w:space="0" w:color="666666" w:themeColor="text1" w:themeTint="99"/>
+        <w:right w:val="single" w:sz="4" w:space="0" w:color="666666" w:themeColor="text1" w:themeTint="99"/>
+        <w:insideH w:val="single" w:sz="4" w:space="0" w:color="666666" w:themeColor="text1" w:themeTint="99"/>
+        <w:insideV w:val="single" w:sz="4" w:space="0" w:color="666666" w:themeColor="text1" w:themeTint="99"/>
+      </w:tblBorders>
+    </w:tblPr>
+    <w:tblStylePr w:type="firstRow">
+      <w:rPr>
+        <w:b/>
+        <w:bCs/>
+        <w:color w:val="FFFFFF" w:themeColor="background1"/>
+      </w:rPr>
+      <w:tblPr/>
+      <w:tcPr>
+        <w:tcBorders>
+          <w:top w:val="single" w:sz="4" w:space="0" w:color="000000" w:themeColor="text1"/>
+          <w:left w:val="single" w:sz="4" w:space="0" w:color="000000" w:themeColor="text1"/>
+          <w:bottom w:val="single" w:sz="4" w:space="0" w:color="000000" w:themeColor="text1"/>
+          <w:right w:val="single" w:sz="4" w:space="0" w:color="000000" w:themeColor="text1"/>
+          <w:insideH w:val="nil"/>
+          <w:insideV w:val="nil"/>
+        </w:tcBorders>
+        <w:shd w:val="clear" w:color="auto" w:fill="000000" w:themeFill="text1"/>
+      </w:tcPr>
+    </w:tblStylePr>
+    <w:tblStylePr w:type="lastRow">
+      <w:rPr>
+        <w:b/>
+        <w:bCs/>
+      </w:rPr>
+      <w:tblPr/>
+      <w:tcPr>
+        <w:tcBorders>
+          <w:top w:val="double" w:sz="4" w:space="0" w:color="000000" w:themeColor="text1"/>
+        </w:tcBorders>
+      </w:tcPr>
+    </w:tblStylePr>
+    <w:tblStylePr w:type="firstCol">
+      <w:rPr>
+        <w:b/>
+        <w:bCs/>
+      </w:rPr>
+    </w:tblStylePr>
+    <w:tblStylePr w:type="lastCol">
+      <w:rPr>
+        <w:b/>
+        <w:bCs/>
+      </w:rPr>
+    </w:tblStylePr>
+    <w:tblStylePr w:type="band1Vert">
+      <w:tblPr/>
+      <w:tcPr>
+        <w:shd w:val="clear" w:color="auto" w:fill="CCCCCC" w:themeFill="text1" w:themeFillTint="33"/>
+      </w:tcPr>
+    </w:tblStylePr>
+    <w:tblStylePr w:type="band1Horz">
+      <w:tblPr/>
+      <w:tcPr>
+        <w:shd w:val="clear" w:color="auto" w:fill="CCCCCC" w:themeFill="text1" w:themeFillTint="33"/>
+      </w:tcPr>
+    </w:tblStylePr>
+  </w:style>
+  <w:style w:type="table" w:styleId="GridTable1Light">
+    <w:name w:val="Grid Table 1 Light"/>
+    <w:basedOn w:val="TableNormal"/>
+    <w:uiPriority w:val="46"/>
+    <w:rsid w:val="005A1276"/>
+    <w:pPr>
+      <w:spacing w:line="240" w:lineRule="auto"/>
+    </w:pPr>
+    <w:tblPr>
+      <w:tblStyleRowBandSize w:val="1"/>
+      <w:tblStyleColBandSize w:val="1"/>
+      <w:tblBorders>
+        <w:top w:val="single" w:sz="4" w:space="0" w:color="999999" w:themeColor="text1" w:themeTint="66"/>
+        <w:left w:val="single" w:sz="4" w:space="0" w:color="999999" w:themeColor="text1" w:themeTint="66"/>
+        <w:bottom w:val="single" w:sz="4" w:space="0" w:color="999999" w:themeColor="text1" w:themeTint="66"/>
+        <w:right w:val="single" w:sz="4" w:space="0" w:color="999999" w:themeColor="text1" w:themeTint="66"/>
+        <w:insideH w:val="single" w:sz="4" w:space="0" w:color="999999" w:themeColor="text1" w:themeTint="66"/>
+        <w:insideV w:val="single" w:sz="4" w:space="0" w:color="999999" w:themeColor="text1" w:themeTint="66"/>
+      </w:tblBorders>
+    </w:tblPr>
+    <w:tblStylePr w:type="firstRow">
+      <w:rPr>
+        <w:b/>
+        <w:bCs/>
+      </w:rPr>
+      <w:tblPr/>
+      <w:tcPr>
+        <w:tcBorders>
+          <w:bottom w:val="single" w:sz="12" w:space="0" w:color="666666" w:themeColor="text1" w:themeTint="99"/>
+        </w:tcBorders>
+      </w:tcPr>
+    </w:tblStylePr>
+    <w:tblStylePr w:type="lastRow">
+      <w:rPr>
+        <w:b/>
+        <w:bCs/>
+      </w:rPr>
+      <w:tblPr/>
+      <w:tcPr>
+        <w:tcBorders>
+          <w:top w:val="double" w:sz="2" w:space="0" w:color="666666" w:themeColor="text1" w:themeTint="99"/>
+        </w:tcBorders>
+      </w:tcPr>
+    </w:tblStylePr>
+    <w:tblStylePr w:type="firstCol">
+      <w:rPr>
+        <w:b/>
+        <w:bCs/>
+      </w:rPr>
+    </w:tblStylePr>
+    <w:tblStylePr w:type="lastCol">
+      <w:rPr>
+        <w:b/>
+        <w:bCs/>
+      </w:rPr>
+    </w:tblStylePr>
+  </w:style>
+  <w:style w:type="table" w:styleId="GridTable1Light-Accent6">
+    <w:name w:val="Grid Table 1 Light Accent 6"/>
+    <w:basedOn w:val="TableNormal"/>
+    <w:uiPriority w:val="46"/>
+    <w:rsid w:val="005A1276"/>
+    <w:pPr>
+      <w:spacing w:line="240" w:lineRule="auto"/>
+    </w:pPr>
+    <w:tblPr>
+      <w:tblStyleRowBandSize w:val="1"/>
+      <w:tblStyleColBandSize w:val="1"/>
+      <w:tblBorders>
+        <w:top w:val="single" w:sz="4" w:space="0" w:color="FBD4B4" w:themeColor="accent6" w:themeTint="66"/>
+        <w:left w:val="single" w:sz="4" w:space="0" w:color="FBD4B4" w:themeColor="accent6" w:themeTint="66"/>
+        <w:bottom w:val="single" w:sz="4" w:space="0" w:color="FBD4B4" w:themeColor="accent6" w:themeTint="66"/>
+        <w:right w:val="single" w:sz="4" w:space="0" w:color="FBD4B4" w:themeColor="accent6" w:themeTint="66"/>
+        <w:insideH w:val="single" w:sz="4" w:space="0" w:color="FBD4B4" w:themeColor="accent6" w:themeTint="66"/>
+        <w:insideV w:val="single" w:sz="4" w:space="0" w:color="FBD4B4" w:themeColor="accent6" w:themeTint="66"/>
+      </w:tblBorders>
+    </w:tblPr>
+    <w:tblStylePr w:type="firstRow">
+      <w:rPr>
+        <w:b/>
+        <w:bCs/>
+      </w:rPr>
+      <w:tblPr/>
+      <w:tcPr>
+        <w:tcBorders>
+          <w:bottom w:val="single" w:sz="12" w:space="0" w:color="FABF8F" w:themeColor="accent6" w:themeTint="99"/>
+        </w:tcBorders>
+      </w:tcPr>
+    </w:tblStylePr>
+    <w:tblStylePr w:type="lastRow">
+      <w:rPr>
+        <w:b/>
+        <w:bCs/>
+      </w:rPr>
+      <w:tblPr/>
+      <w:tcPr>
+        <w:tcBorders>
+          <w:top w:val="double" w:sz="2" w:space="0" w:color="FABF8F" w:themeColor="accent6" w:themeTint="99"/>
+        </w:tcBorders>
+      </w:tcPr>
+    </w:tblStylePr>
+    <w:tblStylePr w:type="firstCol">
+      <w:rPr>
+        <w:b/>
+        <w:bCs/>
+      </w:rPr>
+    </w:tblStylePr>
+    <w:tblStylePr w:type="lastCol">
+      <w:rPr>
+        <w:b/>
+        <w:bCs/>
+      </w:rPr>
+    </w:tblStylePr>
+  </w:style>
 </w:styles>
 </file>
 

</xml_diff>

<commit_message>
chore: added tables with preconditions and postconditions in chapter 3
</commit_message>
<xml_diff>
--- a/thesis/Дипломски рад.docx
+++ b/thesis/Дипломски рад.docx
@@ -6319,7 +6319,7 @@
             </w:rPr>
             <w:fldChar w:fldCharType="separate"/>
           </w:r>
-          <w:hyperlink w:anchor="_Toc212028715" w:history="1">
+          <w:hyperlink w:anchor="_Toc212376477" w:history="1">
             <w:r>
               <w:rPr>
                 <w:rStyle w:val="Hyperlink"/>
@@ -6347,7 +6347,7 @@
                 <w:noProof/>
                 <w:webHidden/>
               </w:rPr>
-              <w:instrText xml:space="preserve"> PAGEREF _Toc212028715 \h </w:instrText>
+              <w:instrText xml:space="preserve"> PAGEREF _Toc212376477 \h </w:instrText>
             </w:r>
             <w:r>
               <w:rPr>
@@ -6389,7 +6389,7 @@
               <w14:ligatures w14:val="standardContextual"/>
             </w:rPr>
           </w:pPr>
-          <w:hyperlink w:anchor="_Toc212028716" w:history="1">
+          <w:hyperlink w:anchor="_Toc212376478" w:history="1">
             <w:r>
               <w:rPr>
                 <w:rStyle w:val="Hyperlink"/>
@@ -6424,7 +6424,7 @@
                 <w:noProof/>
                 <w:webHidden/>
               </w:rPr>
-              <w:instrText xml:space="preserve"> PAGEREF _Toc212028716 \h </w:instrText>
+              <w:instrText xml:space="preserve"> PAGEREF _Toc212376478 \h </w:instrText>
             </w:r>
             <w:r>
               <w:rPr>
@@ -6469,7 +6469,7 @@
               <w14:ligatures w14:val="standardContextual"/>
             </w:rPr>
           </w:pPr>
-          <w:hyperlink w:anchor="_Toc212028717" w:history="1">
+          <w:hyperlink w:anchor="_Toc212376479" w:history="1">
             <w:r>
               <w:rPr>
                 <w:rStyle w:val="Hyperlink"/>
@@ -6519,7 +6519,7 @@
                 <w:noProof/>
                 <w:webHidden/>
               </w:rPr>
-              <w:instrText xml:space="preserve"> PAGEREF _Toc212028717 \h </w:instrText>
+              <w:instrText xml:space="preserve"> PAGEREF _Toc212376479 \h </w:instrText>
             </w:r>
             <w:r>
               <w:rPr>
@@ -6564,7 +6564,7 @@
               <w14:ligatures w14:val="standardContextual"/>
             </w:rPr>
           </w:pPr>
-          <w:hyperlink w:anchor="_Toc212028718" w:history="1">
+          <w:hyperlink w:anchor="_Toc212376480" w:history="1">
             <w:r>
               <w:rPr>
                 <w:rStyle w:val="Hyperlink"/>
@@ -6614,7 +6614,7 @@
                 <w:noProof/>
                 <w:webHidden/>
               </w:rPr>
-              <w:instrText xml:space="preserve"> PAGEREF _Toc212028718 \h </w:instrText>
+              <w:instrText xml:space="preserve"> PAGEREF _Toc212376480 \h </w:instrText>
             </w:r>
             <w:r>
               <w:rPr>
@@ -6659,7 +6659,7 @@
               <w14:ligatures w14:val="standardContextual"/>
             </w:rPr>
           </w:pPr>
-          <w:hyperlink w:anchor="_Toc212028719" w:history="1">
+          <w:hyperlink w:anchor="_Toc212376481" w:history="1">
             <w:r>
               <w:rPr>
                 <w:rStyle w:val="Hyperlink"/>
@@ -6717,7 +6717,7 @@
                 <w:noProof/>
                 <w:webHidden/>
               </w:rPr>
-              <w:instrText xml:space="preserve"> PAGEREF _Toc212028719 \h </w:instrText>
+              <w:instrText xml:space="preserve"> PAGEREF _Toc212376481 \h </w:instrText>
             </w:r>
             <w:r>
               <w:rPr>
@@ -6762,7 +6762,7 @@
               <w14:ligatures w14:val="standardContextual"/>
             </w:rPr>
           </w:pPr>
-          <w:hyperlink w:anchor="_Toc212028720" w:history="1">
+          <w:hyperlink w:anchor="_Toc212376482" w:history="1">
             <w:r>
               <w:rPr>
                 <w:rStyle w:val="Hyperlink"/>
@@ -6812,7 +6812,7 @@
                 <w:noProof/>
                 <w:webHidden/>
               </w:rPr>
-              <w:instrText xml:space="preserve"> PAGEREF _Toc212028720 \h </w:instrText>
+              <w:instrText xml:space="preserve"> PAGEREF _Toc212376482 \h </w:instrText>
             </w:r>
             <w:r>
               <w:rPr>
@@ -6857,7 +6857,7 @@
               <w14:ligatures w14:val="standardContextual"/>
             </w:rPr>
           </w:pPr>
-          <w:hyperlink w:anchor="_Toc212028721" w:history="1">
+          <w:hyperlink w:anchor="_Toc212376483" w:history="1">
             <w:r>
               <w:rPr>
                 <w:rStyle w:val="Hyperlink"/>
@@ -6907,7 +6907,7 @@
                 <w:noProof/>
                 <w:webHidden/>
               </w:rPr>
-              <w:instrText xml:space="preserve"> PAGEREF _Toc212028721 \h </w:instrText>
+              <w:instrText xml:space="preserve"> PAGEREF _Toc212376483 \h </w:instrText>
             </w:r>
             <w:r>
               <w:rPr>
@@ -6952,7 +6952,7 @@
               <w14:ligatures w14:val="standardContextual"/>
             </w:rPr>
           </w:pPr>
-          <w:hyperlink w:anchor="_Toc212028722" w:history="1">
+          <w:hyperlink w:anchor="_Toc212376484" w:history="1">
             <w:r>
               <w:rPr>
                 <w:rStyle w:val="Hyperlink"/>
@@ -7010,7 +7010,7 @@
                 <w:noProof/>
                 <w:webHidden/>
               </w:rPr>
-              <w:instrText xml:space="preserve"> PAGEREF _Toc212028722 \h </w:instrText>
+              <w:instrText xml:space="preserve"> PAGEREF _Toc212376484 \h </w:instrText>
             </w:r>
             <w:r>
               <w:rPr>
@@ -7055,7 +7055,7 @@
               <w14:ligatures w14:val="standardContextual"/>
             </w:rPr>
           </w:pPr>
-          <w:hyperlink w:anchor="_Toc212028723" w:history="1">
+          <w:hyperlink w:anchor="_Toc212376485" w:history="1">
             <w:r>
               <w:rPr>
                 <w:rStyle w:val="Hyperlink"/>
@@ -7121,7 +7121,7 @@
                 <w:noProof/>
                 <w:webHidden/>
               </w:rPr>
-              <w:instrText xml:space="preserve"> PAGEREF _Toc212028723 \h </w:instrText>
+              <w:instrText xml:space="preserve"> PAGEREF _Toc212376485 \h </w:instrText>
             </w:r>
             <w:r>
               <w:rPr>
@@ -7166,7 +7166,7 @@
               <w14:ligatures w14:val="standardContextual"/>
             </w:rPr>
           </w:pPr>
-          <w:hyperlink w:anchor="_Toc212028724" w:history="1">
+          <w:hyperlink w:anchor="_Toc212376486" w:history="1">
             <w:r>
               <w:rPr>
                 <w:rStyle w:val="Hyperlink"/>
@@ -7232,7 +7232,7 @@
                 <w:noProof/>
                 <w:webHidden/>
               </w:rPr>
-              <w:instrText xml:space="preserve"> PAGEREF _Toc212028724 \h </w:instrText>
+              <w:instrText xml:space="preserve"> PAGEREF _Toc212376486 \h </w:instrText>
             </w:r>
             <w:r>
               <w:rPr>
@@ -7274,7 +7274,7 @@
               <w14:ligatures w14:val="standardContextual"/>
             </w:rPr>
           </w:pPr>
-          <w:hyperlink w:anchor="_Toc212028725" w:history="1">
+          <w:hyperlink w:anchor="_Toc212376487" w:history="1">
             <w:r>
               <w:rPr>
                 <w:rStyle w:val="Hyperlink"/>
@@ -7302,7 +7302,7 @@
                 <w:noProof/>
                 <w:webHidden/>
               </w:rPr>
-              <w:instrText xml:space="preserve"> PAGEREF _Toc212028725 \h </w:instrText>
+              <w:instrText xml:space="preserve"> PAGEREF _Toc212376487 \h </w:instrText>
             </w:r>
             <w:r>
               <w:rPr>
@@ -7347,7 +7347,7 @@
               <w14:ligatures w14:val="standardContextual"/>
             </w:rPr>
           </w:pPr>
-          <w:hyperlink w:anchor="_Toc212028726" w:history="1">
+          <w:hyperlink w:anchor="_Toc212376488" w:history="1">
             <w:r>
               <w:rPr>
                 <w:rStyle w:val="Hyperlink"/>
@@ -7390,7 +7390,7 @@
                 <w:noProof/>
                 <w:webHidden/>
               </w:rPr>
-              <w:instrText xml:space="preserve"> PAGEREF _Toc212028726 \h </w:instrText>
+              <w:instrText xml:space="preserve"> PAGEREF _Toc212376488 \h </w:instrText>
             </w:r>
             <w:r>
               <w:rPr>
@@ -7435,7 +7435,7 @@
               <w14:ligatures w14:val="standardContextual"/>
             </w:rPr>
           </w:pPr>
-          <w:hyperlink w:anchor="_Toc212028727" w:history="1">
+          <w:hyperlink w:anchor="_Toc212376489" w:history="1">
             <w:r>
               <w:rPr>
                 <w:rStyle w:val="Hyperlink"/>
@@ -7471,7 +7471,7 @@
                 <w:noProof/>
                 <w:webHidden/>
               </w:rPr>
-              <w:instrText xml:space="preserve"> PAGEREF _Toc212028727 \h </w:instrText>
+              <w:instrText xml:space="preserve"> PAGEREF _Toc212376489 \h </w:instrText>
             </w:r>
             <w:r>
               <w:rPr>
@@ -7491,7 +7491,7 @@
                 <w:noProof/>
                 <w:webHidden/>
               </w:rPr>
-              <w:t>19</w:t>
+              <w:t>20</w:t>
             </w:r>
             <w:r>
               <w:rPr>
@@ -7513,7 +7513,7 @@
               <w14:ligatures w14:val="standardContextual"/>
             </w:rPr>
           </w:pPr>
-          <w:hyperlink w:anchor="_Toc212028728" w:history="1">
+          <w:hyperlink w:anchor="_Toc212376490" w:history="1">
             <w:r>
               <w:rPr>
                 <w:rStyle w:val="Hyperlink"/>
@@ -7541,7 +7541,7 @@
                 <w:noProof/>
                 <w:webHidden/>
               </w:rPr>
-              <w:instrText xml:space="preserve"> PAGEREF _Toc212028728 \h </w:instrText>
+              <w:instrText xml:space="preserve"> PAGEREF _Toc212376490 \h </w:instrText>
             </w:r>
             <w:r>
               <w:rPr>
@@ -7561,7 +7561,7 @@
                 <w:noProof/>
                 <w:webHidden/>
               </w:rPr>
-              <w:t>21</w:t>
+              <w:t>22</w:t>
             </w:r>
             <w:r>
               <w:rPr>
@@ -7586,7 +7586,7 @@
               <w14:ligatures w14:val="standardContextual"/>
             </w:rPr>
           </w:pPr>
-          <w:hyperlink w:anchor="_Toc212028729" w:history="1">
+          <w:hyperlink w:anchor="_Toc212376491" w:history="1">
             <w:r>
               <w:rPr>
                 <w:rStyle w:val="Hyperlink"/>
@@ -7629,7 +7629,7 @@
                 <w:noProof/>
                 <w:webHidden/>
               </w:rPr>
-              <w:instrText xml:space="preserve"> PAGEREF _Toc212028729 \h </w:instrText>
+              <w:instrText xml:space="preserve"> PAGEREF _Toc212376491 \h </w:instrText>
             </w:r>
             <w:r>
               <w:rPr>
@@ -7649,7 +7649,7 @@
                 <w:noProof/>
                 <w:webHidden/>
               </w:rPr>
-              <w:t>21</w:t>
+              <w:t>22</w:t>
             </w:r>
             <w:r>
               <w:rPr>
@@ -7674,7 +7674,7 @@
               <w14:ligatures w14:val="standardContextual"/>
             </w:rPr>
           </w:pPr>
-          <w:hyperlink w:anchor="_Toc212028730" w:history="1">
+          <w:hyperlink w:anchor="_Toc212376492" w:history="1">
             <w:r>
               <w:rPr>
                 <w:rStyle w:val="Hyperlink"/>
@@ -7732,7 +7732,7 @@
                 <w:noProof/>
                 <w:webHidden/>
               </w:rPr>
-              <w:instrText xml:space="preserve"> PAGEREF _Toc212028730 \h </w:instrText>
+              <w:instrText xml:space="preserve"> PAGEREF _Toc212376492 \h </w:instrText>
             </w:r>
             <w:r>
               <w:rPr>
@@ -7752,7 +7752,7 @@
                 <w:noProof/>
                 <w:webHidden/>
               </w:rPr>
-              <w:t>22</w:t>
+              <w:t>23</w:t>
             </w:r>
             <w:r>
               <w:rPr>
@@ -7777,7 +7777,7 @@
               <w14:ligatures w14:val="standardContextual"/>
             </w:rPr>
           </w:pPr>
-          <w:hyperlink w:anchor="_Toc212028731" w:history="1">
+          <w:hyperlink w:anchor="_Toc212376493" w:history="1">
             <w:r>
               <w:rPr>
                 <w:rStyle w:val="Hyperlink"/>
@@ -7830,7 +7830,7 @@
                 <w:noProof/>
                 <w:lang w:val="sr-Cyrl-RS"/>
               </w:rPr>
-              <w:t>базираног на садржају</w:t>
+              <w:t>базиран на садржају</w:t>
             </w:r>
             <w:r>
               <w:rPr>
@@ -7851,7 +7851,7 @@
                 <w:noProof/>
                 <w:webHidden/>
               </w:rPr>
-              <w:instrText xml:space="preserve"> PAGEREF _Toc212028731 \h </w:instrText>
+              <w:instrText xml:space="preserve"> PAGEREF _Toc212376493 \h </w:instrText>
             </w:r>
             <w:r>
               <w:rPr>
@@ -7871,7 +7871,7 @@
                 <w:noProof/>
                 <w:webHidden/>
               </w:rPr>
-              <w:t>25</w:t>
+              <w:t>26</w:t>
             </w:r>
             <w:r>
               <w:rPr>
@@ -7893,7 +7893,7 @@
               <w14:ligatures w14:val="standardContextual"/>
             </w:rPr>
           </w:pPr>
-          <w:hyperlink w:anchor="_Toc212028732" w:history="1">
+          <w:hyperlink w:anchor="_Toc212376494" w:history="1">
             <w:r>
               <w:rPr>
                 <w:rStyle w:val="Hyperlink"/>
@@ -7928,7 +7928,7 @@
                 <w:noProof/>
                 <w:webHidden/>
               </w:rPr>
-              <w:instrText xml:space="preserve"> PAGEREF _Toc212028732 \h </w:instrText>
+              <w:instrText xml:space="preserve"> PAGEREF _Toc212376494 \h </w:instrText>
             </w:r>
             <w:r>
               <w:rPr>
@@ -7948,7 +7948,7 @@
                 <w:noProof/>
                 <w:webHidden/>
               </w:rPr>
-              <w:t>27</w:t>
+              <w:t>28</w:t>
             </w:r>
             <w:r>
               <w:rPr>
@@ -7973,41 +7973,49 @@
               <w14:ligatures w14:val="standardContextual"/>
             </w:rPr>
           </w:pPr>
-          <w:hyperlink w:anchor="_Toc212028733" w:history="1">
+          <w:hyperlink w:anchor="_Toc212376495" w:history="1">
             <w:r>
               <w:rPr>
                 <w:rStyle w:val="Hyperlink"/>
                 <w:noProof/>
-                <w:lang w:val="sr-Cyrl-RS"/>
-              </w:rPr>
-              <w:t>5</w:t>
+                <w:lang w:val="en-US"/>
+              </w:rPr>
+              <w:t>C</w:t>
             </w:r>
             <w:r>
               <w:rPr>
                 <w:rStyle w:val="Hyperlink"/>
                 <w:noProof/>
-              </w:rPr>
-              <w:t>.</w:t>
+                <w:lang w:val="sr-Cyrl-RS"/>
+              </w:rPr>
+              <w:t>5</w:t>
             </w:r>
             <w:r>
               <w:rPr>
                 <w:rStyle w:val="Hyperlink"/>
                 <w:noProof/>
-                <w:lang w:val="sr-Cyrl-RS"/>
-              </w:rPr>
-              <w:t>1</w:t>
+              </w:rPr>
+              <w:t>.</w:t>
             </w:r>
             <w:r>
               <w:rPr>
                 <w:rStyle w:val="Hyperlink"/>
                 <w:noProof/>
-              </w:rPr>
-              <w:t xml:space="preserve"> </w:t>
+                <w:lang w:val="sr-Cyrl-RS"/>
+              </w:rPr>
+              <w:t>1</w:t>
             </w:r>
             <w:r>
               <w:rPr>
                 <w:rStyle w:val="Hyperlink"/>
                 <w:noProof/>
+              </w:rPr>
+              <w:t xml:space="preserve"> </w:t>
+            </w:r>
+            <w:r>
+              <w:rPr>
+                <w:rStyle w:val="Hyperlink"/>
+                <w:noProof/>
                 <w:lang w:val="sr-Cyrl-RS"/>
               </w:rPr>
               <w:t>Верификација колаборативног филтрирања</w:t>
@@ -8031,7 +8039,7 @@
                 <w:noProof/>
                 <w:webHidden/>
               </w:rPr>
-              <w:instrText xml:space="preserve"> PAGEREF _Toc212028733 \h </w:instrText>
+              <w:instrText xml:space="preserve"> PAGEREF _Toc212376495 \h </w:instrText>
             </w:r>
             <w:r>
               <w:rPr>
@@ -8051,7 +8059,7 @@
                 <w:noProof/>
                 <w:webHidden/>
               </w:rPr>
-              <w:t>27</w:t>
+              <w:t>28</w:t>
             </w:r>
             <w:r>
               <w:rPr>
@@ -8076,7 +8084,7 @@
               <w14:ligatures w14:val="standardContextual"/>
             </w:rPr>
           </w:pPr>
-          <w:hyperlink w:anchor="_Toc212028734" w:history="1">
+          <w:hyperlink w:anchor="_Toc212376496" w:history="1">
             <w:r>
               <w:rPr>
                 <w:rStyle w:val="Hyperlink"/>
@@ -8134,7 +8142,7 @@
                 <w:noProof/>
                 <w:webHidden/>
               </w:rPr>
-              <w:instrText xml:space="preserve"> PAGEREF _Toc212028734 \h </w:instrText>
+              <w:instrText xml:space="preserve"> PAGEREF _Toc212376496 \h </w:instrText>
             </w:r>
             <w:r>
               <w:rPr>
@@ -8154,7 +8162,7 @@
                 <w:noProof/>
                 <w:webHidden/>
               </w:rPr>
-              <w:t>33</w:t>
+              <w:t>34</w:t>
             </w:r>
             <w:r>
               <w:rPr>
@@ -8176,7 +8184,7 @@
               <w14:ligatures w14:val="standardContextual"/>
             </w:rPr>
           </w:pPr>
-          <w:hyperlink w:anchor="_Toc212028735" w:history="1">
+          <w:hyperlink w:anchor="_Toc212376497" w:history="1">
             <w:r>
               <w:rPr>
                 <w:rStyle w:val="Hyperlink"/>
@@ -8204,7 +8212,7 @@
                 <w:noProof/>
                 <w:webHidden/>
               </w:rPr>
-              <w:instrText xml:space="preserve"> PAGEREF _Toc212028735 \h </w:instrText>
+              <w:instrText xml:space="preserve"> PAGEREF _Toc212376497 \h </w:instrText>
             </w:r>
             <w:r>
               <w:rPr>
@@ -8224,7 +8232,7 @@
                 <w:noProof/>
                 <w:webHidden/>
               </w:rPr>
-              <w:t>39</w:t>
+              <w:t>40</w:t>
             </w:r>
             <w:r>
               <w:rPr>
@@ -8246,7 +8254,7 @@
               <w14:ligatures w14:val="standardContextual"/>
             </w:rPr>
           </w:pPr>
-          <w:hyperlink w:anchor="_Toc212028736" w:history="1">
+          <w:hyperlink w:anchor="_Toc212376498" w:history="1">
             <w:r>
               <w:rPr>
                 <w:rStyle w:val="Hyperlink"/>
@@ -8274,7 +8282,7 @@
                 <w:noProof/>
                 <w:webHidden/>
               </w:rPr>
-              <w:instrText xml:space="preserve"> PAGEREF _Toc212028736 \h </w:instrText>
+              <w:instrText xml:space="preserve"> PAGEREF _Toc212376498 \h </w:instrText>
             </w:r>
             <w:r>
               <w:rPr>
@@ -8294,7 +8302,7 @@
                 <w:noProof/>
                 <w:webHidden/>
               </w:rPr>
-              <w:t>41</w:t>
+              <w:t>42</w:t>
             </w:r>
             <w:r>
               <w:rPr>
@@ -8360,7 +8368,7 @@
           <w:lang w:val="sr-Cyrl-RS"/>
         </w:rPr>
       </w:pPr>
-      <w:bookmarkStart w:id="1" w:name="_Toc212028715"/>
+      <w:bookmarkStart w:id="1" w:name="_Toc212376477"/>
       <w:r>
         <w:rPr>
           <w:lang w:val="sr-Cyrl-RS"/>
@@ -8511,7 +8519,7 @@
           <w:lang w:val="en-US"/>
         </w:rPr>
       </w:pPr>
-      <w:bookmarkStart w:id="2" w:name="_Toc212028716"/>
+      <w:bookmarkStart w:id="2" w:name="_Toc212376478"/>
       <w:r>
         <w:lastRenderedPageBreak/>
         <w:t xml:space="preserve">2. </w:t>
@@ -12462,7 +12470,7 @@
           <w:lang w:val="sr-Cyrl-RS"/>
         </w:rPr>
       </w:pPr>
-      <w:bookmarkStart w:id="3" w:name="_Toc212028717"/>
+      <w:bookmarkStart w:id="3" w:name="_Toc212376479"/>
       <w:r>
         <w:lastRenderedPageBreak/>
         <w:t>2.</w:t>
@@ -12571,25 +12579,7 @@
           <w:i/>
           <w:lang w:val="sr-Cyrl-RS"/>
         </w:rPr>
-        <w:t xml:space="preserve">, </w:t>
-      </w:r>
-      <w:proofErr w:type="spellStart"/>
-      <w:r>
-        <w:rPr>
-          <w:rFonts w:cs="Times New Roman"/>
-          <w:i/>
-          <w:lang w:val="sr-Cyrl-RS"/>
-        </w:rPr>
-        <w:t>et</w:t>
-      </w:r>
-      <w:proofErr w:type="spellEnd"/>
-      <w:r>
-        <w:rPr>
-          <w:rFonts w:cs="Times New Roman"/>
-          <w:i/>
-          <w:lang w:val="sr-Cyrl-RS"/>
-        </w:rPr>
-        <w:t xml:space="preserve"> </w:t>
+        <w:t xml:space="preserve">, et </w:t>
       </w:r>
       <w:proofErr w:type="spellStart"/>
       <w:r>
@@ -14662,25 +14652,7 @@
           <w:i/>
           <w:lang w:val="sr-Cyrl-RS"/>
         </w:rPr>
-        <w:t xml:space="preserve">, </w:t>
-      </w:r>
-      <w:proofErr w:type="spellStart"/>
-      <w:r>
-        <w:rPr>
-          <w:rFonts w:cs="Times New Roman"/>
-          <w:i/>
-          <w:lang w:val="sr-Cyrl-RS"/>
-        </w:rPr>
-        <w:t>et</w:t>
-      </w:r>
-      <w:proofErr w:type="spellEnd"/>
-      <w:r>
-        <w:rPr>
-          <w:rFonts w:cs="Times New Roman"/>
-          <w:i/>
-          <w:lang w:val="sr-Cyrl-RS"/>
-        </w:rPr>
-        <w:t xml:space="preserve"> </w:t>
+        <w:t xml:space="preserve">, et </w:t>
       </w:r>
       <w:proofErr w:type="spellStart"/>
       <w:r>
@@ -14820,7 +14792,7 @@
           <w:lang w:val="sr-Cyrl-RS"/>
         </w:rPr>
       </w:pPr>
-      <w:bookmarkStart w:id="5" w:name="_Toc212028718"/>
+      <w:bookmarkStart w:id="5" w:name="_Toc212376480"/>
       <w:r>
         <w:lastRenderedPageBreak/>
         <w:t>2.</w:t>
@@ -20207,7 +20179,7 @@
           <w:lang w:val="sr-Cyrl-RS"/>
         </w:rPr>
       </w:pPr>
-      <w:bookmarkStart w:id="6" w:name="_Toc212028719"/>
+      <w:bookmarkStart w:id="6" w:name="_Toc212376481"/>
       <w:r>
         <w:t>2.</w:t>
       </w:r>
@@ -20790,7 +20762,7 @@
           <w:lang w:val="sr-Cyrl-RS"/>
         </w:rPr>
       </w:pPr>
-      <w:bookmarkStart w:id="7" w:name="_Toc212028720"/>
+      <w:bookmarkStart w:id="7" w:name="_Toc212376482"/>
       <w:r>
         <w:lastRenderedPageBreak/>
         <w:t>2.</w:t>
@@ -21154,7 +21126,7 @@
           <w:lang w:val="sr-Cyrl-RS"/>
         </w:rPr>
       </w:pPr>
-      <w:bookmarkStart w:id="8" w:name="_Toc212028721"/>
+      <w:bookmarkStart w:id="8" w:name="_Toc212376483"/>
       <w:r>
         <w:t>2.</w:t>
       </w:r>
@@ -21538,7 +21510,7 @@
           <w:lang w:val="en-US"/>
         </w:rPr>
       </w:pPr>
-      <w:bookmarkStart w:id="9" w:name="_Toc212028722"/>
+      <w:bookmarkStart w:id="9" w:name="_Toc212376484"/>
       <w:r>
         <w:lastRenderedPageBreak/>
         <w:t>2.</w:t>
@@ -22110,7 +22082,7 @@
           <w:lang w:val="sr-Latn-RS"/>
         </w:rPr>
       </w:pPr>
-      <w:bookmarkStart w:id="10" w:name="_Toc212028723"/>
+      <w:bookmarkStart w:id="10" w:name="_Toc212376485"/>
       <w:r>
         <w:lastRenderedPageBreak/>
         <w:t>2.</w:t>
@@ -23873,7 +23845,7 @@
           <w:lang w:val="sr-Cyrl-RS"/>
         </w:rPr>
       </w:pPr>
-      <w:bookmarkStart w:id="12" w:name="_Toc212028724"/>
+      <w:bookmarkStart w:id="12" w:name="_Toc212376486"/>
       <w:r>
         <w:lastRenderedPageBreak/>
         <w:t>2.</w:t>
@@ -26485,7 +26457,7 @@
           <w:lang w:val="en-US"/>
         </w:rPr>
         <w:drawing>
-          <wp:inline distT="0" distB="0" distL="0" distR="0" wp14:anchorId="5D2B5430" wp14:editId="520450ED">
+          <wp:inline distT="0" distB="0" distL="0" distR="0" wp14:anchorId="5D2B5430" wp14:editId="2BF45F00">
             <wp:extent cx="5274945" cy="3318510"/>
             <wp:effectExtent l="0" t="0" r="1905" b="0"/>
             <wp:docPr id="23" name="Picture 23"/>
@@ -27071,7 +27043,7 @@
           <w:lang w:val="en-US"/>
         </w:rPr>
       </w:pPr>
-      <w:bookmarkStart w:id="14" w:name="_Toc212028725"/>
+      <w:bookmarkStart w:id="14" w:name="_Toc212376487"/>
       <w:r>
         <w:rPr>
           <w:lang w:val="sr-Cyrl-RS"/>
@@ -27259,7 +27231,7 @@
           <w:lang w:val="sr-Cyrl-RS"/>
         </w:rPr>
       </w:pPr>
-      <w:bookmarkStart w:id="15" w:name="_Toc212028726"/>
+      <w:bookmarkStart w:id="15" w:name="_Toc212376488"/>
       <w:r>
         <w:rPr>
           <w:lang w:val="en-US"/>
@@ -27508,7 +27480,6 @@
     </w:p>
     <w:p>
       <w:pPr>
-        <w:jc w:val="both"/>
         <w:rPr>
           <w:lang w:val="en-US"/>
         </w:rPr>
@@ -27516,6 +27487,1509 @@
     </w:p>
     <w:p>
       <w:pPr>
+        <w:jc w:val="both"/>
+        <w:rPr>
+          <w:lang w:val="sr-Cyrl-RS"/>
+        </w:rPr>
+      </w:pPr>
+      <w:r>
+        <w:rPr>
+          <w:lang w:val="sr-Cyrl-RS"/>
+        </w:rPr>
+        <w:t>Како би систем правилно функционисао, у табели 3.1 је дат списак свих предуслова и пост-услова за сваки од случајева коришћења.</w:t>
+      </w:r>
+    </w:p>
+    <w:p>
+      <w:pPr>
+        <w:jc w:val="both"/>
+        <w:rPr>
+          <w:lang w:val="sr-Cyrl-RS"/>
+        </w:rPr>
+      </w:pPr>
+    </w:p>
+    <w:p>
+      <w:pPr>
+        <w:pStyle w:val="Caption"/>
+        <w:keepNext/>
+        <w:rPr>
+          <w:b/>
+          <w:color w:val="000000" w:themeColor="text1"/>
+          <w:sz w:val="22"/>
+          <w:szCs w:val="22"/>
+        </w:rPr>
+      </w:pPr>
+      <w:r>
+        <w:rPr>
+          <w:b/>
+          <w:i w:val="0"/>
+          <w:color w:val="000000" w:themeColor="text1"/>
+          <w:sz w:val="22"/>
+          <w:szCs w:val="22"/>
+          <w:lang w:val="sr-Cyrl-RS"/>
+        </w:rPr>
+        <w:t xml:space="preserve">Табела </w:t>
+      </w:r>
+      <w:r>
+        <w:rPr>
+          <w:b/>
+          <w:i w:val="0"/>
+          <w:color w:val="000000" w:themeColor="text1"/>
+          <w:sz w:val="22"/>
+          <w:szCs w:val="22"/>
+          <w:lang w:val="sr-Cyrl-RS"/>
+        </w:rPr>
+        <w:t>3</w:t>
+      </w:r>
+      <w:r>
+        <w:rPr>
+          <w:b/>
+          <w:i w:val="0"/>
+          <w:color w:val="000000" w:themeColor="text1"/>
+          <w:sz w:val="22"/>
+          <w:szCs w:val="22"/>
+          <w:lang w:val="sr-Cyrl-RS"/>
+        </w:rPr>
+        <w:t>.</w:t>
+      </w:r>
+      <w:r>
+        <w:rPr>
+          <w:b/>
+          <w:i w:val="0"/>
+          <w:color w:val="000000" w:themeColor="text1"/>
+          <w:sz w:val="22"/>
+          <w:szCs w:val="22"/>
+          <w:lang w:val="sr-Cyrl-RS"/>
+        </w:rPr>
+        <w:t>1</w:t>
+      </w:r>
+      <w:r>
+        <w:rPr>
+          <w:b/>
+          <w:i w:val="0"/>
+          <w:color w:val="000000" w:themeColor="text1"/>
+          <w:sz w:val="22"/>
+          <w:szCs w:val="22"/>
+          <w:lang w:val="sr-Cyrl-RS"/>
+        </w:rPr>
+        <w:t xml:space="preserve">. </w:t>
+      </w:r>
+      <w:r>
+        <w:rPr>
+          <w:b/>
+          <w:i w:val="0"/>
+          <w:color w:val="000000" w:themeColor="text1"/>
+          <w:sz w:val="22"/>
+          <w:szCs w:val="22"/>
+          <w:lang w:val="sr-Cyrl-RS"/>
+        </w:rPr>
+        <w:t xml:space="preserve">Списак предуслова и пост-услова за коришћење препоручивања </w:t>
+      </w:r>
+      <w:proofErr w:type="spellStart"/>
+      <w:r>
+        <w:rPr>
+          <w:b/>
+          <w:i w:val="0"/>
+          <w:color w:val="000000" w:themeColor="text1"/>
+          <w:sz w:val="22"/>
+          <w:szCs w:val="22"/>
+          <w:lang w:val="sr-Cyrl-RS"/>
+        </w:rPr>
+        <w:t>колаборативним</w:t>
+      </w:r>
+      <w:proofErr w:type="spellEnd"/>
+      <w:r>
+        <w:rPr>
+          <w:b/>
+          <w:i w:val="0"/>
+          <w:color w:val="000000" w:themeColor="text1"/>
+          <w:sz w:val="22"/>
+          <w:szCs w:val="22"/>
+          <w:lang w:val="sr-Cyrl-RS"/>
+        </w:rPr>
+        <w:t xml:space="preserve"> филтрирањем</w:t>
+      </w:r>
+    </w:p>
+    <w:tbl>
+      <w:tblPr>
+        <w:tblW w:w="8359" w:type="dxa"/>
+        <w:tblLook w:val="04A0" w:firstRow="1" w:lastRow="0" w:firstColumn="1" w:lastColumn="0" w:noHBand="0" w:noVBand="1"/>
+      </w:tblPr>
+      <w:tblGrid>
+        <w:gridCol w:w="1940"/>
+        <w:gridCol w:w="3040"/>
+        <w:gridCol w:w="3379"/>
+      </w:tblGrid>
+      <w:tr>
+        <w:trPr>
+          <w:trHeight w:val="288"/>
+        </w:trPr>
+        <w:tc>
+          <w:tcPr>
+            <w:tcW w:w="1940" w:type="dxa"/>
+            <w:tcBorders>
+              <w:top w:val="single" w:sz="4" w:space="0" w:color="auto"/>
+              <w:left w:val="single" w:sz="4" w:space="0" w:color="auto"/>
+              <w:bottom w:val="single" w:sz="4" w:space="0" w:color="auto"/>
+              <w:right w:val="single" w:sz="4" w:space="0" w:color="auto"/>
+            </w:tcBorders>
+            <w:shd w:val="clear" w:color="000000" w:fill="BFBFBF"/>
+            <w:noWrap/>
+            <w:vAlign w:val="center"/>
+            <w:hideMark/>
+          </w:tcPr>
+          <w:p>
+            <w:pPr>
+              <w:spacing w:line="240" w:lineRule="auto"/>
+              <w:rPr>
+                <w:rFonts w:eastAsia="Times New Roman" w:cs="Times New Roman"/>
+                <w:color w:val="000000"/>
+                <w:sz w:val="22"/>
+                <w:szCs w:val="22"/>
+                <w:lang w:val="sr-Latn-RS" w:eastAsia="sr-Latn-RS"/>
+              </w:rPr>
+            </w:pPr>
+            <w:proofErr w:type="spellStart"/>
+            <w:r>
+              <w:rPr>
+                <w:rFonts w:eastAsia="Times New Roman" w:cs="Times New Roman"/>
+                <w:color w:val="000000"/>
+                <w:sz w:val="22"/>
+                <w:szCs w:val="22"/>
+                <w:lang w:val="sr-Latn-RS" w:eastAsia="sr-Latn-RS"/>
+              </w:rPr>
+              <w:t>Случај</w:t>
+            </w:r>
+            <w:proofErr w:type="spellEnd"/>
+            <w:r>
+              <w:rPr>
+                <w:rFonts w:eastAsia="Times New Roman" w:cs="Times New Roman"/>
+                <w:color w:val="000000"/>
+                <w:sz w:val="22"/>
+                <w:szCs w:val="22"/>
+                <w:lang w:val="sr-Latn-RS" w:eastAsia="sr-Latn-RS"/>
+              </w:rPr>
+              <w:t xml:space="preserve"> </w:t>
+            </w:r>
+            <w:proofErr w:type="spellStart"/>
+            <w:r>
+              <w:rPr>
+                <w:rFonts w:eastAsia="Times New Roman" w:cs="Times New Roman"/>
+                <w:color w:val="000000"/>
+                <w:sz w:val="22"/>
+                <w:szCs w:val="22"/>
+                <w:lang w:val="sr-Latn-RS" w:eastAsia="sr-Latn-RS"/>
+              </w:rPr>
+              <w:t>коришћења</w:t>
+            </w:r>
+            <w:proofErr w:type="spellEnd"/>
+          </w:p>
+        </w:tc>
+        <w:tc>
+          <w:tcPr>
+            <w:tcW w:w="3040" w:type="dxa"/>
+            <w:tcBorders>
+              <w:top w:val="single" w:sz="4" w:space="0" w:color="auto"/>
+              <w:left w:val="nil"/>
+              <w:bottom w:val="single" w:sz="4" w:space="0" w:color="auto"/>
+              <w:right w:val="single" w:sz="4" w:space="0" w:color="auto"/>
+            </w:tcBorders>
+            <w:shd w:val="clear" w:color="000000" w:fill="BFBFBF"/>
+            <w:noWrap/>
+            <w:vAlign w:val="center"/>
+            <w:hideMark/>
+          </w:tcPr>
+          <w:p>
+            <w:pPr>
+              <w:spacing w:line="240" w:lineRule="auto"/>
+              <w:rPr>
+                <w:rFonts w:eastAsia="Times New Roman" w:cs="Times New Roman"/>
+                <w:color w:val="000000"/>
+                <w:sz w:val="22"/>
+                <w:szCs w:val="22"/>
+                <w:lang w:val="sr-Latn-RS" w:eastAsia="sr-Latn-RS"/>
+              </w:rPr>
+            </w:pPr>
+            <w:proofErr w:type="spellStart"/>
+            <w:r>
+              <w:rPr>
+                <w:rFonts w:eastAsia="Times New Roman" w:cs="Times New Roman"/>
+                <w:color w:val="000000"/>
+                <w:sz w:val="22"/>
+                <w:szCs w:val="22"/>
+                <w:lang w:val="sr-Latn-RS" w:eastAsia="sr-Latn-RS"/>
+              </w:rPr>
+              <w:t>Предуслов</w:t>
+            </w:r>
+            <w:proofErr w:type="spellEnd"/>
+          </w:p>
+        </w:tc>
+        <w:tc>
+          <w:tcPr>
+            <w:tcW w:w="3379" w:type="dxa"/>
+            <w:tcBorders>
+              <w:top w:val="single" w:sz="4" w:space="0" w:color="auto"/>
+              <w:left w:val="nil"/>
+              <w:bottom w:val="single" w:sz="4" w:space="0" w:color="auto"/>
+              <w:right w:val="single" w:sz="4" w:space="0" w:color="auto"/>
+            </w:tcBorders>
+            <w:shd w:val="clear" w:color="000000" w:fill="BFBFBF"/>
+            <w:noWrap/>
+            <w:vAlign w:val="center"/>
+            <w:hideMark/>
+          </w:tcPr>
+          <w:p>
+            <w:pPr>
+              <w:spacing w:line="240" w:lineRule="auto"/>
+              <w:rPr>
+                <w:rFonts w:eastAsia="Times New Roman" w:cs="Times New Roman"/>
+                <w:color w:val="000000"/>
+                <w:sz w:val="22"/>
+                <w:szCs w:val="22"/>
+                <w:lang w:val="sr-Latn-RS" w:eastAsia="sr-Latn-RS"/>
+              </w:rPr>
+            </w:pPr>
+            <w:proofErr w:type="spellStart"/>
+            <w:r>
+              <w:rPr>
+                <w:rFonts w:eastAsia="Times New Roman" w:cs="Times New Roman"/>
+                <w:color w:val="000000"/>
+                <w:sz w:val="22"/>
+                <w:szCs w:val="22"/>
+                <w:lang w:val="sr-Latn-RS" w:eastAsia="sr-Latn-RS"/>
+              </w:rPr>
+              <w:t>Пост-услов</w:t>
+            </w:r>
+            <w:proofErr w:type="spellEnd"/>
+          </w:p>
+        </w:tc>
+      </w:tr>
+      <w:tr>
+        <w:trPr>
+          <w:trHeight w:val="864"/>
+        </w:trPr>
+        <w:tc>
+          <w:tcPr>
+            <w:tcW w:w="1940" w:type="dxa"/>
+            <w:tcBorders>
+              <w:top w:val="nil"/>
+              <w:left w:val="single" w:sz="4" w:space="0" w:color="auto"/>
+              <w:bottom w:val="single" w:sz="4" w:space="0" w:color="auto"/>
+              <w:right w:val="single" w:sz="4" w:space="0" w:color="auto"/>
+            </w:tcBorders>
+            <w:shd w:val="clear" w:color="auto" w:fill="auto"/>
+            <w:noWrap/>
+            <w:vAlign w:val="center"/>
+            <w:hideMark/>
+          </w:tcPr>
+          <w:p>
+            <w:pPr>
+              <w:spacing w:line="240" w:lineRule="auto"/>
+              <w:rPr>
+                <w:rFonts w:eastAsia="Times New Roman" w:cs="Times New Roman"/>
+                <w:color w:val="000000"/>
+                <w:sz w:val="22"/>
+                <w:szCs w:val="22"/>
+                <w:lang w:val="sr-Latn-RS" w:eastAsia="sr-Latn-RS"/>
+              </w:rPr>
+            </w:pPr>
+            <w:proofErr w:type="spellStart"/>
+            <w:r>
+              <w:rPr>
+                <w:rFonts w:eastAsia="Times New Roman" w:cs="Times New Roman"/>
+                <w:color w:val="000000"/>
+                <w:sz w:val="22"/>
+                <w:szCs w:val="22"/>
+                <w:lang w:val="sr-Latn-RS" w:eastAsia="sr-Latn-RS"/>
+              </w:rPr>
+              <w:t>Одабир</w:t>
+            </w:r>
+            <w:proofErr w:type="spellEnd"/>
+            <w:r>
+              <w:rPr>
+                <w:rFonts w:eastAsia="Times New Roman" w:cs="Times New Roman"/>
+                <w:color w:val="000000"/>
+                <w:sz w:val="22"/>
+                <w:szCs w:val="22"/>
+                <w:lang w:val="sr-Latn-RS" w:eastAsia="sr-Latn-RS"/>
+              </w:rPr>
+              <w:t xml:space="preserve"> </w:t>
+            </w:r>
+            <w:proofErr w:type="spellStart"/>
+            <w:r>
+              <w:rPr>
+                <w:rFonts w:eastAsia="Times New Roman" w:cs="Times New Roman"/>
+                <w:color w:val="000000"/>
+                <w:sz w:val="22"/>
+                <w:szCs w:val="22"/>
+                <w:lang w:val="sr-Latn-RS" w:eastAsia="sr-Latn-RS"/>
+              </w:rPr>
+              <w:t>корисника</w:t>
+            </w:r>
+            <w:proofErr w:type="spellEnd"/>
+          </w:p>
+        </w:tc>
+        <w:tc>
+          <w:tcPr>
+            <w:tcW w:w="3040" w:type="dxa"/>
+            <w:tcBorders>
+              <w:top w:val="nil"/>
+              <w:left w:val="nil"/>
+              <w:bottom w:val="single" w:sz="4" w:space="0" w:color="auto"/>
+              <w:right w:val="single" w:sz="4" w:space="0" w:color="auto"/>
+            </w:tcBorders>
+            <w:shd w:val="clear" w:color="auto" w:fill="auto"/>
+            <w:vAlign w:val="center"/>
+            <w:hideMark/>
+          </w:tcPr>
+          <w:p>
+            <w:pPr>
+              <w:spacing w:line="240" w:lineRule="auto"/>
+              <w:rPr>
+                <w:rFonts w:eastAsia="Times New Roman" w:cs="Times New Roman"/>
+                <w:color w:val="000000"/>
+                <w:sz w:val="22"/>
+                <w:szCs w:val="22"/>
+                <w:lang w:val="sr-Latn-RS" w:eastAsia="sr-Latn-RS"/>
+              </w:rPr>
+            </w:pPr>
+            <w:r>
+              <w:rPr>
+                <w:rFonts w:eastAsia="Times New Roman" w:cs="Times New Roman"/>
+                <w:color w:val="000000"/>
+                <w:sz w:val="22"/>
+                <w:szCs w:val="22"/>
+                <w:lang w:val="sr-Latn-RS" w:eastAsia="sr-Latn-RS"/>
+              </w:rPr>
+              <w:t xml:space="preserve"> - </w:t>
+            </w:r>
+            <w:proofErr w:type="spellStart"/>
+            <w:r>
+              <w:rPr>
+                <w:rFonts w:eastAsia="Times New Roman" w:cs="Times New Roman"/>
+                <w:color w:val="000000"/>
+                <w:sz w:val="22"/>
+                <w:szCs w:val="22"/>
+                <w:lang w:val="sr-Latn-RS" w:eastAsia="sr-Latn-RS"/>
+              </w:rPr>
+              <w:t>Корисник</w:t>
+            </w:r>
+            <w:proofErr w:type="spellEnd"/>
+            <w:r>
+              <w:rPr>
+                <w:rFonts w:eastAsia="Times New Roman" w:cs="Times New Roman"/>
+                <w:color w:val="000000"/>
+                <w:sz w:val="22"/>
+                <w:szCs w:val="22"/>
+                <w:lang w:val="sr-Latn-RS" w:eastAsia="sr-Latn-RS"/>
+              </w:rPr>
+              <w:t xml:space="preserve"> </w:t>
+            </w:r>
+            <w:proofErr w:type="spellStart"/>
+            <w:r>
+              <w:rPr>
+                <w:rFonts w:eastAsia="Times New Roman" w:cs="Times New Roman"/>
+                <w:color w:val="000000"/>
+                <w:sz w:val="22"/>
+                <w:szCs w:val="22"/>
+                <w:lang w:val="sr-Latn-RS" w:eastAsia="sr-Latn-RS"/>
+              </w:rPr>
+              <w:t>се</w:t>
+            </w:r>
+            <w:proofErr w:type="spellEnd"/>
+            <w:r>
+              <w:rPr>
+                <w:rFonts w:eastAsia="Times New Roman" w:cs="Times New Roman"/>
+                <w:color w:val="000000"/>
+                <w:sz w:val="22"/>
+                <w:szCs w:val="22"/>
+                <w:lang w:val="sr-Latn-RS" w:eastAsia="sr-Latn-RS"/>
+              </w:rPr>
+              <w:t xml:space="preserve"> </w:t>
+            </w:r>
+            <w:proofErr w:type="spellStart"/>
+            <w:r>
+              <w:rPr>
+                <w:rFonts w:eastAsia="Times New Roman" w:cs="Times New Roman"/>
+                <w:color w:val="000000"/>
+                <w:sz w:val="22"/>
+                <w:szCs w:val="22"/>
+                <w:lang w:val="sr-Latn-RS" w:eastAsia="sr-Latn-RS"/>
+              </w:rPr>
+              <w:t>налази</w:t>
+            </w:r>
+            <w:proofErr w:type="spellEnd"/>
+            <w:r>
+              <w:rPr>
+                <w:rFonts w:eastAsia="Times New Roman" w:cs="Times New Roman"/>
+                <w:color w:val="000000"/>
+                <w:sz w:val="22"/>
+                <w:szCs w:val="22"/>
+                <w:lang w:val="sr-Latn-RS" w:eastAsia="sr-Latn-RS"/>
+              </w:rPr>
+              <w:t xml:space="preserve"> у </w:t>
+            </w:r>
+            <w:proofErr w:type="spellStart"/>
+            <w:r>
+              <w:rPr>
+                <w:rFonts w:eastAsia="Times New Roman" w:cs="Times New Roman"/>
+                <w:color w:val="000000"/>
+                <w:sz w:val="22"/>
+                <w:szCs w:val="22"/>
+                <w:lang w:val="sr-Latn-RS" w:eastAsia="sr-Latn-RS"/>
+              </w:rPr>
+              <w:t>систему</w:t>
+            </w:r>
+            <w:proofErr w:type="spellEnd"/>
+            <w:r>
+              <w:rPr>
+                <w:rFonts w:eastAsia="Times New Roman" w:cs="Times New Roman"/>
+                <w:color w:val="000000"/>
+                <w:sz w:val="22"/>
+                <w:szCs w:val="22"/>
+                <w:lang w:val="sr-Latn-RS" w:eastAsia="sr-Latn-RS"/>
+              </w:rPr>
+              <w:t xml:space="preserve"> </w:t>
+            </w:r>
+            <w:proofErr w:type="spellStart"/>
+            <w:r>
+              <w:rPr>
+                <w:rFonts w:eastAsia="Times New Roman" w:cs="Times New Roman"/>
+                <w:color w:val="000000"/>
+                <w:sz w:val="22"/>
+                <w:szCs w:val="22"/>
+                <w:lang w:val="sr-Latn-RS" w:eastAsia="sr-Latn-RS"/>
+              </w:rPr>
+              <w:t>за</w:t>
+            </w:r>
+            <w:proofErr w:type="spellEnd"/>
+            <w:r>
+              <w:rPr>
+                <w:rFonts w:eastAsia="Times New Roman" w:cs="Times New Roman"/>
+                <w:color w:val="000000"/>
+                <w:sz w:val="22"/>
+                <w:szCs w:val="22"/>
+                <w:lang w:val="sr-Latn-RS" w:eastAsia="sr-Latn-RS"/>
+              </w:rPr>
+              <w:t xml:space="preserve"> КФ</w:t>
+            </w:r>
+            <w:r>
+              <w:rPr>
+                <w:rFonts w:eastAsia="Times New Roman" w:cs="Times New Roman"/>
+                <w:color w:val="000000"/>
+                <w:sz w:val="22"/>
+                <w:szCs w:val="22"/>
+                <w:lang w:val="sr-Latn-RS" w:eastAsia="sr-Latn-RS"/>
+              </w:rPr>
+              <w:br/>
+              <w:t xml:space="preserve"> - </w:t>
+            </w:r>
+            <w:proofErr w:type="spellStart"/>
+            <w:r>
+              <w:rPr>
+                <w:rFonts w:eastAsia="Times New Roman" w:cs="Times New Roman"/>
+                <w:color w:val="000000"/>
+                <w:sz w:val="22"/>
+                <w:szCs w:val="22"/>
+                <w:lang w:val="sr-Latn-RS" w:eastAsia="sr-Latn-RS"/>
+              </w:rPr>
+              <w:t>Постоји</w:t>
+            </w:r>
+            <w:proofErr w:type="spellEnd"/>
+            <w:r>
+              <w:rPr>
+                <w:rFonts w:eastAsia="Times New Roman" w:cs="Times New Roman"/>
+                <w:color w:val="000000"/>
+                <w:sz w:val="22"/>
+                <w:szCs w:val="22"/>
+                <w:lang w:val="sr-Latn-RS" w:eastAsia="sr-Latn-RS"/>
+              </w:rPr>
+              <w:t xml:space="preserve"> </w:t>
+            </w:r>
+            <w:proofErr w:type="spellStart"/>
+            <w:r>
+              <w:rPr>
+                <w:rFonts w:eastAsia="Times New Roman" w:cs="Times New Roman"/>
+                <w:color w:val="000000"/>
+                <w:sz w:val="22"/>
+                <w:szCs w:val="22"/>
+                <w:lang w:val="sr-Latn-RS" w:eastAsia="sr-Latn-RS"/>
+              </w:rPr>
+              <w:t>корисник</w:t>
+            </w:r>
+            <w:proofErr w:type="spellEnd"/>
+            <w:r>
+              <w:rPr>
+                <w:rFonts w:eastAsia="Times New Roman" w:cs="Times New Roman"/>
+                <w:color w:val="000000"/>
+                <w:sz w:val="22"/>
+                <w:szCs w:val="22"/>
+                <w:lang w:val="sr-Latn-RS" w:eastAsia="sr-Latn-RS"/>
+              </w:rPr>
+              <w:t xml:space="preserve"> у </w:t>
+            </w:r>
+            <w:proofErr w:type="spellStart"/>
+            <w:r>
+              <w:rPr>
+                <w:rFonts w:eastAsia="Times New Roman" w:cs="Times New Roman"/>
+                <w:color w:val="000000"/>
+                <w:sz w:val="22"/>
+                <w:szCs w:val="22"/>
+                <w:lang w:val="sr-Latn-RS" w:eastAsia="sr-Latn-RS"/>
+              </w:rPr>
+              <w:t>систему</w:t>
+            </w:r>
+            <w:proofErr w:type="spellEnd"/>
+          </w:p>
+        </w:tc>
+        <w:tc>
+          <w:tcPr>
+            <w:tcW w:w="3379" w:type="dxa"/>
+            <w:tcBorders>
+              <w:top w:val="nil"/>
+              <w:left w:val="nil"/>
+              <w:bottom w:val="single" w:sz="4" w:space="0" w:color="auto"/>
+              <w:right w:val="single" w:sz="4" w:space="0" w:color="auto"/>
+            </w:tcBorders>
+            <w:shd w:val="clear" w:color="auto" w:fill="auto"/>
+            <w:noWrap/>
+            <w:vAlign w:val="center"/>
+            <w:hideMark/>
+          </w:tcPr>
+          <w:p>
+            <w:pPr>
+              <w:spacing w:line="240" w:lineRule="auto"/>
+              <w:rPr>
+                <w:rFonts w:eastAsia="Times New Roman" w:cs="Times New Roman"/>
+                <w:color w:val="000000"/>
+                <w:sz w:val="22"/>
+                <w:szCs w:val="22"/>
+                <w:lang w:val="sr-Latn-RS" w:eastAsia="sr-Latn-RS"/>
+              </w:rPr>
+            </w:pPr>
+            <w:r>
+              <w:rPr>
+                <w:rFonts w:eastAsia="Times New Roman" w:cs="Times New Roman"/>
+                <w:color w:val="000000"/>
+                <w:sz w:val="22"/>
+                <w:szCs w:val="22"/>
+                <w:lang w:val="sr-Latn-RS" w:eastAsia="sr-Latn-RS"/>
+              </w:rPr>
+              <w:t xml:space="preserve"> - </w:t>
+            </w:r>
+            <w:proofErr w:type="spellStart"/>
+            <w:r>
+              <w:rPr>
+                <w:rFonts w:eastAsia="Times New Roman" w:cs="Times New Roman"/>
+                <w:color w:val="000000"/>
+                <w:sz w:val="22"/>
+                <w:szCs w:val="22"/>
+                <w:lang w:val="sr-Latn-RS" w:eastAsia="sr-Latn-RS"/>
+              </w:rPr>
+              <w:t>Корисник</w:t>
+            </w:r>
+            <w:proofErr w:type="spellEnd"/>
+            <w:r>
+              <w:rPr>
+                <w:rFonts w:eastAsia="Times New Roman" w:cs="Times New Roman"/>
+                <w:color w:val="000000"/>
+                <w:sz w:val="22"/>
+                <w:szCs w:val="22"/>
+                <w:lang w:val="sr-Latn-RS" w:eastAsia="sr-Latn-RS"/>
+              </w:rPr>
+              <w:t xml:space="preserve"> </w:t>
+            </w:r>
+            <w:proofErr w:type="spellStart"/>
+            <w:r>
+              <w:rPr>
+                <w:rFonts w:eastAsia="Times New Roman" w:cs="Times New Roman"/>
+                <w:color w:val="000000"/>
+                <w:sz w:val="22"/>
+                <w:szCs w:val="22"/>
+                <w:lang w:val="sr-Latn-RS" w:eastAsia="sr-Latn-RS"/>
+              </w:rPr>
+              <w:t>је</w:t>
+            </w:r>
+            <w:proofErr w:type="spellEnd"/>
+            <w:r>
+              <w:rPr>
+                <w:rFonts w:eastAsia="Times New Roman" w:cs="Times New Roman"/>
+                <w:color w:val="000000"/>
+                <w:sz w:val="22"/>
+                <w:szCs w:val="22"/>
+                <w:lang w:val="sr-Latn-RS" w:eastAsia="sr-Latn-RS"/>
+              </w:rPr>
+              <w:t xml:space="preserve"> </w:t>
+            </w:r>
+            <w:proofErr w:type="spellStart"/>
+            <w:r>
+              <w:rPr>
+                <w:rFonts w:eastAsia="Times New Roman" w:cs="Times New Roman"/>
+                <w:color w:val="000000"/>
+                <w:sz w:val="22"/>
+                <w:szCs w:val="22"/>
+                <w:lang w:val="sr-Latn-RS" w:eastAsia="sr-Latn-RS"/>
+              </w:rPr>
+              <w:t>улогован</w:t>
+            </w:r>
+            <w:proofErr w:type="spellEnd"/>
+            <w:r>
+              <w:rPr>
+                <w:rFonts w:eastAsia="Times New Roman" w:cs="Times New Roman"/>
+                <w:color w:val="000000"/>
+                <w:sz w:val="22"/>
+                <w:szCs w:val="22"/>
+                <w:lang w:val="sr-Latn-RS" w:eastAsia="sr-Latn-RS"/>
+              </w:rPr>
+              <w:t xml:space="preserve"> </w:t>
+            </w:r>
+            <w:proofErr w:type="spellStart"/>
+            <w:r>
+              <w:rPr>
+                <w:rFonts w:eastAsia="Times New Roman" w:cs="Times New Roman"/>
+                <w:color w:val="000000"/>
+                <w:sz w:val="22"/>
+                <w:szCs w:val="22"/>
+                <w:lang w:val="sr-Latn-RS" w:eastAsia="sr-Latn-RS"/>
+              </w:rPr>
+              <w:t>на</w:t>
+            </w:r>
+            <w:proofErr w:type="spellEnd"/>
+            <w:r>
+              <w:rPr>
+                <w:rFonts w:eastAsia="Times New Roman" w:cs="Times New Roman"/>
+                <w:color w:val="000000"/>
+                <w:sz w:val="22"/>
+                <w:szCs w:val="22"/>
+                <w:lang w:val="sr-Latn-RS" w:eastAsia="sr-Latn-RS"/>
+              </w:rPr>
+              <w:t xml:space="preserve"> </w:t>
+            </w:r>
+            <w:proofErr w:type="spellStart"/>
+            <w:r>
+              <w:rPr>
+                <w:rFonts w:eastAsia="Times New Roman" w:cs="Times New Roman"/>
+                <w:color w:val="000000"/>
+                <w:sz w:val="22"/>
+                <w:szCs w:val="22"/>
+                <w:lang w:val="sr-Latn-RS" w:eastAsia="sr-Latn-RS"/>
+              </w:rPr>
+              <w:t>систем</w:t>
+            </w:r>
+            <w:proofErr w:type="spellEnd"/>
+          </w:p>
+        </w:tc>
+      </w:tr>
+      <w:tr>
+        <w:trPr>
+          <w:trHeight w:val="288"/>
+        </w:trPr>
+        <w:tc>
+          <w:tcPr>
+            <w:tcW w:w="1940" w:type="dxa"/>
+            <w:tcBorders>
+              <w:top w:val="nil"/>
+              <w:left w:val="single" w:sz="4" w:space="0" w:color="auto"/>
+              <w:bottom w:val="single" w:sz="4" w:space="0" w:color="auto"/>
+              <w:right w:val="single" w:sz="4" w:space="0" w:color="auto"/>
+            </w:tcBorders>
+            <w:shd w:val="clear" w:color="auto" w:fill="auto"/>
+            <w:noWrap/>
+            <w:vAlign w:val="center"/>
+            <w:hideMark/>
+          </w:tcPr>
+          <w:p>
+            <w:pPr>
+              <w:spacing w:line="240" w:lineRule="auto"/>
+              <w:rPr>
+                <w:rFonts w:eastAsia="Times New Roman" w:cs="Times New Roman"/>
+                <w:color w:val="000000"/>
+                <w:sz w:val="22"/>
+                <w:szCs w:val="22"/>
+                <w:lang w:val="sr-Latn-RS" w:eastAsia="sr-Latn-RS"/>
+              </w:rPr>
+            </w:pPr>
+            <w:proofErr w:type="spellStart"/>
+            <w:r>
+              <w:rPr>
+                <w:rFonts w:eastAsia="Times New Roman" w:cs="Times New Roman"/>
+                <w:color w:val="000000"/>
+                <w:sz w:val="22"/>
+                <w:szCs w:val="22"/>
+                <w:lang w:val="sr-Latn-RS" w:eastAsia="sr-Latn-RS"/>
+              </w:rPr>
+              <w:t>Препорука</w:t>
+            </w:r>
+            <w:proofErr w:type="spellEnd"/>
+            <w:r>
+              <w:rPr>
+                <w:rFonts w:eastAsia="Times New Roman" w:cs="Times New Roman"/>
+                <w:color w:val="000000"/>
+                <w:sz w:val="22"/>
+                <w:szCs w:val="22"/>
+                <w:lang w:val="sr-Latn-RS" w:eastAsia="sr-Latn-RS"/>
+              </w:rPr>
+              <w:t xml:space="preserve"> </w:t>
+            </w:r>
+            <w:proofErr w:type="spellStart"/>
+            <w:r>
+              <w:rPr>
+                <w:rFonts w:eastAsia="Times New Roman" w:cs="Times New Roman"/>
+                <w:color w:val="000000"/>
+                <w:sz w:val="22"/>
+                <w:szCs w:val="22"/>
+                <w:lang w:val="sr-Latn-RS" w:eastAsia="sr-Latn-RS"/>
+              </w:rPr>
+              <w:t>филмова</w:t>
+            </w:r>
+            <w:proofErr w:type="spellEnd"/>
+          </w:p>
+        </w:tc>
+        <w:tc>
+          <w:tcPr>
+            <w:tcW w:w="3040" w:type="dxa"/>
+            <w:tcBorders>
+              <w:top w:val="nil"/>
+              <w:left w:val="nil"/>
+              <w:bottom w:val="single" w:sz="4" w:space="0" w:color="auto"/>
+              <w:right w:val="single" w:sz="4" w:space="0" w:color="auto"/>
+            </w:tcBorders>
+            <w:shd w:val="clear" w:color="auto" w:fill="auto"/>
+            <w:noWrap/>
+            <w:vAlign w:val="center"/>
+            <w:hideMark/>
+          </w:tcPr>
+          <w:p>
+            <w:pPr>
+              <w:spacing w:line="240" w:lineRule="auto"/>
+              <w:rPr>
+                <w:rFonts w:eastAsia="Times New Roman" w:cs="Times New Roman"/>
+                <w:color w:val="000000"/>
+                <w:sz w:val="22"/>
+                <w:szCs w:val="22"/>
+                <w:lang w:val="sr-Latn-RS" w:eastAsia="sr-Latn-RS"/>
+              </w:rPr>
+            </w:pPr>
+            <w:r>
+              <w:rPr>
+                <w:rFonts w:eastAsia="Times New Roman" w:cs="Times New Roman"/>
+                <w:color w:val="000000"/>
+                <w:sz w:val="22"/>
+                <w:szCs w:val="22"/>
+                <w:lang w:val="sr-Latn-RS" w:eastAsia="sr-Latn-RS"/>
+              </w:rPr>
+              <w:t xml:space="preserve"> - </w:t>
+            </w:r>
+            <w:proofErr w:type="spellStart"/>
+            <w:r>
+              <w:rPr>
+                <w:rFonts w:eastAsia="Times New Roman" w:cs="Times New Roman"/>
+                <w:color w:val="000000"/>
+                <w:sz w:val="22"/>
+                <w:szCs w:val="22"/>
+                <w:lang w:val="sr-Latn-RS" w:eastAsia="sr-Latn-RS"/>
+              </w:rPr>
+              <w:t>Корисник</w:t>
+            </w:r>
+            <w:proofErr w:type="spellEnd"/>
+            <w:r>
+              <w:rPr>
+                <w:rFonts w:eastAsia="Times New Roman" w:cs="Times New Roman"/>
+                <w:color w:val="000000"/>
+                <w:sz w:val="22"/>
+                <w:szCs w:val="22"/>
+                <w:lang w:val="sr-Latn-RS" w:eastAsia="sr-Latn-RS"/>
+              </w:rPr>
+              <w:t xml:space="preserve"> </w:t>
+            </w:r>
+            <w:proofErr w:type="spellStart"/>
+            <w:r>
+              <w:rPr>
+                <w:rFonts w:eastAsia="Times New Roman" w:cs="Times New Roman"/>
+                <w:color w:val="000000"/>
+                <w:sz w:val="22"/>
+                <w:szCs w:val="22"/>
+                <w:lang w:val="sr-Latn-RS" w:eastAsia="sr-Latn-RS"/>
+              </w:rPr>
+              <w:t>је</w:t>
+            </w:r>
+            <w:proofErr w:type="spellEnd"/>
+            <w:r>
+              <w:rPr>
+                <w:rFonts w:eastAsia="Times New Roman" w:cs="Times New Roman"/>
+                <w:color w:val="000000"/>
+                <w:sz w:val="22"/>
+                <w:szCs w:val="22"/>
+                <w:lang w:val="sr-Latn-RS" w:eastAsia="sr-Latn-RS"/>
+              </w:rPr>
+              <w:t xml:space="preserve"> </w:t>
+            </w:r>
+            <w:proofErr w:type="spellStart"/>
+            <w:r>
+              <w:rPr>
+                <w:rFonts w:eastAsia="Times New Roman" w:cs="Times New Roman"/>
+                <w:color w:val="000000"/>
+                <w:sz w:val="22"/>
+                <w:szCs w:val="22"/>
+                <w:lang w:val="sr-Latn-RS" w:eastAsia="sr-Latn-RS"/>
+              </w:rPr>
+              <w:t>улогован</w:t>
+            </w:r>
+            <w:proofErr w:type="spellEnd"/>
+            <w:r>
+              <w:rPr>
+                <w:rFonts w:eastAsia="Times New Roman" w:cs="Times New Roman"/>
+                <w:color w:val="000000"/>
+                <w:sz w:val="22"/>
+                <w:szCs w:val="22"/>
+                <w:lang w:val="sr-Latn-RS" w:eastAsia="sr-Latn-RS"/>
+              </w:rPr>
+              <w:t xml:space="preserve"> </w:t>
+            </w:r>
+            <w:proofErr w:type="spellStart"/>
+            <w:r>
+              <w:rPr>
+                <w:rFonts w:eastAsia="Times New Roman" w:cs="Times New Roman"/>
+                <w:color w:val="000000"/>
+                <w:sz w:val="22"/>
+                <w:szCs w:val="22"/>
+                <w:lang w:val="sr-Latn-RS" w:eastAsia="sr-Latn-RS"/>
+              </w:rPr>
+              <w:t>на</w:t>
+            </w:r>
+            <w:proofErr w:type="spellEnd"/>
+            <w:r>
+              <w:rPr>
+                <w:rFonts w:eastAsia="Times New Roman" w:cs="Times New Roman"/>
+                <w:color w:val="000000"/>
+                <w:sz w:val="22"/>
+                <w:szCs w:val="22"/>
+                <w:lang w:val="sr-Latn-RS" w:eastAsia="sr-Latn-RS"/>
+              </w:rPr>
+              <w:t xml:space="preserve"> </w:t>
+            </w:r>
+            <w:proofErr w:type="spellStart"/>
+            <w:r>
+              <w:rPr>
+                <w:rFonts w:eastAsia="Times New Roman" w:cs="Times New Roman"/>
+                <w:color w:val="000000"/>
+                <w:sz w:val="22"/>
+                <w:szCs w:val="22"/>
+                <w:lang w:val="sr-Latn-RS" w:eastAsia="sr-Latn-RS"/>
+              </w:rPr>
+              <w:t>ситем</w:t>
+            </w:r>
+            <w:proofErr w:type="spellEnd"/>
+          </w:p>
+        </w:tc>
+        <w:tc>
+          <w:tcPr>
+            <w:tcW w:w="3379" w:type="dxa"/>
+            <w:tcBorders>
+              <w:top w:val="nil"/>
+              <w:left w:val="nil"/>
+              <w:bottom w:val="single" w:sz="4" w:space="0" w:color="auto"/>
+              <w:right w:val="single" w:sz="4" w:space="0" w:color="auto"/>
+            </w:tcBorders>
+            <w:shd w:val="clear" w:color="auto" w:fill="auto"/>
+            <w:noWrap/>
+            <w:vAlign w:val="center"/>
+            <w:hideMark/>
+          </w:tcPr>
+          <w:p>
+            <w:pPr>
+              <w:spacing w:line="240" w:lineRule="auto"/>
+              <w:rPr>
+                <w:rFonts w:eastAsia="Times New Roman" w:cs="Times New Roman"/>
+                <w:color w:val="000000"/>
+                <w:sz w:val="22"/>
+                <w:szCs w:val="22"/>
+                <w:lang w:val="sr-Latn-RS" w:eastAsia="sr-Latn-RS"/>
+              </w:rPr>
+            </w:pPr>
+            <w:r>
+              <w:rPr>
+                <w:rFonts w:eastAsia="Times New Roman" w:cs="Times New Roman"/>
+                <w:color w:val="000000"/>
+                <w:sz w:val="22"/>
+                <w:szCs w:val="22"/>
+                <w:lang w:val="sr-Latn-RS" w:eastAsia="sr-Latn-RS"/>
+              </w:rPr>
+              <w:t xml:space="preserve"> - </w:t>
+            </w:r>
+            <w:proofErr w:type="spellStart"/>
+            <w:r>
+              <w:rPr>
+                <w:rFonts w:eastAsia="Times New Roman" w:cs="Times New Roman"/>
+                <w:color w:val="000000"/>
+                <w:sz w:val="22"/>
+                <w:szCs w:val="22"/>
+                <w:lang w:val="sr-Latn-RS" w:eastAsia="sr-Latn-RS"/>
+              </w:rPr>
+              <w:t>Пронађени</w:t>
+            </w:r>
+            <w:proofErr w:type="spellEnd"/>
+            <w:r>
+              <w:rPr>
+                <w:rFonts w:eastAsia="Times New Roman" w:cs="Times New Roman"/>
+                <w:color w:val="000000"/>
+                <w:sz w:val="22"/>
+                <w:szCs w:val="22"/>
+                <w:lang w:val="sr-Latn-RS" w:eastAsia="sr-Latn-RS"/>
+              </w:rPr>
+              <w:t xml:space="preserve"> </w:t>
+            </w:r>
+            <w:proofErr w:type="spellStart"/>
+            <w:r>
+              <w:rPr>
+                <w:rFonts w:eastAsia="Times New Roman" w:cs="Times New Roman"/>
+                <w:color w:val="000000"/>
+                <w:sz w:val="22"/>
+                <w:szCs w:val="22"/>
+                <w:lang w:val="sr-Latn-RS" w:eastAsia="sr-Latn-RS"/>
+              </w:rPr>
+              <w:t>су</w:t>
+            </w:r>
+            <w:proofErr w:type="spellEnd"/>
+            <w:r>
+              <w:rPr>
+                <w:rFonts w:eastAsia="Times New Roman" w:cs="Times New Roman"/>
+                <w:color w:val="000000"/>
+                <w:sz w:val="22"/>
+                <w:szCs w:val="22"/>
+                <w:lang w:val="sr-Latn-RS" w:eastAsia="sr-Latn-RS"/>
+              </w:rPr>
+              <w:t xml:space="preserve"> </w:t>
+            </w:r>
+            <w:proofErr w:type="spellStart"/>
+            <w:r>
+              <w:rPr>
+                <w:rFonts w:eastAsia="Times New Roman" w:cs="Times New Roman"/>
+                <w:color w:val="000000"/>
+                <w:sz w:val="22"/>
+                <w:szCs w:val="22"/>
+                <w:lang w:val="sr-Latn-RS" w:eastAsia="sr-Latn-RS"/>
+              </w:rPr>
+              <w:t>филмови</w:t>
+            </w:r>
+            <w:proofErr w:type="spellEnd"/>
+            <w:r>
+              <w:rPr>
+                <w:rFonts w:eastAsia="Times New Roman" w:cs="Times New Roman"/>
+                <w:color w:val="000000"/>
+                <w:sz w:val="22"/>
+                <w:szCs w:val="22"/>
+                <w:lang w:val="sr-Latn-RS" w:eastAsia="sr-Latn-RS"/>
+              </w:rPr>
+              <w:t xml:space="preserve"> </w:t>
+            </w:r>
+            <w:proofErr w:type="spellStart"/>
+            <w:r>
+              <w:rPr>
+                <w:rFonts w:eastAsia="Times New Roman" w:cs="Times New Roman"/>
+                <w:color w:val="000000"/>
+                <w:sz w:val="22"/>
+                <w:szCs w:val="22"/>
+                <w:lang w:val="sr-Latn-RS" w:eastAsia="sr-Latn-RS"/>
+              </w:rPr>
+              <w:t>за</w:t>
+            </w:r>
+            <w:proofErr w:type="spellEnd"/>
+            <w:r>
+              <w:rPr>
+                <w:rFonts w:eastAsia="Times New Roman" w:cs="Times New Roman"/>
+                <w:color w:val="000000"/>
+                <w:sz w:val="22"/>
+                <w:szCs w:val="22"/>
+                <w:lang w:val="sr-Latn-RS" w:eastAsia="sr-Latn-RS"/>
+              </w:rPr>
+              <w:t xml:space="preserve"> </w:t>
+            </w:r>
+            <w:proofErr w:type="spellStart"/>
+            <w:r>
+              <w:rPr>
+                <w:rFonts w:eastAsia="Times New Roman" w:cs="Times New Roman"/>
+                <w:color w:val="000000"/>
+                <w:sz w:val="22"/>
+                <w:szCs w:val="22"/>
+                <w:lang w:val="sr-Latn-RS" w:eastAsia="sr-Latn-RS"/>
+              </w:rPr>
+              <w:t>препоручивање</w:t>
+            </w:r>
+            <w:proofErr w:type="spellEnd"/>
+          </w:p>
+        </w:tc>
+      </w:tr>
+      <w:tr>
+        <w:trPr>
+          <w:trHeight w:val="1044"/>
+        </w:trPr>
+        <w:tc>
+          <w:tcPr>
+            <w:tcW w:w="1940" w:type="dxa"/>
+            <w:tcBorders>
+              <w:top w:val="nil"/>
+              <w:left w:val="single" w:sz="4" w:space="0" w:color="auto"/>
+              <w:bottom w:val="single" w:sz="4" w:space="0" w:color="auto"/>
+              <w:right w:val="single" w:sz="4" w:space="0" w:color="auto"/>
+            </w:tcBorders>
+            <w:shd w:val="clear" w:color="auto" w:fill="auto"/>
+            <w:noWrap/>
+            <w:vAlign w:val="center"/>
+            <w:hideMark/>
+          </w:tcPr>
+          <w:p>
+            <w:pPr>
+              <w:spacing w:line="240" w:lineRule="auto"/>
+              <w:rPr>
+                <w:rFonts w:eastAsia="Times New Roman" w:cs="Times New Roman"/>
+                <w:color w:val="000000"/>
+                <w:sz w:val="22"/>
+                <w:szCs w:val="22"/>
+                <w:lang w:val="sr-Latn-RS" w:eastAsia="sr-Latn-RS"/>
+              </w:rPr>
+            </w:pPr>
+            <w:proofErr w:type="spellStart"/>
+            <w:r>
+              <w:rPr>
+                <w:rFonts w:eastAsia="Times New Roman" w:cs="Times New Roman"/>
+                <w:color w:val="000000"/>
+                <w:sz w:val="22"/>
+                <w:szCs w:val="22"/>
+                <w:lang w:val="sr-Latn-RS" w:eastAsia="sr-Latn-RS"/>
+              </w:rPr>
+              <w:t>Приказ</w:t>
+            </w:r>
+            <w:proofErr w:type="spellEnd"/>
+            <w:r>
+              <w:rPr>
+                <w:rFonts w:eastAsia="Times New Roman" w:cs="Times New Roman"/>
+                <w:color w:val="000000"/>
+                <w:sz w:val="22"/>
+                <w:szCs w:val="22"/>
+                <w:lang w:val="sr-Latn-RS" w:eastAsia="sr-Latn-RS"/>
+              </w:rPr>
+              <w:t xml:space="preserve"> </w:t>
+            </w:r>
+            <w:proofErr w:type="spellStart"/>
+            <w:r>
+              <w:rPr>
+                <w:rFonts w:eastAsia="Times New Roman" w:cs="Times New Roman"/>
+                <w:color w:val="000000"/>
+                <w:sz w:val="22"/>
+                <w:szCs w:val="22"/>
+                <w:lang w:val="sr-Latn-RS" w:eastAsia="sr-Latn-RS"/>
+              </w:rPr>
+              <w:t>филмова</w:t>
+            </w:r>
+            <w:proofErr w:type="spellEnd"/>
+          </w:p>
+        </w:tc>
+        <w:tc>
+          <w:tcPr>
+            <w:tcW w:w="3040" w:type="dxa"/>
+            <w:tcBorders>
+              <w:top w:val="nil"/>
+              <w:left w:val="nil"/>
+              <w:bottom w:val="single" w:sz="4" w:space="0" w:color="auto"/>
+              <w:right w:val="single" w:sz="4" w:space="0" w:color="auto"/>
+            </w:tcBorders>
+            <w:shd w:val="clear" w:color="auto" w:fill="auto"/>
+            <w:vAlign w:val="center"/>
+            <w:hideMark/>
+          </w:tcPr>
+          <w:p>
+            <w:pPr>
+              <w:spacing w:line="240" w:lineRule="auto"/>
+              <w:rPr>
+                <w:rFonts w:eastAsia="Times New Roman" w:cs="Times New Roman"/>
+                <w:color w:val="000000"/>
+                <w:sz w:val="22"/>
+                <w:szCs w:val="22"/>
+                <w:lang w:val="sr-Latn-RS" w:eastAsia="sr-Latn-RS"/>
+              </w:rPr>
+            </w:pPr>
+            <w:r>
+              <w:rPr>
+                <w:rFonts w:eastAsia="Times New Roman" w:cs="Times New Roman"/>
+                <w:color w:val="000000"/>
+                <w:sz w:val="22"/>
+                <w:szCs w:val="22"/>
+                <w:lang w:val="sr-Latn-RS" w:eastAsia="sr-Latn-RS"/>
+              </w:rPr>
+              <w:t xml:space="preserve"> - </w:t>
+            </w:r>
+            <w:proofErr w:type="spellStart"/>
+            <w:r>
+              <w:rPr>
+                <w:rFonts w:eastAsia="Times New Roman" w:cs="Times New Roman"/>
+                <w:color w:val="000000"/>
+                <w:sz w:val="22"/>
+                <w:szCs w:val="22"/>
+                <w:lang w:val="sr-Latn-RS" w:eastAsia="sr-Latn-RS"/>
+              </w:rPr>
+              <w:t>Корисник</w:t>
+            </w:r>
+            <w:proofErr w:type="spellEnd"/>
+            <w:r>
+              <w:rPr>
+                <w:rFonts w:eastAsia="Times New Roman" w:cs="Times New Roman"/>
+                <w:color w:val="000000"/>
+                <w:sz w:val="22"/>
+                <w:szCs w:val="22"/>
+                <w:lang w:val="sr-Latn-RS" w:eastAsia="sr-Latn-RS"/>
+              </w:rPr>
+              <w:t xml:space="preserve"> </w:t>
+            </w:r>
+            <w:proofErr w:type="spellStart"/>
+            <w:r>
+              <w:rPr>
+                <w:rFonts w:eastAsia="Times New Roman" w:cs="Times New Roman"/>
+                <w:color w:val="000000"/>
+                <w:sz w:val="22"/>
+                <w:szCs w:val="22"/>
+                <w:lang w:val="sr-Latn-RS" w:eastAsia="sr-Latn-RS"/>
+              </w:rPr>
+              <w:t>је</w:t>
+            </w:r>
+            <w:proofErr w:type="spellEnd"/>
+            <w:r>
+              <w:rPr>
+                <w:rFonts w:eastAsia="Times New Roman" w:cs="Times New Roman"/>
+                <w:color w:val="000000"/>
+                <w:sz w:val="22"/>
+                <w:szCs w:val="22"/>
+                <w:lang w:val="sr-Latn-RS" w:eastAsia="sr-Latn-RS"/>
+              </w:rPr>
+              <w:t xml:space="preserve"> </w:t>
+            </w:r>
+            <w:proofErr w:type="spellStart"/>
+            <w:r>
+              <w:rPr>
+                <w:rFonts w:eastAsia="Times New Roman" w:cs="Times New Roman"/>
+                <w:color w:val="000000"/>
+                <w:sz w:val="22"/>
+                <w:szCs w:val="22"/>
+                <w:lang w:val="sr-Latn-RS" w:eastAsia="sr-Latn-RS"/>
+              </w:rPr>
+              <w:t>улогован</w:t>
+            </w:r>
+            <w:proofErr w:type="spellEnd"/>
+            <w:r>
+              <w:rPr>
+                <w:rFonts w:eastAsia="Times New Roman" w:cs="Times New Roman"/>
+                <w:color w:val="000000"/>
+                <w:sz w:val="22"/>
+                <w:szCs w:val="22"/>
+                <w:lang w:val="sr-Latn-RS" w:eastAsia="sr-Latn-RS"/>
+              </w:rPr>
+              <w:t xml:space="preserve"> </w:t>
+            </w:r>
+            <w:proofErr w:type="spellStart"/>
+            <w:r>
+              <w:rPr>
+                <w:rFonts w:eastAsia="Times New Roman" w:cs="Times New Roman"/>
+                <w:color w:val="000000"/>
+                <w:sz w:val="22"/>
+                <w:szCs w:val="22"/>
+                <w:lang w:val="sr-Latn-RS" w:eastAsia="sr-Latn-RS"/>
+              </w:rPr>
+              <w:t>на</w:t>
+            </w:r>
+            <w:proofErr w:type="spellEnd"/>
+            <w:r>
+              <w:rPr>
+                <w:rFonts w:eastAsia="Times New Roman" w:cs="Times New Roman"/>
+                <w:color w:val="000000"/>
+                <w:sz w:val="22"/>
+                <w:szCs w:val="22"/>
+                <w:lang w:val="sr-Latn-RS" w:eastAsia="sr-Latn-RS"/>
+              </w:rPr>
+              <w:t xml:space="preserve"> </w:t>
+            </w:r>
+            <w:proofErr w:type="spellStart"/>
+            <w:r>
+              <w:rPr>
+                <w:rFonts w:eastAsia="Times New Roman" w:cs="Times New Roman"/>
+                <w:color w:val="000000"/>
+                <w:sz w:val="22"/>
+                <w:szCs w:val="22"/>
+                <w:lang w:val="sr-Latn-RS" w:eastAsia="sr-Latn-RS"/>
+              </w:rPr>
+              <w:t>ситем</w:t>
+            </w:r>
+            <w:proofErr w:type="spellEnd"/>
+            <w:r>
+              <w:rPr>
+                <w:rFonts w:eastAsia="Times New Roman" w:cs="Times New Roman"/>
+                <w:color w:val="000000"/>
+                <w:sz w:val="22"/>
+                <w:szCs w:val="22"/>
+                <w:lang w:val="sr-Latn-RS" w:eastAsia="sr-Latn-RS"/>
+              </w:rPr>
+              <w:br/>
+              <w:t xml:space="preserve"> - </w:t>
+            </w:r>
+            <w:proofErr w:type="spellStart"/>
+            <w:r>
+              <w:rPr>
+                <w:rFonts w:eastAsia="Times New Roman" w:cs="Times New Roman"/>
+                <w:color w:val="000000"/>
+                <w:sz w:val="22"/>
+                <w:szCs w:val="22"/>
+                <w:lang w:val="sr-Latn-RS" w:eastAsia="sr-Latn-RS"/>
+              </w:rPr>
+              <w:t>Пронађени</w:t>
+            </w:r>
+            <w:proofErr w:type="spellEnd"/>
+            <w:r>
+              <w:rPr>
+                <w:rFonts w:eastAsia="Times New Roman" w:cs="Times New Roman"/>
+                <w:color w:val="000000"/>
+                <w:sz w:val="22"/>
+                <w:szCs w:val="22"/>
+                <w:lang w:val="sr-Latn-RS" w:eastAsia="sr-Latn-RS"/>
+              </w:rPr>
+              <w:t xml:space="preserve"> </w:t>
+            </w:r>
+            <w:proofErr w:type="spellStart"/>
+            <w:r>
+              <w:rPr>
+                <w:rFonts w:eastAsia="Times New Roman" w:cs="Times New Roman"/>
+                <w:color w:val="000000"/>
+                <w:sz w:val="22"/>
+                <w:szCs w:val="22"/>
+                <w:lang w:val="sr-Latn-RS" w:eastAsia="sr-Latn-RS"/>
+              </w:rPr>
+              <w:t>су</w:t>
+            </w:r>
+            <w:proofErr w:type="spellEnd"/>
+            <w:r>
+              <w:rPr>
+                <w:rFonts w:eastAsia="Times New Roman" w:cs="Times New Roman"/>
+                <w:color w:val="000000"/>
+                <w:sz w:val="22"/>
+                <w:szCs w:val="22"/>
+                <w:lang w:val="sr-Latn-RS" w:eastAsia="sr-Latn-RS"/>
+              </w:rPr>
+              <w:t xml:space="preserve"> </w:t>
+            </w:r>
+            <w:proofErr w:type="spellStart"/>
+            <w:r>
+              <w:rPr>
+                <w:rFonts w:eastAsia="Times New Roman" w:cs="Times New Roman"/>
+                <w:color w:val="000000"/>
+                <w:sz w:val="22"/>
+                <w:szCs w:val="22"/>
+                <w:lang w:val="sr-Latn-RS" w:eastAsia="sr-Latn-RS"/>
+              </w:rPr>
+              <w:t>филмови</w:t>
+            </w:r>
+            <w:proofErr w:type="spellEnd"/>
+            <w:r>
+              <w:rPr>
+                <w:rFonts w:eastAsia="Times New Roman" w:cs="Times New Roman"/>
+                <w:color w:val="000000"/>
+                <w:sz w:val="22"/>
+                <w:szCs w:val="22"/>
+                <w:lang w:val="sr-Latn-RS" w:eastAsia="sr-Latn-RS"/>
+              </w:rPr>
+              <w:t xml:space="preserve"> </w:t>
+            </w:r>
+            <w:proofErr w:type="spellStart"/>
+            <w:r>
+              <w:rPr>
+                <w:rFonts w:eastAsia="Times New Roman" w:cs="Times New Roman"/>
+                <w:color w:val="000000"/>
+                <w:sz w:val="22"/>
+                <w:szCs w:val="22"/>
+                <w:lang w:val="sr-Latn-RS" w:eastAsia="sr-Latn-RS"/>
+              </w:rPr>
+              <w:t>за</w:t>
+            </w:r>
+            <w:proofErr w:type="spellEnd"/>
+            <w:r>
+              <w:rPr>
+                <w:rFonts w:eastAsia="Times New Roman" w:cs="Times New Roman"/>
+                <w:color w:val="000000"/>
+                <w:sz w:val="22"/>
+                <w:szCs w:val="22"/>
+                <w:lang w:val="sr-Latn-RS" w:eastAsia="sr-Latn-RS"/>
+              </w:rPr>
+              <w:t xml:space="preserve"> </w:t>
+            </w:r>
+            <w:proofErr w:type="spellStart"/>
+            <w:r>
+              <w:rPr>
+                <w:rFonts w:eastAsia="Times New Roman" w:cs="Times New Roman"/>
+                <w:color w:val="000000"/>
+                <w:sz w:val="22"/>
+                <w:szCs w:val="22"/>
+                <w:lang w:val="sr-Latn-RS" w:eastAsia="sr-Latn-RS"/>
+              </w:rPr>
+              <w:t>препоручивање</w:t>
+            </w:r>
+            <w:proofErr w:type="spellEnd"/>
+          </w:p>
+        </w:tc>
+        <w:tc>
+          <w:tcPr>
+            <w:tcW w:w="3379" w:type="dxa"/>
+            <w:tcBorders>
+              <w:top w:val="nil"/>
+              <w:left w:val="nil"/>
+              <w:bottom w:val="single" w:sz="4" w:space="0" w:color="auto"/>
+              <w:right w:val="single" w:sz="4" w:space="0" w:color="auto"/>
+            </w:tcBorders>
+            <w:shd w:val="clear" w:color="auto" w:fill="auto"/>
+            <w:noWrap/>
+            <w:vAlign w:val="center"/>
+            <w:hideMark/>
+          </w:tcPr>
+          <w:p>
+            <w:pPr>
+              <w:spacing w:line="240" w:lineRule="auto"/>
+              <w:rPr>
+                <w:rFonts w:eastAsia="Times New Roman" w:cs="Times New Roman"/>
+                <w:color w:val="000000"/>
+                <w:sz w:val="22"/>
+                <w:szCs w:val="22"/>
+                <w:lang w:val="sr-Latn-RS" w:eastAsia="sr-Latn-RS"/>
+              </w:rPr>
+            </w:pPr>
+            <w:r>
+              <w:rPr>
+                <w:rFonts w:eastAsia="Times New Roman" w:cs="Times New Roman"/>
+                <w:color w:val="000000"/>
+                <w:sz w:val="22"/>
+                <w:szCs w:val="22"/>
+                <w:lang w:val="sr-Latn-RS" w:eastAsia="sr-Latn-RS"/>
+              </w:rPr>
+              <w:t xml:space="preserve"> - </w:t>
+            </w:r>
+            <w:proofErr w:type="spellStart"/>
+            <w:r>
+              <w:rPr>
+                <w:rFonts w:eastAsia="Times New Roman" w:cs="Times New Roman"/>
+                <w:color w:val="000000"/>
+                <w:sz w:val="22"/>
+                <w:szCs w:val="22"/>
+                <w:lang w:val="sr-Latn-RS" w:eastAsia="sr-Latn-RS"/>
+              </w:rPr>
+              <w:t>Филмови</w:t>
+            </w:r>
+            <w:proofErr w:type="spellEnd"/>
+            <w:r>
+              <w:rPr>
+                <w:rFonts w:eastAsia="Times New Roman" w:cs="Times New Roman"/>
+                <w:color w:val="000000"/>
+                <w:sz w:val="22"/>
+                <w:szCs w:val="22"/>
+                <w:lang w:val="sr-Latn-RS" w:eastAsia="sr-Latn-RS"/>
+              </w:rPr>
+              <w:t xml:space="preserve"> </w:t>
+            </w:r>
+            <w:proofErr w:type="spellStart"/>
+            <w:r>
+              <w:rPr>
+                <w:rFonts w:eastAsia="Times New Roman" w:cs="Times New Roman"/>
+                <w:color w:val="000000"/>
+                <w:sz w:val="22"/>
+                <w:szCs w:val="22"/>
+                <w:lang w:val="sr-Latn-RS" w:eastAsia="sr-Latn-RS"/>
+              </w:rPr>
+              <w:t>су</w:t>
+            </w:r>
+            <w:proofErr w:type="spellEnd"/>
+            <w:r>
+              <w:rPr>
+                <w:rFonts w:eastAsia="Times New Roman" w:cs="Times New Roman"/>
+                <w:color w:val="000000"/>
+                <w:sz w:val="22"/>
+                <w:szCs w:val="22"/>
+                <w:lang w:val="sr-Latn-RS" w:eastAsia="sr-Latn-RS"/>
+              </w:rPr>
+              <w:t xml:space="preserve"> </w:t>
+            </w:r>
+            <w:proofErr w:type="spellStart"/>
+            <w:r>
+              <w:rPr>
+                <w:rFonts w:eastAsia="Times New Roman" w:cs="Times New Roman"/>
+                <w:color w:val="000000"/>
+                <w:sz w:val="22"/>
+                <w:szCs w:val="22"/>
+                <w:lang w:val="sr-Latn-RS" w:eastAsia="sr-Latn-RS"/>
+              </w:rPr>
+              <w:t>успешно</w:t>
+            </w:r>
+            <w:proofErr w:type="spellEnd"/>
+            <w:r>
+              <w:rPr>
+                <w:rFonts w:eastAsia="Times New Roman" w:cs="Times New Roman"/>
+                <w:color w:val="000000"/>
+                <w:sz w:val="22"/>
+                <w:szCs w:val="22"/>
+                <w:lang w:val="sr-Latn-RS" w:eastAsia="sr-Latn-RS"/>
+              </w:rPr>
+              <w:t xml:space="preserve"> </w:t>
+            </w:r>
+            <w:proofErr w:type="spellStart"/>
+            <w:r>
+              <w:rPr>
+                <w:rFonts w:eastAsia="Times New Roman" w:cs="Times New Roman"/>
+                <w:color w:val="000000"/>
+                <w:sz w:val="22"/>
+                <w:szCs w:val="22"/>
+                <w:lang w:val="sr-Latn-RS" w:eastAsia="sr-Latn-RS"/>
+              </w:rPr>
+              <w:t>приказани</w:t>
+            </w:r>
+            <w:proofErr w:type="spellEnd"/>
+          </w:p>
+        </w:tc>
+      </w:tr>
+    </w:tbl>
+    <w:p>
+      <w:pPr>
+        <w:jc w:val="both"/>
+        <w:rPr>
+          <w:lang w:val="en-US"/>
+        </w:rPr>
+      </w:pPr>
+    </w:p>
+    <w:p>
+      <w:pPr>
+        <w:jc w:val="both"/>
+        <w:rPr>
+          <w:lang w:val="en-US"/>
+        </w:rPr>
+      </w:pPr>
+    </w:p>
+    <w:p>
+      <w:pPr>
+        <w:jc w:val="both"/>
+        <w:rPr>
+          <w:lang w:val="en-US"/>
+        </w:rPr>
+      </w:pPr>
+    </w:p>
+    <w:p>
+      <w:pPr>
+        <w:jc w:val="both"/>
+        <w:rPr>
+          <w:lang w:val="en-US"/>
+        </w:rPr>
+      </w:pPr>
+    </w:p>
+    <w:p>
+      <w:pPr>
+        <w:jc w:val="both"/>
+        <w:rPr>
+          <w:lang w:val="sr-Cyrl-RS"/>
+        </w:rPr>
+      </w:pPr>
+    </w:p>
+    <w:p>
+      <w:pPr>
         <w:ind w:firstLine="360"/>
         <w:jc w:val="both"/>
         <w:rPr>
@@ -27526,7 +29000,26 @@
         <w:rPr>
           <w:lang w:val="sr-Cyrl-RS"/>
         </w:rPr>
-        <w:t>На основу дијаграма овог случаја, кориснички интерфејс би отприлике требао да изгледа као што је на слици 3.</w:t>
+        <w:lastRenderedPageBreak/>
+        <w:t>На основу дијаграма овог случаја</w:t>
+      </w:r>
+      <w:r>
+        <w:rPr>
+          <w:lang w:val="en-US"/>
+        </w:rPr>
+        <w:t xml:space="preserve"> </w:t>
+      </w:r>
+      <w:r>
+        <w:rPr>
+          <w:lang w:val="sr-Cyrl-RS"/>
+        </w:rPr>
+        <w:t>и на основу предуслова и пост-услова из табеле 3.1</w:t>
+      </w:r>
+      <w:r>
+        <w:rPr>
+          <w:lang w:val="sr-Cyrl-RS"/>
+        </w:rPr>
+        <w:t>, кориснички интерфејс би отприлике требао да изгледа као што је на слици 3.</w:t>
       </w:r>
       <w:r>
         <w:rPr>
@@ -27600,30 +29093,29 @@
       <w:pPr>
         <w:jc w:val="center"/>
         <w:rPr>
-          <w:sz w:val="36"/>
-          <w:szCs w:val="36"/>
-          <w:lang w:val="en-US"/>
-        </w:rPr>
-      </w:pPr>
-      <w:r>
-        <w:rPr>
-          <w:b/>
-          <w:lang w:val="sr-Cyrl-RS"/>
-        </w:rPr>
-        <w:t xml:space="preserve">Слика </w:t>
-      </w:r>
-      <w:r>
-        <w:rPr>
-          <w:b/>
-          <w:lang w:val="sr-Cyrl-RS"/>
-        </w:rPr>
-        <w:t>3</w:t>
-      </w:r>
-      <w:r>
-        <w:rPr>
           <w:b/>
           <w:lang w:val="en-US"/>
         </w:rPr>
+      </w:pPr>
+      <w:r>
+        <w:rPr>
+          <w:b/>
+          <w:lang w:val="sr-Cyrl-RS"/>
+        </w:rPr>
+        <w:t xml:space="preserve">Слика </w:t>
+      </w:r>
+      <w:r>
+        <w:rPr>
+          <w:b/>
+          <w:lang w:val="sr-Cyrl-RS"/>
+        </w:rPr>
+        <w:t>3</w:t>
+      </w:r>
+      <w:r>
+        <w:rPr>
+          <w:b/>
+          <w:lang w:val="en-US"/>
+        </w:rPr>
         <w:t>.</w:t>
       </w:r>
       <w:r>
@@ -27666,12 +29158,27 @@
     </w:p>
     <w:p>
       <w:pPr>
+        <w:rPr>
+          <w:b/>
+          <w:lang w:val="en-US"/>
+        </w:rPr>
+      </w:pPr>
+      <w:r>
+        <w:rPr>
+          <w:b/>
+          <w:lang w:val="en-US"/>
+        </w:rPr>
+        <w:br w:type="page"/>
+      </w:r>
+    </w:p>
+    <w:p>
+      <w:pPr>
         <w:pStyle w:val="Heading2"/>
         <w:rPr>
           <w:lang w:val="sr-Cyrl-RS"/>
         </w:rPr>
       </w:pPr>
-      <w:bookmarkStart w:id="16" w:name="_Toc212028727"/>
+      <w:bookmarkStart w:id="16" w:name="_Toc212376489"/>
       <w:r>
         <w:rPr>
           <w:lang w:val="en-US"/>
@@ -27752,7 +29259,7 @@
         <w:rPr>
           <w:lang w:val="sr-Cyrl-RS"/>
         </w:rPr>
-        <w:t>може послати. Такође, потребно је и приказати ту поруку. Систем  затим треба да на основу послате поруке, уради препоручивање филмова. Када систем пронађе препоручене филмове, те филмове као резултат треба приказати у поруци. Цео овај случај приказан је на слици 3.</w:t>
+        <w:t>може послати. Такође, потребно је и приказати ту поруку. Систем затим треба да на основу послате поруке, уради препоручивање филмова. Када систем пронађе препоручене филмове, те филмове као резултат треба приказати у поруци. Цео овај случај приказан је на слици 3.</w:t>
       </w:r>
       <w:r>
         <w:rPr>
@@ -27933,14 +29440,14 @@
     <w:p>
       <w:pPr>
         <w:rPr>
-          <w:lang w:val="en-US"/>
-        </w:rPr>
-      </w:pPr>
-      <w:r>
-        <w:rPr>
-          <w:lang w:val="en-US"/>
-        </w:rPr>
-        <w:br w:type="page"/>
+          <w:lang w:val="sr-Cyrl-RS"/>
+        </w:rPr>
+      </w:pPr>
+      <w:r>
+        <w:rPr>
+          <w:lang w:val="sr-Cyrl-RS"/>
+        </w:rPr>
+        <w:t>Како би овај део система правилно функционисао, у табели 3.2 су пописани предуслови и пост-услови за сваки од случајева коришћења.</w:t>
       </w:r>
     </w:p>
     <w:p>
@@ -27949,10 +29456,1442 @@
           <w:lang w:val="en-US"/>
         </w:rPr>
       </w:pPr>
+      <w:r>
+        <w:rPr>
+          <w:lang w:val="en-US"/>
+        </w:rPr>
+        <w:br w:type="page"/>
+      </w:r>
     </w:p>
     <w:p>
       <w:pPr>
         <w:rPr>
+          <w:lang w:val="en-US"/>
+        </w:rPr>
+      </w:pPr>
+    </w:p>
+    <w:p>
+      <w:pPr>
+        <w:pStyle w:val="Caption"/>
+        <w:keepNext/>
+        <w:rPr>
+          <w:b/>
+          <w:color w:val="000000" w:themeColor="text1"/>
+          <w:sz w:val="22"/>
+          <w:szCs w:val="22"/>
+        </w:rPr>
+      </w:pPr>
+      <w:r>
+        <w:rPr>
+          <w:b/>
+          <w:i w:val="0"/>
+          <w:color w:val="000000" w:themeColor="text1"/>
+          <w:sz w:val="22"/>
+          <w:szCs w:val="22"/>
+          <w:lang w:val="sr-Cyrl-RS"/>
+        </w:rPr>
+        <w:t xml:space="preserve">Табела </w:t>
+      </w:r>
+      <w:r>
+        <w:rPr>
+          <w:b/>
+          <w:i w:val="0"/>
+          <w:color w:val="000000" w:themeColor="text1"/>
+          <w:sz w:val="22"/>
+          <w:szCs w:val="22"/>
+          <w:lang w:val="sr-Cyrl-RS"/>
+        </w:rPr>
+        <w:t>3.</w:t>
+      </w:r>
+      <w:r>
+        <w:rPr>
+          <w:b/>
+          <w:i w:val="0"/>
+          <w:color w:val="000000" w:themeColor="text1"/>
+          <w:sz w:val="22"/>
+          <w:szCs w:val="22"/>
+          <w:lang w:val="sr-Cyrl-RS"/>
+        </w:rPr>
+        <w:t>2</w:t>
+      </w:r>
+      <w:r>
+        <w:rPr>
+          <w:b/>
+          <w:i w:val="0"/>
+          <w:color w:val="000000" w:themeColor="text1"/>
+          <w:sz w:val="22"/>
+          <w:szCs w:val="22"/>
+          <w:lang w:val="sr-Cyrl-RS"/>
+        </w:rPr>
+        <w:t>. Списак предуслова и пост-услова за коришћење препоручивања филтрирањем</w:t>
+      </w:r>
+      <w:r>
+        <w:rPr>
+          <w:b/>
+          <w:i w:val="0"/>
+          <w:color w:val="000000" w:themeColor="text1"/>
+          <w:sz w:val="22"/>
+          <w:szCs w:val="22"/>
+          <w:lang w:val="sr-Cyrl-RS"/>
+        </w:rPr>
+        <w:t xml:space="preserve"> базираном на садржају</w:t>
+      </w:r>
+    </w:p>
+    <w:tbl>
+      <w:tblPr>
+        <w:tblW w:w="8359" w:type="dxa"/>
+        <w:tblLook w:val="04A0" w:firstRow="1" w:lastRow="0" w:firstColumn="1" w:lastColumn="0" w:noHBand="0" w:noVBand="1"/>
+      </w:tblPr>
+      <w:tblGrid>
+        <w:gridCol w:w="2405"/>
+        <w:gridCol w:w="3686"/>
+        <w:gridCol w:w="2268"/>
+      </w:tblGrid>
+      <w:tr>
+        <w:trPr>
+          <w:trHeight w:val="288"/>
+        </w:trPr>
+        <w:tc>
+          <w:tcPr>
+            <w:tcW w:w="2405" w:type="dxa"/>
+            <w:tcBorders>
+              <w:top w:val="single" w:sz="4" w:space="0" w:color="auto"/>
+              <w:left w:val="single" w:sz="4" w:space="0" w:color="auto"/>
+              <w:bottom w:val="single" w:sz="4" w:space="0" w:color="auto"/>
+              <w:right w:val="single" w:sz="4" w:space="0" w:color="auto"/>
+            </w:tcBorders>
+            <w:shd w:val="clear" w:color="000000" w:fill="BFBFBF"/>
+            <w:noWrap/>
+            <w:vAlign w:val="center"/>
+            <w:hideMark/>
+          </w:tcPr>
+          <w:p>
+            <w:pPr>
+              <w:spacing w:line="240" w:lineRule="auto"/>
+              <w:rPr>
+                <w:rFonts w:eastAsia="Times New Roman" w:cs="Times New Roman"/>
+                <w:color w:val="000000"/>
+                <w:sz w:val="22"/>
+                <w:szCs w:val="22"/>
+                <w:lang w:val="sr-Latn-RS" w:eastAsia="sr-Latn-RS"/>
+              </w:rPr>
+            </w:pPr>
+            <w:proofErr w:type="spellStart"/>
+            <w:r>
+              <w:rPr>
+                <w:rFonts w:eastAsia="Times New Roman" w:cs="Times New Roman"/>
+                <w:color w:val="000000"/>
+                <w:sz w:val="22"/>
+                <w:szCs w:val="22"/>
+                <w:lang w:val="sr-Latn-RS" w:eastAsia="sr-Latn-RS"/>
+              </w:rPr>
+              <w:t>Случај</w:t>
+            </w:r>
+            <w:proofErr w:type="spellEnd"/>
+            <w:r>
+              <w:rPr>
+                <w:rFonts w:eastAsia="Times New Roman" w:cs="Times New Roman"/>
+                <w:color w:val="000000"/>
+                <w:sz w:val="22"/>
+                <w:szCs w:val="22"/>
+                <w:lang w:val="sr-Latn-RS" w:eastAsia="sr-Latn-RS"/>
+              </w:rPr>
+              <w:t xml:space="preserve"> </w:t>
+            </w:r>
+            <w:proofErr w:type="spellStart"/>
+            <w:r>
+              <w:rPr>
+                <w:rFonts w:eastAsia="Times New Roman" w:cs="Times New Roman"/>
+                <w:color w:val="000000"/>
+                <w:sz w:val="22"/>
+                <w:szCs w:val="22"/>
+                <w:lang w:val="sr-Latn-RS" w:eastAsia="sr-Latn-RS"/>
+              </w:rPr>
+              <w:t>коришћења</w:t>
+            </w:r>
+            <w:proofErr w:type="spellEnd"/>
+          </w:p>
+        </w:tc>
+        <w:tc>
+          <w:tcPr>
+            <w:tcW w:w="3686" w:type="dxa"/>
+            <w:tcBorders>
+              <w:top w:val="single" w:sz="4" w:space="0" w:color="auto"/>
+              <w:left w:val="nil"/>
+              <w:bottom w:val="single" w:sz="4" w:space="0" w:color="auto"/>
+              <w:right w:val="single" w:sz="4" w:space="0" w:color="auto"/>
+            </w:tcBorders>
+            <w:shd w:val="clear" w:color="000000" w:fill="BFBFBF"/>
+            <w:noWrap/>
+            <w:vAlign w:val="center"/>
+            <w:hideMark/>
+          </w:tcPr>
+          <w:p>
+            <w:pPr>
+              <w:spacing w:line="240" w:lineRule="auto"/>
+              <w:rPr>
+                <w:rFonts w:eastAsia="Times New Roman" w:cs="Times New Roman"/>
+                <w:color w:val="000000"/>
+                <w:sz w:val="22"/>
+                <w:szCs w:val="22"/>
+                <w:lang w:val="sr-Latn-RS" w:eastAsia="sr-Latn-RS"/>
+              </w:rPr>
+            </w:pPr>
+            <w:proofErr w:type="spellStart"/>
+            <w:r>
+              <w:rPr>
+                <w:rFonts w:eastAsia="Times New Roman" w:cs="Times New Roman"/>
+                <w:color w:val="000000"/>
+                <w:sz w:val="22"/>
+                <w:szCs w:val="22"/>
+                <w:lang w:val="sr-Latn-RS" w:eastAsia="sr-Latn-RS"/>
+              </w:rPr>
+              <w:t>Предуслов</w:t>
+            </w:r>
+            <w:proofErr w:type="spellEnd"/>
+          </w:p>
+        </w:tc>
+        <w:tc>
+          <w:tcPr>
+            <w:tcW w:w="2268" w:type="dxa"/>
+            <w:tcBorders>
+              <w:top w:val="single" w:sz="4" w:space="0" w:color="auto"/>
+              <w:left w:val="nil"/>
+              <w:bottom w:val="single" w:sz="4" w:space="0" w:color="auto"/>
+              <w:right w:val="single" w:sz="4" w:space="0" w:color="auto"/>
+            </w:tcBorders>
+            <w:shd w:val="clear" w:color="000000" w:fill="BFBFBF"/>
+            <w:noWrap/>
+            <w:vAlign w:val="center"/>
+            <w:hideMark/>
+          </w:tcPr>
+          <w:p>
+            <w:pPr>
+              <w:spacing w:line="240" w:lineRule="auto"/>
+              <w:rPr>
+                <w:rFonts w:eastAsia="Times New Roman" w:cs="Times New Roman"/>
+                <w:color w:val="000000"/>
+                <w:sz w:val="22"/>
+                <w:szCs w:val="22"/>
+                <w:lang w:val="sr-Latn-RS" w:eastAsia="sr-Latn-RS"/>
+              </w:rPr>
+            </w:pPr>
+            <w:proofErr w:type="spellStart"/>
+            <w:r>
+              <w:rPr>
+                <w:rFonts w:eastAsia="Times New Roman" w:cs="Times New Roman"/>
+                <w:color w:val="000000"/>
+                <w:sz w:val="22"/>
+                <w:szCs w:val="22"/>
+                <w:lang w:val="sr-Latn-RS" w:eastAsia="sr-Latn-RS"/>
+              </w:rPr>
+              <w:t>Пост-услов</w:t>
+            </w:r>
+            <w:proofErr w:type="spellEnd"/>
+          </w:p>
+        </w:tc>
+      </w:tr>
+      <w:tr>
+        <w:trPr>
+          <w:trHeight w:val="864"/>
+        </w:trPr>
+        <w:tc>
+          <w:tcPr>
+            <w:tcW w:w="2405" w:type="dxa"/>
+            <w:tcBorders>
+              <w:top w:val="nil"/>
+              <w:left w:val="single" w:sz="4" w:space="0" w:color="auto"/>
+              <w:bottom w:val="single" w:sz="4" w:space="0" w:color="auto"/>
+              <w:right w:val="single" w:sz="4" w:space="0" w:color="auto"/>
+            </w:tcBorders>
+            <w:shd w:val="clear" w:color="auto" w:fill="auto"/>
+            <w:noWrap/>
+            <w:vAlign w:val="center"/>
+            <w:hideMark/>
+          </w:tcPr>
+          <w:p>
+            <w:pPr>
+              <w:spacing w:line="240" w:lineRule="auto"/>
+              <w:rPr>
+                <w:rFonts w:eastAsia="Times New Roman" w:cs="Times New Roman"/>
+                <w:color w:val="000000"/>
+                <w:sz w:val="22"/>
+                <w:szCs w:val="22"/>
+                <w:lang w:val="sr-Latn-RS" w:eastAsia="sr-Latn-RS"/>
+              </w:rPr>
+            </w:pPr>
+            <w:proofErr w:type="spellStart"/>
+            <w:r>
+              <w:rPr>
+                <w:rFonts w:eastAsia="Times New Roman" w:cs="Times New Roman"/>
+                <w:color w:val="000000"/>
+                <w:sz w:val="22"/>
+                <w:szCs w:val="22"/>
+                <w:lang w:val="sr-Latn-RS" w:eastAsia="sr-Latn-RS"/>
+              </w:rPr>
+              <w:t>Унос</w:t>
+            </w:r>
+            <w:proofErr w:type="spellEnd"/>
+            <w:r>
+              <w:rPr>
+                <w:rFonts w:eastAsia="Times New Roman" w:cs="Times New Roman"/>
+                <w:color w:val="000000"/>
+                <w:sz w:val="22"/>
+                <w:szCs w:val="22"/>
+                <w:lang w:val="sr-Latn-RS" w:eastAsia="sr-Latn-RS"/>
+              </w:rPr>
+              <w:t xml:space="preserve"> </w:t>
+            </w:r>
+            <w:proofErr w:type="spellStart"/>
+            <w:r>
+              <w:rPr>
+                <w:rFonts w:eastAsia="Times New Roman" w:cs="Times New Roman"/>
+                <w:color w:val="000000"/>
+                <w:sz w:val="22"/>
+                <w:szCs w:val="22"/>
+                <w:lang w:val="sr-Latn-RS" w:eastAsia="sr-Latn-RS"/>
+              </w:rPr>
+              <w:t>синопсиса</w:t>
+            </w:r>
+            <w:proofErr w:type="spellEnd"/>
+            <w:r>
+              <w:rPr>
+                <w:rFonts w:eastAsia="Times New Roman" w:cs="Times New Roman"/>
+                <w:color w:val="000000"/>
+                <w:sz w:val="22"/>
+                <w:szCs w:val="22"/>
+                <w:lang w:val="sr-Latn-RS" w:eastAsia="sr-Latn-RS"/>
+              </w:rPr>
+              <w:t xml:space="preserve"> </w:t>
+            </w:r>
+            <w:proofErr w:type="spellStart"/>
+            <w:r>
+              <w:rPr>
+                <w:rFonts w:eastAsia="Times New Roman" w:cs="Times New Roman"/>
+                <w:color w:val="000000"/>
+                <w:sz w:val="22"/>
+                <w:szCs w:val="22"/>
+                <w:lang w:val="sr-Latn-RS" w:eastAsia="sr-Latn-RS"/>
+              </w:rPr>
+              <w:t>филма</w:t>
+            </w:r>
+            <w:proofErr w:type="spellEnd"/>
+            <w:r>
+              <w:rPr>
+                <w:rFonts w:eastAsia="Times New Roman" w:cs="Times New Roman"/>
+                <w:color w:val="000000"/>
+                <w:sz w:val="22"/>
+                <w:szCs w:val="22"/>
+                <w:lang w:val="sr-Latn-RS" w:eastAsia="sr-Latn-RS"/>
+              </w:rPr>
+              <w:t xml:space="preserve"> (у </w:t>
+            </w:r>
+            <w:proofErr w:type="spellStart"/>
+            <w:r>
+              <w:rPr>
+                <w:rFonts w:eastAsia="Times New Roman" w:cs="Times New Roman"/>
+                <w:color w:val="000000"/>
+                <w:sz w:val="22"/>
+                <w:szCs w:val="22"/>
+                <w:lang w:val="sr-Latn-RS" w:eastAsia="sr-Latn-RS"/>
+              </w:rPr>
+              <w:t>виду</w:t>
+            </w:r>
+            <w:proofErr w:type="spellEnd"/>
+            <w:r>
+              <w:rPr>
+                <w:rFonts w:eastAsia="Times New Roman" w:cs="Times New Roman"/>
+                <w:color w:val="000000"/>
+                <w:sz w:val="22"/>
+                <w:szCs w:val="22"/>
+                <w:lang w:val="sr-Latn-RS" w:eastAsia="sr-Latn-RS"/>
+              </w:rPr>
+              <w:t xml:space="preserve"> </w:t>
+            </w:r>
+            <w:proofErr w:type="spellStart"/>
+            <w:r>
+              <w:rPr>
+                <w:rFonts w:eastAsia="Times New Roman" w:cs="Times New Roman"/>
+                <w:color w:val="000000"/>
+                <w:sz w:val="22"/>
+                <w:szCs w:val="22"/>
+                <w:lang w:val="sr-Latn-RS" w:eastAsia="sr-Latn-RS"/>
+              </w:rPr>
+              <w:t>поруке</w:t>
+            </w:r>
+            <w:proofErr w:type="spellEnd"/>
+            <w:r>
+              <w:rPr>
+                <w:rFonts w:eastAsia="Times New Roman" w:cs="Times New Roman"/>
+                <w:color w:val="000000"/>
+                <w:sz w:val="22"/>
+                <w:szCs w:val="22"/>
+                <w:lang w:val="sr-Latn-RS" w:eastAsia="sr-Latn-RS"/>
+              </w:rPr>
+              <w:t>)</w:t>
+            </w:r>
+          </w:p>
+        </w:tc>
+        <w:tc>
+          <w:tcPr>
+            <w:tcW w:w="3686" w:type="dxa"/>
+            <w:tcBorders>
+              <w:top w:val="nil"/>
+              <w:left w:val="nil"/>
+              <w:bottom w:val="single" w:sz="4" w:space="0" w:color="auto"/>
+              <w:right w:val="single" w:sz="4" w:space="0" w:color="auto"/>
+            </w:tcBorders>
+            <w:shd w:val="clear" w:color="auto" w:fill="auto"/>
+            <w:vAlign w:val="center"/>
+            <w:hideMark/>
+          </w:tcPr>
+          <w:p>
+            <w:pPr>
+              <w:spacing w:line="240" w:lineRule="auto"/>
+              <w:rPr>
+                <w:rFonts w:eastAsia="Times New Roman" w:cs="Times New Roman"/>
+                <w:color w:val="000000"/>
+                <w:sz w:val="22"/>
+                <w:szCs w:val="22"/>
+                <w:lang w:val="sr-Latn-RS" w:eastAsia="sr-Latn-RS"/>
+              </w:rPr>
+            </w:pPr>
+            <w:r>
+              <w:rPr>
+                <w:rFonts w:eastAsia="Times New Roman" w:cs="Times New Roman"/>
+                <w:color w:val="000000"/>
+                <w:sz w:val="22"/>
+                <w:szCs w:val="22"/>
+                <w:lang w:val="sr-Latn-RS" w:eastAsia="sr-Latn-RS"/>
+              </w:rPr>
+              <w:t xml:space="preserve"> - </w:t>
+            </w:r>
+            <w:proofErr w:type="spellStart"/>
+            <w:r>
+              <w:rPr>
+                <w:rFonts w:eastAsia="Times New Roman" w:cs="Times New Roman"/>
+                <w:color w:val="000000"/>
+                <w:sz w:val="22"/>
+                <w:szCs w:val="22"/>
+                <w:lang w:val="sr-Latn-RS" w:eastAsia="sr-Latn-RS"/>
+              </w:rPr>
+              <w:t>Корисник</w:t>
+            </w:r>
+            <w:proofErr w:type="spellEnd"/>
+            <w:r>
+              <w:rPr>
+                <w:rFonts w:eastAsia="Times New Roman" w:cs="Times New Roman"/>
+                <w:color w:val="000000"/>
+                <w:sz w:val="22"/>
+                <w:szCs w:val="22"/>
+                <w:lang w:val="sr-Latn-RS" w:eastAsia="sr-Latn-RS"/>
+              </w:rPr>
+              <w:t xml:space="preserve"> </w:t>
+            </w:r>
+            <w:proofErr w:type="spellStart"/>
+            <w:r>
+              <w:rPr>
+                <w:rFonts w:eastAsia="Times New Roman" w:cs="Times New Roman"/>
+                <w:color w:val="000000"/>
+                <w:sz w:val="22"/>
+                <w:szCs w:val="22"/>
+                <w:lang w:val="sr-Latn-RS" w:eastAsia="sr-Latn-RS"/>
+              </w:rPr>
+              <w:t>се</w:t>
+            </w:r>
+            <w:proofErr w:type="spellEnd"/>
+            <w:r>
+              <w:rPr>
+                <w:rFonts w:eastAsia="Times New Roman" w:cs="Times New Roman"/>
+                <w:color w:val="000000"/>
+                <w:sz w:val="22"/>
+                <w:szCs w:val="22"/>
+                <w:lang w:val="sr-Latn-RS" w:eastAsia="sr-Latn-RS"/>
+              </w:rPr>
+              <w:t xml:space="preserve"> </w:t>
+            </w:r>
+            <w:proofErr w:type="spellStart"/>
+            <w:r>
+              <w:rPr>
+                <w:rFonts w:eastAsia="Times New Roman" w:cs="Times New Roman"/>
+                <w:color w:val="000000"/>
+                <w:sz w:val="22"/>
+                <w:szCs w:val="22"/>
+                <w:lang w:val="sr-Latn-RS" w:eastAsia="sr-Latn-RS"/>
+              </w:rPr>
+              <w:t>налази</w:t>
+            </w:r>
+            <w:proofErr w:type="spellEnd"/>
+            <w:r>
+              <w:rPr>
+                <w:rFonts w:eastAsia="Times New Roman" w:cs="Times New Roman"/>
+                <w:color w:val="000000"/>
+                <w:sz w:val="22"/>
+                <w:szCs w:val="22"/>
+                <w:lang w:val="sr-Latn-RS" w:eastAsia="sr-Latn-RS"/>
+              </w:rPr>
+              <w:t xml:space="preserve"> у </w:t>
+            </w:r>
+            <w:proofErr w:type="spellStart"/>
+            <w:r>
+              <w:rPr>
+                <w:rFonts w:eastAsia="Times New Roman" w:cs="Times New Roman"/>
+                <w:color w:val="000000"/>
+                <w:sz w:val="22"/>
+                <w:szCs w:val="22"/>
+                <w:lang w:val="sr-Latn-RS" w:eastAsia="sr-Latn-RS"/>
+              </w:rPr>
+              <w:t>делу</w:t>
+            </w:r>
+            <w:proofErr w:type="spellEnd"/>
+            <w:r>
+              <w:rPr>
+                <w:rFonts w:eastAsia="Times New Roman" w:cs="Times New Roman"/>
+                <w:color w:val="000000"/>
+                <w:sz w:val="22"/>
+                <w:szCs w:val="22"/>
+                <w:lang w:val="sr-Latn-RS" w:eastAsia="sr-Latn-RS"/>
+              </w:rPr>
+              <w:t xml:space="preserve"> </w:t>
+            </w:r>
+            <w:proofErr w:type="spellStart"/>
+            <w:r>
+              <w:rPr>
+                <w:rFonts w:eastAsia="Times New Roman" w:cs="Times New Roman"/>
+                <w:color w:val="000000"/>
+                <w:sz w:val="22"/>
+                <w:szCs w:val="22"/>
+                <w:lang w:val="sr-Latn-RS" w:eastAsia="sr-Latn-RS"/>
+              </w:rPr>
+              <w:t>система</w:t>
+            </w:r>
+            <w:proofErr w:type="spellEnd"/>
+            <w:r>
+              <w:rPr>
+                <w:rFonts w:eastAsia="Times New Roman" w:cs="Times New Roman"/>
+                <w:color w:val="000000"/>
+                <w:sz w:val="22"/>
+                <w:szCs w:val="22"/>
+                <w:lang w:val="sr-Latn-RS" w:eastAsia="sr-Latn-RS"/>
+              </w:rPr>
+              <w:t xml:space="preserve"> </w:t>
+            </w:r>
+            <w:proofErr w:type="spellStart"/>
+            <w:r>
+              <w:rPr>
+                <w:rFonts w:eastAsia="Times New Roman" w:cs="Times New Roman"/>
+                <w:color w:val="000000"/>
+                <w:sz w:val="22"/>
+                <w:szCs w:val="22"/>
+                <w:lang w:val="sr-Latn-RS" w:eastAsia="sr-Latn-RS"/>
+              </w:rPr>
+              <w:t>за</w:t>
+            </w:r>
+            <w:proofErr w:type="spellEnd"/>
+            <w:r>
+              <w:rPr>
+                <w:rFonts w:eastAsia="Times New Roman" w:cs="Times New Roman"/>
+                <w:color w:val="000000"/>
+                <w:sz w:val="22"/>
+                <w:szCs w:val="22"/>
+                <w:lang w:val="sr-Latn-RS" w:eastAsia="sr-Latn-RS"/>
+              </w:rPr>
+              <w:t xml:space="preserve"> ФБС</w:t>
+            </w:r>
+            <w:r>
+              <w:rPr>
+                <w:rFonts w:eastAsia="Times New Roman" w:cs="Times New Roman"/>
+                <w:color w:val="000000"/>
+                <w:sz w:val="22"/>
+                <w:szCs w:val="22"/>
+                <w:lang w:val="sr-Latn-RS" w:eastAsia="sr-Latn-RS"/>
+              </w:rPr>
+              <w:br/>
+              <w:t xml:space="preserve"> - </w:t>
+            </w:r>
+            <w:proofErr w:type="spellStart"/>
+            <w:r>
+              <w:rPr>
+                <w:rFonts w:eastAsia="Times New Roman" w:cs="Times New Roman"/>
+                <w:color w:val="000000"/>
+                <w:sz w:val="22"/>
+                <w:szCs w:val="22"/>
+                <w:lang w:val="sr-Latn-RS" w:eastAsia="sr-Latn-RS"/>
+              </w:rPr>
+              <w:t>Порука</w:t>
+            </w:r>
+            <w:proofErr w:type="spellEnd"/>
+            <w:r>
+              <w:rPr>
+                <w:rFonts w:eastAsia="Times New Roman" w:cs="Times New Roman"/>
+                <w:color w:val="000000"/>
+                <w:sz w:val="22"/>
+                <w:szCs w:val="22"/>
+                <w:lang w:val="sr-Latn-RS" w:eastAsia="sr-Latn-RS"/>
+              </w:rPr>
+              <w:t xml:space="preserve"> </w:t>
+            </w:r>
+            <w:proofErr w:type="spellStart"/>
+            <w:r>
+              <w:rPr>
+                <w:rFonts w:eastAsia="Times New Roman" w:cs="Times New Roman"/>
+                <w:color w:val="000000"/>
+                <w:sz w:val="22"/>
+                <w:szCs w:val="22"/>
+                <w:lang w:val="sr-Latn-RS" w:eastAsia="sr-Latn-RS"/>
+              </w:rPr>
+              <w:t>није</w:t>
+            </w:r>
+            <w:proofErr w:type="spellEnd"/>
+            <w:r>
+              <w:rPr>
+                <w:rFonts w:eastAsia="Times New Roman" w:cs="Times New Roman"/>
+                <w:color w:val="000000"/>
+                <w:sz w:val="22"/>
+                <w:szCs w:val="22"/>
+                <w:lang w:val="sr-Latn-RS" w:eastAsia="sr-Latn-RS"/>
+              </w:rPr>
+              <w:t xml:space="preserve"> </w:t>
+            </w:r>
+            <w:proofErr w:type="spellStart"/>
+            <w:r>
+              <w:rPr>
+                <w:rFonts w:eastAsia="Times New Roman" w:cs="Times New Roman"/>
+                <w:color w:val="000000"/>
+                <w:sz w:val="22"/>
+                <w:szCs w:val="22"/>
+                <w:lang w:val="sr-Latn-RS" w:eastAsia="sr-Latn-RS"/>
+              </w:rPr>
+              <w:t>празна</w:t>
+            </w:r>
+            <w:proofErr w:type="spellEnd"/>
+          </w:p>
+        </w:tc>
+        <w:tc>
+          <w:tcPr>
+            <w:tcW w:w="2268" w:type="dxa"/>
+            <w:tcBorders>
+              <w:top w:val="nil"/>
+              <w:left w:val="nil"/>
+              <w:bottom w:val="single" w:sz="4" w:space="0" w:color="auto"/>
+              <w:right w:val="single" w:sz="4" w:space="0" w:color="auto"/>
+            </w:tcBorders>
+            <w:shd w:val="clear" w:color="auto" w:fill="auto"/>
+            <w:noWrap/>
+            <w:vAlign w:val="center"/>
+            <w:hideMark/>
+          </w:tcPr>
+          <w:p>
+            <w:pPr>
+              <w:spacing w:line="240" w:lineRule="auto"/>
+              <w:rPr>
+                <w:rFonts w:eastAsia="Times New Roman" w:cs="Times New Roman"/>
+                <w:color w:val="000000"/>
+                <w:sz w:val="22"/>
+                <w:szCs w:val="22"/>
+                <w:lang w:val="sr-Latn-RS" w:eastAsia="sr-Latn-RS"/>
+              </w:rPr>
+            </w:pPr>
+            <w:r>
+              <w:rPr>
+                <w:rFonts w:eastAsia="Times New Roman" w:cs="Times New Roman"/>
+                <w:color w:val="000000"/>
+                <w:sz w:val="22"/>
+                <w:szCs w:val="22"/>
+                <w:lang w:val="sr-Latn-RS" w:eastAsia="sr-Latn-RS"/>
+              </w:rPr>
+              <w:t xml:space="preserve">- </w:t>
+            </w:r>
+            <w:proofErr w:type="spellStart"/>
+            <w:r>
+              <w:rPr>
+                <w:rFonts w:eastAsia="Times New Roman" w:cs="Times New Roman"/>
+                <w:color w:val="000000"/>
+                <w:sz w:val="22"/>
+                <w:szCs w:val="22"/>
+                <w:lang w:val="sr-Latn-RS" w:eastAsia="sr-Latn-RS"/>
+              </w:rPr>
+              <w:t>Порука</w:t>
+            </w:r>
+            <w:proofErr w:type="spellEnd"/>
+            <w:r>
+              <w:rPr>
+                <w:rFonts w:eastAsia="Times New Roman" w:cs="Times New Roman"/>
+                <w:color w:val="000000"/>
+                <w:sz w:val="22"/>
+                <w:szCs w:val="22"/>
+                <w:lang w:val="sr-Latn-RS" w:eastAsia="sr-Latn-RS"/>
+              </w:rPr>
+              <w:t xml:space="preserve"> </w:t>
+            </w:r>
+            <w:proofErr w:type="spellStart"/>
+            <w:r>
+              <w:rPr>
+                <w:rFonts w:eastAsia="Times New Roman" w:cs="Times New Roman"/>
+                <w:color w:val="000000"/>
+                <w:sz w:val="22"/>
+                <w:szCs w:val="22"/>
+                <w:lang w:val="sr-Latn-RS" w:eastAsia="sr-Latn-RS"/>
+              </w:rPr>
+              <w:t>је</w:t>
+            </w:r>
+            <w:proofErr w:type="spellEnd"/>
+            <w:r>
+              <w:rPr>
+                <w:rFonts w:eastAsia="Times New Roman" w:cs="Times New Roman"/>
+                <w:color w:val="000000"/>
+                <w:sz w:val="22"/>
+                <w:szCs w:val="22"/>
+                <w:lang w:val="sr-Latn-RS" w:eastAsia="sr-Latn-RS"/>
+              </w:rPr>
+              <w:t xml:space="preserve"> </w:t>
+            </w:r>
+            <w:proofErr w:type="spellStart"/>
+            <w:r>
+              <w:rPr>
+                <w:rFonts w:eastAsia="Times New Roman" w:cs="Times New Roman"/>
+                <w:color w:val="000000"/>
+                <w:sz w:val="22"/>
+                <w:szCs w:val="22"/>
+                <w:lang w:val="sr-Latn-RS" w:eastAsia="sr-Latn-RS"/>
+              </w:rPr>
+              <w:t>успешно</w:t>
+            </w:r>
+            <w:proofErr w:type="spellEnd"/>
+            <w:r>
+              <w:rPr>
+                <w:rFonts w:eastAsia="Times New Roman" w:cs="Times New Roman"/>
+                <w:color w:val="000000"/>
+                <w:sz w:val="22"/>
+                <w:szCs w:val="22"/>
+                <w:lang w:val="sr-Latn-RS" w:eastAsia="sr-Latn-RS"/>
+              </w:rPr>
+              <w:t xml:space="preserve"> </w:t>
+            </w:r>
+            <w:proofErr w:type="spellStart"/>
+            <w:r>
+              <w:rPr>
+                <w:rFonts w:eastAsia="Times New Roman" w:cs="Times New Roman"/>
+                <w:color w:val="000000"/>
+                <w:sz w:val="22"/>
+                <w:szCs w:val="22"/>
+                <w:lang w:val="sr-Latn-RS" w:eastAsia="sr-Latn-RS"/>
+              </w:rPr>
+              <w:t>унета</w:t>
+            </w:r>
+            <w:proofErr w:type="spellEnd"/>
+            <w:r>
+              <w:rPr>
+                <w:rFonts w:eastAsia="Times New Roman" w:cs="Times New Roman"/>
+                <w:color w:val="000000"/>
+                <w:sz w:val="22"/>
+                <w:szCs w:val="22"/>
+                <w:lang w:val="sr-Latn-RS" w:eastAsia="sr-Latn-RS"/>
+              </w:rPr>
+              <w:t xml:space="preserve"> и </w:t>
+            </w:r>
+            <w:proofErr w:type="spellStart"/>
+            <w:r>
+              <w:rPr>
+                <w:rFonts w:eastAsia="Times New Roman" w:cs="Times New Roman"/>
+                <w:color w:val="000000"/>
+                <w:sz w:val="22"/>
+                <w:szCs w:val="22"/>
+                <w:lang w:val="sr-Latn-RS" w:eastAsia="sr-Latn-RS"/>
+              </w:rPr>
+              <w:t>послата</w:t>
+            </w:r>
+            <w:proofErr w:type="spellEnd"/>
+          </w:p>
+        </w:tc>
+      </w:tr>
+      <w:tr>
+        <w:trPr>
+          <w:trHeight w:val="288"/>
+        </w:trPr>
+        <w:tc>
+          <w:tcPr>
+            <w:tcW w:w="2405" w:type="dxa"/>
+            <w:tcBorders>
+              <w:top w:val="nil"/>
+              <w:left w:val="single" w:sz="4" w:space="0" w:color="auto"/>
+              <w:bottom w:val="single" w:sz="4" w:space="0" w:color="auto"/>
+              <w:right w:val="single" w:sz="4" w:space="0" w:color="auto"/>
+            </w:tcBorders>
+            <w:shd w:val="clear" w:color="auto" w:fill="auto"/>
+            <w:noWrap/>
+            <w:vAlign w:val="center"/>
+            <w:hideMark/>
+          </w:tcPr>
+          <w:p>
+            <w:pPr>
+              <w:spacing w:line="240" w:lineRule="auto"/>
+              <w:rPr>
+                <w:rFonts w:eastAsia="Times New Roman" w:cs="Times New Roman"/>
+                <w:color w:val="000000"/>
+                <w:sz w:val="22"/>
+                <w:szCs w:val="22"/>
+                <w:lang w:val="sr-Latn-RS" w:eastAsia="sr-Latn-RS"/>
+              </w:rPr>
+            </w:pPr>
+            <w:proofErr w:type="spellStart"/>
+            <w:r>
+              <w:rPr>
+                <w:rFonts w:eastAsia="Times New Roman" w:cs="Times New Roman"/>
+                <w:color w:val="000000"/>
+                <w:sz w:val="22"/>
+                <w:szCs w:val="22"/>
+                <w:lang w:val="sr-Latn-RS" w:eastAsia="sr-Latn-RS"/>
+              </w:rPr>
+              <w:t>Препорука</w:t>
+            </w:r>
+            <w:proofErr w:type="spellEnd"/>
+            <w:r>
+              <w:rPr>
+                <w:rFonts w:eastAsia="Times New Roman" w:cs="Times New Roman"/>
+                <w:color w:val="000000"/>
+                <w:sz w:val="22"/>
+                <w:szCs w:val="22"/>
+                <w:lang w:val="sr-Latn-RS" w:eastAsia="sr-Latn-RS"/>
+              </w:rPr>
+              <w:t xml:space="preserve"> </w:t>
+            </w:r>
+            <w:proofErr w:type="spellStart"/>
+            <w:r>
+              <w:rPr>
+                <w:rFonts w:eastAsia="Times New Roman" w:cs="Times New Roman"/>
+                <w:color w:val="000000"/>
+                <w:sz w:val="22"/>
+                <w:szCs w:val="22"/>
+                <w:lang w:val="sr-Latn-RS" w:eastAsia="sr-Latn-RS"/>
+              </w:rPr>
+              <w:t>филмова</w:t>
+            </w:r>
+            <w:proofErr w:type="spellEnd"/>
+          </w:p>
+        </w:tc>
+        <w:tc>
+          <w:tcPr>
+            <w:tcW w:w="3686" w:type="dxa"/>
+            <w:tcBorders>
+              <w:top w:val="nil"/>
+              <w:left w:val="nil"/>
+              <w:bottom w:val="single" w:sz="4" w:space="0" w:color="auto"/>
+              <w:right w:val="single" w:sz="4" w:space="0" w:color="auto"/>
+            </w:tcBorders>
+            <w:shd w:val="clear" w:color="auto" w:fill="auto"/>
+            <w:noWrap/>
+            <w:vAlign w:val="center"/>
+            <w:hideMark/>
+          </w:tcPr>
+          <w:p>
+            <w:pPr>
+              <w:spacing w:line="240" w:lineRule="auto"/>
+              <w:rPr>
+                <w:rFonts w:eastAsia="Times New Roman" w:cs="Times New Roman"/>
+                <w:color w:val="000000"/>
+                <w:sz w:val="22"/>
+                <w:szCs w:val="22"/>
+                <w:lang w:val="sr-Latn-RS" w:eastAsia="sr-Latn-RS"/>
+              </w:rPr>
+            </w:pPr>
+            <w:r>
+              <w:rPr>
+                <w:rFonts w:eastAsia="Times New Roman" w:cs="Times New Roman"/>
+                <w:color w:val="000000"/>
+                <w:sz w:val="22"/>
+                <w:szCs w:val="22"/>
+                <w:lang w:val="sr-Latn-RS" w:eastAsia="sr-Latn-RS"/>
+              </w:rPr>
+              <w:t xml:space="preserve">- </w:t>
+            </w:r>
+            <w:proofErr w:type="spellStart"/>
+            <w:r>
+              <w:rPr>
+                <w:rFonts w:eastAsia="Times New Roman" w:cs="Times New Roman"/>
+                <w:color w:val="000000"/>
+                <w:sz w:val="22"/>
+                <w:szCs w:val="22"/>
+                <w:lang w:val="sr-Latn-RS" w:eastAsia="sr-Latn-RS"/>
+              </w:rPr>
+              <w:t>Порука</w:t>
+            </w:r>
+            <w:proofErr w:type="spellEnd"/>
+            <w:r>
+              <w:rPr>
+                <w:rFonts w:eastAsia="Times New Roman" w:cs="Times New Roman"/>
+                <w:color w:val="000000"/>
+                <w:sz w:val="22"/>
+                <w:szCs w:val="22"/>
+                <w:lang w:val="sr-Latn-RS" w:eastAsia="sr-Latn-RS"/>
+              </w:rPr>
+              <w:t xml:space="preserve"> </w:t>
+            </w:r>
+            <w:proofErr w:type="spellStart"/>
+            <w:r>
+              <w:rPr>
+                <w:rFonts w:eastAsia="Times New Roman" w:cs="Times New Roman"/>
+                <w:color w:val="000000"/>
+                <w:sz w:val="22"/>
+                <w:szCs w:val="22"/>
+                <w:lang w:val="sr-Latn-RS" w:eastAsia="sr-Latn-RS"/>
+              </w:rPr>
+              <w:t>је</w:t>
+            </w:r>
+            <w:proofErr w:type="spellEnd"/>
+            <w:r>
+              <w:rPr>
+                <w:rFonts w:eastAsia="Times New Roman" w:cs="Times New Roman"/>
+                <w:color w:val="000000"/>
+                <w:sz w:val="22"/>
+                <w:szCs w:val="22"/>
+                <w:lang w:val="sr-Latn-RS" w:eastAsia="sr-Latn-RS"/>
+              </w:rPr>
+              <w:t xml:space="preserve"> </w:t>
+            </w:r>
+            <w:proofErr w:type="spellStart"/>
+            <w:r>
+              <w:rPr>
+                <w:rFonts w:eastAsia="Times New Roman" w:cs="Times New Roman"/>
+                <w:color w:val="000000"/>
+                <w:sz w:val="22"/>
+                <w:szCs w:val="22"/>
+                <w:lang w:val="sr-Latn-RS" w:eastAsia="sr-Latn-RS"/>
+              </w:rPr>
+              <w:t>послата</w:t>
+            </w:r>
+            <w:proofErr w:type="spellEnd"/>
+          </w:p>
+        </w:tc>
+        <w:tc>
+          <w:tcPr>
+            <w:tcW w:w="2268" w:type="dxa"/>
+            <w:tcBorders>
+              <w:top w:val="nil"/>
+              <w:left w:val="nil"/>
+              <w:bottom w:val="single" w:sz="4" w:space="0" w:color="auto"/>
+              <w:right w:val="single" w:sz="4" w:space="0" w:color="auto"/>
+            </w:tcBorders>
+            <w:shd w:val="clear" w:color="auto" w:fill="auto"/>
+            <w:noWrap/>
+            <w:vAlign w:val="center"/>
+            <w:hideMark/>
+          </w:tcPr>
+          <w:p>
+            <w:pPr>
+              <w:spacing w:line="240" w:lineRule="auto"/>
+              <w:rPr>
+                <w:rFonts w:eastAsia="Times New Roman" w:cs="Times New Roman"/>
+                <w:color w:val="000000"/>
+                <w:sz w:val="22"/>
+                <w:szCs w:val="22"/>
+                <w:lang w:val="sr-Latn-RS" w:eastAsia="sr-Latn-RS"/>
+              </w:rPr>
+            </w:pPr>
+            <w:r>
+              <w:rPr>
+                <w:rFonts w:eastAsia="Times New Roman" w:cs="Times New Roman"/>
+                <w:color w:val="000000"/>
+                <w:sz w:val="22"/>
+                <w:szCs w:val="22"/>
+                <w:lang w:val="sr-Latn-RS" w:eastAsia="sr-Latn-RS"/>
+              </w:rPr>
+              <w:t xml:space="preserve"> - </w:t>
+            </w:r>
+            <w:proofErr w:type="spellStart"/>
+            <w:r>
+              <w:rPr>
+                <w:rFonts w:eastAsia="Times New Roman" w:cs="Times New Roman"/>
+                <w:color w:val="000000"/>
+                <w:sz w:val="22"/>
+                <w:szCs w:val="22"/>
+                <w:lang w:val="sr-Latn-RS" w:eastAsia="sr-Latn-RS"/>
+              </w:rPr>
+              <w:t>Пронађени</w:t>
+            </w:r>
+            <w:proofErr w:type="spellEnd"/>
+            <w:r>
+              <w:rPr>
+                <w:rFonts w:eastAsia="Times New Roman" w:cs="Times New Roman"/>
+                <w:color w:val="000000"/>
+                <w:sz w:val="22"/>
+                <w:szCs w:val="22"/>
+                <w:lang w:val="sr-Latn-RS" w:eastAsia="sr-Latn-RS"/>
+              </w:rPr>
+              <w:t xml:space="preserve"> </w:t>
+            </w:r>
+            <w:proofErr w:type="spellStart"/>
+            <w:r>
+              <w:rPr>
+                <w:rFonts w:eastAsia="Times New Roman" w:cs="Times New Roman"/>
+                <w:color w:val="000000"/>
+                <w:sz w:val="22"/>
+                <w:szCs w:val="22"/>
+                <w:lang w:val="sr-Latn-RS" w:eastAsia="sr-Latn-RS"/>
+              </w:rPr>
+              <w:t>су</w:t>
+            </w:r>
+            <w:proofErr w:type="spellEnd"/>
+            <w:r>
+              <w:rPr>
+                <w:rFonts w:eastAsia="Times New Roman" w:cs="Times New Roman"/>
+                <w:color w:val="000000"/>
+                <w:sz w:val="22"/>
+                <w:szCs w:val="22"/>
+                <w:lang w:val="sr-Latn-RS" w:eastAsia="sr-Latn-RS"/>
+              </w:rPr>
+              <w:t xml:space="preserve"> </w:t>
+            </w:r>
+            <w:proofErr w:type="spellStart"/>
+            <w:r>
+              <w:rPr>
+                <w:rFonts w:eastAsia="Times New Roman" w:cs="Times New Roman"/>
+                <w:color w:val="000000"/>
+                <w:sz w:val="22"/>
+                <w:szCs w:val="22"/>
+                <w:lang w:val="sr-Latn-RS" w:eastAsia="sr-Latn-RS"/>
+              </w:rPr>
+              <w:t>филмови</w:t>
+            </w:r>
+            <w:proofErr w:type="spellEnd"/>
+            <w:r>
+              <w:rPr>
+                <w:rFonts w:eastAsia="Times New Roman" w:cs="Times New Roman"/>
+                <w:color w:val="000000"/>
+                <w:sz w:val="22"/>
+                <w:szCs w:val="22"/>
+                <w:lang w:val="sr-Latn-RS" w:eastAsia="sr-Latn-RS"/>
+              </w:rPr>
+              <w:t xml:space="preserve"> </w:t>
+            </w:r>
+            <w:proofErr w:type="spellStart"/>
+            <w:r>
+              <w:rPr>
+                <w:rFonts w:eastAsia="Times New Roman" w:cs="Times New Roman"/>
+                <w:color w:val="000000"/>
+                <w:sz w:val="22"/>
+                <w:szCs w:val="22"/>
+                <w:lang w:val="sr-Latn-RS" w:eastAsia="sr-Latn-RS"/>
+              </w:rPr>
+              <w:t>за</w:t>
+            </w:r>
+            <w:proofErr w:type="spellEnd"/>
+            <w:r>
+              <w:rPr>
+                <w:rFonts w:eastAsia="Times New Roman" w:cs="Times New Roman"/>
+                <w:color w:val="000000"/>
+                <w:sz w:val="22"/>
+                <w:szCs w:val="22"/>
+                <w:lang w:val="sr-Latn-RS" w:eastAsia="sr-Latn-RS"/>
+              </w:rPr>
+              <w:t xml:space="preserve"> </w:t>
+            </w:r>
+            <w:proofErr w:type="spellStart"/>
+            <w:r>
+              <w:rPr>
+                <w:rFonts w:eastAsia="Times New Roman" w:cs="Times New Roman"/>
+                <w:color w:val="000000"/>
+                <w:sz w:val="22"/>
+                <w:szCs w:val="22"/>
+                <w:lang w:val="sr-Latn-RS" w:eastAsia="sr-Latn-RS"/>
+              </w:rPr>
+              <w:t>препоручивање</w:t>
+            </w:r>
+            <w:proofErr w:type="spellEnd"/>
+          </w:p>
+        </w:tc>
+      </w:tr>
+      <w:tr>
+        <w:trPr>
+          <w:trHeight w:val="288"/>
+        </w:trPr>
+        <w:tc>
+          <w:tcPr>
+            <w:tcW w:w="2405" w:type="dxa"/>
+            <w:tcBorders>
+              <w:top w:val="nil"/>
+              <w:left w:val="single" w:sz="4" w:space="0" w:color="auto"/>
+              <w:bottom w:val="single" w:sz="4" w:space="0" w:color="auto"/>
+              <w:right w:val="single" w:sz="4" w:space="0" w:color="auto"/>
+            </w:tcBorders>
+            <w:shd w:val="clear" w:color="auto" w:fill="auto"/>
+            <w:noWrap/>
+            <w:vAlign w:val="center"/>
+            <w:hideMark/>
+          </w:tcPr>
+          <w:p>
+            <w:pPr>
+              <w:spacing w:line="240" w:lineRule="auto"/>
+              <w:rPr>
+                <w:rFonts w:eastAsia="Times New Roman" w:cs="Times New Roman"/>
+                <w:color w:val="000000"/>
+                <w:sz w:val="22"/>
+                <w:szCs w:val="22"/>
+                <w:lang w:val="sr-Latn-RS" w:eastAsia="sr-Latn-RS"/>
+              </w:rPr>
+            </w:pPr>
+            <w:proofErr w:type="spellStart"/>
+            <w:r>
+              <w:rPr>
+                <w:rFonts w:eastAsia="Times New Roman" w:cs="Times New Roman"/>
+                <w:color w:val="000000"/>
+                <w:sz w:val="22"/>
+                <w:szCs w:val="22"/>
+                <w:lang w:val="sr-Latn-RS" w:eastAsia="sr-Latn-RS"/>
+              </w:rPr>
+              <w:t>Приказ</w:t>
+            </w:r>
+            <w:proofErr w:type="spellEnd"/>
+            <w:r>
+              <w:rPr>
+                <w:rFonts w:eastAsia="Times New Roman" w:cs="Times New Roman"/>
+                <w:color w:val="000000"/>
+                <w:sz w:val="22"/>
+                <w:szCs w:val="22"/>
+                <w:lang w:val="sr-Latn-RS" w:eastAsia="sr-Latn-RS"/>
+              </w:rPr>
+              <w:t xml:space="preserve"> </w:t>
+            </w:r>
+            <w:proofErr w:type="spellStart"/>
+            <w:r>
+              <w:rPr>
+                <w:rFonts w:eastAsia="Times New Roman" w:cs="Times New Roman"/>
+                <w:color w:val="000000"/>
+                <w:sz w:val="22"/>
+                <w:szCs w:val="22"/>
+                <w:lang w:val="sr-Latn-RS" w:eastAsia="sr-Latn-RS"/>
+              </w:rPr>
+              <w:t>филмова</w:t>
+            </w:r>
+            <w:proofErr w:type="spellEnd"/>
+            <w:r>
+              <w:rPr>
+                <w:rFonts w:eastAsia="Times New Roman" w:cs="Times New Roman"/>
+                <w:color w:val="000000"/>
+                <w:sz w:val="22"/>
+                <w:szCs w:val="22"/>
+                <w:lang w:val="sr-Latn-RS" w:eastAsia="sr-Latn-RS"/>
+              </w:rPr>
+              <w:t xml:space="preserve"> (у </w:t>
+            </w:r>
+            <w:proofErr w:type="spellStart"/>
+            <w:r>
+              <w:rPr>
+                <w:rFonts w:eastAsia="Times New Roman" w:cs="Times New Roman"/>
+                <w:color w:val="000000"/>
+                <w:sz w:val="22"/>
+                <w:szCs w:val="22"/>
+                <w:lang w:val="sr-Latn-RS" w:eastAsia="sr-Latn-RS"/>
+              </w:rPr>
+              <w:t>виду</w:t>
+            </w:r>
+            <w:proofErr w:type="spellEnd"/>
+            <w:r>
+              <w:rPr>
+                <w:rFonts w:eastAsia="Times New Roman" w:cs="Times New Roman"/>
+                <w:color w:val="000000"/>
+                <w:sz w:val="22"/>
+                <w:szCs w:val="22"/>
+                <w:lang w:val="sr-Latn-RS" w:eastAsia="sr-Latn-RS"/>
+              </w:rPr>
+              <w:t xml:space="preserve"> </w:t>
+            </w:r>
+            <w:proofErr w:type="spellStart"/>
+            <w:r>
+              <w:rPr>
+                <w:rFonts w:eastAsia="Times New Roman" w:cs="Times New Roman"/>
+                <w:color w:val="000000"/>
+                <w:sz w:val="22"/>
+                <w:szCs w:val="22"/>
+                <w:lang w:val="sr-Latn-RS" w:eastAsia="sr-Latn-RS"/>
+              </w:rPr>
+              <w:t>поруке</w:t>
+            </w:r>
+            <w:proofErr w:type="spellEnd"/>
+            <w:r>
+              <w:rPr>
+                <w:rFonts w:eastAsia="Times New Roman" w:cs="Times New Roman"/>
+                <w:color w:val="000000"/>
+                <w:sz w:val="22"/>
+                <w:szCs w:val="22"/>
+                <w:lang w:val="sr-Latn-RS" w:eastAsia="sr-Latn-RS"/>
+              </w:rPr>
+              <w:t>)</w:t>
+            </w:r>
+          </w:p>
+        </w:tc>
+        <w:tc>
+          <w:tcPr>
+            <w:tcW w:w="3686" w:type="dxa"/>
+            <w:tcBorders>
+              <w:top w:val="nil"/>
+              <w:left w:val="nil"/>
+              <w:bottom w:val="single" w:sz="4" w:space="0" w:color="auto"/>
+              <w:right w:val="single" w:sz="4" w:space="0" w:color="auto"/>
+            </w:tcBorders>
+            <w:shd w:val="clear" w:color="auto" w:fill="auto"/>
+            <w:vAlign w:val="center"/>
+            <w:hideMark/>
+          </w:tcPr>
+          <w:p>
+            <w:pPr>
+              <w:spacing w:line="240" w:lineRule="auto"/>
+              <w:rPr>
+                <w:rFonts w:eastAsia="Times New Roman" w:cs="Times New Roman"/>
+                <w:color w:val="000000"/>
+                <w:sz w:val="22"/>
+                <w:szCs w:val="22"/>
+                <w:lang w:val="sr-Latn-RS" w:eastAsia="sr-Latn-RS"/>
+              </w:rPr>
+            </w:pPr>
+            <w:r>
+              <w:rPr>
+                <w:rFonts w:eastAsia="Times New Roman" w:cs="Times New Roman"/>
+                <w:color w:val="000000"/>
+                <w:sz w:val="22"/>
+                <w:szCs w:val="22"/>
+                <w:lang w:val="sr-Latn-RS" w:eastAsia="sr-Latn-RS"/>
+              </w:rPr>
+              <w:t xml:space="preserve"> - </w:t>
+            </w:r>
+            <w:proofErr w:type="spellStart"/>
+            <w:r>
+              <w:rPr>
+                <w:rFonts w:eastAsia="Times New Roman" w:cs="Times New Roman"/>
+                <w:color w:val="000000"/>
+                <w:sz w:val="22"/>
+                <w:szCs w:val="22"/>
+                <w:lang w:val="sr-Latn-RS" w:eastAsia="sr-Latn-RS"/>
+              </w:rPr>
+              <w:t>Пронађени</w:t>
+            </w:r>
+            <w:proofErr w:type="spellEnd"/>
+            <w:r>
+              <w:rPr>
+                <w:rFonts w:eastAsia="Times New Roman" w:cs="Times New Roman"/>
+                <w:color w:val="000000"/>
+                <w:sz w:val="22"/>
+                <w:szCs w:val="22"/>
+                <w:lang w:val="sr-Latn-RS" w:eastAsia="sr-Latn-RS"/>
+              </w:rPr>
+              <w:t xml:space="preserve"> </w:t>
+            </w:r>
+            <w:proofErr w:type="spellStart"/>
+            <w:r>
+              <w:rPr>
+                <w:rFonts w:eastAsia="Times New Roman" w:cs="Times New Roman"/>
+                <w:color w:val="000000"/>
+                <w:sz w:val="22"/>
+                <w:szCs w:val="22"/>
+                <w:lang w:val="sr-Latn-RS" w:eastAsia="sr-Latn-RS"/>
+              </w:rPr>
+              <w:t>су</w:t>
+            </w:r>
+            <w:proofErr w:type="spellEnd"/>
+            <w:r>
+              <w:rPr>
+                <w:rFonts w:eastAsia="Times New Roman" w:cs="Times New Roman"/>
+                <w:color w:val="000000"/>
+                <w:sz w:val="22"/>
+                <w:szCs w:val="22"/>
+                <w:lang w:val="sr-Latn-RS" w:eastAsia="sr-Latn-RS"/>
+              </w:rPr>
+              <w:t xml:space="preserve"> </w:t>
+            </w:r>
+            <w:proofErr w:type="spellStart"/>
+            <w:r>
+              <w:rPr>
+                <w:rFonts w:eastAsia="Times New Roman" w:cs="Times New Roman"/>
+                <w:color w:val="000000"/>
+                <w:sz w:val="22"/>
+                <w:szCs w:val="22"/>
+                <w:lang w:val="sr-Latn-RS" w:eastAsia="sr-Latn-RS"/>
+              </w:rPr>
+              <w:t>филмови</w:t>
+            </w:r>
+            <w:proofErr w:type="spellEnd"/>
+            <w:r>
+              <w:rPr>
+                <w:rFonts w:eastAsia="Times New Roman" w:cs="Times New Roman"/>
+                <w:color w:val="000000"/>
+                <w:sz w:val="22"/>
+                <w:szCs w:val="22"/>
+                <w:lang w:val="sr-Latn-RS" w:eastAsia="sr-Latn-RS"/>
+              </w:rPr>
+              <w:t xml:space="preserve"> </w:t>
+            </w:r>
+            <w:proofErr w:type="spellStart"/>
+            <w:r>
+              <w:rPr>
+                <w:rFonts w:eastAsia="Times New Roman" w:cs="Times New Roman"/>
+                <w:color w:val="000000"/>
+                <w:sz w:val="22"/>
+                <w:szCs w:val="22"/>
+                <w:lang w:val="sr-Latn-RS" w:eastAsia="sr-Latn-RS"/>
+              </w:rPr>
+              <w:t>за</w:t>
+            </w:r>
+            <w:proofErr w:type="spellEnd"/>
+            <w:r>
+              <w:rPr>
+                <w:rFonts w:eastAsia="Times New Roman" w:cs="Times New Roman"/>
+                <w:color w:val="000000"/>
+                <w:sz w:val="22"/>
+                <w:szCs w:val="22"/>
+                <w:lang w:val="sr-Latn-RS" w:eastAsia="sr-Latn-RS"/>
+              </w:rPr>
+              <w:t xml:space="preserve"> </w:t>
+            </w:r>
+            <w:proofErr w:type="spellStart"/>
+            <w:r>
+              <w:rPr>
+                <w:rFonts w:eastAsia="Times New Roman" w:cs="Times New Roman"/>
+                <w:color w:val="000000"/>
+                <w:sz w:val="22"/>
+                <w:szCs w:val="22"/>
+                <w:lang w:val="sr-Latn-RS" w:eastAsia="sr-Latn-RS"/>
+              </w:rPr>
+              <w:t>препоручивање</w:t>
+            </w:r>
+            <w:proofErr w:type="spellEnd"/>
+          </w:p>
+        </w:tc>
+        <w:tc>
+          <w:tcPr>
+            <w:tcW w:w="2268" w:type="dxa"/>
+            <w:tcBorders>
+              <w:top w:val="nil"/>
+              <w:left w:val="nil"/>
+              <w:bottom w:val="single" w:sz="4" w:space="0" w:color="auto"/>
+              <w:right w:val="single" w:sz="4" w:space="0" w:color="auto"/>
+            </w:tcBorders>
+            <w:shd w:val="clear" w:color="auto" w:fill="auto"/>
+            <w:noWrap/>
+            <w:vAlign w:val="center"/>
+            <w:hideMark/>
+          </w:tcPr>
+          <w:p>
+            <w:pPr>
+              <w:spacing w:line="240" w:lineRule="auto"/>
+              <w:rPr>
+                <w:rFonts w:eastAsia="Times New Roman" w:cs="Times New Roman"/>
+                <w:color w:val="000000"/>
+                <w:sz w:val="22"/>
+                <w:szCs w:val="22"/>
+                <w:lang w:val="sr-Latn-RS" w:eastAsia="sr-Latn-RS"/>
+              </w:rPr>
+            </w:pPr>
+            <w:r>
+              <w:rPr>
+                <w:rFonts w:eastAsia="Times New Roman" w:cs="Times New Roman"/>
+                <w:color w:val="000000"/>
+                <w:sz w:val="22"/>
+                <w:szCs w:val="22"/>
+                <w:lang w:val="sr-Latn-RS" w:eastAsia="sr-Latn-RS"/>
+              </w:rPr>
+              <w:t xml:space="preserve"> - </w:t>
+            </w:r>
+            <w:proofErr w:type="spellStart"/>
+            <w:r>
+              <w:rPr>
+                <w:rFonts w:eastAsia="Times New Roman" w:cs="Times New Roman"/>
+                <w:color w:val="000000"/>
+                <w:sz w:val="22"/>
+                <w:szCs w:val="22"/>
+                <w:lang w:val="sr-Latn-RS" w:eastAsia="sr-Latn-RS"/>
+              </w:rPr>
+              <w:t>Филмови</w:t>
+            </w:r>
+            <w:proofErr w:type="spellEnd"/>
+            <w:r>
+              <w:rPr>
+                <w:rFonts w:eastAsia="Times New Roman" w:cs="Times New Roman"/>
+                <w:color w:val="000000"/>
+                <w:sz w:val="22"/>
+                <w:szCs w:val="22"/>
+                <w:lang w:val="sr-Latn-RS" w:eastAsia="sr-Latn-RS"/>
+              </w:rPr>
+              <w:t xml:space="preserve"> </w:t>
+            </w:r>
+            <w:proofErr w:type="spellStart"/>
+            <w:r>
+              <w:rPr>
+                <w:rFonts w:eastAsia="Times New Roman" w:cs="Times New Roman"/>
+                <w:color w:val="000000"/>
+                <w:sz w:val="22"/>
+                <w:szCs w:val="22"/>
+                <w:lang w:val="sr-Latn-RS" w:eastAsia="sr-Latn-RS"/>
+              </w:rPr>
+              <w:t>су</w:t>
+            </w:r>
+            <w:proofErr w:type="spellEnd"/>
+            <w:r>
+              <w:rPr>
+                <w:rFonts w:eastAsia="Times New Roman" w:cs="Times New Roman"/>
+                <w:color w:val="000000"/>
+                <w:sz w:val="22"/>
+                <w:szCs w:val="22"/>
+                <w:lang w:val="sr-Latn-RS" w:eastAsia="sr-Latn-RS"/>
+              </w:rPr>
+              <w:t xml:space="preserve"> </w:t>
+            </w:r>
+            <w:proofErr w:type="spellStart"/>
+            <w:r>
+              <w:rPr>
+                <w:rFonts w:eastAsia="Times New Roman" w:cs="Times New Roman"/>
+                <w:color w:val="000000"/>
+                <w:sz w:val="22"/>
+                <w:szCs w:val="22"/>
+                <w:lang w:val="sr-Latn-RS" w:eastAsia="sr-Latn-RS"/>
+              </w:rPr>
+              <w:t>успешно</w:t>
+            </w:r>
+            <w:proofErr w:type="spellEnd"/>
+            <w:r>
+              <w:rPr>
+                <w:rFonts w:eastAsia="Times New Roman" w:cs="Times New Roman"/>
+                <w:color w:val="000000"/>
+                <w:sz w:val="22"/>
+                <w:szCs w:val="22"/>
+                <w:lang w:val="sr-Latn-RS" w:eastAsia="sr-Latn-RS"/>
+              </w:rPr>
+              <w:t xml:space="preserve"> </w:t>
+            </w:r>
+            <w:proofErr w:type="spellStart"/>
+            <w:r>
+              <w:rPr>
+                <w:rFonts w:eastAsia="Times New Roman" w:cs="Times New Roman"/>
+                <w:color w:val="000000"/>
+                <w:sz w:val="22"/>
+                <w:szCs w:val="22"/>
+                <w:lang w:val="sr-Latn-RS" w:eastAsia="sr-Latn-RS"/>
+              </w:rPr>
+              <w:t>приказани</w:t>
+            </w:r>
+            <w:proofErr w:type="spellEnd"/>
+          </w:p>
+        </w:tc>
+      </w:tr>
+    </w:tbl>
+    <w:p>
+      <w:pPr>
+        <w:rPr>
+          <w:lang w:val="en-US"/>
+        </w:rPr>
+      </w:pPr>
+    </w:p>
+    <w:p>
+      <w:pPr>
+        <w:jc w:val="both"/>
+        <w:rPr>
+          <w:lang w:val="en-US"/>
+        </w:rPr>
+      </w:pPr>
+    </w:p>
+    <w:p>
+      <w:pPr>
+        <w:jc w:val="both"/>
+        <w:rPr>
           <w:lang w:val="sr-Cyrl-RS"/>
         </w:rPr>
       </w:pPr>
@@ -27967,6 +30906,12 @@
           <w:lang w:val="sr-Cyrl-RS"/>
         </w:rPr>
         <w:t>4</w:t>
+      </w:r>
+      <w:r>
+        <w:rPr>
+          <w:lang w:val="sr-Cyrl-RS"/>
+        </w:rPr>
+        <w:t xml:space="preserve"> и на основу предуслова и пост-услова из табеле 3.2 </w:t>
       </w:r>
       <w:r>
         <w:rPr>
@@ -28145,7 +31090,7 @@
           <w:lang w:val="sr-Cyrl-RS"/>
         </w:rPr>
       </w:pPr>
-      <w:bookmarkStart w:id="18" w:name="_Toc212028728"/>
+      <w:bookmarkStart w:id="18" w:name="_Toc212376490"/>
       <w:r>
         <w:rPr>
           <w:lang w:val="sr-Cyrl-RS"/>
@@ -28197,7 +31142,7 @@
           <w:lang w:val="sr-Cyrl-RS"/>
         </w:rPr>
       </w:pPr>
-      <w:bookmarkStart w:id="19" w:name="_Toc212028729"/>
+      <w:bookmarkStart w:id="19" w:name="_Toc212376491"/>
       <w:r>
         <w:rPr>
           <w:lang w:val="sr-Cyrl-RS"/>
@@ -28423,7 +31368,7 @@
     <w:p>
       <w:pPr>
         <w:rPr>
-          <w:lang w:val="en-US"/>
+          <w:lang w:val="sr-Cyrl-RS"/>
         </w:rPr>
       </w:pPr>
       <w:r>
@@ -28435,23 +31380,17 @@
     </w:p>
     <w:p>
       <w:pPr>
-        <w:rPr>
-          <w:lang w:val="en-US"/>
-        </w:rPr>
-      </w:pPr>
-    </w:p>
-    <w:p>
-      <w:pPr>
         <w:pStyle w:val="Heading2"/>
         <w:rPr>
           <w:lang w:val="sr-Cyrl-RS"/>
         </w:rPr>
       </w:pPr>
-      <w:bookmarkStart w:id="20" w:name="_Toc212028730"/>
-      <w:r>
-        <w:rPr>
-          <w:lang w:val="sr-Cyrl-RS"/>
-        </w:rPr>
+      <w:bookmarkStart w:id="20" w:name="_Toc212376492"/>
+      <w:r>
+        <w:rPr>
+          <w:lang w:val="sr-Cyrl-RS"/>
+        </w:rPr>
+        <w:lastRenderedPageBreak/>
         <w:t>4</w:t>
       </w:r>
       <w:r>
@@ -28748,7 +31687,7 @@
             <w:pPr>
               <w:jc w:val="both"/>
               <w:rPr>
-                <w:lang w:val="sr-Cyrl-RS"/>
+                <w:lang w:val="en-US"/>
               </w:rPr>
             </w:pPr>
             <w:r>
@@ -29425,8 +32364,34 @@
         <w:rPr>
           <w:lang w:val="sr-Cyrl-RS"/>
         </w:rPr>
+        <w:t xml:space="preserve"> 4.3</w:t>
+      </w:r>
+      <w:r>
+        <w:rPr>
+          <w:lang w:val="sr-Cyrl-RS"/>
+        </w:rPr>
         <w:t>.</w:t>
       </w:r>
+    </w:p>
+    <w:p>
+      <w:pPr>
+        <w:pStyle w:val="ListParagraph"/>
+        <w:ind w:left="0"/>
+        <w:jc w:val="both"/>
+        <w:rPr>
+          <w:lang w:val="sr-Cyrl-RS"/>
+        </w:rPr>
+      </w:pPr>
+    </w:p>
+    <w:p>
+      <w:pPr>
+        <w:pStyle w:val="ListParagraph"/>
+        <w:ind w:left="0"/>
+        <w:jc w:val="both"/>
+        <w:rPr>
+          <w:lang w:val="sr-Cyrl-RS"/>
+        </w:rPr>
+      </w:pPr>
     </w:p>
     <w:p>
       <w:pPr>
@@ -31790,7 +34755,7 @@
           <w:lang w:val="sr-Cyrl-RS"/>
         </w:rPr>
       </w:pPr>
-      <w:bookmarkStart w:id="25" w:name="_Toc212028731"/>
+      <w:bookmarkStart w:id="25" w:name="_Toc212376493"/>
       <w:r>
         <w:rPr>
           <w:lang w:val="sr-Cyrl-RS"/>
@@ -32394,7 +35359,7 @@
         </w:rPr>
         <w:br w:type="page"/>
       </w:r>
-      <w:bookmarkStart w:id="26" w:name="_Toc212028732"/>
+      <w:bookmarkStart w:id="26" w:name="_Toc212376494"/>
       <w:r>
         <w:rPr>
           <w:lang w:val="sr-Cyrl-RS"/>
@@ -32459,7 +35424,7 @@
           <w:lang w:val="sr-Cyrl-RS"/>
         </w:rPr>
       </w:pPr>
-      <w:bookmarkStart w:id="27" w:name="_Toc212028733"/>
+      <w:bookmarkStart w:id="27" w:name="_Toc212376495"/>
       <w:r>
         <w:rPr>
           <w:lang w:val="en-US"/>
@@ -35691,7 +38656,7 @@
           <w:lang w:val="sr-Cyrl-RS"/>
         </w:rPr>
         <w:drawing>
-          <wp:inline distT="0" distB="0" distL="0" distR="0" wp14:anchorId="7D5AF9AF" wp14:editId="57577A86">
+          <wp:inline distT="0" distB="0" distL="0" distR="0" wp14:anchorId="7D5AF9AF" wp14:editId="10EB3F9F">
             <wp:extent cx="5275660" cy="3185160"/>
             <wp:effectExtent l="0" t="0" r="1270" b="0"/>
             <wp:docPr id="7" name="Picture 7"/>
@@ -36065,7 +39030,7 @@
           <w:lang w:val="sr-Cyrl-RS"/>
         </w:rPr>
         <w:drawing>
-          <wp:inline distT="0" distB="0" distL="0" distR="0" wp14:anchorId="75622322" wp14:editId="24AE8CAC">
+          <wp:inline distT="0" distB="0" distL="0" distR="0" wp14:anchorId="75622322" wp14:editId="7FB9AB3D">
             <wp:extent cx="4831080" cy="2576575"/>
             <wp:effectExtent l="0" t="0" r="7620" b="0"/>
             <wp:docPr id="9" name="Picture 9"/>
@@ -36350,7 +39315,7 @@
           <w:lang w:val="sr-Cyrl-RS"/>
         </w:rPr>
         <w:drawing>
-          <wp:inline distT="0" distB="0" distL="0" distR="0" wp14:anchorId="5685312B" wp14:editId="38440632">
+          <wp:inline distT="0" distB="0" distL="0" distR="0" wp14:anchorId="5685312B" wp14:editId="7231E8B7">
             <wp:extent cx="5165092" cy="2754716"/>
             <wp:effectExtent l="0" t="0" r="0" b="7620"/>
             <wp:docPr id="6" name="Picture 6"/>
@@ -36721,7 +39686,7 @@
           <w:lang w:val="sr-Cyrl-RS"/>
         </w:rPr>
         <w:drawing>
-          <wp:inline distT="0" distB="0" distL="0" distR="0" wp14:anchorId="28785063" wp14:editId="46835AED">
+          <wp:inline distT="0" distB="0" distL="0" distR="0" wp14:anchorId="28785063" wp14:editId="721D8987">
             <wp:extent cx="5294493" cy="2823730"/>
             <wp:effectExtent l="0" t="0" r="1905" b="0"/>
             <wp:docPr id="8" name="Picture 8"/>
@@ -38670,7 +41635,7 @@
           <w:lang w:val="sr-Cyrl-RS"/>
         </w:rPr>
       </w:pPr>
-      <w:bookmarkStart w:id="32" w:name="_Toc212028734"/>
+      <w:bookmarkStart w:id="32" w:name="_Toc212376496"/>
       <w:r>
         <w:rPr>
           <w:lang w:val="sr-Cyrl-RS"/>
@@ -41722,7 +44687,7 @@
           <w:lang w:val="en-US"/>
         </w:rPr>
       </w:pPr>
-      <w:bookmarkStart w:id="35" w:name="_Toc212028735"/>
+      <w:bookmarkStart w:id="35" w:name="_Toc212376497"/>
       <w:r>
         <w:rPr>
           <w:lang w:val="sr-Cyrl-RS"/>
@@ -42413,7 +45378,7 @@
           <w:lang w:val="sr-Cyrl-RS"/>
         </w:rPr>
       </w:pPr>
-      <w:bookmarkStart w:id="36" w:name="_Toc212028736"/>
+      <w:bookmarkStart w:id="36" w:name="_Toc212376498"/>
       <w:r>
         <w:rPr>
           <w:lang w:val="sr-Cyrl-RS"/>
@@ -42761,31 +45726,16 @@
         </w:rPr>
         <w:t xml:space="preserve">2022). </w:t>
       </w:r>
-      <w:r>
-        <w:fldChar w:fldCharType="begin"/>
-      </w:r>
-      <w:r>
-        <w:instrText>HYPERLINK "https://doi.org/10.1186/s40537-022-00592-5"</w:instrText>
-      </w:r>
-      <w:r>
-        <w:fldChar w:fldCharType="separate"/>
-      </w:r>
-      <w:r>
-        <w:rPr>
-          <w:rStyle w:val="Hyperlink"/>
-          <w:rFonts w:cs="Times New Roman"/>
-          <w:lang w:val="sr-Cyrl-RS"/>
-        </w:rPr>
-        <w:t>https://doi.org/10.1186/s40537-022-00592-5</w:t>
-      </w:r>
-      <w:r>
-        <w:rPr>
-          <w:rStyle w:val="Hyperlink"/>
-          <w:rFonts w:cs="Times New Roman"/>
-          <w:lang w:val="sr-Cyrl-RS"/>
-        </w:rPr>
-        <w:fldChar w:fldCharType="end"/>
-      </w:r>
+      <w:hyperlink r:id="rId42" w:history="1">
+        <w:r>
+          <w:rPr>
+            <w:rStyle w:val="Hyperlink"/>
+            <w:rFonts w:cs="Times New Roman"/>
+            <w:lang w:val="sr-Cyrl-RS"/>
+          </w:rPr>
+          <w:t>https://doi.org/10.1186/s40537-022-00592-5</w:t>
+        </w:r>
+      </w:hyperlink>
     </w:p>
     <w:p>
       <w:pPr>
@@ -42832,23 +45782,7 @@
           <w:rFonts w:cs="Times New Roman"/>
           <w:lang w:val="sr-Cyrl-RS"/>
         </w:rPr>
-        <w:t xml:space="preserve">, </w:t>
-      </w:r>
-      <w:proofErr w:type="spellStart"/>
-      <w:r>
-        <w:rPr>
-          <w:rFonts w:cs="Times New Roman"/>
-          <w:lang w:val="sr-Cyrl-RS"/>
-        </w:rPr>
-        <w:t>et</w:t>
-      </w:r>
-      <w:proofErr w:type="spellEnd"/>
-      <w:r>
-        <w:rPr>
-          <w:rFonts w:cs="Times New Roman"/>
-          <w:lang w:val="sr-Cyrl-RS"/>
-        </w:rPr>
-        <w:t xml:space="preserve"> </w:t>
+        <w:t xml:space="preserve">, et </w:t>
       </w:r>
       <w:proofErr w:type="spellStart"/>
       <w:r>
@@ -43465,7 +46399,7 @@
         </w:rPr>
         <w:t xml:space="preserve">Преузето са </w:t>
       </w:r>
-      <w:hyperlink r:id="rId42" w:history="1">
+      <w:hyperlink r:id="rId43" w:history="1">
         <w:r>
           <w:rPr>
             <w:rStyle w:val="Hyperlink"/>
@@ -43678,29 +46612,15 @@
         </w:rPr>
         <w:t xml:space="preserve"> </w:t>
       </w:r>
-      <w:r>
-        <w:fldChar w:fldCharType="begin"/>
-      </w:r>
-      <w:r>
-        <w:instrText>HYPERLINK "https://cs.carleton.edu/cs_comps/0607/recommend/recommender/itembased.html"</w:instrText>
-      </w:r>
-      <w:r>
-        <w:fldChar w:fldCharType="separate"/>
-      </w:r>
-      <w:r>
-        <w:rPr>
-          <w:rStyle w:val="Hyperlink"/>
-          <w:lang w:val="sr-Cyrl-RS"/>
-        </w:rPr>
-        <w:t>https://cs.carleton.edu/cs_comps/0607/recommend/recommender/itembased.html</w:t>
-      </w:r>
-      <w:r>
-        <w:rPr>
-          <w:rStyle w:val="Hyperlink"/>
-          <w:lang w:val="sr-Cyrl-RS"/>
-        </w:rPr>
-        <w:fldChar w:fldCharType="end"/>
-      </w:r>
+      <w:hyperlink r:id="rId44" w:history="1">
+        <w:r>
+          <w:rPr>
+            <w:rStyle w:val="Hyperlink"/>
+            <w:lang w:val="sr-Cyrl-RS"/>
+          </w:rPr>
+          <w:t>https://cs.carleton.edu/cs_comps/0607/recommend/recommender/itembased.html</w:t>
+        </w:r>
+      </w:hyperlink>
     </w:p>
     <w:p>
       <w:pPr>
@@ -44501,7 +47421,7 @@
         </w:rPr>
         <w:t xml:space="preserve">, 2024 – Преузето са </w:t>
       </w:r>
-      <w:hyperlink r:id="rId43" w:anchor="f01" w:history="1">
+      <w:hyperlink r:id="rId45" w:anchor="f01" w:history="1">
         <w:r>
           <w:rPr>
             <w:rStyle w:val="Hyperlink"/>
@@ -44594,7 +47514,7 @@
         </w:rPr>
         <w:t xml:space="preserve">, 2025 – преузето са </w:t>
       </w:r>
-      <w:hyperlink r:id="rId44" w:history="1">
+      <w:hyperlink r:id="rId46" w:history="1">
         <w:r>
           <w:rPr>
             <w:rStyle w:val="Hyperlink"/>
@@ -44715,7 +47635,7 @@
         </w:rPr>
         <w:t xml:space="preserve">, 2024 – преузето са </w:t>
       </w:r>
-      <w:hyperlink r:id="rId45" w:history="1">
+      <w:hyperlink r:id="rId47" w:history="1">
         <w:r>
           <w:rPr>
             <w:rStyle w:val="Hyperlink"/>
@@ -44757,7 +47677,7 @@
         </w:rPr>
         <w:t xml:space="preserve">преузето са </w:t>
       </w:r>
-      <w:hyperlink r:id="rId46" w:history="1">
+      <w:hyperlink r:id="rId48" w:history="1">
         <w:r>
           <w:rPr>
             <w:rStyle w:val="Hyperlink"/>
@@ -44851,7 +47771,7 @@
         </w:rPr>
         <w:t xml:space="preserve">, 2021 – преузето са </w:t>
       </w:r>
-      <w:hyperlink r:id="rId47" w:history="1">
+      <w:hyperlink r:id="rId49" w:history="1">
         <w:r>
           <w:rPr>
             <w:rStyle w:val="Hyperlink"/>
@@ -44973,7 +47893,7 @@
         </w:rPr>
         <w:t xml:space="preserve">, - преузето са </w:t>
       </w:r>
-      <w:hyperlink r:id="rId48" w:anchor="fraction-of-concordant-pairs-fcp" w:history="1">
+      <w:hyperlink r:id="rId50" w:anchor="fraction-of-concordant-pairs-fcp" w:history="1">
         <w:r>
           <w:rPr>
             <w:rStyle w:val="Hyperlink"/>
@@ -45317,7 +48237,7 @@
         </w:rPr>
         <w:t xml:space="preserve">, 2017 - </w:t>
       </w:r>
-      <w:hyperlink r:id="rId49" w:history="1">
+      <w:hyperlink r:id="rId51" w:history="1">
         <w:r>
           <w:rPr>
             <w:rStyle w:val="Hyperlink"/>
@@ -45352,7 +48272,7 @@
         </w:rPr>
         <w:t xml:space="preserve">, 2015 - </w:t>
       </w:r>
-      <w:hyperlink r:id="rId50" w:anchor="what-are-raw-and-inner-ids" w:history="1">
+      <w:hyperlink r:id="rId52" w:anchor="what-are-raw-and-inner-ids" w:history="1">
         <w:r>
           <w:rPr>
             <w:rStyle w:val="Hyperlink"/>
@@ -45558,7 +48478,7 @@
         </w:rPr>
         <w:t xml:space="preserve">, 2025 - </w:t>
       </w:r>
-      <w:hyperlink r:id="rId51" w:history="1">
+      <w:hyperlink r:id="rId53" w:history="1">
         <w:r>
           <w:rPr>
             <w:rStyle w:val="Hyperlink"/>
@@ -46154,7 +49074,7 @@
         </w:rPr>
         <w:t xml:space="preserve">, 2024 - </w:t>
       </w:r>
-      <w:hyperlink r:id="rId52" w:history="1">
+      <w:hyperlink r:id="rId54" w:history="1">
         <w:r>
           <w:rPr>
             <w:rStyle w:val="Hyperlink"/>
@@ -46239,7 +49159,7 @@
         </w:rPr>
         <w:t xml:space="preserve">, 2025 - </w:t>
       </w:r>
-      <w:hyperlink r:id="rId53" w:anchor=":~:text=cost%20to%20you.-,What%20is%20TF%2DIDF?,a%2C%20the%2C%20and" w:history="1">
+      <w:hyperlink r:id="rId55" w:anchor=":~:text=cost%20to%20you.-,What%20is%20TF%2DIDF?,a%2C%20the%2C%20and" w:history="1">
         <w:r>
           <w:rPr>
             <w:rStyle w:val="Hyperlink"/>
@@ -46344,7 +49264,7 @@
         </w:rPr>
         <w:t xml:space="preserve">, 2025 - </w:t>
       </w:r>
-      <w:hyperlink r:id="rId54" w:history="1">
+      <w:hyperlink r:id="rId56" w:history="1">
         <w:r>
           <w:rPr>
             <w:rStyle w:val="Hyperlink"/>
@@ -46424,7 +49344,7 @@
         </w:rPr>
         <w:t xml:space="preserve">, 2021 - </w:t>
       </w:r>
-      <w:hyperlink r:id="rId55" w:history="1">
+      <w:hyperlink r:id="rId57" w:history="1">
         <w:r>
           <w:rPr>
             <w:rStyle w:val="Hyperlink"/>
@@ -46496,7 +49416,7 @@
         </w:rPr>
         <w:t xml:space="preserve">, 2024 - </w:t>
       </w:r>
-      <w:hyperlink r:id="rId56" w:history="1">
+      <w:hyperlink r:id="rId58" w:history="1">
         <w:r>
           <w:rPr>
             <w:rStyle w:val="Hyperlink"/>
@@ -46610,7 +49530,7 @@
         </w:rPr>
         <w:t xml:space="preserve">, 2019 - </w:t>
       </w:r>
-      <w:hyperlink r:id="rId57" w:history="1">
+      <w:hyperlink r:id="rId59" w:history="1">
         <w:r>
           <w:rPr>
             <w:rStyle w:val="Hyperlink"/>
@@ -46704,7 +49624,7 @@
         </w:rPr>
         <w:t xml:space="preserve">, 2024 - </w:t>
       </w:r>
-      <w:hyperlink r:id="rId58" w:history="1">
+      <w:hyperlink r:id="rId60" w:history="1">
         <w:r>
           <w:rPr>
             <w:rStyle w:val="Hyperlink"/>
@@ -46829,7 +49749,7 @@
         </w:rPr>
         <w:t xml:space="preserve">, 2025 - </w:t>
       </w:r>
-      <w:hyperlink r:id="rId59" w:history="1">
+      <w:hyperlink r:id="rId61" w:history="1">
         <w:r>
           <w:rPr>
             <w:rStyle w:val="Hyperlink"/>
@@ -46920,7 +49840,7 @@
         </w:rPr>
         <w:t xml:space="preserve">, 2025 - </w:t>
       </w:r>
-      <w:hyperlink r:id="rId60" w:anchor=":~:text=your%20embedding%20requirements?-,What%20are%20embeddings%20in%20machine%20learning?,needed%20to%20complete%20new%20tasks" w:history="1">
+      <w:hyperlink r:id="rId62" w:anchor=":~:text=your%20embedding%20requirements?-,What%20are%20embeddings%20in%20machine%20learning?,needed%20to%20complete%20new%20tasks" w:history="1">
         <w:r>
           <w:rPr>
             <w:rStyle w:val="Hyperlink"/>
@@ -46958,7 +49878,7 @@
       </w:pPr>
     </w:p>
     <w:sectPr>
-      <w:headerReference w:type="first" r:id="rId61"/>
+      <w:headerReference w:type="first" r:id="rId63"/>
       <w:pgSz w:w="11907" w:h="16840" w:code="9"/>
       <w:pgMar w:top="1440" w:right="1800" w:bottom="1440" w:left="1800" w:header="567" w:footer="567" w:gutter="0"/>
       <w:pgNumType w:start="1"/>

</xml_diff>

<commit_message>
chore: page numbers are centered in footer
</commit_message>
<xml_diff>
--- a/thesis/Дипломски рад.docx
+++ b/thesis/Дипломски рад.docx
@@ -6319,7 +6319,7 @@
             </w:rPr>
             <w:fldChar w:fldCharType="separate"/>
           </w:r>
-          <w:hyperlink w:anchor="_Toc212376477" w:history="1">
+          <w:hyperlink w:anchor="_Toc212377644" w:history="1">
             <w:r>
               <w:rPr>
                 <w:rStyle w:val="Hyperlink"/>
@@ -6347,7 +6347,7 @@
                 <w:noProof/>
                 <w:webHidden/>
               </w:rPr>
-              <w:instrText xml:space="preserve"> PAGEREF _Toc212376477 \h </w:instrText>
+              <w:instrText xml:space="preserve"> PAGEREF _Toc212377644 \h </w:instrText>
             </w:r>
             <w:r>
               <w:rPr>
@@ -6389,7 +6389,7 @@
               <w14:ligatures w14:val="standardContextual"/>
             </w:rPr>
           </w:pPr>
-          <w:hyperlink w:anchor="_Toc212376478" w:history="1">
+          <w:hyperlink w:anchor="_Toc212377645" w:history="1">
             <w:r>
               <w:rPr>
                 <w:rStyle w:val="Hyperlink"/>
@@ -6424,7 +6424,7 @@
                 <w:noProof/>
                 <w:webHidden/>
               </w:rPr>
-              <w:instrText xml:space="preserve"> PAGEREF _Toc212376478 \h </w:instrText>
+              <w:instrText xml:space="preserve"> PAGEREF _Toc212377645 \h </w:instrText>
             </w:r>
             <w:r>
               <w:rPr>
@@ -6469,7 +6469,7 @@
               <w14:ligatures w14:val="standardContextual"/>
             </w:rPr>
           </w:pPr>
-          <w:hyperlink w:anchor="_Toc212376479" w:history="1">
+          <w:hyperlink w:anchor="_Toc212377646" w:history="1">
             <w:r>
               <w:rPr>
                 <w:rStyle w:val="Hyperlink"/>
@@ -6519,7 +6519,7 @@
                 <w:noProof/>
                 <w:webHidden/>
               </w:rPr>
-              <w:instrText xml:space="preserve"> PAGEREF _Toc212376479 \h </w:instrText>
+              <w:instrText xml:space="preserve"> PAGEREF _Toc212377646 \h </w:instrText>
             </w:r>
             <w:r>
               <w:rPr>
@@ -6564,7 +6564,7 @@
               <w14:ligatures w14:val="standardContextual"/>
             </w:rPr>
           </w:pPr>
-          <w:hyperlink w:anchor="_Toc212376480" w:history="1">
+          <w:hyperlink w:anchor="_Toc212377647" w:history="1">
             <w:r>
               <w:rPr>
                 <w:rStyle w:val="Hyperlink"/>
@@ -6614,7 +6614,7 @@
                 <w:noProof/>
                 <w:webHidden/>
               </w:rPr>
-              <w:instrText xml:space="preserve"> PAGEREF _Toc212376480 \h </w:instrText>
+              <w:instrText xml:space="preserve"> PAGEREF _Toc212377647 \h </w:instrText>
             </w:r>
             <w:r>
               <w:rPr>
@@ -6659,7 +6659,7 @@
               <w14:ligatures w14:val="standardContextual"/>
             </w:rPr>
           </w:pPr>
-          <w:hyperlink w:anchor="_Toc212376481" w:history="1">
+          <w:hyperlink w:anchor="_Toc212377648" w:history="1">
             <w:r>
               <w:rPr>
                 <w:rStyle w:val="Hyperlink"/>
@@ -6717,7 +6717,7 @@
                 <w:noProof/>
                 <w:webHidden/>
               </w:rPr>
-              <w:instrText xml:space="preserve"> PAGEREF _Toc212376481 \h </w:instrText>
+              <w:instrText xml:space="preserve"> PAGEREF _Toc212377648 \h </w:instrText>
             </w:r>
             <w:r>
               <w:rPr>
@@ -6762,7 +6762,7 @@
               <w14:ligatures w14:val="standardContextual"/>
             </w:rPr>
           </w:pPr>
-          <w:hyperlink w:anchor="_Toc212376482" w:history="1">
+          <w:hyperlink w:anchor="_Toc212377649" w:history="1">
             <w:r>
               <w:rPr>
                 <w:rStyle w:val="Hyperlink"/>
@@ -6812,7 +6812,7 @@
                 <w:noProof/>
                 <w:webHidden/>
               </w:rPr>
-              <w:instrText xml:space="preserve"> PAGEREF _Toc212376482 \h </w:instrText>
+              <w:instrText xml:space="preserve"> PAGEREF _Toc212377649 \h </w:instrText>
             </w:r>
             <w:r>
               <w:rPr>
@@ -6857,7 +6857,7 @@
               <w14:ligatures w14:val="standardContextual"/>
             </w:rPr>
           </w:pPr>
-          <w:hyperlink w:anchor="_Toc212376483" w:history="1">
+          <w:hyperlink w:anchor="_Toc212377650" w:history="1">
             <w:r>
               <w:rPr>
                 <w:rStyle w:val="Hyperlink"/>
@@ -6907,7 +6907,7 @@
                 <w:noProof/>
                 <w:webHidden/>
               </w:rPr>
-              <w:instrText xml:space="preserve"> PAGEREF _Toc212376483 \h </w:instrText>
+              <w:instrText xml:space="preserve"> PAGEREF _Toc212377650 \h </w:instrText>
             </w:r>
             <w:r>
               <w:rPr>
@@ -6952,7 +6952,7 @@
               <w14:ligatures w14:val="standardContextual"/>
             </w:rPr>
           </w:pPr>
-          <w:hyperlink w:anchor="_Toc212376484" w:history="1">
+          <w:hyperlink w:anchor="_Toc212377651" w:history="1">
             <w:r>
               <w:rPr>
                 <w:rStyle w:val="Hyperlink"/>
@@ -7010,7 +7010,7 @@
                 <w:noProof/>
                 <w:webHidden/>
               </w:rPr>
-              <w:instrText xml:space="preserve"> PAGEREF _Toc212376484 \h </w:instrText>
+              <w:instrText xml:space="preserve"> PAGEREF _Toc212377651 \h </w:instrText>
             </w:r>
             <w:r>
               <w:rPr>
@@ -7055,7 +7055,7 @@
               <w14:ligatures w14:val="standardContextual"/>
             </w:rPr>
           </w:pPr>
-          <w:hyperlink w:anchor="_Toc212376485" w:history="1">
+          <w:hyperlink w:anchor="_Toc212377652" w:history="1">
             <w:r>
               <w:rPr>
                 <w:rStyle w:val="Hyperlink"/>
@@ -7121,7 +7121,7 @@
                 <w:noProof/>
                 <w:webHidden/>
               </w:rPr>
-              <w:instrText xml:space="preserve"> PAGEREF _Toc212376485 \h </w:instrText>
+              <w:instrText xml:space="preserve"> PAGEREF _Toc212377652 \h </w:instrText>
             </w:r>
             <w:r>
               <w:rPr>
@@ -7166,7 +7166,7 @@
               <w14:ligatures w14:val="standardContextual"/>
             </w:rPr>
           </w:pPr>
-          <w:hyperlink w:anchor="_Toc212376486" w:history="1">
+          <w:hyperlink w:anchor="_Toc212377653" w:history="1">
             <w:r>
               <w:rPr>
                 <w:rStyle w:val="Hyperlink"/>
@@ -7232,7 +7232,7 @@
                 <w:noProof/>
                 <w:webHidden/>
               </w:rPr>
-              <w:instrText xml:space="preserve"> PAGEREF _Toc212376486 \h </w:instrText>
+              <w:instrText xml:space="preserve"> PAGEREF _Toc212377653 \h </w:instrText>
             </w:r>
             <w:r>
               <w:rPr>
@@ -7274,7 +7274,7 @@
               <w14:ligatures w14:val="standardContextual"/>
             </w:rPr>
           </w:pPr>
-          <w:hyperlink w:anchor="_Toc212376487" w:history="1">
+          <w:hyperlink w:anchor="_Toc212377654" w:history="1">
             <w:r>
               <w:rPr>
                 <w:rStyle w:val="Hyperlink"/>
@@ -7302,7 +7302,7 @@
                 <w:noProof/>
                 <w:webHidden/>
               </w:rPr>
-              <w:instrText xml:space="preserve"> PAGEREF _Toc212376487 \h </w:instrText>
+              <w:instrText xml:space="preserve"> PAGEREF _Toc212377654 \h </w:instrText>
             </w:r>
             <w:r>
               <w:rPr>
@@ -7347,7 +7347,7 @@
               <w14:ligatures w14:val="standardContextual"/>
             </w:rPr>
           </w:pPr>
-          <w:hyperlink w:anchor="_Toc212376488" w:history="1">
+          <w:hyperlink w:anchor="_Toc212377655" w:history="1">
             <w:r>
               <w:rPr>
                 <w:rStyle w:val="Hyperlink"/>
@@ -7390,7 +7390,7 @@
                 <w:noProof/>
                 <w:webHidden/>
               </w:rPr>
-              <w:instrText xml:space="preserve"> PAGEREF _Toc212376488 \h </w:instrText>
+              <w:instrText xml:space="preserve"> PAGEREF _Toc212377655 \h </w:instrText>
             </w:r>
             <w:r>
               <w:rPr>
@@ -7435,7 +7435,7 @@
               <w14:ligatures w14:val="standardContextual"/>
             </w:rPr>
           </w:pPr>
-          <w:hyperlink w:anchor="_Toc212376489" w:history="1">
+          <w:hyperlink w:anchor="_Toc212377656" w:history="1">
             <w:r>
               <w:rPr>
                 <w:rStyle w:val="Hyperlink"/>
@@ -7471,7 +7471,7 @@
                 <w:noProof/>
                 <w:webHidden/>
               </w:rPr>
-              <w:instrText xml:space="preserve"> PAGEREF _Toc212376489 \h </w:instrText>
+              <w:instrText xml:space="preserve"> PAGEREF _Toc212377656 \h </w:instrText>
             </w:r>
             <w:r>
               <w:rPr>
@@ -7513,7 +7513,7 @@
               <w14:ligatures w14:val="standardContextual"/>
             </w:rPr>
           </w:pPr>
-          <w:hyperlink w:anchor="_Toc212376490" w:history="1">
+          <w:hyperlink w:anchor="_Toc212377657" w:history="1">
             <w:r>
               <w:rPr>
                 <w:rStyle w:val="Hyperlink"/>
@@ -7541,7 +7541,7 @@
                 <w:noProof/>
                 <w:webHidden/>
               </w:rPr>
-              <w:instrText xml:space="preserve"> PAGEREF _Toc212376490 \h </w:instrText>
+              <w:instrText xml:space="preserve"> PAGEREF _Toc212377657 \h </w:instrText>
             </w:r>
             <w:r>
               <w:rPr>
@@ -7586,7 +7586,7 @@
               <w14:ligatures w14:val="standardContextual"/>
             </w:rPr>
           </w:pPr>
-          <w:hyperlink w:anchor="_Toc212376491" w:history="1">
+          <w:hyperlink w:anchor="_Toc212377658" w:history="1">
             <w:r>
               <w:rPr>
                 <w:rStyle w:val="Hyperlink"/>
@@ -7629,7 +7629,7 @@
                 <w:noProof/>
                 <w:webHidden/>
               </w:rPr>
-              <w:instrText xml:space="preserve"> PAGEREF _Toc212376491 \h </w:instrText>
+              <w:instrText xml:space="preserve"> PAGEREF _Toc212377658 \h </w:instrText>
             </w:r>
             <w:r>
               <w:rPr>
@@ -7674,7 +7674,7 @@
               <w14:ligatures w14:val="standardContextual"/>
             </w:rPr>
           </w:pPr>
-          <w:hyperlink w:anchor="_Toc212376492" w:history="1">
+          <w:hyperlink w:anchor="_Toc212377659" w:history="1">
             <w:r>
               <w:rPr>
                 <w:rStyle w:val="Hyperlink"/>
@@ -7732,7 +7732,7 @@
                 <w:noProof/>
                 <w:webHidden/>
               </w:rPr>
-              <w:instrText xml:space="preserve"> PAGEREF _Toc212376492 \h </w:instrText>
+              <w:instrText xml:space="preserve"> PAGEREF _Toc212377659 \h </w:instrText>
             </w:r>
             <w:r>
               <w:rPr>
@@ -7777,7 +7777,7 @@
               <w14:ligatures w14:val="standardContextual"/>
             </w:rPr>
           </w:pPr>
-          <w:hyperlink w:anchor="_Toc212376493" w:history="1">
+          <w:hyperlink w:anchor="_Toc212377660" w:history="1">
             <w:r>
               <w:rPr>
                 <w:rStyle w:val="Hyperlink"/>
@@ -7851,7 +7851,7 @@
                 <w:noProof/>
                 <w:webHidden/>
               </w:rPr>
-              <w:instrText xml:space="preserve"> PAGEREF _Toc212376493 \h </w:instrText>
+              <w:instrText xml:space="preserve"> PAGEREF _Toc212377660 \h </w:instrText>
             </w:r>
             <w:r>
               <w:rPr>
@@ -7893,7 +7893,7 @@
               <w14:ligatures w14:val="standardContextual"/>
             </w:rPr>
           </w:pPr>
-          <w:hyperlink w:anchor="_Toc212376494" w:history="1">
+          <w:hyperlink w:anchor="_Toc212377661" w:history="1">
             <w:r>
               <w:rPr>
                 <w:rStyle w:val="Hyperlink"/>
@@ -7928,7 +7928,7 @@
                 <w:noProof/>
                 <w:webHidden/>
               </w:rPr>
-              <w:instrText xml:space="preserve"> PAGEREF _Toc212376494 \h </w:instrText>
+              <w:instrText xml:space="preserve"> PAGEREF _Toc212377661 \h </w:instrText>
             </w:r>
             <w:r>
               <w:rPr>
@@ -7973,7 +7973,7 @@
               <w14:ligatures w14:val="standardContextual"/>
             </w:rPr>
           </w:pPr>
-          <w:hyperlink w:anchor="_Toc212376495" w:history="1">
+          <w:hyperlink w:anchor="_Toc212377662" w:history="1">
             <w:r>
               <w:rPr>
                 <w:rStyle w:val="Hyperlink"/>
@@ -8039,7 +8039,7 @@
                 <w:noProof/>
                 <w:webHidden/>
               </w:rPr>
-              <w:instrText xml:space="preserve"> PAGEREF _Toc212376495 \h </w:instrText>
+              <w:instrText xml:space="preserve"> PAGEREF _Toc212377662 \h </w:instrText>
             </w:r>
             <w:r>
               <w:rPr>
@@ -8084,7 +8084,7 @@
               <w14:ligatures w14:val="standardContextual"/>
             </w:rPr>
           </w:pPr>
-          <w:hyperlink w:anchor="_Toc212376496" w:history="1">
+          <w:hyperlink w:anchor="_Toc212377663" w:history="1">
             <w:r>
               <w:rPr>
                 <w:rStyle w:val="Hyperlink"/>
@@ -8142,7 +8142,7 @@
                 <w:noProof/>
                 <w:webHidden/>
               </w:rPr>
-              <w:instrText xml:space="preserve"> PAGEREF _Toc212376496 \h </w:instrText>
+              <w:instrText xml:space="preserve"> PAGEREF _Toc212377663 \h </w:instrText>
             </w:r>
             <w:r>
               <w:rPr>
@@ -8184,7 +8184,7 @@
               <w14:ligatures w14:val="standardContextual"/>
             </w:rPr>
           </w:pPr>
-          <w:hyperlink w:anchor="_Toc212376497" w:history="1">
+          <w:hyperlink w:anchor="_Toc212377664" w:history="1">
             <w:r>
               <w:rPr>
                 <w:rStyle w:val="Hyperlink"/>
@@ -8212,7 +8212,7 @@
                 <w:noProof/>
                 <w:webHidden/>
               </w:rPr>
-              <w:instrText xml:space="preserve"> PAGEREF _Toc212376497 \h </w:instrText>
+              <w:instrText xml:space="preserve"> PAGEREF _Toc212377664 \h </w:instrText>
             </w:r>
             <w:r>
               <w:rPr>
@@ -8254,7 +8254,7 @@
               <w14:ligatures w14:val="standardContextual"/>
             </w:rPr>
           </w:pPr>
-          <w:hyperlink w:anchor="_Toc212376498" w:history="1">
+          <w:hyperlink w:anchor="_Toc212377665" w:history="1">
             <w:r>
               <w:rPr>
                 <w:rStyle w:val="Hyperlink"/>
@@ -8282,7 +8282,7 @@
                 <w:noProof/>
                 <w:webHidden/>
               </w:rPr>
-              <w:instrText xml:space="preserve"> PAGEREF _Toc212376498 \h </w:instrText>
+              <w:instrText xml:space="preserve"> PAGEREF _Toc212377665 \h </w:instrText>
             </w:r>
             <w:r>
               <w:rPr>
@@ -8368,7 +8368,7 @@
           <w:lang w:val="sr-Cyrl-RS"/>
         </w:rPr>
       </w:pPr>
-      <w:bookmarkStart w:id="1" w:name="_Toc212376477"/>
+      <w:bookmarkStart w:id="1" w:name="_Toc212377644"/>
       <w:r>
         <w:rPr>
           <w:lang w:val="sr-Cyrl-RS"/>
@@ -8519,7 +8519,7 @@
           <w:lang w:val="en-US"/>
         </w:rPr>
       </w:pPr>
-      <w:bookmarkStart w:id="2" w:name="_Toc212376478"/>
+      <w:bookmarkStart w:id="2" w:name="_Toc212377645"/>
       <w:r>
         <w:lastRenderedPageBreak/>
         <w:t xml:space="preserve">2. </w:t>
@@ -12470,7 +12470,7 @@
           <w:lang w:val="sr-Cyrl-RS"/>
         </w:rPr>
       </w:pPr>
-      <w:bookmarkStart w:id="3" w:name="_Toc212376479"/>
+      <w:bookmarkStart w:id="3" w:name="_Toc212377646"/>
       <w:r>
         <w:lastRenderedPageBreak/>
         <w:t>2.</w:t>
@@ -14792,7 +14792,7 @@
           <w:lang w:val="sr-Cyrl-RS"/>
         </w:rPr>
       </w:pPr>
-      <w:bookmarkStart w:id="5" w:name="_Toc212376480"/>
+      <w:bookmarkStart w:id="5" w:name="_Toc212377647"/>
       <w:r>
         <w:lastRenderedPageBreak/>
         <w:t>2.</w:t>
@@ -20179,7 +20179,7 @@
           <w:lang w:val="sr-Cyrl-RS"/>
         </w:rPr>
       </w:pPr>
-      <w:bookmarkStart w:id="6" w:name="_Toc212376481"/>
+      <w:bookmarkStart w:id="6" w:name="_Toc212377648"/>
       <w:r>
         <w:t>2.</w:t>
       </w:r>
@@ -20762,7 +20762,7 @@
           <w:lang w:val="sr-Cyrl-RS"/>
         </w:rPr>
       </w:pPr>
-      <w:bookmarkStart w:id="7" w:name="_Toc212376482"/>
+      <w:bookmarkStart w:id="7" w:name="_Toc212377649"/>
       <w:r>
         <w:lastRenderedPageBreak/>
         <w:t>2.</w:t>
@@ -21126,7 +21126,7 @@
           <w:lang w:val="sr-Cyrl-RS"/>
         </w:rPr>
       </w:pPr>
-      <w:bookmarkStart w:id="8" w:name="_Toc212376483"/>
+      <w:bookmarkStart w:id="8" w:name="_Toc212377650"/>
       <w:r>
         <w:t>2.</w:t>
       </w:r>
@@ -21510,7 +21510,7 @@
           <w:lang w:val="en-US"/>
         </w:rPr>
       </w:pPr>
-      <w:bookmarkStart w:id="9" w:name="_Toc212376484"/>
+      <w:bookmarkStart w:id="9" w:name="_Toc212377651"/>
       <w:r>
         <w:lastRenderedPageBreak/>
         <w:t>2.</w:t>
@@ -22082,7 +22082,7 @@
           <w:lang w:val="sr-Latn-RS"/>
         </w:rPr>
       </w:pPr>
-      <w:bookmarkStart w:id="10" w:name="_Toc212376485"/>
+      <w:bookmarkStart w:id="10" w:name="_Toc212377652"/>
       <w:r>
         <w:lastRenderedPageBreak/>
         <w:t>2.</w:t>
@@ -23845,7 +23845,7 @@
           <w:lang w:val="sr-Cyrl-RS"/>
         </w:rPr>
       </w:pPr>
-      <w:bookmarkStart w:id="12" w:name="_Toc212376486"/>
+      <w:bookmarkStart w:id="12" w:name="_Toc212377653"/>
       <w:r>
         <w:lastRenderedPageBreak/>
         <w:t>2.</w:t>
@@ -27043,7 +27043,7 @@
           <w:lang w:val="en-US"/>
         </w:rPr>
       </w:pPr>
-      <w:bookmarkStart w:id="14" w:name="_Toc212376487"/>
+      <w:bookmarkStart w:id="14" w:name="_Toc212377654"/>
       <w:r>
         <w:rPr>
           <w:lang w:val="sr-Cyrl-RS"/>
@@ -27231,7 +27231,7 @@
           <w:lang w:val="sr-Cyrl-RS"/>
         </w:rPr>
       </w:pPr>
-      <w:bookmarkStart w:id="15" w:name="_Toc212376488"/>
+      <w:bookmarkStart w:id="15" w:name="_Toc212377655"/>
       <w:r>
         <w:rPr>
           <w:lang w:val="en-US"/>
@@ -29178,7 +29178,7 @@
           <w:lang w:val="sr-Cyrl-RS"/>
         </w:rPr>
       </w:pPr>
-      <w:bookmarkStart w:id="16" w:name="_Toc212376489"/>
+      <w:bookmarkStart w:id="16" w:name="_Toc212377656"/>
       <w:r>
         <w:rPr>
           <w:lang w:val="en-US"/>
@@ -31090,7 +31090,7 @@
           <w:lang w:val="sr-Cyrl-RS"/>
         </w:rPr>
       </w:pPr>
-      <w:bookmarkStart w:id="18" w:name="_Toc212376490"/>
+      <w:bookmarkStart w:id="18" w:name="_Toc212377657"/>
       <w:r>
         <w:rPr>
           <w:lang w:val="sr-Cyrl-RS"/>
@@ -31142,7 +31142,7 @@
           <w:lang w:val="sr-Cyrl-RS"/>
         </w:rPr>
       </w:pPr>
-      <w:bookmarkStart w:id="19" w:name="_Toc212376491"/>
+      <w:bookmarkStart w:id="19" w:name="_Toc212377658"/>
       <w:r>
         <w:rPr>
           <w:lang w:val="sr-Cyrl-RS"/>
@@ -31385,7 +31385,7 @@
           <w:lang w:val="sr-Cyrl-RS"/>
         </w:rPr>
       </w:pPr>
-      <w:bookmarkStart w:id="20" w:name="_Toc212376492"/>
+      <w:bookmarkStart w:id="20" w:name="_Toc212377659"/>
       <w:r>
         <w:rPr>
           <w:lang w:val="sr-Cyrl-RS"/>
@@ -34755,7 +34755,7 @@
           <w:lang w:val="sr-Cyrl-RS"/>
         </w:rPr>
       </w:pPr>
-      <w:bookmarkStart w:id="25" w:name="_Toc212376493"/>
+      <w:bookmarkStart w:id="25" w:name="_Toc212377660"/>
       <w:r>
         <w:rPr>
           <w:lang w:val="sr-Cyrl-RS"/>
@@ -35359,7 +35359,7 @@
         </w:rPr>
         <w:br w:type="page"/>
       </w:r>
-      <w:bookmarkStart w:id="26" w:name="_Toc212376494"/>
+      <w:bookmarkStart w:id="26" w:name="_Toc212377661"/>
       <w:r>
         <w:rPr>
           <w:lang w:val="sr-Cyrl-RS"/>
@@ -35424,7 +35424,7 @@
           <w:lang w:val="sr-Cyrl-RS"/>
         </w:rPr>
       </w:pPr>
-      <w:bookmarkStart w:id="27" w:name="_Toc212376495"/>
+      <w:bookmarkStart w:id="27" w:name="_Toc212377662"/>
       <w:r>
         <w:rPr>
           <w:lang w:val="en-US"/>
@@ -41635,7 +41635,7 @@
           <w:lang w:val="sr-Cyrl-RS"/>
         </w:rPr>
       </w:pPr>
-      <w:bookmarkStart w:id="32" w:name="_Toc212376496"/>
+      <w:bookmarkStart w:id="32" w:name="_Toc212377663"/>
       <w:r>
         <w:rPr>
           <w:lang w:val="sr-Cyrl-RS"/>
@@ -44687,7 +44687,7 @@
           <w:lang w:val="en-US"/>
         </w:rPr>
       </w:pPr>
-      <w:bookmarkStart w:id="35" w:name="_Toc212376497"/>
+      <w:bookmarkStart w:id="35" w:name="_Toc212377664"/>
       <w:r>
         <w:rPr>
           <w:lang w:val="sr-Cyrl-RS"/>
@@ -45378,7 +45378,7 @@
           <w:lang w:val="sr-Cyrl-RS"/>
         </w:rPr>
       </w:pPr>
-      <w:bookmarkStart w:id="36" w:name="_Toc212376498"/>
+      <w:bookmarkStart w:id="36" w:name="_Toc212377665"/>
       <w:r>
         <w:rPr>
           <w:lang w:val="sr-Cyrl-RS"/>
@@ -49919,7 +49919,7 @@
 <w:ftr xmlns:wpc="http://schemas.microsoft.com/office/word/2010/wordprocessingCanvas" xmlns:cx="http://schemas.microsoft.com/office/drawing/2014/chartex" xmlns:cx1="http://schemas.microsoft.com/office/drawing/2015/9/8/chartex" xmlns:cx2="http://schemas.microsoft.com/office/drawing/2015/10/21/chartex" xmlns:cx3="http://schemas.microsoft.com/office/drawing/2016/5/9/chartex" xmlns:cx4="http://schemas.microsoft.com/office/drawing/2016/5/10/chartex" xmlns:cx5="http://schemas.microsoft.com/office/drawing/2016/5/11/chartex" xmlns:cx6="http://schemas.microsoft.com/office/drawing/2016/5/12/chartex" xmlns:cx7="http://schemas.microsoft.com/office/drawing/2016/5/13/chartex" xmlns:cx8="http://schemas.microsoft.com/office/drawing/2016/5/14/chartex" xmlns:mc="http://schemas.openxmlformats.org/markup-compatibility/2006" xmlns:aink="http://schemas.microsoft.com/office/drawing/2016/ink" xmlns:am3d="http://schemas.microsoft.com/office/drawing/2017/model3d" xmlns:o="urn:schemas-microsoft-com:office:office" xmlns:oel="http://schemas.microsoft.com/office/2019/extlst" xmlns:r="http://schemas.openxmlformats.org/officeDocument/2006/relationships" xmlns:m="http://schemas.openxmlformats.org/officeDocument/2006/math" xmlns:v="urn:schemas-microsoft-com:vml" xmlns:wp14="http://schemas.microsoft.com/office/word/2010/wordprocessingDrawing" xmlns:wp="http://schemas.openxmlformats.org/drawingml/2006/wordprocessingDrawing" xmlns:w10="urn:schemas-microsoft-com:office:word" xmlns:w="http://schemas.openxmlformats.org/wordprocessingml/2006/main" xmlns:w14="http://schemas.microsoft.com/office/word/2010/wordml" xmlns:w15="http://schemas.microsoft.com/office/word/2012/wordml" xmlns:w16cex="http://schemas.microsoft.com/office/word/2018/wordml/cex" xmlns:w16cid="http://schemas.microsoft.com/office/word/2016/wordml/cid" xmlns:w16="http://schemas.microsoft.com/office/word/2018/wordml" xmlns:w16sdtdh="http://schemas.microsoft.com/office/word/2020/wordml/sdtdatahash" xmlns:w16se="http://schemas.microsoft.com/office/word/2015/wordml/symex" xmlns:wpg="http://schemas.microsoft.com/office/word/2010/wordprocessingGroup" xmlns:wpi="http://schemas.microsoft.com/office/word/2010/wordprocessingInk" xmlns:wne="http://schemas.microsoft.com/office/word/2006/wordml" xmlns:wps="http://schemas.microsoft.com/office/word/2010/wordprocessingShape" mc:Ignorable="w14 w15 w16se w16cid w16 w16cex w16sdtdh wp14">
   <w:sdt>
     <w:sdtPr>
-      <w:id w:val="134304642"/>
+      <w:id w:val="-212726522"/>
       <w:docPartObj>
         <w:docPartGallery w:val="Page Numbers (Bottom of Page)"/>
         <w:docPartUnique/>
@@ -49929,6 +49929,7 @@
       <w:p>
         <w:pPr>
           <w:pStyle w:val="Footer"/>
+          <w:jc w:val="center"/>
         </w:pPr>
         <w:r>
           <w:fldChar w:fldCharType="begin"/>

</xml_diff>